<commit_message>
Updated preliminary report format
</commit_message>
<xml_diff>
--- a/preliminary report/Final Project - Preliminary Report.docx
+++ b/preliminary report/Final Project - Preliminary Report.docx
@@ -3,8 +3,84 @@
 <w:document xmlns:wpc="http://schemas.microsoft.com/office/word/2010/wordprocessingCanvas" xmlns:cx="http://schemas.microsoft.com/office/drawing/2014/chartex" xmlns:cx1="http://schemas.microsoft.com/office/drawing/2015/9/8/chartex" xmlns:cx2="http://schemas.microsoft.com/office/drawing/2015/10/21/chartex" xmlns:cx3="http://schemas.microsoft.com/office/drawing/2016/5/9/chartex" xmlns:cx4="http://schemas.microsoft.com/office/drawing/2016/5/10/chartex" xmlns:cx5="http://schemas.microsoft.com/office/drawing/2016/5/11/chartex" xmlns:cx6="http://schemas.microsoft.com/office/drawing/2016/5/12/chartex" xmlns:cx7="http://schemas.microsoft.com/office/drawing/2016/5/13/chartex" xmlns:cx8="http://schemas.microsoft.com/office/drawing/2016/5/14/chartex" xmlns:mc="http://schemas.openxmlformats.org/markup-compatibility/2006" xmlns:aink="http://schemas.microsoft.com/office/drawing/2016/ink" xmlns:am3d="http://schemas.microsoft.com/office/drawing/2017/model3d" xmlns:o="urn:schemas-microsoft-com:office:office" xmlns:oel="http://schemas.microsoft.com/office/2019/extlst" xmlns:r="http://schemas.openxmlformats.org/officeDocument/2006/relationships" xmlns:m="http://schemas.openxmlformats.org/officeDocument/2006/math" xmlns:v="urn:schemas-microsoft-com:vml" xmlns:wp14="http://schemas.microsoft.com/office/word/2010/wordprocessingDrawing" xmlns:wp="http://schemas.openxmlformats.org/drawingml/2006/wordprocessingDrawing" xmlns:w10="urn:schemas-microsoft-com:office:word" xmlns:w="http://schemas.openxmlformats.org/wordprocessingml/2006/main" xmlns:w14="http://schemas.microsoft.com/office/word/2010/wordml" xmlns:w15="http://schemas.microsoft.com/office/word/2012/wordml" xmlns:w16cex="http://schemas.microsoft.com/office/word/2018/wordml/cex" xmlns:w16cid="http://schemas.microsoft.com/office/word/2016/wordml/cid" xmlns:w16="http://schemas.microsoft.com/office/word/2018/wordml" xmlns:w16du="http://schemas.microsoft.com/office/word/2023/wordml/word16du" xmlns:w16sdtdh="http://schemas.microsoft.com/office/word/2020/wordml/sdtdatahash" xmlns:w16sdtfl="http://schemas.microsoft.com/office/word/2024/wordml/sdtformatlock" xmlns:w16se="http://schemas.microsoft.com/office/word/2015/wordml/symex" xmlns:wpg="http://schemas.microsoft.com/office/word/2010/wordprocessingGroup" xmlns:wpi="http://schemas.microsoft.com/office/word/2010/wordprocessingInk" xmlns:wne="http://schemas.microsoft.com/office/word/2006/wordml" xmlns:wps="http://schemas.microsoft.com/office/word/2010/wordprocessingShape" mc:Ignorable="w14 w15 w16se w16cid w16 w16cex w16sdtdh w16sdtfl w16du wp14">
   <w:body>
     <w:p>
-      <w:r>
-        <w:t>Final Project</w:t>
+      <w:pPr>
+        <w:pStyle w:val="Title"/>
+        <w:jc w:val="center"/>
+      </w:pPr>
+      <w:r>
+        <w:t>FINAL PROJECT</w:t>
+      </w:r>
+    </w:p>
+    <w:p>
+      <w:pPr>
+        <w:pStyle w:val="Title"/>
+        <w:jc w:val="center"/>
+      </w:pPr>
+      <w:r>
+        <w:t>CM 3070</w:t>
+      </w:r>
+    </w:p>
+    <w:p/>
+    <w:p/>
+    <w:p>
+      <w:pPr>
+        <w:jc w:val="center"/>
+        <w:rPr>
+          <w:sz w:val="40"/>
+          <w:szCs w:val="40"/>
+        </w:rPr>
+      </w:pPr>
+    </w:p>
+    <w:p>
+      <w:pPr>
+        <w:jc w:val="center"/>
+        <w:rPr>
+          <w:sz w:val="40"/>
+          <w:szCs w:val="40"/>
+        </w:rPr>
+      </w:pPr>
+    </w:p>
+    <w:p>
+      <w:pPr>
+        <w:jc w:val="center"/>
+        <w:rPr>
+          <w:sz w:val="40"/>
+          <w:szCs w:val="40"/>
+        </w:rPr>
+      </w:pPr>
+    </w:p>
+    <w:p>
+      <w:pPr>
+        <w:jc w:val="center"/>
+        <w:rPr>
+          <w:sz w:val="40"/>
+          <w:szCs w:val="40"/>
+        </w:rPr>
+      </w:pPr>
+    </w:p>
+    <w:p>
+      <w:pPr>
+        <w:jc w:val="center"/>
+        <w:rPr>
+          <w:sz w:val="40"/>
+          <w:szCs w:val="40"/>
+        </w:rPr>
+      </w:pPr>
+    </w:p>
+    <w:p>
+      <w:pPr>
+        <w:jc w:val="center"/>
+        <w:rPr>
+          <w:sz w:val="40"/>
+          <w:szCs w:val="40"/>
+        </w:rPr>
+      </w:pPr>
+      <w:r>
+        <w:rPr>
+          <w:sz w:val="40"/>
+          <w:szCs w:val="40"/>
+        </w:rPr>
+        <w:t>PRELIMINARY REPORT</w:t>
       </w:r>
     </w:p>
     <w:p>
@@ -12,22 +88,501 @@
         <w:br w:type="page"/>
       </w:r>
     </w:p>
-    <w:p>
-      <w:r>
-        <w:lastRenderedPageBreak/>
-        <w:t>Table of contents</w:t>
-      </w:r>
-    </w:p>
+    <w:sdt>
+      <w:sdtPr>
+        <w:id w:val="8269102"/>
+        <w:docPartObj>
+          <w:docPartGallery w:val="Table of Contents"/>
+          <w:docPartUnique/>
+        </w:docPartObj>
+      </w:sdtPr>
+      <w:sdtEndPr>
+        <w:rPr>
+          <w:rFonts w:asciiTheme="minorHAnsi" w:eastAsiaTheme="minorHAnsi" w:hAnsiTheme="minorHAnsi" w:cstheme="minorBidi"/>
+          <w:b/>
+          <w:bCs/>
+          <w:noProof/>
+          <w:color w:val="auto"/>
+          <w:kern w:val="2"/>
+          <w:sz w:val="24"/>
+          <w:szCs w:val="24"/>
+          <w:lang w:val="en-GB"/>
+          <w14:ligatures w14:val="standardContextual"/>
+        </w:rPr>
+      </w:sdtEndPr>
+      <w:sdtContent>
+        <w:p>
+          <w:pPr>
+            <w:pStyle w:val="TOCHeading"/>
+          </w:pPr>
+          <w:r>
+            <w:t>Table of Contents</w:t>
+          </w:r>
+        </w:p>
+        <w:p>
+          <w:pPr>
+            <w:rPr>
+              <w:lang w:val="en-US"/>
+            </w:rPr>
+          </w:pPr>
+        </w:p>
+        <w:p>
+          <w:pPr>
+            <w:pStyle w:val="TOC2"/>
+            <w:tabs>
+              <w:tab w:val="right" w:leader="dot" w:pos="9016"/>
+            </w:tabs>
+            <w:rPr>
+              <w:rFonts w:eastAsiaTheme="minorEastAsia"/>
+              <w:noProof/>
+              <w:lang w:val="en-LC" w:eastAsia="en-LC"/>
+            </w:rPr>
+          </w:pPr>
+          <w:r>
+            <w:fldChar w:fldCharType="begin"/>
+          </w:r>
+          <w:r>
+            <w:instrText xml:space="preserve"> TOC \o "1-3" \h \z \u </w:instrText>
+          </w:r>
+          <w:r>
+            <w:fldChar w:fldCharType="separate"/>
+          </w:r>
+          <w:hyperlink w:anchor="_Toc232583040" w:history="1">
+            <w:r>
+              <w:rPr>
+                <w:rStyle w:val="Hyperlink"/>
+                <w:noProof/>
+              </w:rPr>
+              <w:t>Introduction</w:t>
+            </w:r>
+            <w:r>
+              <w:rPr>
+                <w:noProof/>
+                <w:webHidden/>
+              </w:rPr>
+              <w:tab/>
+            </w:r>
+            <w:r>
+              <w:rPr>
+                <w:noProof/>
+                <w:webHidden/>
+              </w:rPr>
+              <w:fldChar w:fldCharType="begin"/>
+            </w:r>
+            <w:r>
+              <w:rPr>
+                <w:noProof/>
+                <w:webHidden/>
+              </w:rPr>
+              <w:instrText xml:space="preserve"> PAGEREF _Toc232583040 \h </w:instrText>
+            </w:r>
+            <w:r>
+              <w:rPr>
+                <w:noProof/>
+                <w:webHidden/>
+              </w:rPr>
+            </w:r>
+            <w:r>
+              <w:rPr>
+                <w:noProof/>
+                <w:webHidden/>
+              </w:rPr>
+              <w:fldChar w:fldCharType="separate"/>
+            </w:r>
+            <w:r>
+              <w:rPr>
+                <w:noProof/>
+                <w:webHidden/>
+              </w:rPr>
+              <w:t>3</w:t>
+            </w:r>
+            <w:r>
+              <w:rPr>
+                <w:noProof/>
+                <w:webHidden/>
+              </w:rPr>
+              <w:fldChar w:fldCharType="end"/>
+            </w:r>
+          </w:hyperlink>
+        </w:p>
+        <w:p>
+          <w:pPr>
+            <w:pStyle w:val="TOC2"/>
+            <w:tabs>
+              <w:tab w:val="right" w:leader="dot" w:pos="9016"/>
+            </w:tabs>
+            <w:rPr>
+              <w:rFonts w:eastAsiaTheme="minorEastAsia"/>
+              <w:noProof/>
+              <w:lang w:val="en-LC" w:eastAsia="en-LC"/>
+            </w:rPr>
+          </w:pPr>
+          <w:hyperlink w:anchor="_Toc232583041" w:history="1">
+            <w:r>
+              <w:rPr>
+                <w:rStyle w:val="Hyperlink"/>
+                <w:noProof/>
+              </w:rPr>
+              <w:t>Literature Review</w:t>
+            </w:r>
+            <w:r>
+              <w:rPr>
+                <w:noProof/>
+                <w:webHidden/>
+              </w:rPr>
+              <w:tab/>
+            </w:r>
+            <w:r>
+              <w:rPr>
+                <w:noProof/>
+                <w:webHidden/>
+              </w:rPr>
+              <w:fldChar w:fldCharType="begin"/>
+            </w:r>
+            <w:r>
+              <w:rPr>
+                <w:noProof/>
+                <w:webHidden/>
+              </w:rPr>
+              <w:instrText xml:space="preserve"> PAGEREF _Toc232583041 \h </w:instrText>
+            </w:r>
+            <w:r>
+              <w:rPr>
+                <w:noProof/>
+                <w:webHidden/>
+              </w:rPr>
+            </w:r>
+            <w:r>
+              <w:rPr>
+                <w:noProof/>
+                <w:webHidden/>
+              </w:rPr>
+              <w:fldChar w:fldCharType="separate"/>
+            </w:r>
+            <w:r>
+              <w:rPr>
+                <w:noProof/>
+                <w:webHidden/>
+              </w:rPr>
+              <w:t>4</w:t>
+            </w:r>
+            <w:r>
+              <w:rPr>
+                <w:noProof/>
+                <w:webHidden/>
+              </w:rPr>
+              <w:fldChar w:fldCharType="end"/>
+            </w:r>
+          </w:hyperlink>
+        </w:p>
+        <w:p>
+          <w:pPr>
+            <w:pStyle w:val="TOC3"/>
+            <w:tabs>
+              <w:tab w:val="right" w:leader="dot" w:pos="9016"/>
+            </w:tabs>
+            <w:rPr>
+              <w:rFonts w:eastAsiaTheme="minorEastAsia"/>
+              <w:noProof/>
+              <w:lang w:val="en-LC" w:eastAsia="en-LC"/>
+            </w:rPr>
+          </w:pPr>
+          <w:hyperlink w:anchor="_Toc232583042" w:history="1">
+            <w:r>
+              <w:rPr>
+                <w:rStyle w:val="Hyperlink"/>
+                <w:noProof/>
+              </w:rPr>
+              <w:t>Optical Character Recognition (OCR)</w:t>
+            </w:r>
+            <w:r>
+              <w:rPr>
+                <w:noProof/>
+                <w:webHidden/>
+              </w:rPr>
+              <w:tab/>
+            </w:r>
+            <w:r>
+              <w:rPr>
+                <w:noProof/>
+                <w:webHidden/>
+              </w:rPr>
+              <w:fldChar w:fldCharType="begin"/>
+            </w:r>
+            <w:r>
+              <w:rPr>
+                <w:noProof/>
+                <w:webHidden/>
+              </w:rPr>
+              <w:instrText xml:space="preserve"> PAGEREF _Toc232583042 \h </w:instrText>
+            </w:r>
+            <w:r>
+              <w:rPr>
+                <w:noProof/>
+                <w:webHidden/>
+              </w:rPr>
+            </w:r>
+            <w:r>
+              <w:rPr>
+                <w:noProof/>
+                <w:webHidden/>
+              </w:rPr>
+              <w:fldChar w:fldCharType="separate"/>
+            </w:r>
+            <w:r>
+              <w:rPr>
+                <w:noProof/>
+                <w:webHidden/>
+              </w:rPr>
+              <w:t>5</w:t>
+            </w:r>
+            <w:r>
+              <w:rPr>
+                <w:noProof/>
+                <w:webHidden/>
+              </w:rPr>
+              <w:fldChar w:fldCharType="end"/>
+            </w:r>
+          </w:hyperlink>
+        </w:p>
+        <w:p>
+          <w:pPr>
+            <w:pStyle w:val="TOC3"/>
+            <w:tabs>
+              <w:tab w:val="right" w:leader="dot" w:pos="9016"/>
+            </w:tabs>
+            <w:rPr>
+              <w:rFonts w:eastAsiaTheme="minorEastAsia"/>
+              <w:noProof/>
+              <w:lang w:val="en-LC" w:eastAsia="en-LC"/>
+            </w:rPr>
+          </w:pPr>
+          <w:hyperlink w:anchor="_Toc232583043" w:history="1">
+            <w:r>
+              <w:rPr>
+                <w:rStyle w:val="Hyperlink"/>
+                <w:noProof/>
+              </w:rPr>
+              <w:t>Speech-To-Text (STT)</w:t>
+            </w:r>
+            <w:r>
+              <w:rPr>
+                <w:noProof/>
+                <w:webHidden/>
+              </w:rPr>
+              <w:tab/>
+            </w:r>
+            <w:r>
+              <w:rPr>
+                <w:noProof/>
+                <w:webHidden/>
+              </w:rPr>
+              <w:fldChar w:fldCharType="begin"/>
+            </w:r>
+            <w:r>
+              <w:rPr>
+                <w:noProof/>
+                <w:webHidden/>
+              </w:rPr>
+              <w:instrText xml:space="preserve"> PAGEREF _Toc232583043 \h </w:instrText>
+            </w:r>
+            <w:r>
+              <w:rPr>
+                <w:noProof/>
+                <w:webHidden/>
+              </w:rPr>
+            </w:r>
+            <w:r>
+              <w:rPr>
+                <w:noProof/>
+                <w:webHidden/>
+              </w:rPr>
+              <w:fldChar w:fldCharType="separate"/>
+            </w:r>
+            <w:r>
+              <w:rPr>
+                <w:noProof/>
+                <w:webHidden/>
+              </w:rPr>
+              <w:t>5</w:t>
+            </w:r>
+            <w:r>
+              <w:rPr>
+                <w:noProof/>
+                <w:webHidden/>
+              </w:rPr>
+              <w:fldChar w:fldCharType="end"/>
+            </w:r>
+          </w:hyperlink>
+        </w:p>
+        <w:p>
+          <w:pPr>
+            <w:pStyle w:val="TOC2"/>
+            <w:tabs>
+              <w:tab w:val="right" w:leader="dot" w:pos="9016"/>
+            </w:tabs>
+            <w:rPr>
+              <w:rFonts w:eastAsiaTheme="minorEastAsia"/>
+              <w:noProof/>
+              <w:lang w:val="en-LC" w:eastAsia="en-LC"/>
+            </w:rPr>
+          </w:pPr>
+          <w:hyperlink w:anchor="_Toc232583044" w:history="1">
+            <w:r>
+              <w:rPr>
+                <w:rStyle w:val="Hyperlink"/>
+                <w:noProof/>
+              </w:rPr>
+              <w:t>Feature Prototype</w:t>
+            </w:r>
+            <w:r>
+              <w:rPr>
+                <w:noProof/>
+                <w:webHidden/>
+              </w:rPr>
+              <w:tab/>
+            </w:r>
+            <w:r>
+              <w:rPr>
+                <w:noProof/>
+                <w:webHidden/>
+              </w:rPr>
+              <w:fldChar w:fldCharType="begin"/>
+            </w:r>
+            <w:r>
+              <w:rPr>
+                <w:noProof/>
+                <w:webHidden/>
+              </w:rPr>
+              <w:instrText xml:space="preserve"> PAGEREF _Toc232583044 \h </w:instrText>
+            </w:r>
+            <w:r>
+              <w:rPr>
+                <w:noProof/>
+                <w:webHidden/>
+              </w:rPr>
+            </w:r>
+            <w:r>
+              <w:rPr>
+                <w:noProof/>
+                <w:webHidden/>
+              </w:rPr>
+              <w:fldChar w:fldCharType="separate"/>
+            </w:r>
+            <w:r>
+              <w:rPr>
+                <w:noProof/>
+                <w:webHidden/>
+              </w:rPr>
+              <w:t>8</w:t>
+            </w:r>
+            <w:r>
+              <w:rPr>
+                <w:noProof/>
+                <w:webHidden/>
+              </w:rPr>
+              <w:fldChar w:fldCharType="end"/>
+            </w:r>
+          </w:hyperlink>
+        </w:p>
+        <w:p>
+          <w:pPr>
+            <w:pStyle w:val="TOC2"/>
+            <w:tabs>
+              <w:tab w:val="right" w:leader="dot" w:pos="9016"/>
+            </w:tabs>
+            <w:rPr>
+              <w:rFonts w:eastAsiaTheme="minorEastAsia"/>
+              <w:noProof/>
+              <w:lang w:val="en-LC" w:eastAsia="en-LC"/>
+            </w:rPr>
+          </w:pPr>
+          <w:hyperlink w:anchor="_Toc232583045" w:history="1">
+            <w:r>
+              <w:rPr>
+                <w:rStyle w:val="Hyperlink"/>
+                <w:noProof/>
+              </w:rPr>
+              <w:t>REFERENCE LIST</w:t>
+            </w:r>
+            <w:r>
+              <w:rPr>
+                <w:noProof/>
+                <w:webHidden/>
+              </w:rPr>
+              <w:tab/>
+            </w:r>
+            <w:r>
+              <w:rPr>
+                <w:noProof/>
+                <w:webHidden/>
+              </w:rPr>
+              <w:fldChar w:fldCharType="begin"/>
+            </w:r>
+            <w:r>
+              <w:rPr>
+                <w:noProof/>
+                <w:webHidden/>
+              </w:rPr>
+              <w:instrText xml:space="preserve"> PAGEREF _Toc232583045 \h </w:instrText>
+            </w:r>
+            <w:r>
+              <w:rPr>
+                <w:noProof/>
+                <w:webHidden/>
+              </w:rPr>
+            </w:r>
+            <w:r>
+              <w:rPr>
+                <w:noProof/>
+                <w:webHidden/>
+              </w:rPr>
+              <w:fldChar w:fldCharType="separate"/>
+            </w:r>
+            <w:r>
+              <w:rPr>
+                <w:noProof/>
+                <w:webHidden/>
+              </w:rPr>
+              <w:t>9</w:t>
+            </w:r>
+            <w:r>
+              <w:rPr>
+                <w:noProof/>
+                <w:webHidden/>
+              </w:rPr>
+              <w:fldChar w:fldCharType="end"/>
+            </w:r>
+          </w:hyperlink>
+        </w:p>
+        <w:p>
+          <w:r>
+            <w:rPr>
+              <w:b/>
+              <w:bCs/>
+              <w:noProof/>
+            </w:rPr>
+            <w:fldChar w:fldCharType="end"/>
+          </w:r>
+        </w:p>
+      </w:sdtContent>
+    </w:sdt>
+    <w:p/>
     <w:p>
       <w:r>
         <w:br w:type="page"/>
       </w:r>
     </w:p>
     <w:p>
+      <w:pPr>
+        <w:pStyle w:val="Heading2"/>
+      </w:pPr>
+      <w:bookmarkStart w:id="0" w:name="_Toc232583040"/>
       <w:r>
         <w:lastRenderedPageBreak/>
         <w:t>Introduction</w:t>
       </w:r>
+      <w:bookmarkEnd w:id="0"/>
     </w:p>
     <w:p/>
     <w:p>
@@ -183,10 +738,12 @@
       <w:pPr>
         <w:pStyle w:val="Heading2"/>
       </w:pPr>
+      <w:bookmarkStart w:id="1" w:name="_Toc232583041"/>
       <w:r>
         <w:lastRenderedPageBreak/>
         <w:t>Literature Review</w:t>
       </w:r>
+      <w:bookmarkEnd w:id="1"/>
     </w:p>
     <w:p/>
     <w:p>
@@ -308,195 +865,178 @@
         <w:rPr>
           <w:highlight w:val="yellow"/>
         </w:rPr>
-        <w:t xml:space="preserve">, define what they are, pick the best model, justify selection, speak about features and limitations, if </w:t>
-      </w:r>
-      <w:proofErr w:type="gramStart"/>
-      <w:r>
+        <w:t>, define what they are, pick the best model, justify selection, speak about features and limitations, if possible get material showing how they performed against other similar models, this will lead to pipeline, avoid elaborate deep discussion of how they work</w:t>
+      </w:r>
+    </w:p>
+    <w:p>
+      <w:pPr>
+        <w:pStyle w:val="Heading3"/>
+      </w:pPr>
+      <w:bookmarkStart w:id="2" w:name="_Toc232583042"/>
+      <w:r>
+        <w:t>Optical Character Recognition (OCR)</w:t>
+      </w:r>
+      <w:bookmarkEnd w:id="2"/>
+    </w:p>
+    <w:p>
+      <w:pPr>
         <w:rPr>
-          <w:highlight w:val="yellow"/>
+          <w:b/>
+          <w:bCs/>
         </w:rPr>
-        <w:t>possible</w:t>
-      </w:r>
-      <w:proofErr w:type="gramEnd"/>
+      </w:pPr>
       <w:r>
         <w:rPr>
-          <w:highlight w:val="yellow"/>
+          <w:b/>
+          <w:bCs/>
         </w:rPr>
-        <w:t xml:space="preserve"> get material showing how they performed against other similar models, this will lead to pipeline, avoid elaborate deep discussion of how they work</w:t>
+        <w:t>What is OCR?</w:t>
+      </w:r>
+    </w:p>
+    <w:p>
+      <w:r>
+        <w:t xml:space="preserve">Optical character recognition according to [11] is as procedure that detects and recognizes the printed and </w:t>
+      </w:r>
+      <w:r>
+        <w:t>handwritten</w:t>
+      </w:r>
+      <w:r>
+        <w:t xml:space="preserve"> text from an image and coverts it to editable test. </w:t>
+      </w:r>
+      <w:r>
+        <w:t xml:space="preserve">[12] Traditionally, an OCR system includes two main modules: a text detection module and a text recognition module. Text detection localizes all text blocks at word-level or </w:t>
+      </w:r>
+      <w:proofErr w:type="spellStart"/>
+      <w:r>
+        <w:t>textline</w:t>
+      </w:r>
+      <w:proofErr w:type="spellEnd"/>
+      <w:r>
+        <w:t>-level while text recognition aims to understand the text image content and transcribe the visual signals in to natural language tokens.</w:t>
+      </w:r>
+    </w:p>
+    <w:p>
+      <w:r>
+        <w:t>What is the performance of current OCR models?</w:t>
+      </w:r>
+    </w:p>
+    <w:p>
+      <w:r>
+        <w:t>What metrics do OCR models use?</w:t>
+      </w:r>
+    </w:p>
+    <w:p>
+      <w:r>
+        <w:t>What are the limitations of OCR models?</w:t>
+      </w:r>
+    </w:p>
+    <w:p>
+      <w:r>
+        <w:t>Free models, Get literature comparing model performance</w:t>
+      </w:r>
+    </w:p>
+    <w:p>
+      <w:proofErr w:type="spellStart"/>
+      <w:r>
+        <w:t>TrOCR</w:t>
+      </w:r>
+      <w:proofErr w:type="spellEnd"/>
+      <w:r>
+        <w:t xml:space="preserve">(best for raw accuracy), </w:t>
+      </w:r>
+      <w:proofErr w:type="spellStart"/>
+      <w:r>
+        <w:t>PaddleOCR</w:t>
+      </w:r>
+      <w:proofErr w:type="spellEnd"/>
+      <w:r>
+        <w:t xml:space="preserve">(best </w:t>
+      </w:r>
+      <w:proofErr w:type="spellStart"/>
+      <w:r>
+        <w:t>allin</w:t>
+      </w:r>
+      <w:proofErr w:type="spellEnd"/>
+      <w:r>
+        <w:t xml:space="preserve"> one engine), EasyOCR (easiest to code)</w:t>
+      </w:r>
+    </w:p>
+    <w:p>
+      <w:r>
+        <w:t xml:space="preserve">Why that OCR model? </w:t>
+      </w:r>
+    </w:p>
+    <w:p>
+      <w:r>
+        <w:t>Compare them using WER (word error rate) or (</w:t>
+      </w:r>
+      <w:proofErr w:type="spellStart"/>
+      <w:r>
+        <w:t>Chaaracter</w:t>
+      </w:r>
+      <w:proofErr w:type="spellEnd"/>
+      <w:r>
+        <w:t xml:space="preserve"> error rate)</w:t>
       </w:r>
     </w:p>
     <w:p>
       <w:pPr>
         <w:pStyle w:val="Heading2"/>
       </w:pPr>
-      <w:r>
-        <w:t>Optical Character Recognition (OCR)</w:t>
-      </w:r>
-    </w:p>
-    <w:p>
-      <w:r>
-        <w:t>What is OCR?</w:t>
-      </w:r>
-    </w:p>
-    <w:p>
-      <w:r>
-        <w:t xml:space="preserve">Optical character recognition according to [11] is as procedure that detects and recognizes the printed and </w:t>
-      </w:r>
-      <w:proofErr w:type="gramStart"/>
-      <w:r>
-        <w:t>hand written</w:t>
-      </w:r>
-      <w:proofErr w:type="gramEnd"/>
-      <w:r>
-        <w:t xml:space="preserve"> text from an image and coverts it to editable test. </w:t>
-      </w:r>
-    </w:p>
-    <w:p>
-      <w:r>
-        <w:t>What is the performance of current OCR models?</w:t>
-      </w:r>
-    </w:p>
-    <w:p>
-      <w:r>
-        <w:t>What metrics do OCR models use?</w:t>
-      </w:r>
-    </w:p>
-    <w:p>
-      <w:r>
-        <w:t>What are the limitations of OCR models?</w:t>
-      </w:r>
-    </w:p>
-    <w:p>
-      <w:r>
-        <w:t xml:space="preserve">Free models, </w:t>
-      </w:r>
-      <w:proofErr w:type="gramStart"/>
-      <w:r>
-        <w:t>Get</w:t>
-      </w:r>
-      <w:proofErr w:type="gramEnd"/>
-      <w:r>
-        <w:t xml:space="preserve"> literature comparing model performance</w:t>
-      </w:r>
-    </w:p>
-    <w:p>
+    </w:p>
+    <w:p>
+      <w:pPr>
+        <w:pStyle w:val="Heading3"/>
+      </w:pPr>
+      <w:bookmarkStart w:id="3" w:name="_Toc232583043"/>
+      <w:r>
+        <w:t>Speech-To-Text</w:t>
+      </w:r>
+      <w:r>
+        <w:t xml:space="preserve"> (STT)</w:t>
+      </w:r>
+      <w:bookmarkEnd w:id="3"/>
+    </w:p>
+    <w:p>
+      <w:r>
+        <w:t>What is a speech-to-text system?</w:t>
+      </w:r>
+    </w:p>
+    <w:p>
+      <w:r>
+        <w:t>What is the performance of current speech-to-text models?</w:t>
+      </w:r>
+    </w:p>
+    <w:p>
+      <w:r>
+        <w:t>What metrics do speech-to-text models use?</w:t>
+      </w:r>
+    </w:p>
+    <w:p>
+      <w:r>
+        <w:lastRenderedPageBreak/>
+        <w:t>What are the limitations of speech-to-text models?</w:t>
+      </w:r>
+    </w:p>
+    <w:p>
+      <w:r>
+        <w:t xml:space="preserve">Why that speech-to-text-model? </w:t>
+      </w:r>
+      <w:r>
+        <w:t>Get literature comparing model performance</w:t>
+      </w:r>
+    </w:p>
+    <w:p>
+      <w:r>
+        <w:t>OpenAI whisper (</w:t>
+      </w:r>
       <w:proofErr w:type="spellStart"/>
-      <w:proofErr w:type="gramStart"/>
-      <w:r>
-        <w:t>TrOCR</w:t>
+      <w:r>
+        <w:t>academeic</w:t>
       </w:r>
       <w:proofErr w:type="spellEnd"/>
       <w:r>
-        <w:t>(</w:t>
-      </w:r>
-      <w:proofErr w:type="gramEnd"/>
-      <w:r>
-        <w:t xml:space="preserve">best for raw accuracy), </w:t>
-      </w:r>
-      <w:proofErr w:type="spellStart"/>
-      <w:proofErr w:type="gramStart"/>
-      <w:r>
-        <w:t>PaddleOCR</w:t>
-      </w:r>
-      <w:proofErr w:type="spellEnd"/>
-      <w:r>
-        <w:t>(</w:t>
-      </w:r>
-      <w:proofErr w:type="gramEnd"/>
-      <w:r>
-        <w:t xml:space="preserve">best </w:t>
-      </w:r>
-      <w:proofErr w:type="spellStart"/>
-      <w:r>
-        <w:t>allin</w:t>
-      </w:r>
-      <w:proofErr w:type="spellEnd"/>
-      <w:r>
-        <w:t xml:space="preserve"> one engine), EasyOCR (easiest to code)</w:t>
-      </w:r>
-    </w:p>
-    <w:p>
-      <w:r>
-        <w:t xml:space="preserve">Why that OCR model? </w:t>
-      </w:r>
-    </w:p>
-    <w:p>
-      <w:r>
-        <w:t>Compare them using WER (word error rate) or (</w:t>
-      </w:r>
-      <w:proofErr w:type="spellStart"/>
-      <w:r>
-        <w:t>Chaaracter</w:t>
-      </w:r>
-      <w:proofErr w:type="spellEnd"/>
-      <w:r>
-        <w:t xml:space="preserve"> error rate)</w:t>
-      </w:r>
-    </w:p>
-    <w:p>
-      <w:pPr>
-        <w:pStyle w:val="Heading2"/>
-      </w:pPr>
-    </w:p>
-    <w:p>
-      <w:pPr>
-        <w:pStyle w:val="Heading2"/>
-      </w:pPr>
-      <w:r>
-        <w:t>Speech-To-Text</w:t>
-      </w:r>
-      <w:r>
-        <w:t xml:space="preserve"> (STT)</w:t>
-      </w:r>
-    </w:p>
-    <w:p>
-      <w:r>
-        <w:t>What is a speech-to-text system?</w:t>
-      </w:r>
-    </w:p>
-    <w:p>
-      <w:r>
-        <w:t>What is the performance of current speech-to-text models?</w:t>
-      </w:r>
-    </w:p>
-    <w:p>
-      <w:r>
-        <w:t>What metrics do speech-to-text models use?</w:t>
-      </w:r>
-    </w:p>
-    <w:p>
-      <w:r>
-        <w:t>What are the limitations of speech-to-text models?</w:t>
-      </w:r>
-    </w:p>
-    <w:p>
-      <w:r>
-        <w:t xml:space="preserve">Why that speech-to-text-model? </w:t>
-      </w:r>
-      <w:r>
-        <w:t>Get literature comparing model performance</w:t>
-      </w:r>
-    </w:p>
-    <w:p>
-      <w:r>
-        <w:lastRenderedPageBreak/>
-        <w:t>OpenAI whisper (</w:t>
-      </w:r>
-      <w:proofErr w:type="spellStart"/>
-      <w:r>
-        <w:t>academeic</w:t>
-      </w:r>
-      <w:proofErr w:type="spellEnd"/>
-      <w:r>
-        <w:t xml:space="preserve"> gold standard), NVIDIA Canary-</w:t>
-      </w:r>
-      <w:proofErr w:type="gramStart"/>
-      <w:r>
-        <w:t>Queen(</w:t>
-      </w:r>
-      <w:proofErr w:type="gramEnd"/>
-      <w:r>
-        <w:t>best for raw English accuracy), Distil-Whisper – (Best for low-Resource hardware)</w:t>
+        <w:t xml:space="preserve"> gold standard), NVIDIA Canary-Queen(best for raw English accuracy), Distil-Whisper – (Best for low-Resource hardware)</w:t>
       </w:r>
     </w:p>
     <w:p/>
@@ -537,19 +1077,168 @@
       </w:r>
     </w:p>
     <w:p>
+      <w:pPr>
+        <w:pStyle w:val="Heading2"/>
+      </w:pPr>
+      <w:bookmarkStart w:id="4" w:name="_Toc232583044"/>
       <w:r>
         <w:lastRenderedPageBreak/>
         <w:t>Feature Prototype</w:t>
       </w:r>
-    </w:p>
+      <w:bookmarkEnd w:id="4"/>
+    </w:p>
+    <w:p>
+      <w:pPr>
+        <w:rPr>
+          <w:rFonts w:asciiTheme="majorHAnsi" w:eastAsiaTheme="majorEastAsia" w:hAnsiTheme="majorHAnsi" w:cstheme="majorBidi"/>
+          <w:color w:val="0F4761" w:themeColor="accent1" w:themeShade="BF"/>
+          <w:sz w:val="32"/>
+          <w:szCs w:val="32"/>
+        </w:rPr>
+      </w:pPr>
+      <w:r>
+        <w:br w:type="page"/>
+      </w:r>
+    </w:p>
+    <w:p>
+      <w:pPr>
+        <w:pStyle w:val="Heading2"/>
+      </w:pPr>
+      <w:bookmarkStart w:id="5" w:name="_Toc232583045"/>
+      <w:r>
+        <w:lastRenderedPageBreak/>
+        <w:t>REFERENCE LIST</w:t>
+      </w:r>
+      <w:bookmarkEnd w:id="5"/>
+    </w:p>
+    <w:p/>
     <w:sectPr>
+      <w:footerReference w:type="default" r:id="rId7"/>
       <w:pgSz w:w="11906" w:h="16838"/>
       <w:pgMar w:top="1440" w:right="1440" w:bottom="1440" w:left="1440" w:header="708" w:footer="708" w:gutter="0"/>
       <w:cols w:space="708"/>
+      <w:titlePg/>
       <w:docGrid w:linePitch="360"/>
     </w:sectPr>
   </w:body>
 </w:document>
+</file>
+
+<file path=word/endnotes.xml><?xml version="1.0" encoding="utf-8"?>
+<w:endnotes xmlns:wpc="http://schemas.microsoft.com/office/word/2010/wordprocessingCanvas" xmlns:cx="http://schemas.microsoft.com/office/drawing/2014/chartex" xmlns:cx1="http://schemas.microsoft.com/office/drawing/2015/9/8/chartex" xmlns:cx2="http://schemas.microsoft.com/office/drawing/2015/10/21/chartex" xmlns:cx3="http://schemas.microsoft.com/office/drawing/2016/5/9/chartex" xmlns:cx4="http://schemas.microsoft.com/office/drawing/2016/5/10/chartex" xmlns:cx5="http://schemas.microsoft.com/office/drawing/2016/5/11/chartex" xmlns:cx6="http://schemas.microsoft.com/office/drawing/2016/5/12/chartex" xmlns:cx7="http://schemas.microsoft.com/office/drawing/2016/5/13/chartex" xmlns:cx8="http://schemas.microsoft.com/office/drawing/2016/5/14/chartex" xmlns:mc="http://schemas.openxmlformats.org/markup-compatibility/2006" xmlns:aink="http://schemas.microsoft.com/office/drawing/2016/ink" xmlns:am3d="http://schemas.microsoft.com/office/drawing/2017/model3d" xmlns:o="urn:schemas-microsoft-com:office:office" xmlns:oel="http://schemas.microsoft.com/office/2019/extlst" xmlns:r="http://schemas.openxmlformats.org/officeDocument/2006/relationships" xmlns:m="http://schemas.openxmlformats.org/officeDocument/2006/math" xmlns:v="urn:schemas-microsoft-com:vml" xmlns:wp14="http://schemas.microsoft.com/office/word/2010/wordprocessingDrawing" xmlns:wp="http://schemas.openxmlformats.org/drawingml/2006/wordprocessingDrawing" xmlns:w10="urn:schemas-microsoft-com:office:word" xmlns:w="http://schemas.openxmlformats.org/wordprocessingml/2006/main" xmlns:w14="http://schemas.microsoft.com/office/word/2010/wordml" xmlns:w15="http://schemas.microsoft.com/office/word/2012/wordml" xmlns:w16cex="http://schemas.microsoft.com/office/word/2018/wordml/cex" xmlns:w16cid="http://schemas.microsoft.com/office/word/2016/wordml/cid" xmlns:w16="http://schemas.microsoft.com/office/word/2018/wordml" xmlns:w16du="http://schemas.microsoft.com/office/word/2023/wordml/word16du" xmlns:w16sdtdh="http://schemas.microsoft.com/office/word/2020/wordml/sdtdatahash" xmlns:w16sdtfl="http://schemas.microsoft.com/office/word/2024/wordml/sdtformatlock" xmlns:w16se="http://schemas.microsoft.com/office/word/2015/wordml/symex" xmlns:wpg="http://schemas.microsoft.com/office/word/2010/wordprocessingGroup" xmlns:wpi="http://schemas.microsoft.com/office/word/2010/wordprocessingInk" xmlns:wne="http://schemas.microsoft.com/office/word/2006/wordml" xmlns:wps="http://schemas.microsoft.com/office/word/2010/wordprocessingShape" mc:Ignorable="w14 w15 w16se w16cid w16 w16cex w16sdtdh w16sdtfl w16du wp14">
+  <w:endnote w:type="separator" w:id="-1">
+    <w:p>
+      <w:pPr>
+        <w:spacing w:after="0" w:line="240" w:lineRule="auto"/>
+      </w:pPr>
+      <w:r>
+        <w:separator/>
+      </w:r>
+    </w:p>
+  </w:endnote>
+  <w:endnote w:type="continuationSeparator" w:id="0">
+    <w:p>
+      <w:pPr>
+        <w:spacing w:after="0" w:line="240" w:lineRule="auto"/>
+      </w:pPr>
+      <w:r>
+        <w:continuationSeparator/>
+      </w:r>
+    </w:p>
+  </w:endnote>
+</w:endnotes>
+</file>
+
+<file path=word/footer1.xml><?xml version="1.0" encoding="utf-8"?>
+<w:ftr xmlns:wpc="http://schemas.microsoft.com/office/word/2010/wordprocessingCanvas" xmlns:cx="http://schemas.microsoft.com/office/drawing/2014/chartex" xmlns:cx1="http://schemas.microsoft.com/office/drawing/2015/9/8/chartex" xmlns:cx2="http://schemas.microsoft.com/office/drawing/2015/10/21/chartex" xmlns:cx3="http://schemas.microsoft.com/office/drawing/2016/5/9/chartex" xmlns:cx4="http://schemas.microsoft.com/office/drawing/2016/5/10/chartex" xmlns:cx5="http://schemas.microsoft.com/office/drawing/2016/5/11/chartex" xmlns:cx6="http://schemas.microsoft.com/office/drawing/2016/5/12/chartex" xmlns:cx7="http://schemas.microsoft.com/office/drawing/2016/5/13/chartex" xmlns:cx8="http://schemas.microsoft.com/office/drawing/2016/5/14/chartex" xmlns:mc="http://schemas.openxmlformats.org/markup-compatibility/2006" xmlns:aink="http://schemas.microsoft.com/office/drawing/2016/ink" xmlns:am3d="http://schemas.microsoft.com/office/drawing/2017/model3d" xmlns:o="urn:schemas-microsoft-com:office:office" xmlns:oel="http://schemas.microsoft.com/office/2019/extlst" xmlns:r="http://schemas.openxmlformats.org/officeDocument/2006/relationships" xmlns:m="http://schemas.openxmlformats.org/officeDocument/2006/math" xmlns:v="urn:schemas-microsoft-com:vml" xmlns:wp14="http://schemas.microsoft.com/office/word/2010/wordprocessingDrawing" xmlns:wp="http://schemas.openxmlformats.org/drawingml/2006/wordprocessingDrawing" xmlns:w10="urn:schemas-microsoft-com:office:word" xmlns:w="http://schemas.openxmlformats.org/wordprocessingml/2006/main" xmlns:w14="http://schemas.microsoft.com/office/word/2010/wordml" xmlns:w15="http://schemas.microsoft.com/office/word/2012/wordml" xmlns:w16cex="http://schemas.microsoft.com/office/word/2018/wordml/cex" xmlns:w16cid="http://schemas.microsoft.com/office/word/2016/wordml/cid" xmlns:w16="http://schemas.microsoft.com/office/word/2018/wordml" xmlns:w16du="http://schemas.microsoft.com/office/word/2023/wordml/word16du" xmlns:w16sdtdh="http://schemas.microsoft.com/office/word/2020/wordml/sdtdatahash" xmlns:w16sdtfl="http://schemas.microsoft.com/office/word/2024/wordml/sdtformatlock" xmlns:w16se="http://schemas.microsoft.com/office/word/2015/wordml/symex" xmlns:wpg="http://schemas.microsoft.com/office/word/2010/wordprocessingGroup" xmlns:wpi="http://schemas.microsoft.com/office/word/2010/wordprocessingInk" xmlns:wne="http://schemas.microsoft.com/office/word/2006/wordml" xmlns:wps="http://schemas.microsoft.com/office/word/2010/wordprocessingShape" mc:Ignorable="w14 w15 w16se w16cid w16 w16cex w16sdtdh w16sdtfl w16du wp14">
+  <w:sdt>
+    <w:sdtPr>
+      <w:id w:val="1977879214"/>
+      <w:docPartObj>
+        <w:docPartGallery w:val="Page Numbers (Bottom of Page)"/>
+        <w:docPartUnique/>
+      </w:docPartObj>
+    </w:sdtPr>
+    <w:sdtEndPr>
+      <w:rPr>
+        <w:color w:val="7F7F7F" w:themeColor="background1" w:themeShade="7F"/>
+        <w:spacing w:val="60"/>
+      </w:rPr>
+    </w:sdtEndPr>
+    <w:sdtContent>
+      <w:p>
+        <w:pPr>
+          <w:pStyle w:val="Footer"/>
+          <w:pBdr>
+            <w:top w:val="single" w:sz="4" w:space="1" w:color="D9D9D9" w:themeColor="background1" w:themeShade="D9"/>
+          </w:pBdr>
+          <w:jc w:val="right"/>
+        </w:pPr>
+        <w:r>
+          <w:fldChar w:fldCharType="begin"/>
+        </w:r>
+        <w:r>
+          <w:instrText xml:space="preserve"> PAGE   \* MERGEFORMAT </w:instrText>
+        </w:r>
+        <w:r>
+          <w:fldChar w:fldCharType="separate"/>
+        </w:r>
+        <w:r>
+          <w:rPr>
+            <w:noProof/>
+          </w:rPr>
+          <w:t>2</w:t>
+        </w:r>
+        <w:r>
+          <w:rPr>
+            <w:noProof/>
+          </w:rPr>
+          <w:fldChar w:fldCharType="end"/>
+        </w:r>
+        <w:r>
+          <w:t xml:space="preserve"> | </w:t>
+        </w:r>
+        <w:r>
+          <w:rPr>
+            <w:color w:val="7F7F7F" w:themeColor="background1" w:themeShade="7F"/>
+            <w:spacing w:val="60"/>
+          </w:rPr>
+          <w:t>Page</w:t>
+        </w:r>
+      </w:p>
+    </w:sdtContent>
+  </w:sdt>
+  <w:p>
+    <w:pPr>
+      <w:pStyle w:val="Footer"/>
+    </w:pPr>
+  </w:p>
+</w:ftr>
+</file>
+
+<file path=word/footnotes.xml><?xml version="1.0" encoding="utf-8"?>
+<w:footnotes xmlns:wpc="http://schemas.microsoft.com/office/word/2010/wordprocessingCanvas" xmlns:cx="http://schemas.microsoft.com/office/drawing/2014/chartex" xmlns:cx1="http://schemas.microsoft.com/office/drawing/2015/9/8/chartex" xmlns:cx2="http://schemas.microsoft.com/office/drawing/2015/10/21/chartex" xmlns:cx3="http://schemas.microsoft.com/office/drawing/2016/5/9/chartex" xmlns:cx4="http://schemas.microsoft.com/office/drawing/2016/5/10/chartex" xmlns:cx5="http://schemas.microsoft.com/office/drawing/2016/5/11/chartex" xmlns:cx6="http://schemas.microsoft.com/office/drawing/2016/5/12/chartex" xmlns:cx7="http://schemas.microsoft.com/office/drawing/2016/5/13/chartex" xmlns:cx8="http://schemas.microsoft.com/office/drawing/2016/5/14/chartex" xmlns:mc="http://schemas.openxmlformats.org/markup-compatibility/2006" xmlns:aink="http://schemas.microsoft.com/office/drawing/2016/ink" xmlns:am3d="http://schemas.microsoft.com/office/drawing/2017/model3d" xmlns:o="urn:schemas-microsoft-com:office:office" xmlns:oel="http://schemas.microsoft.com/office/2019/extlst" xmlns:r="http://schemas.openxmlformats.org/officeDocument/2006/relationships" xmlns:m="http://schemas.openxmlformats.org/officeDocument/2006/math" xmlns:v="urn:schemas-microsoft-com:vml" xmlns:wp14="http://schemas.microsoft.com/office/word/2010/wordprocessingDrawing" xmlns:wp="http://schemas.openxmlformats.org/drawingml/2006/wordprocessingDrawing" xmlns:w10="urn:schemas-microsoft-com:office:word" xmlns:w="http://schemas.openxmlformats.org/wordprocessingml/2006/main" xmlns:w14="http://schemas.microsoft.com/office/word/2010/wordml" xmlns:w15="http://schemas.microsoft.com/office/word/2012/wordml" xmlns:w16cex="http://schemas.microsoft.com/office/word/2018/wordml/cex" xmlns:w16cid="http://schemas.microsoft.com/office/word/2016/wordml/cid" xmlns:w16="http://schemas.microsoft.com/office/word/2018/wordml" xmlns:w16du="http://schemas.microsoft.com/office/word/2023/wordml/word16du" xmlns:w16sdtdh="http://schemas.microsoft.com/office/word/2020/wordml/sdtdatahash" xmlns:w16sdtfl="http://schemas.microsoft.com/office/word/2024/wordml/sdtformatlock" xmlns:w16se="http://schemas.microsoft.com/office/word/2015/wordml/symex" xmlns:wpg="http://schemas.microsoft.com/office/word/2010/wordprocessingGroup" xmlns:wpi="http://schemas.microsoft.com/office/word/2010/wordprocessingInk" xmlns:wne="http://schemas.microsoft.com/office/word/2006/wordml" xmlns:wps="http://schemas.microsoft.com/office/word/2010/wordprocessingShape" mc:Ignorable="w14 w15 w16se w16cid w16 w16cex w16sdtdh w16sdtfl w16du wp14">
+  <w:footnote w:type="separator" w:id="-1">
+    <w:p>
+      <w:pPr>
+        <w:spacing w:after="0" w:line="240" w:lineRule="auto"/>
+      </w:pPr>
+      <w:r>
+        <w:separator/>
+      </w:r>
+    </w:p>
+  </w:footnote>
+  <w:footnote w:type="continuationSeparator" w:id="0">
+    <w:p>
+      <w:pPr>
+        <w:spacing w:after="0" w:line="240" w:lineRule="auto"/>
+      </w:pPr>
+      <w:r>
+        <w:continuationSeparator/>
+      </w:r>
+    </w:p>
+  </w:footnote>
+</w:footnotes>
 </file>
 
 <file path=word/styles.xml><?xml version="1.0" encoding="utf-8"?>
@@ -1002,7 +1691,6 @@
     <w:next w:val="Normal"/>
     <w:link w:val="Heading3Char"/>
     <w:uiPriority w:val="9"/>
-    <w:semiHidden/>
     <w:unhideWhenUsed/>
     <w:qFormat/>
     <w:rsid w:val="002146F0"/>
@@ -1209,7 +1897,6 @@
     <w:basedOn w:val="DefaultParagraphFont"/>
     <w:link w:val="Heading3"/>
     <w:uiPriority w:val="9"/>
-    <w:semiHidden/>
     <w:rsid w:val="002146F0"/>
     <w:rPr>
       <w:rFonts w:eastAsiaTheme="majorEastAsia" w:cstheme="majorBidi"/>
@@ -1466,6 +2153,107 @@
       <w:color w:val="0F4761" w:themeColor="accent1" w:themeShade="BF"/>
       <w:spacing w:val="5"/>
     </w:rPr>
+  </w:style>
+  <w:style w:type="paragraph" w:styleId="TOCHeading">
+    <w:name w:val="TOC Heading"/>
+    <w:basedOn w:val="Heading1"/>
+    <w:next w:val="Normal"/>
+    <w:uiPriority w:val="39"/>
+    <w:unhideWhenUsed/>
+    <w:qFormat/>
+    <w:rsid w:val="00FD3203"/>
+    <w:pPr>
+      <w:spacing w:before="240" w:after="0" w:line="259" w:lineRule="auto"/>
+      <w:outlineLvl w:val="9"/>
+    </w:pPr>
+    <w:rPr>
+      <w:kern w:val="0"/>
+      <w:sz w:val="32"/>
+      <w:szCs w:val="32"/>
+      <w:lang w:val="en-US"/>
+      <w14:ligatures w14:val="none"/>
+    </w:rPr>
+  </w:style>
+  <w:style w:type="paragraph" w:styleId="TOC2">
+    <w:name w:val="toc 2"/>
+    <w:basedOn w:val="Normal"/>
+    <w:next w:val="Normal"/>
+    <w:autoRedefine/>
+    <w:uiPriority w:val="39"/>
+    <w:unhideWhenUsed/>
+    <w:rsid w:val="00FD3203"/>
+    <w:pPr>
+      <w:spacing w:after="100"/>
+      <w:ind w:left="240"/>
+    </w:pPr>
+  </w:style>
+  <w:style w:type="paragraph" w:styleId="TOC3">
+    <w:name w:val="toc 3"/>
+    <w:basedOn w:val="Normal"/>
+    <w:next w:val="Normal"/>
+    <w:autoRedefine/>
+    <w:uiPriority w:val="39"/>
+    <w:unhideWhenUsed/>
+    <w:rsid w:val="00FD3203"/>
+    <w:pPr>
+      <w:spacing w:after="100"/>
+      <w:ind w:left="480"/>
+    </w:pPr>
+  </w:style>
+  <w:style w:type="character" w:styleId="Hyperlink">
+    <w:name w:val="Hyperlink"/>
+    <w:basedOn w:val="DefaultParagraphFont"/>
+    <w:uiPriority w:val="99"/>
+    <w:unhideWhenUsed/>
+    <w:rsid w:val="00FD3203"/>
+    <w:rPr>
+      <w:color w:val="467886" w:themeColor="hyperlink"/>
+      <w:u w:val="single"/>
+    </w:rPr>
+  </w:style>
+  <w:style w:type="paragraph" w:styleId="Header">
+    <w:name w:val="header"/>
+    <w:basedOn w:val="Normal"/>
+    <w:link w:val="HeaderChar"/>
+    <w:uiPriority w:val="99"/>
+    <w:unhideWhenUsed/>
+    <w:rsid w:val="00FD3203"/>
+    <w:pPr>
+      <w:tabs>
+        <w:tab w:val="center" w:pos="4513"/>
+        <w:tab w:val="right" w:pos="9026"/>
+      </w:tabs>
+      <w:spacing w:after="0" w:line="240" w:lineRule="auto"/>
+    </w:pPr>
+  </w:style>
+  <w:style w:type="character" w:customStyle="1" w:styleId="HeaderChar">
+    <w:name w:val="Header Char"/>
+    <w:basedOn w:val="DefaultParagraphFont"/>
+    <w:link w:val="Header"/>
+    <w:uiPriority w:val="99"/>
+    <w:rsid w:val="00FD3203"/>
+  </w:style>
+  <w:style w:type="paragraph" w:styleId="Footer">
+    <w:name w:val="footer"/>
+    <w:basedOn w:val="Normal"/>
+    <w:link w:val="FooterChar"/>
+    <w:uiPriority w:val="99"/>
+    <w:unhideWhenUsed/>
+    <w:rsid w:val="00FD3203"/>
+    <w:pPr>
+      <w:tabs>
+        <w:tab w:val="center" w:pos="4513"/>
+        <w:tab w:val="right" w:pos="9026"/>
+      </w:tabs>
+      <w:spacing w:after="0" w:line="240" w:lineRule="auto"/>
+    </w:pPr>
+  </w:style>
+  <w:style w:type="character" w:customStyle="1" w:styleId="FooterChar">
+    <w:name w:val="Footer Char"/>
+    <w:basedOn w:val="DefaultParagraphFont"/>
+    <w:link w:val="Footer"/>
+    <w:uiPriority w:val="99"/>
+    <w:rsid w:val="00FD3203"/>
   </w:style>
 </w:styles>
 </file>
@@ -1783,4 +2571,16 @@
     </a:ext>
   </a:extLst>
 </a:theme>
+</file>
+
+<file path=customXml/item1.xml><?xml version="1.0" encoding="utf-8"?>
+<b:Sources xmlns:b="http://schemas.openxmlformats.org/officeDocument/2006/bibliography" xmlns="http://schemas.openxmlformats.org/officeDocument/2006/bibliography" SelectedStyle="\APASixthEditionOfficeOnline.xsl" StyleName="APA" Version="6"/>
+</file>
+
+<file path=customXml/itemProps1.xml><?xml version="1.0" encoding="utf-8"?>
+<ds:datastoreItem xmlns:ds="http://schemas.openxmlformats.org/officeDocument/2006/customXml" ds:itemID="{63DE5D2B-3F6D-45DB-954D-AC8DE19819AE}">
+  <ds:schemaRefs>
+    <ds:schemaRef ds:uri="http://schemas.openxmlformats.org/officeDocument/2006/bibliography"/>
+  </ds:schemaRefs>
+</ds:datastoreItem>
 </file>
</xml_diff>

<commit_message>
Updated priliminary intro, aes, ocr, ocr metrics, argument for tr-ocr
</commit_message>
<xml_diff>
--- a/preliminary report/Final Project - Preliminary Report.docx
+++ b/preliminary report/Final Project - Preliminary Report.docx
@@ -90,6 +90,15 @@
     </w:p>
     <w:sdt>
       <w:sdtPr>
+        <w:rPr>
+          <w:rFonts w:asciiTheme="minorHAnsi" w:eastAsiaTheme="minorHAnsi" w:hAnsiTheme="minorHAnsi" w:cstheme="minorBidi"/>
+          <w:color w:val="auto"/>
+          <w:kern w:val="2"/>
+          <w:sz w:val="24"/>
+          <w:szCs w:val="24"/>
+          <w:lang w:val="en-GB"/>
+          <w14:ligatures w14:val="standardContextual"/>
+        </w:rPr>
         <w:id w:val="8269102"/>
         <w:docPartObj>
           <w:docPartGallery w:val="Table of Contents"/>
@@ -98,16 +107,9 @@
       </w:sdtPr>
       <w:sdtEndPr>
         <w:rPr>
-          <w:rFonts w:asciiTheme="minorHAnsi" w:eastAsiaTheme="minorHAnsi" w:hAnsiTheme="minorHAnsi" w:cstheme="minorBidi"/>
           <w:b/>
           <w:bCs/>
           <w:noProof/>
-          <w:color w:val="auto"/>
-          <w:kern w:val="2"/>
-          <w:sz w:val="24"/>
-          <w:szCs w:val="24"/>
-          <w:lang w:val="en-GB"/>
-          <w14:ligatures w14:val="standardContextual"/>
         </w:rPr>
       </w:sdtEndPr>
       <w:sdtContent>
@@ -769,29 +771,47 @@
     </w:p>
     <w:p>
       <w:r>
-        <w:t>According to [10] Automated essay scoring refers to the process of grading student essays without human interference. An AES system takes as input an essay written for a given prompt (the topic) and then assigns a numeric score to the essay reflecting its quality, based on traits such as content, grammar and organization. [10] proposed a system that uses a neural approach which holistically scores an essay. A holistic score according to [6] is a single numeric value assigned to an essay after evaluation, reflecting its quality, without providing evidence of how the score was obtained. Neural approaches engineer features like sentence length and number of paragraphs and encode these in dense numerical feature vectors. This enables them to iteratively adjust weights to learn a model that can then generalise to score new essay. These models have performed better than their predecessors according to [5], in some cases achieving QWK scores of 0.72 [7] and above.</w:t>
+        <w:t>According to [10] Automated essay scoring refers to the process of grading student essays without human interference. An AES system takes as input an essay written for a given prompt (the topic) and then assigns a numeric score to the essay reflecting its quality, based on traits such as content, grammar and organization. [10] proposed a system that uses a neural approach which holistically scores an essay. A holistic score is a single numeric value assigned to an essay after evaluation, reflecting its quality, without providing evidence of how the score was obtained</w:t>
       </w:r>
       <w:r>
         <w:t xml:space="preserve"> </w:t>
       </w:r>
       <w:r>
+        <w:t>[6]</w:t>
+      </w:r>
+      <w:r>
+        <w:t>. Neural approaches engineer features like sentence length and number of paragraphs and encode these in dense numerical feature vectors. This enables them to iteratively adjust weights to learn a model that can then generalise to score new essay. These models have performed better than their predecessors according to [5], in some cases achieving QWK scores of 0.72 [7] and above.</w:t>
+      </w:r>
+      <w:r>
+        <w:t xml:space="preserve"> </w:t>
+      </w:r>
+      <w:r>
         <w:t xml:space="preserve"> [4] compared the performance of three neural approaches LSTM, Bi-LSTM and BERT a transformer model and concluded that the transformer model offered superior performance. [6] reviewed several pretrained models in AES and discovered that BERT outperformed all of them achieving a QWK of 0.83. QWK (Quadratic weighted Kappa) evaluates the degree of agreement among human and AI scorers, it is a metric between 0 and 1, representing no agreement beyond chance and perfect agreement [5].</w:t>
       </w:r>
     </w:p>
     <w:p>
       <w:r>
-        <w:t xml:space="preserve">Transformer models are non-sequential and work by using an attention mechanism that relates each token in the text to every other token thus eliminating the need to sequentially scan through a sentence to understand the context in which a token occurs.  As effective as stand-alone neural approaches are, they are usually criticized for their lack of readability and interpretability by humans. A dense vector can contain several numerical values relating to a feature or combination of features. These numbers have not positional significance to humans as compared to handcrafted features. [1] suggests not relying solely on transformer models and like [2], proposed a technique of combining transformers with more traditional approaches like those that employ handcrafted features. [5] </w:t>
+        <w:t>Transformer models are non-sequential</w:t>
+      </w:r>
+      <w:r>
+        <w:t xml:space="preserve"> (don’t’ analyse documents sentence-by-sentence)</w:t>
+      </w:r>
+      <w:r>
+        <w:t xml:space="preserve"> and work by using an attention mechanism that relates each token in the text to every other token thus eliminating the need to sequentially scan through a sentence to understand the context in which a token occurs.  As effective as stand-alone neural approaches are, they are usually criticized for their lack of readability and interpretability by humans. A dense vector can contain several numerical values relating to a feature or combination of features. These numbers have not positional significance to humans as compared to handcrafted features. [1] suggests not relying solely on transformer models and like [2], proposed a technique of combining transformers with more traditional approaches like those that employ handcrafted features. [5] </w:t>
       </w:r>
       <w:r>
         <w:t>argued that human evaluation remains important since expert markers can identify subtle linguistic and cognitive qualities that automated systems may overlook</w:t>
       </w:r>
       <w:r>
-        <w:t xml:space="preserve">.[2] indicated that when models work in combination the results are more promising. [7] used a hybrid model – LSTM and Word Embedding and achieved a QWK of 0.94. </w:t>
-      </w:r>
-    </w:p>
-    <w:p>
+        <w:t xml:space="preserve">.[2] indicated that when models work in combination the results are more </w:t>
+      </w:r>
       <w:r>
         <w:lastRenderedPageBreak/>
+        <w:t xml:space="preserve">promising. [7] used a hybrid model – LSTM and Word Embedding and achieved a QWK of 0.94. </w:t>
+      </w:r>
+    </w:p>
+    <w:p>
+      <w:r>
         <w:t xml:space="preserve">Therefore, this research proposes a hybrid </w:t>
       </w:r>
       <w:r>
@@ -831,52 +851,68 @@
         <w:t xml:space="preserve">. </w:t>
       </w:r>
     </w:p>
-    <w:p/>
-    <w:p>
-      <w:r>
+    <w:p>
+      <w:r>
+        <w:t xml:space="preserve">The proposed system will achieve accessibility by </w:t>
+      </w:r>
+      <w:r>
+        <w:t>utilizing pretrained</w:t>
+      </w:r>
+      <w:r>
+        <w:t xml:space="preserve"> OCR </w:t>
+      </w:r>
+      <w:r>
+        <w:t xml:space="preserve">and a speech-to-text (STT) models </w:t>
+      </w:r>
+      <w:r>
+        <w:t xml:space="preserve">to allow </w:t>
+      </w:r>
+      <w:r>
+        <w:t xml:space="preserve">audio-transcribed, typed and scanned images of handwritten essays to be uploaded for evaluation. </w:t>
+      </w:r>
+    </w:p>
+    <w:p>
+      <w:pPr>
+        <w:ind w:right="971"/>
+      </w:pPr>
+      <w:r>
+        <w:t xml:space="preserve">Output from the speech-to-text and image-to-text models will be transformed into machine-readable text and fed as input to the transformer model for contextual and semantic analysis and final holistic scoring. This proposed </w:t>
+      </w:r>
+      <w:r>
+        <w:t>three</w:t>
+      </w:r>
+      <w:r>
+        <w:t xml:space="preserve">-model architecture, aims to investigate whether a hybrid multi-modal system can improve the accessibility, </w:t>
+      </w:r>
+      <w:r>
+        <w:t xml:space="preserve">interpretability, readability </w:t>
+      </w:r>
+      <w:r>
+        <w:t xml:space="preserve">and reliability of AES systems. </w:t>
+      </w:r>
+    </w:p>
+    <w:p>
+      <w:pPr>
+        <w:pStyle w:val="Heading3"/>
+      </w:pPr>
+      <w:bookmarkStart w:id="2" w:name="_Toc232583042"/>
+    </w:p>
+    <w:p>
+      <w:pPr>
+        <w:pStyle w:val="Heading3"/>
+      </w:pPr>
+      <w:r>
+        <w:t>Optical Character Recognition (OCR)</w:t>
+      </w:r>
+      <w:bookmarkEnd w:id="2"/>
+    </w:p>
+    <w:p>
+      <w:pPr>
         <w:rPr>
-          <w:highlight w:val="yellow"/>
+          <w:b/>
+          <w:bCs/>
         </w:rPr>
-        <w:t xml:space="preserve">For the section on </w:t>
-      </w:r>
-      <w:proofErr w:type="spellStart"/>
-      <w:r>
-        <w:rPr>
-          <w:highlight w:val="yellow"/>
-        </w:rPr>
-        <w:t>ocr</w:t>
-      </w:r>
-      <w:proofErr w:type="spellEnd"/>
-      <w:r>
-        <w:rPr>
-          <w:highlight w:val="yellow"/>
-        </w:rPr>
-        <w:t xml:space="preserve"> and </w:t>
-      </w:r>
-      <w:proofErr w:type="spellStart"/>
-      <w:r>
-        <w:rPr>
-          <w:highlight w:val="yellow"/>
-        </w:rPr>
-        <w:t>stt</w:t>
-      </w:r>
-      <w:proofErr w:type="spellEnd"/>
-      <w:r>
-        <w:rPr>
-          <w:highlight w:val="yellow"/>
-        </w:rPr>
-        <w:t>, define what they are, pick the best model, justify selection, speak about features and limitations, if possible get material showing how they performed against other similar models, this will lead to pipeline, avoid elaborate deep discussion of how they work</w:t>
-      </w:r>
-    </w:p>
-    <w:p>
-      <w:pPr>
-        <w:pStyle w:val="Heading3"/>
-      </w:pPr>
-      <w:bookmarkStart w:id="2" w:name="_Toc232583042"/>
-      <w:r>
-        <w:t>Optical Character Recognition (OCR)</w:t>
-      </w:r>
-      <w:bookmarkEnd w:id="2"/>
+      </w:pPr>
     </w:p>
     <w:p>
       <w:pPr>
@@ -895,148 +931,376 @@
     </w:p>
     <w:p>
       <w:r>
-        <w:t xml:space="preserve">Optical character recognition according to [11] is as procedure that detects and recognizes the printed and </w:t>
-      </w:r>
-      <w:r>
-        <w:t>handwritten</w:t>
-      </w:r>
-      <w:r>
-        <w:t xml:space="preserve"> text from an image and coverts it to editable test. </w:t>
-      </w:r>
-      <w:r>
-        <w:t xml:space="preserve">[12] Traditionally, an OCR system includes two main modules: a text detection module and a text recognition module. Text detection localizes all text blocks at word-level or </w:t>
+        <w:t xml:space="preserve">Jain et. al. </w:t>
+      </w:r>
+      <w:r>
+        <w:t>[15]</w:t>
+      </w:r>
+      <w:r>
+        <w:t xml:space="preserve"> </w:t>
+      </w:r>
+      <w:r>
+        <w:t>defines</w:t>
+      </w:r>
+      <w:r>
+        <w:t xml:space="preserve"> OCR as a computational technology that extracts text in an editable format from PDF files, scanned or hand-written documents, images etc</w:t>
+      </w:r>
+      <w:r>
+        <w:t xml:space="preserve">. </w:t>
+      </w:r>
+      <w:r>
+        <w:t xml:space="preserve">Li et al. </w:t>
+      </w:r>
+      <w:r>
+        <w:t>[12]</w:t>
+      </w:r>
+      <w:r>
+        <w:t xml:space="preserve"> describe traditional OCR systems as comprising two modules</w:t>
+      </w:r>
+      <w:r>
+        <w:t>: a text detection module and a text recognition module. Text detection localizes all text blocks at word-level or text</w:t>
+      </w:r>
+      <w:r>
+        <w:t>-</w:t>
+      </w:r>
+      <w:r>
+        <w:t>line</w:t>
+      </w:r>
+      <w:r>
+        <w:t xml:space="preserve"> </w:t>
+      </w:r>
+      <w:r>
+        <w:t xml:space="preserve">level while text recognition aims to understand the text image content and transcribe the visual signals </w:t>
+      </w:r>
+      <w:r>
+        <w:t>into</w:t>
+      </w:r>
+      <w:r>
+        <w:t xml:space="preserve"> natural language tokens.</w:t>
+      </w:r>
+      <w:r>
+        <w:t xml:space="preserve"> Mostafa et al </w:t>
+      </w:r>
+      <w:r>
+        <w:t>[25]</w:t>
+      </w:r>
+      <w:r>
+        <w:t xml:space="preserve"> </w:t>
+      </w:r>
+      <w:r>
+        <w:t>summarized</w:t>
+      </w:r>
+      <w:r>
+        <w:t xml:space="preserve"> work done </w:t>
+      </w:r>
+      <w:r>
+        <w:t>using OCR</w:t>
+      </w:r>
+      <w:r>
+        <w:t xml:space="preserve"> </w:t>
+      </w:r>
+      <w:r>
+        <w:t>to digitize</w:t>
+      </w:r>
+      <w:r>
+        <w:t xml:space="preserve"> Bangla scripts</w:t>
+      </w:r>
+      <w:r>
+        <w:t xml:space="preserve"> - a diverse and complicated language in written form.</w:t>
+      </w:r>
+      <w:r>
+        <w:t xml:space="preserve"> </w:t>
+      </w:r>
+      <w:r>
+        <w:t xml:space="preserve">They concluded that </w:t>
+      </w:r>
+      <w:r>
+        <w:t xml:space="preserve">CNN architectures are the most accurate tried and tested method for that task. [25] also stated that using </w:t>
+      </w:r>
+      <w:r>
+        <w:t>an</w:t>
+      </w:r>
+      <w:r>
+        <w:t xml:space="preserve"> RNN layer like LSTM or GRU alongside the base</w:t>
+      </w:r>
+      <w:r>
+        <w:t xml:space="preserve"> </w:t>
+      </w:r>
+      <w:r>
+        <w:t>CNN-based architecture</w:t>
+      </w:r>
+      <w:r>
+        <w:t xml:space="preserve"> can further improve the accuracy</w:t>
+      </w:r>
+      <w:r>
+        <w:t xml:space="preserve"> of the CNN</w:t>
+      </w:r>
+      <w:r>
+        <w:t>.</w:t>
+      </w:r>
+      <w:r>
+        <w:t xml:space="preserve"> </w:t>
+      </w:r>
+      <w:r>
+        <w:t xml:space="preserve">They stated that </w:t>
+      </w:r>
+      <w:r>
+        <w:t xml:space="preserve">the </w:t>
+      </w:r>
+      <w:r>
+        <w:t>transformer models showed</w:t>
+      </w:r>
+      <w:r>
+        <w:t xml:space="preserve"> promise</w:t>
+      </w:r>
+      <w:r>
+        <w:t xml:space="preserve"> but </w:t>
+      </w:r>
+      <w:r>
+        <w:t>also acknowledged</w:t>
+      </w:r>
+      <w:r>
+        <w:t xml:space="preserve"> that there is no empirical evidence</w:t>
+      </w:r>
+      <w:r>
+        <w:t xml:space="preserve"> of Bangla scripts being extracted with them. </w:t>
+      </w:r>
+      <w:r>
+        <w:t xml:space="preserve"> </w:t>
+      </w:r>
+      <w:r>
+        <w:t>[12]</w:t>
+      </w:r>
+      <w:r>
+        <w:t xml:space="preserve"> achieved </w:t>
+      </w:r>
+      <w:r>
+        <w:t>state-of-the-art results on printed, handwritten and scene te</w:t>
+      </w:r>
+      <w:r>
+        <w:t xml:space="preserve">xt </w:t>
+      </w:r>
+      <w:r>
+        <w:t>image datasets without any complex pre/post-processing steps</w:t>
+      </w:r>
+      <w:r>
+        <w:t xml:space="preserve"> </w:t>
+      </w:r>
+      <w:r>
+        <w:t>with Tr-OCR, an end-to-end Transformer-based mode</w:t>
+      </w:r>
+      <w:r>
+        <w:t>l</w:t>
+      </w:r>
+      <w:r>
+        <w:t xml:space="preserve">. </w:t>
+      </w:r>
+      <w:r>
+        <w:t>The model</w:t>
+      </w:r>
+      <w:r>
+        <w:t xml:space="preserve"> </w:t>
+      </w:r>
+      <w:r>
+        <w:t>achieved world-level precision, recall and f1 scores of 96.59, 96.57 and 96.58 respectively on the</w:t>
+      </w:r>
+      <w:r>
+        <w:t xml:space="preserve"> SROIE</w:t>
+      </w:r>
+      <w:r>
+        <w:t xml:space="preserve"> (Scanned Receipts OCR and </w:t>
+      </w:r>
+      <w:r>
+        <w:lastRenderedPageBreak/>
+        <w:t>Image formation Extraction) dataset</w:t>
+      </w:r>
+      <w:r>
+        <w:t xml:space="preserve"> and</w:t>
+      </w:r>
+      <w:r>
+        <w:t xml:space="preserve"> achieved a state-of-the art CER</w:t>
+      </w:r>
+      <w:r>
+        <w:t xml:space="preserve"> (Character Error Rate)</w:t>
+      </w:r>
+      <w:r>
+        <w:t xml:space="preserve"> of 2.89</w:t>
+      </w:r>
+      <w:r>
+        <w:t xml:space="preserve"> on the IAM Handwriting Dataset</w:t>
+      </w:r>
+      <w:r>
+        <w:t xml:space="preserve">. </w:t>
+      </w:r>
+      <w:r>
+        <w:t xml:space="preserve">A study carried out by [14] found that a Tr-OCR provides the best overall solution for reliable, high-accuracy container ISO code recognition with a recognition accuracy of 92% outperforming a </w:t>
       </w:r>
       <w:proofErr w:type="spellStart"/>
       <w:r>
-        <w:t>textline</w:t>
+        <w:t>PaddleOCR</w:t>
       </w:r>
       <w:proofErr w:type="spellEnd"/>
       <w:r>
-        <w:t>-level while text recognition aims to understand the text image content and transcribe the visual signals in to natural language tokens.</w:t>
-      </w:r>
-    </w:p>
-    <w:p>
-      <w:r>
-        <w:t>What is the performance of current OCR models?</w:t>
-      </w:r>
-    </w:p>
-    <w:p>
-      <w:r>
-        <w:t>What metrics do OCR models use?</w:t>
-      </w:r>
-    </w:p>
-    <w:p>
-      <w:r>
-        <w:t>What are the limitations of OCR models?</w:t>
-      </w:r>
-    </w:p>
-    <w:p>
-      <w:r>
-        <w:t>Free models, Get literature comparing model performance</w:t>
-      </w:r>
-    </w:p>
-    <w:p>
+        <w:t xml:space="preserve"> a hybrid CNN-Transformer model.</w:t>
+      </w:r>
+      <w:r>
+        <w:t xml:space="preserve"> </w:t>
+      </w:r>
+      <w:r>
+        <w:t>[31</w:t>
+      </w:r>
+      <w:r>
+        <w:t>] Tr</w:t>
+      </w:r>
+      <w:r>
+        <w:t>-OCR also outperformed Tesseract</w:t>
+      </w:r>
+      <w:r>
+        <w:t>, a model using three types of LSTM-based models [32</w:t>
+      </w:r>
+      <w:r>
+        <w:t>] and</w:t>
+      </w:r>
+      <w:r>
+        <w:t xml:space="preserve"> Easy-OCR in recognizing </w:t>
+      </w:r>
+      <w:r>
+        <w:t xml:space="preserve">crossed-out </w:t>
+      </w:r>
+      <w:proofErr w:type="gramStart"/>
+      <w:r>
+        <w:t>text .</w:t>
+      </w:r>
+      <w:proofErr w:type="gramEnd"/>
+    </w:p>
+    <w:p>
+      <w:pPr>
+        <w:rPr>
+          <w:b/>
+          <w:bCs/>
+        </w:rPr>
+      </w:pPr>
+      <w:r>
+        <w:rPr>
+          <w:b/>
+          <w:bCs/>
+        </w:rPr>
+        <w:t xml:space="preserve">What </w:t>
+      </w:r>
+      <w:r>
+        <w:rPr>
+          <w:b/>
+          <w:bCs/>
+        </w:rPr>
+        <w:t>do these metrics mean</w:t>
+      </w:r>
+      <w:r>
+        <w:rPr>
+          <w:b/>
+          <w:bCs/>
+        </w:rPr>
+        <w:t>?</w:t>
+      </w:r>
+    </w:p>
+    <w:p>
+      <w:r>
+        <w:t>A</w:t>
+      </w:r>
+      <w:r>
+        <w:t>ccuracy rate is a measure of the number of correct classifications over the entire test set, indicating the strength of the classifier [27]. [ 28] Precision is the fraction of correctly predicted, positive results</w:t>
+      </w:r>
+      <w:r>
+        <w:t xml:space="preserve"> out of the sum of all positive predictions (true positives + false positives)</w:t>
+      </w:r>
+      <w:r>
+        <w:t xml:space="preserve">. This number is useful in situations where the false-positives outnumber the false-negatives. A high-precision value suggests that the model makes accurate positive predictions. </w:t>
+      </w:r>
+      <w:r>
+        <w:t xml:space="preserve">Recall on the other hand [30] indicates how well the classifier labels as positive, cases that are positive, showing the ability to correctly identify cases that are positive. This measure is also described as sensitivity.[28] the F1-Score is a measure of the test’s accuracy and is calculated from </w:t>
+      </w:r>
+      <w:r>
+        <w:t>the precision</w:t>
+      </w:r>
+      <w:r>
+        <w:t xml:space="preserve"> and recall of the test. </w:t>
+      </w:r>
+    </w:p>
+    <w:p>
+      <w:r>
+        <w:t>Compare them using WER (word error rate) or (</w:t>
+      </w:r>
+      <w:r>
+        <w:t>Character</w:t>
+      </w:r>
+      <w:r>
+        <w:t xml:space="preserve"> error rate)</w:t>
+      </w:r>
+    </w:p>
+    <w:p>
+      <w:pPr>
+        <w:pStyle w:val="Heading2"/>
+      </w:pPr>
+    </w:p>
+    <w:p>
+      <w:pPr>
+        <w:pStyle w:val="Heading3"/>
+      </w:pPr>
+      <w:bookmarkStart w:id="3" w:name="_Toc232583043"/>
+      <w:r>
+        <w:t>Speech-To-Text</w:t>
+      </w:r>
+      <w:r>
+        <w:t xml:space="preserve"> (STT)</w:t>
+      </w:r>
+      <w:bookmarkEnd w:id="3"/>
+    </w:p>
+    <w:p>
+      <w:r>
+        <w:t>What is a speech-to-text system?</w:t>
+      </w:r>
+    </w:p>
+    <w:p>
+      <w:r>
+        <w:t>What is the performance of current speech-to-text models?</w:t>
+      </w:r>
+    </w:p>
+    <w:p>
+      <w:r>
+        <w:t>What metrics do speech-to-text models use?</w:t>
+      </w:r>
+    </w:p>
+    <w:p>
+      <w:r>
+        <w:t>What are the limitations of speech-to-text models?</w:t>
+      </w:r>
+    </w:p>
+    <w:p>
+      <w:r>
+        <w:t xml:space="preserve">Why that speech-to-text-model? </w:t>
+      </w:r>
+      <w:r>
+        <w:t>Get literature comparing model performance</w:t>
+      </w:r>
+    </w:p>
+    <w:p>
+      <w:r>
+        <w:t>OpenAI whisper (</w:t>
+      </w:r>
       <w:proofErr w:type="spellStart"/>
       <w:r>
-        <w:t>TrOCR</w:t>
+        <w:t>academeic</w:t>
       </w:r>
       <w:proofErr w:type="spellEnd"/>
       <w:r>
-        <w:t xml:space="preserve">(best for raw accuracy), </w:t>
-      </w:r>
-      <w:proofErr w:type="spellStart"/>
-      <w:r>
-        <w:t>PaddleOCR</w:t>
-      </w:r>
-      <w:proofErr w:type="spellEnd"/>
-      <w:r>
-        <w:t xml:space="preserve">(best </w:t>
-      </w:r>
-      <w:proofErr w:type="spellStart"/>
-      <w:r>
-        <w:t>allin</w:t>
-      </w:r>
-      <w:proofErr w:type="spellEnd"/>
-      <w:r>
-        <w:t xml:space="preserve"> one engine), EasyOCR (easiest to code)</w:t>
-      </w:r>
-    </w:p>
-    <w:p>
-      <w:r>
-        <w:t xml:space="preserve">Why that OCR model? </w:t>
-      </w:r>
-    </w:p>
-    <w:p>
-      <w:r>
-        <w:t>Compare them using WER (word error rate) or (</w:t>
-      </w:r>
-      <w:proofErr w:type="spellStart"/>
-      <w:r>
-        <w:t>Chaaracter</w:t>
-      </w:r>
-      <w:proofErr w:type="spellEnd"/>
-      <w:r>
-        <w:t xml:space="preserve"> error rate)</w:t>
-      </w:r>
-    </w:p>
-    <w:p>
-      <w:pPr>
-        <w:pStyle w:val="Heading2"/>
-      </w:pPr>
-    </w:p>
-    <w:p>
-      <w:pPr>
-        <w:pStyle w:val="Heading3"/>
-      </w:pPr>
-      <w:bookmarkStart w:id="3" w:name="_Toc232583043"/>
-      <w:r>
-        <w:t>Speech-To-Text</w:t>
-      </w:r>
-      <w:r>
-        <w:t xml:space="preserve"> (STT)</w:t>
-      </w:r>
-      <w:bookmarkEnd w:id="3"/>
-    </w:p>
-    <w:p>
-      <w:r>
-        <w:t>What is a speech-to-text system?</w:t>
-      </w:r>
-    </w:p>
-    <w:p>
-      <w:r>
-        <w:t>What is the performance of current speech-to-text models?</w:t>
-      </w:r>
-    </w:p>
-    <w:p>
-      <w:r>
-        <w:t>What metrics do speech-to-text models use?</w:t>
-      </w:r>
-    </w:p>
-    <w:p>
-      <w:r>
-        <w:lastRenderedPageBreak/>
-        <w:t>What are the limitations of speech-to-text models?</w:t>
-      </w:r>
-    </w:p>
-    <w:p>
-      <w:r>
-        <w:t xml:space="preserve">Why that speech-to-text-model? </w:t>
-      </w:r>
-      <w:r>
-        <w:t>Get literature comparing model performance</w:t>
-      </w:r>
-    </w:p>
-    <w:p>
-      <w:r>
-        <w:t>OpenAI whisper (</w:t>
-      </w:r>
-      <w:proofErr w:type="spellStart"/>
-      <w:r>
-        <w:t>academeic</w:t>
-      </w:r>
-      <w:proofErr w:type="spellEnd"/>
-      <w:r>
-        <w:t xml:space="preserve"> gold standard), NVIDIA Canary-Queen(best for raw English accuracy), Distil-Whisper – (Best for low-Resource hardware)</w:t>
+        <w:t xml:space="preserve"> gold standard), NVIDIA Canary-</w:t>
+      </w:r>
+      <w:proofErr w:type="gramStart"/>
+      <w:r>
+        <w:t>Queen(</w:t>
+      </w:r>
+      <w:proofErr w:type="gramEnd"/>
+      <w:r>
+        <w:t>best for raw English accuracy), Distil-Whisper – (Best for low-Resource hardware)</w:t>
       </w:r>
     </w:p>
     <w:p/>
@@ -1054,9 +1318,71 @@
     <w:p/>
     <w:p>
       <w:r>
+        <w:lastRenderedPageBreak/>
         <w:t>Evaluation plan</w:t>
       </w:r>
     </w:p>
+    <w:p>
+      <w:r>
+        <w:t>Does it upload essays in various formats?</w:t>
+      </w:r>
+    </w:p>
+    <w:p>
+      <w:r>
+        <w:t xml:space="preserve">Does </w:t>
+      </w:r>
+      <w:proofErr w:type="spellStart"/>
+      <w:r>
+        <w:t>ocr</w:t>
+      </w:r>
+      <w:proofErr w:type="spellEnd"/>
+      <w:r>
+        <w:t xml:space="preserve"> work? What is the output? What is the </w:t>
+      </w:r>
+      <w:proofErr w:type="spellStart"/>
+      <w:r>
+        <w:t>wer</w:t>
+      </w:r>
+      <w:proofErr w:type="spellEnd"/>
+      <w:r>
+        <w:t xml:space="preserve"> and </w:t>
+      </w:r>
+      <w:proofErr w:type="spellStart"/>
+      <w:r>
+        <w:t>cer</w:t>
+      </w:r>
+      <w:proofErr w:type="spellEnd"/>
+      <w:r>
+        <w:t>?</w:t>
+      </w:r>
+    </w:p>
+    <w:p>
+      <w:r>
+        <w:t xml:space="preserve">Does the </w:t>
+      </w:r>
+      <w:proofErr w:type="spellStart"/>
+      <w:r>
+        <w:t>stt</w:t>
+      </w:r>
+      <w:proofErr w:type="spellEnd"/>
+      <w:r>
+        <w:t xml:space="preserve"> work, what is the output, what is the error rate?</w:t>
+      </w:r>
+    </w:p>
+    <w:p>
+      <w:r>
+        <w:t xml:space="preserve">Does the </w:t>
+      </w:r>
+      <w:proofErr w:type="spellStart"/>
+      <w:r>
+        <w:t>aes</w:t>
+      </w:r>
+      <w:proofErr w:type="spellEnd"/>
+      <w:r>
+        <w:t xml:space="preserve"> work, does it output a holistic score, doe it output trait scores?</w:t>
+      </w:r>
+    </w:p>
+    <w:p/>
     <w:p>
       <w:r>
         <w:t>How to mitigate against OCR and STT input errors to AES</w:t>
@@ -1069,6 +1395,42 @@
       <w:r>
         <w:lastRenderedPageBreak/>
         <w:t xml:space="preserve">Design </w:t>
+      </w:r>
+    </w:p>
+    <w:p>
+      <w:r>
+        <w:t>Website front end</w:t>
+      </w:r>
+    </w:p>
+    <w:p>
+      <w:r>
+        <w:t xml:space="preserve">Logic – </w:t>
+      </w:r>
+      <w:proofErr w:type="spellStart"/>
+      <w:r>
+        <w:t>aes</w:t>
+      </w:r>
+      <w:proofErr w:type="spellEnd"/>
+      <w:r>
+        <w:t xml:space="preserve">, </w:t>
+      </w:r>
+      <w:proofErr w:type="spellStart"/>
+      <w:r>
+        <w:t>ocr</w:t>
+      </w:r>
+      <w:proofErr w:type="spellEnd"/>
+      <w:r>
+        <w:t xml:space="preserve">, </w:t>
+      </w:r>
+      <w:proofErr w:type="spellStart"/>
+      <w:r>
+        <w:t>stt</w:t>
+      </w:r>
+      <w:proofErr w:type="spellEnd"/>
+    </w:p>
+    <w:p>
+      <w:r>
+        <w:t>Back end – db (might not be necessary as the performance is all that matters)</w:t>
       </w:r>
     </w:p>
     <w:p>
@@ -1096,6 +1458,22 @@
           <w:szCs w:val="32"/>
         </w:rPr>
       </w:pPr>
+      <w:proofErr w:type="spellStart"/>
+      <w:r>
+        <w:t>Aes</w:t>
+      </w:r>
+      <w:proofErr w:type="spellEnd"/>
+      <w:r>
+        <w:t xml:space="preserve">, transformer model outputting score after </w:t>
+      </w:r>
+      <w:proofErr w:type="spellStart"/>
+      <w:r>
+        <w:t>ocr</w:t>
+      </w:r>
+      <w:proofErr w:type="spellEnd"/>
+      <w:r>
+        <w:t xml:space="preserve"> inputs essay</w:t>
+      </w:r>
       <w:r>
         <w:br w:type="page"/>
       </w:r>
@@ -1113,7 +1491,7 @@
     </w:p>
     <w:p/>
     <w:sectPr>
-      <w:footerReference w:type="default" r:id="rId7"/>
+      <w:footerReference w:type="default" r:id="rId8"/>
       <w:pgSz w:w="11906" w:h="16838"/>
       <w:pgMar w:top="1440" w:right="1440" w:bottom="1440" w:left="1440" w:header="708" w:footer="708" w:gutter="0"/>
       <w:cols w:space="708"/>
@@ -1239,6 +1617,100 @@
     </w:p>
   </w:footnote>
 </w:footnotes>
+</file>
+
+<file path=word/numbering.xml><?xml version="1.0" encoding="utf-8"?>
+<w:numbering xmlns:wpc="http://schemas.microsoft.com/office/word/2010/wordprocessingCanvas" xmlns:cx="http://schemas.microsoft.com/office/drawing/2014/chartex" xmlns:cx1="http://schemas.microsoft.com/office/drawing/2015/9/8/chartex" xmlns:cx2="http://schemas.microsoft.com/office/drawing/2015/10/21/chartex" xmlns:cx3="http://schemas.microsoft.com/office/drawing/2016/5/9/chartex" xmlns:cx4="http://schemas.microsoft.com/office/drawing/2016/5/10/chartex" xmlns:cx5="http://schemas.microsoft.com/office/drawing/2016/5/11/chartex" xmlns:cx6="http://schemas.microsoft.com/office/drawing/2016/5/12/chartex" xmlns:cx7="http://schemas.microsoft.com/office/drawing/2016/5/13/chartex" xmlns:cx8="http://schemas.microsoft.com/office/drawing/2016/5/14/chartex" xmlns:mc="http://schemas.openxmlformats.org/markup-compatibility/2006" xmlns:aink="http://schemas.microsoft.com/office/drawing/2016/ink" xmlns:am3d="http://schemas.microsoft.com/office/drawing/2017/model3d" xmlns:o="urn:schemas-microsoft-com:office:office" xmlns:oel="http://schemas.microsoft.com/office/2019/extlst" xmlns:r="http://schemas.openxmlformats.org/officeDocument/2006/relationships" xmlns:m="http://schemas.openxmlformats.org/officeDocument/2006/math" xmlns:v="urn:schemas-microsoft-com:vml" xmlns:wp14="http://schemas.microsoft.com/office/word/2010/wordprocessingDrawing" xmlns:wp="http://schemas.openxmlformats.org/drawingml/2006/wordprocessingDrawing" xmlns:w10="urn:schemas-microsoft-com:office:word" xmlns:w="http://schemas.openxmlformats.org/wordprocessingml/2006/main" xmlns:w14="http://schemas.microsoft.com/office/word/2010/wordml" xmlns:w15="http://schemas.microsoft.com/office/word/2012/wordml" xmlns:w16cex="http://schemas.microsoft.com/office/word/2018/wordml/cex" xmlns:w16cid="http://schemas.microsoft.com/office/word/2016/wordml/cid" xmlns:w16="http://schemas.microsoft.com/office/word/2018/wordml" xmlns:w16du="http://schemas.microsoft.com/office/word/2023/wordml/word16du" xmlns:w16sdtdh="http://schemas.microsoft.com/office/word/2020/wordml/sdtdatahash" xmlns:w16sdtfl="http://schemas.microsoft.com/office/word/2024/wordml/sdtformatlock" xmlns:w16se="http://schemas.microsoft.com/office/word/2015/wordml/symex" xmlns:wpg="http://schemas.microsoft.com/office/word/2010/wordprocessingGroup" xmlns:wpi="http://schemas.microsoft.com/office/word/2010/wordprocessingInk" xmlns:wne="http://schemas.microsoft.com/office/word/2006/wordml" xmlns:wps="http://schemas.microsoft.com/office/word/2010/wordprocessingShape" mc:Ignorable="w14 w15 w16se w16cid w16 w16cex w16sdtdh w16sdtfl w16du wp14">
+  <w:abstractNum w:abstractNumId="0" w15:restartNumberingAfterBreak="0">
+    <w:nsid w:val="1B584821"/>
+    <w:multiLevelType w:val="hybridMultilevel"/>
+    <w:tmpl w:val="D3B676AC"/>
+    <w:lvl w:ilvl="0" w:tplc="0809000F">
+      <w:start w:val="1"/>
+      <w:numFmt w:val="decimal"/>
+      <w:lvlText w:val="%1."/>
+      <w:lvlJc w:val="left"/>
+      <w:pPr>
+        <w:ind w:left="780" w:hanging="360"/>
+      </w:pPr>
+    </w:lvl>
+    <w:lvl w:ilvl="1" w:tplc="08090019" w:tentative="1">
+      <w:start w:val="1"/>
+      <w:numFmt w:val="lowerLetter"/>
+      <w:lvlText w:val="%2."/>
+      <w:lvlJc w:val="left"/>
+      <w:pPr>
+        <w:ind w:left="1500" w:hanging="360"/>
+      </w:pPr>
+    </w:lvl>
+    <w:lvl w:ilvl="2" w:tplc="0809001B" w:tentative="1">
+      <w:start w:val="1"/>
+      <w:numFmt w:val="lowerRoman"/>
+      <w:lvlText w:val="%3."/>
+      <w:lvlJc w:val="right"/>
+      <w:pPr>
+        <w:ind w:left="2220" w:hanging="180"/>
+      </w:pPr>
+    </w:lvl>
+    <w:lvl w:ilvl="3" w:tplc="0809000F" w:tentative="1">
+      <w:start w:val="1"/>
+      <w:numFmt w:val="decimal"/>
+      <w:lvlText w:val="%4."/>
+      <w:lvlJc w:val="left"/>
+      <w:pPr>
+        <w:ind w:left="2940" w:hanging="360"/>
+      </w:pPr>
+    </w:lvl>
+    <w:lvl w:ilvl="4" w:tplc="08090019" w:tentative="1">
+      <w:start w:val="1"/>
+      <w:numFmt w:val="lowerLetter"/>
+      <w:lvlText w:val="%5."/>
+      <w:lvlJc w:val="left"/>
+      <w:pPr>
+        <w:ind w:left="3660" w:hanging="360"/>
+      </w:pPr>
+    </w:lvl>
+    <w:lvl w:ilvl="5" w:tplc="0809001B" w:tentative="1">
+      <w:start w:val="1"/>
+      <w:numFmt w:val="lowerRoman"/>
+      <w:lvlText w:val="%6."/>
+      <w:lvlJc w:val="right"/>
+      <w:pPr>
+        <w:ind w:left="4380" w:hanging="180"/>
+      </w:pPr>
+    </w:lvl>
+    <w:lvl w:ilvl="6" w:tplc="0809000F" w:tentative="1">
+      <w:start w:val="1"/>
+      <w:numFmt w:val="decimal"/>
+      <w:lvlText w:val="%7."/>
+      <w:lvlJc w:val="left"/>
+      <w:pPr>
+        <w:ind w:left="5100" w:hanging="360"/>
+      </w:pPr>
+    </w:lvl>
+    <w:lvl w:ilvl="7" w:tplc="08090019" w:tentative="1">
+      <w:start w:val="1"/>
+      <w:numFmt w:val="lowerLetter"/>
+      <w:lvlText w:val="%8."/>
+      <w:lvlJc w:val="left"/>
+      <w:pPr>
+        <w:ind w:left="5820" w:hanging="360"/>
+      </w:pPr>
+    </w:lvl>
+    <w:lvl w:ilvl="8" w:tplc="0809001B" w:tentative="1">
+      <w:start w:val="1"/>
+      <w:numFmt w:val="lowerRoman"/>
+      <w:lvlText w:val="%9."/>
+      <w:lvlJc w:val="right"/>
+      <w:pPr>
+        <w:ind w:left="6540" w:hanging="180"/>
+      </w:pPr>
+    </w:lvl>
+  </w:abstractNum>
+  <w:num w:numId="1" w16cid:durableId="408817448">
+    <w:abstractNumId w:val="0"/>
+  </w:num>
+</w:numbering>
 </file>
 
 <file path=word/styles.xml><?xml version="1.0" encoding="utf-8"?>
@@ -1842,7 +2314,6 @@
   <w:style w:type="character" w:default="1" w:styleId="DefaultParagraphFont">
     <w:name w:val="Default Paragraph Font"/>
     <w:uiPriority w:val="1"/>
-    <w:semiHidden/>
     <w:unhideWhenUsed/>
   </w:style>
   <w:style w:type="table" w:default="1" w:styleId="TableNormal">

</xml_diff>

<commit_message>
Updated reference order in preliminary report
</commit_message>
<xml_diff>
--- a/preliminary report/Final Project - Preliminary Report.docx
+++ b/preliminary report/Final Project - Preliminary Report.docx
@@ -654,7 +654,19 @@
         <w:ind w:right="971"/>
       </w:pPr>
       <w:r>
-        <w:t xml:space="preserve">Automated Essay Scoring is one of the fastest growing and popular research areas in NLP with respect to education. According to [4] this is due to the rapid progress in Artificial Intelligence which has created new possibilities. Some of the benefits of AES are enhanced fairness, consistency and efficiency in the scoring process [3]. </w:t>
+        <w:t>Automated Essay Scoring is one of the fastest growing and popular research areas in NLP with respect to education. According to [</w:t>
+      </w:r>
+      <w:r>
+        <w:t>1</w:t>
+      </w:r>
+      <w:r>
+        <w:t>] this is due to the rapid progress in Artificial Intelligence which has created new possibilities. Some of the benefits of AES are enhanced fairness, consistency and efficiency in the scoring process [</w:t>
+      </w:r>
+      <w:r>
+        <w:t>2</w:t>
+      </w:r>
+      <w:r>
+        <w:t xml:space="preserve">]. </w:t>
       </w:r>
     </w:p>
     <w:p>
@@ -771,22 +783,49 @@
     </w:p>
     <w:p>
       <w:r>
-        <w:t>According to [10] Automated essay scoring refers to the process of grading student essays without human interference. An AES system takes as input an essay written for a given prompt (the topic) and then assigns a numeric score to the essay reflecting its quality, based on traits such as content, grammar and organization. [10] proposed a system that uses a neural approach which holistically scores an essay. A holistic score is a single numeric value assigned to an essay after evaluation, reflecting its quality, without providing evidence of how the score was obtained</w:t>
+        <w:t>According to [</w:t>
+      </w:r>
+      <w:r>
+        <w:t>3</w:t>
+      </w:r>
+      <w:r>
+        <w:t>] Automated essay scoring refers to the process of grading student essays without human interference. An AES system takes as input an essay written for a given prompt (the topic) and then assigns a numeric score to the essay reflecting its quality, based on traits such as content, grammar and organization. [</w:t>
+      </w:r>
+      <w:r>
+        <w:t>3</w:t>
+      </w:r>
+      <w:r>
+        <w:t>] proposed a system that uses a neural approach which holistically scores an essay. A holistic score is a single numeric value assigned to an essay after evaluation, reflecting its quality, without providing evidence of how the score was obtained</w:t>
+      </w:r>
+      <w:r>
+        <w:t xml:space="preserve"> [</w:t>
+      </w:r>
+      <w:r>
+        <w:t>4</w:t>
+      </w:r>
+      <w:r>
+        <w:t>]</w:t>
+      </w:r>
+      <w:r>
+        <w:t>. Neural approaches engineer features like sentence length and number of paragraphs and encode these in dense numerical feature vectors. This enables them to iteratively adjust weights to learn a model that can then generalise to score new essay. These models have performed better than their predecessors according to [5], in some cases achieving QWK scores of 0.72 [7] and above.</w:t>
       </w:r>
       <w:r>
         <w:t xml:space="preserve"> </w:t>
       </w:r>
       <w:r>
-        <w:t>[6]</w:t>
-      </w:r>
-      <w:r>
-        <w:t>. Neural approaches engineer features like sentence length and number of paragraphs and encode these in dense numerical feature vectors. This enables them to iteratively adjust weights to learn a model that can then generalise to score new essay. These models have performed better than their predecessors according to [5], in some cases achieving QWK scores of 0.72 [7] and above.</w:t>
-      </w:r>
-      <w:r>
-        <w:t xml:space="preserve"> </w:t>
-      </w:r>
-      <w:r>
-        <w:t xml:space="preserve"> [4] compared the performance of three neural approaches LSTM, Bi-LSTM and BERT a transformer model and concluded that the transformer model offered superior performance. [6] reviewed several pretrained models in AES and discovered that BERT outperformed all of them achieving a QWK of 0.83. QWK (Quadratic weighted Kappa) evaluates the degree of agreement among human and AI scorers, it is a metric between 0 and 1, representing no agreement beyond chance and perfect agreement [5].</w:t>
+        <w:t xml:space="preserve"> [</w:t>
+      </w:r>
+      <w:r>
+        <w:t>1</w:t>
+      </w:r>
+      <w:r>
+        <w:t>] compared the performance of three neural approaches LSTM, Bi-LSTM and BERT a transformer model and concluded that the transformer model offered superior performance. [</w:t>
+      </w:r>
+      <w:r>
+        <w:t>4</w:t>
+      </w:r>
+      <w:r>
+        <w:t>] reviewed several pretrained models in AES and discovered that BERT outperformed all of them achieving a QWK of 0.83. QWK (Quadratic weighted Kappa) evaluates the degree of agreement among human and AI scorers, it is a metric between 0 and 1, representing no agreement beyond chance and perfect agreement [5].</w:t>
       </w:r>
     </w:p>
     <w:p>
@@ -797,21 +836,45 @@
         <w:t xml:space="preserve"> (don’t’ analyse documents sentence-by-sentence)</w:t>
       </w:r>
       <w:r>
-        <w:t xml:space="preserve"> and work by using an attention mechanism that relates each token in the text to every other token thus eliminating the need to sequentially scan through a sentence to understand the context in which a token occurs.  As effective as stand-alone neural approaches are, they are usually criticized for their lack of readability and interpretability by humans. A dense vector can contain several numerical values relating to a feature or combination of features. These numbers have not positional significance to humans as compared to handcrafted features. [1] suggests not relying solely on transformer models and like [2], proposed a technique of combining transformers with more traditional approaches like those that employ handcrafted features. [5] </w:t>
-      </w:r>
-      <w:r>
-        <w:t>argued that human evaluation remains important since expert markers can identify subtle linguistic and cognitive qualities that automated systems may overlook</w:t>
-      </w:r>
-      <w:r>
-        <w:t xml:space="preserve">.[2] indicated that when models work in combination the results are more </w:t>
-      </w:r>
+        <w:t xml:space="preserve"> and work by using an attention mechanism that relates each token in the text to every other token thus eliminating the need to sequentially scan through a sentence to understand the context in which a token occurs.  As effective as stand-alone neural approaches are, they are usually criticized for their lack of readability and interpretability by humans. A dense vector can contain several numerical values relating to a feature or combination of features. These numbers have not positional significance to humans as compared to handcrafted features. [</w:t>
+      </w:r>
+      <w:r>
+        <w:t>6</w:t>
+      </w:r>
+      <w:r>
+        <w:t>] suggests not relying solely on transformer models and like [</w:t>
+      </w:r>
+      <w:r>
+        <w:t>7</w:t>
+      </w:r>
+      <w:r>
+        <w:t xml:space="preserve">], proposed a technique of combining transformers with more traditional approaches like those that employ handcrafted features. [5] </w:t>
+      </w:r>
+      <w:r>
+        <w:t xml:space="preserve">argued that human evaluation remains important since expert markers can identify subtle linguistic and cognitive qualities that automated systems may </w:t>
+      </w:r>
+      <w:r>
+        <w:t>overlook</w:t>
+      </w:r>
+      <w:r>
+        <w:t>. [</w:t>
+      </w:r>
+      <w:r>
+        <w:t>7</w:t>
+      </w:r>
+      <w:r>
+        <w:t>] indicated that when models work in combination the results are more promising. [</w:t>
+      </w:r>
+      <w:r>
+        <w:t>8</w:t>
+      </w:r>
+      <w:r>
+        <w:t xml:space="preserve">] used a hybrid model – LSTM and Word Embedding and achieved a QWK of 0.94. </w:t>
+      </w:r>
+    </w:p>
+    <w:p>
       <w:r>
         <w:lastRenderedPageBreak/>
-        <w:t xml:space="preserve">promising. [7] used a hybrid model – LSTM and Word Embedding and achieved a QWK of 0.94. </w:t>
-      </w:r>
-    </w:p>
-    <w:p>
-      <w:r>
         <w:t xml:space="preserve">Therefore, this research proposes a hybrid </w:t>
       </w:r>
       <w:r>
@@ -842,7 +905,25 @@
         <w:t xml:space="preserve">. This approach is </w:t>
       </w:r>
       <w:r>
-        <w:t xml:space="preserve">supported by the conclusion reached by [1], [2] and [7] after evaluating the performance of stand-alone models in comparison to </w:t>
+        <w:t>supported by the conclusion reached by [</w:t>
+      </w:r>
+      <w:r>
+        <w:t>6</w:t>
+      </w:r>
+      <w:r>
+        <w:t>], [</w:t>
+      </w:r>
+      <w:r>
+        <w:t>7</w:t>
+      </w:r>
+      <w:r>
+        <w:t>] and [</w:t>
+      </w:r>
+      <w:r>
+        <w:t>8</w:t>
+      </w:r>
+      <w:r>
+        <w:t xml:space="preserve">] after evaluating the performance of stand-alone models in comparison to </w:t>
       </w:r>
       <w:r>
         <w:t>hybrid ones</w:t>
@@ -876,19 +957,7 @@
         <w:ind w:right="971"/>
       </w:pPr>
       <w:r>
-        <w:t xml:space="preserve">Output from the speech-to-text and image-to-text models will be transformed into machine-readable text and fed as input to the transformer model for contextual and semantic analysis and final holistic scoring. This proposed </w:t>
-      </w:r>
-      <w:r>
-        <w:t>three</w:t>
-      </w:r>
-      <w:r>
-        <w:t xml:space="preserve">-model architecture, aims to investigate whether a hybrid multi-modal system can improve the accessibility, </w:t>
-      </w:r>
-      <w:r>
-        <w:t xml:space="preserve">interpretability, readability </w:t>
-      </w:r>
-      <w:r>
-        <w:t xml:space="preserve">and reliability of AES systems. </w:t>
+        <w:t xml:space="preserve">Output from the speech-to-text and image-to-text models will be transformed into machine-readable text and fed as input to the transformer model for contextual and semantic analysis and final holistic scoring. This proposed three-model architecture, aims to investigate whether a hybrid multi-modal system can improve the accessibility, interpretability, readability and reliability of AES systems. </w:t>
       </w:r>
     </w:p>
     <w:p>
@@ -934,7 +1003,13 @@
         <w:t xml:space="preserve">Jain et. al. </w:t>
       </w:r>
       <w:r>
-        <w:t>[15]</w:t>
+        <w:t>[</w:t>
+      </w:r>
+      <w:r>
+        <w:t>9</w:t>
+      </w:r>
+      <w:r>
+        <w:t>]</w:t>
       </w:r>
       <w:r>
         <w:t xml:space="preserve"> </w:t>
@@ -952,7 +1027,13 @@
         <w:t xml:space="preserve">Li et al. </w:t>
       </w:r>
       <w:r>
-        <w:t>[12]</w:t>
+        <w:t>[1</w:t>
+      </w:r>
+      <w:r>
+        <w:t>0</w:t>
+      </w:r>
+      <w:r>
+        <w:t>]</w:t>
       </w:r>
       <w:r>
         <w:t xml:space="preserve"> describe traditional OCR systems as comprising two modules</w:t>
@@ -982,7 +1063,13 @@
         <w:t xml:space="preserve"> Mostafa et al </w:t>
       </w:r>
       <w:r>
-        <w:t>[25]</w:t>
+        <w:t>[</w:t>
+      </w:r>
+      <w:r>
+        <w:t>11</w:t>
+      </w:r>
+      <w:r>
+        <w:t>]</w:t>
       </w:r>
       <w:r>
         <w:t xml:space="preserve"> </w:t>
@@ -1015,13 +1102,16 @@
         <w:t xml:space="preserve">They concluded that </w:t>
       </w:r>
       <w:r>
-        <w:t xml:space="preserve">CNN architectures are the most accurate tried and tested method for that task. [25] also stated that using </w:t>
-      </w:r>
-      <w:r>
-        <w:t>an</w:t>
-      </w:r>
-      <w:r>
-        <w:t xml:space="preserve"> RNN layer like LSTM or GRU alongside the base</w:t>
+        <w:t>CNN architectures are the most accurate tried and tested method for that task. [</w:t>
+      </w:r>
+      <w:r>
+        <w:t>11</w:t>
+      </w:r>
+      <w:r>
+        <w:t xml:space="preserve">] also stated that using </w:t>
+      </w:r>
+      <w:r>
+        <w:t>an RNN layer like LSTM or GRU alongside the base</w:t>
       </w:r>
       <w:r>
         <w:t xml:space="preserve"> </w:t>
@@ -1069,7 +1159,13 @@
         <w:t xml:space="preserve"> </w:t>
       </w:r>
       <w:r>
-        <w:t>[12]</w:t>
+        <w:t>[1</w:t>
+      </w:r>
+      <w:r>
+        <w:t>0</w:t>
+      </w:r>
+      <w:r>
+        <w:t>]</w:t>
       </w:r>
       <w:r>
         <w:t xml:space="preserve"> achieved </w:t>
@@ -1084,94 +1180,95 @@
         <w:t>image datasets without any complex pre/post-processing steps</w:t>
       </w:r>
       <w:r>
+        <w:t xml:space="preserve"> with Tr-OCR, an end-to-end Transformer-based model</w:t>
+      </w:r>
+      <w:r>
+        <w:t xml:space="preserve">. </w:t>
+      </w:r>
+      <w:r>
+        <w:t>The model</w:t>
+      </w:r>
+      <w:r>
         <w:t xml:space="preserve"> </w:t>
       </w:r>
       <w:r>
-        <w:t>with Tr-OCR, an end-to-end Transformer-based mode</w:t>
-      </w:r>
-      <w:r>
-        <w:t>l</w:t>
+        <w:t>achieved world-level precision, recall and f1 scores of 96.59, 96.57 and 96.58 respectively on the</w:t>
+      </w:r>
+      <w:r>
+        <w:t xml:space="preserve"> SROIE</w:t>
+      </w:r>
+      <w:r>
+        <w:t xml:space="preserve"> (Scanned Receipts OCR and Image formation Extraction) dataset</w:t>
+      </w:r>
+      <w:r>
+        <w:t xml:space="preserve"> and</w:t>
+      </w:r>
+      <w:r>
+        <w:t xml:space="preserve"> achieved a state-of-the art CER</w:t>
+      </w:r>
+      <w:r>
+        <w:t xml:space="preserve"> (Character Error Rate)</w:t>
+      </w:r>
+      <w:r>
+        <w:t xml:space="preserve"> of 2.89</w:t>
+      </w:r>
+      <w:r>
+        <w:t xml:space="preserve"> on the IAM Handwriting Dataset</w:t>
       </w:r>
       <w:r>
         <w:t xml:space="preserve">. </w:t>
       </w:r>
       <w:r>
-        <w:t>The model</w:t>
+        <w:t>A study carried out by [1</w:t>
+      </w:r>
+      <w:r>
+        <w:t>2</w:t>
+      </w:r>
+      <w:r>
+        <w:t xml:space="preserve">] found </w:t>
+      </w:r>
+      <w:r>
+        <w:lastRenderedPageBreak/>
+        <w:t xml:space="preserve">that a Tr-OCR provides the best overall solution for reliable, high-accuracy container ISO code recognition with a recognition accuracy of 92% outperforming a </w:t>
+      </w:r>
+      <w:proofErr w:type="spellStart"/>
+      <w:r>
+        <w:t>PaddleOCR</w:t>
+      </w:r>
+      <w:proofErr w:type="spellEnd"/>
+      <w:r>
+        <w:t xml:space="preserve"> a hybrid CNN-Transformer model.</w:t>
       </w:r>
       <w:r>
         <w:t xml:space="preserve"> </w:t>
       </w:r>
       <w:r>
-        <w:t>achieved world-level precision, recall and f1 scores of 96.59, 96.57 and 96.58 respectively on the</w:t>
-      </w:r>
-      <w:r>
-        <w:t xml:space="preserve"> SROIE</w:t>
-      </w:r>
-      <w:r>
-        <w:t xml:space="preserve"> (Scanned Receipts OCR and </w:t>
-      </w:r>
-      <w:r>
-        <w:lastRenderedPageBreak/>
-        <w:t>Image formation Extraction) dataset</w:t>
+        <w:t>[</w:t>
+      </w:r>
+      <w:r>
+        <w:t>13</w:t>
+      </w:r>
+      <w:r>
+        <w:t>] Tr</w:t>
+      </w:r>
+      <w:r>
+        <w:t>-OCR also outperformed Tesseract</w:t>
+      </w:r>
+      <w:r>
+        <w:t>, a model using three types of LSTM-based models</w:t>
       </w:r>
       <w:r>
         <w:t xml:space="preserve"> and</w:t>
       </w:r>
       <w:r>
-        <w:t xml:space="preserve"> achieved a state-of-the art CER</w:t>
-      </w:r>
-      <w:r>
-        <w:t xml:space="preserve"> (Character Error Rate)</w:t>
-      </w:r>
-      <w:r>
-        <w:t xml:space="preserve"> of 2.89</w:t>
-      </w:r>
-      <w:r>
-        <w:t xml:space="preserve"> on the IAM Handwriting Dataset</w:t>
-      </w:r>
-      <w:r>
-        <w:t xml:space="preserve">. </w:t>
-      </w:r>
-      <w:r>
-        <w:t xml:space="preserve">A study carried out by [14] found that a Tr-OCR provides the best overall solution for reliable, high-accuracy container ISO code recognition with a recognition accuracy of 92% outperforming a </w:t>
-      </w:r>
-      <w:proofErr w:type="spellStart"/>
-      <w:r>
-        <w:t>PaddleOCR</w:t>
-      </w:r>
-      <w:proofErr w:type="spellEnd"/>
-      <w:r>
-        <w:t xml:space="preserve"> a hybrid CNN-Transformer model.</w:t>
-      </w:r>
-      <w:r>
-        <w:t xml:space="preserve"> </w:t>
-      </w:r>
-      <w:r>
-        <w:t>[31</w:t>
-      </w:r>
-      <w:r>
-        <w:t>] Tr</w:t>
-      </w:r>
-      <w:r>
-        <w:t>-OCR also outperformed Tesseract</w:t>
-      </w:r>
-      <w:r>
-        <w:t>, a model using three types of LSTM-based models [32</w:t>
-      </w:r>
-      <w:r>
-        <w:t>] and</w:t>
-      </w:r>
-      <w:r>
         <w:t xml:space="preserve"> Easy-OCR in recognizing </w:t>
       </w:r>
       <w:r>
         <w:t xml:space="preserve">crossed-out </w:t>
       </w:r>
-      <w:proofErr w:type="gramStart"/>
-      <w:r>
-        <w:t>text .</w:t>
-      </w:r>
-      <w:proofErr w:type="gramEnd"/>
+      <w:r>
+        <w:t>text.</w:t>
+      </w:r>
     </w:p>
     <w:p>
       <w:pPr>
@@ -1207,7 +1304,19 @@
         <w:t>A</w:t>
       </w:r>
       <w:r>
-        <w:t>ccuracy rate is a measure of the number of correct classifications over the entire test set, indicating the strength of the classifier [27]. [ 28] Precision is the fraction of correctly predicted, positive results</w:t>
+        <w:t>ccuracy rate is a measure of the number of correct classifications over the entire test set, indicating the strength of the classifier [</w:t>
+      </w:r>
+      <w:r>
+        <w:t>14</w:t>
+      </w:r>
+      <w:r>
+        <w:t>]. [</w:t>
+      </w:r>
+      <w:r>
+        <w:t>15</w:t>
+      </w:r>
+      <w:r>
+        <w:t>] Precision is the fraction of correctly predicted, positive results</w:t>
       </w:r>
       <w:r>
         <w:t xml:space="preserve"> out of the sum of all positive predictions (true positives + false positives)</w:t>
@@ -1216,7 +1325,19 @@
         <w:t xml:space="preserve">. This number is useful in situations where the false-positives outnumber the false-negatives. A high-precision value suggests that the model makes accurate positive predictions. </w:t>
       </w:r>
       <w:r>
-        <w:t xml:space="preserve">Recall on the other hand [30] indicates how well the classifier labels as positive, cases that are positive, showing the ability to correctly identify cases that are positive. This measure is also described as sensitivity.[28] the F1-Score is a measure of the test’s accuracy and is calculated from </w:t>
+        <w:t>Recall on the other hand [</w:t>
+      </w:r>
+      <w:r>
+        <w:t>16</w:t>
+      </w:r>
+      <w:r>
+        <w:t>] indicates how well the classifier labels as positive, cases that are positive, showing the ability to correctly identify cases that are positive. This measure is also described as sensitivity.[</w:t>
+      </w:r>
+      <w:r>
+        <w:t>15</w:t>
+      </w:r>
+      <w:r>
+        <w:t xml:space="preserve">] the F1-Score is a measure of the test’s accuracy and is calculated from </w:t>
       </w:r>
       <w:r>
         <w:t>the precision</w:t>
@@ -1227,13 +1348,25 @@
     </w:p>
     <w:p>
       <w:r>
+        <w:rPr>
+          <w:highlight w:val="yellow"/>
+        </w:rPr>
         <w:t>Compare them using WER (word error rate) or (</w:t>
       </w:r>
       <w:r>
+        <w:rPr>
+          <w:highlight w:val="yellow"/>
+        </w:rPr>
         <w:t>Character</w:t>
       </w:r>
       <w:r>
-        <w:t xml:space="preserve"> error rate)</w:t>
+        <w:rPr>
+          <w:highlight w:val="yellow"/>
+        </w:rPr>
+        <w:t xml:space="preserve"> error rate</w:t>
+      </w:r>
+      <w:r>
+        <w:t xml:space="preserve">)check [17] </w:t>
       </w:r>
     </w:p>
     <w:p>
@@ -1259,6 +1392,7 @@
         <w:t>What is a speech-to-text system?</w:t>
       </w:r>
     </w:p>
+    <w:p/>
     <w:p>
       <w:r>
         <w:t>What is the performance of current speech-to-text models?</w:t>
@@ -1292,15 +1426,7 @@
       </w:r>
       <w:proofErr w:type="spellEnd"/>
       <w:r>
-        <w:t xml:space="preserve"> gold standard), NVIDIA Canary-</w:t>
-      </w:r>
-      <w:proofErr w:type="gramStart"/>
-      <w:r>
-        <w:t>Queen(</w:t>
-      </w:r>
-      <w:proofErr w:type="gramEnd"/>
-      <w:r>
-        <w:t>best for raw English accuracy), Distil-Whisper – (Best for low-Resource hardware)</w:t>
+        <w:t xml:space="preserve"> gold standard), NVIDIA Canary-Queen(best for raw English accuracy), Distil-Whisper – (Best for low-Resource hardware)</w:t>
       </w:r>
     </w:p>
     <w:p/>
@@ -1318,12 +1444,12 @@
     <w:p/>
     <w:p>
       <w:r>
+        <w:t>Evaluation plan</w:t>
+      </w:r>
+    </w:p>
+    <w:p>
+      <w:r>
         <w:lastRenderedPageBreak/>
-        <w:t>Evaluation plan</w:t>
-      </w:r>
-    </w:p>
-    <w:p>
-      <w:r>
         <w:t>Does it upload essays in various formats?</w:t>
       </w:r>
     </w:p>
@@ -2314,6 +2440,7 @@
   <w:style w:type="character" w:default="1" w:styleId="DefaultParagraphFont">
     <w:name w:val="Default Paragraph Font"/>
     <w:uiPriority w:val="1"/>
+    <w:semiHidden/>
     <w:unhideWhenUsed/>
   </w:style>
   <w:style w:type="table" w:default="1" w:styleId="TableNormal">

</xml_diff>

<commit_message>
Updated tite, introduction and AES section
</commit_message>
<xml_diff>
--- a/preliminary report/Final Project - Preliminary Report.docx
+++ b/preliminary report/Final Project - Preliminary Report.docx
@@ -600,7 +600,10 @@
         <w:t>A</w:t>
       </w:r>
       <w:r>
-        <w:t>n interpretable, accessible, hybrid, multi-</w:t>
+        <w:t xml:space="preserve"> </w:t>
+      </w:r>
+      <w:r>
+        <w:t>hybrid, multi-</w:t>
       </w:r>
       <w:r>
         <w:t>modal, Automated</w:t>
@@ -614,39 +617,75 @@
       <w:r>
         <w:t xml:space="preserve"> system </w:t>
       </w:r>
+      <w:r>
+        <w:t xml:space="preserve">which </w:t>
+      </w:r>
+      <w:r>
+        <w:t xml:space="preserve">orchestrates </w:t>
+      </w:r>
+      <w:r>
+        <w:t xml:space="preserve">an OCR, STT and Transformer model providing accessibility for students and interpretability, readability and automation </w:t>
+      </w:r>
+      <w:r>
+        <w:t xml:space="preserve">to </w:t>
+      </w:r>
+      <w:r>
+        <w:t xml:space="preserve">support </w:t>
+      </w:r>
+      <w:r>
+        <w:t>human scorers</w:t>
+      </w:r>
+      <w:r>
+        <w:t>.</w:t>
+      </w:r>
     </w:p>
     <w:p>
       <w:pPr>
         <w:ind w:right="971"/>
       </w:pPr>
+      <w:r>
+        <w:t>Template of Choice</w:t>
+      </w:r>
     </w:p>
     <w:p>
       <w:pPr>
         <w:ind w:right="971"/>
       </w:pPr>
       <w:r>
-        <w:t>Template of Choice</w:t>
+        <w:t>Template 4.1 Project Idea 1: Orchestrating AI models to achieve a goal</w:t>
       </w:r>
     </w:p>
     <w:p>
       <w:pPr>
         <w:ind w:right="971"/>
       </w:pPr>
-      <w:r>
-        <w:t>Template 4.1 Project Idea 1: Orchestrating AI models to achieve a goal</w:t>
-      </w:r>
     </w:p>
     <w:p>
       <w:pPr>
         <w:ind w:right="971"/>
       </w:pPr>
+      <w:r>
+        <w:t xml:space="preserve">Why the interest in the topic? </w:t>
+      </w:r>
     </w:p>
     <w:p>
       <w:pPr>
         <w:ind w:right="971"/>
       </w:pPr>
       <w:r>
-        <w:t xml:space="preserve">Why the interest in the topic? </w:t>
+        <w:t>Automated Essay Scoring is one of the fastest growing and popular research areas in NLP with respect to education. According to [</w:t>
+      </w:r>
+      <w:r>
+        <w:t>1</w:t>
+      </w:r>
+      <w:r>
+        <w:t>] this is due to the rapid progress in Artificial Intelligence which has created new possibilities. Some of the benefits of AES are enhanced fairness, consistency and efficiency in the scoring process [</w:t>
+      </w:r>
+      <w:r>
+        <w:t>2</w:t>
+      </w:r>
+      <w:r>
+        <w:t xml:space="preserve">]. </w:t>
       </w:r>
     </w:p>
     <w:p>
@@ -654,78 +693,49 @@
         <w:ind w:right="971"/>
       </w:pPr>
       <w:r>
-        <w:t>Automated Essay Scoring is one of the fastest growing and popular research areas in NLP with respect to education. According to [</w:t>
-      </w:r>
-      <w:r>
-        <w:t>1</w:t>
-      </w:r>
-      <w:r>
-        <w:t>] this is due to the rapid progress in Artificial Intelligence which has created new possibilities. Some of the benefits of AES are enhanced fairness, consistency and efficiency in the scoring process [</w:t>
-      </w:r>
-      <w:r>
-        <w:t>2</w:t>
-      </w:r>
-      <w:r>
-        <w:t xml:space="preserve">]. </w:t>
-      </w:r>
-    </w:p>
-    <w:p>
-      <w:pPr>
-        <w:ind w:right="971"/>
-      </w:pPr>
-      <w:r>
         <w:t xml:space="preserve">Reading and providing corrective feedback on a single 250-word essay can take 10-15 minutes on average and a typical English A class </w:t>
       </w:r>
       <w:r>
         <w:t>has</w:t>
       </w:r>
       <w:r>
-        <w:t xml:space="preserve"> 35 students. This manual approach does not scale well if a teacher is assigned to more than one class, as one can imagine. </w:t>
+        <w:t xml:space="preserve"> 35 students. This manual approach does not scale well if a teacher is assigned to more than one class. </w:t>
       </w:r>
       <w:r>
         <w:t xml:space="preserve">I am a teacher and personally understand the stressful, time-consuming ordeal that my colleagues and I must endure when marking answers to open-ended questions, especially essay. Currently </w:t>
       </w:r>
       <w:r>
-        <w:t xml:space="preserve">accessibility is provided by means of </w:t>
-      </w:r>
-      <w:r>
-        <w:t xml:space="preserve">a scribe </w:t>
-      </w:r>
-      <w:r>
-        <w:t>who</w:t>
+        <w:t xml:space="preserve">accessibility </w:t>
+      </w:r>
+      <w:r>
+        <w:t xml:space="preserve">for students </w:t>
+      </w:r>
+      <w:r>
+        <w:t>who can speak but are incapable of writing or typing due to disability</w:t>
       </w:r>
       <w:r>
         <w:t xml:space="preserve"> </w:t>
       </w:r>
       <w:r>
-        <w:t>assist</w:t>
-      </w:r>
-      <w:r>
-        <w:t xml:space="preserve">s </w:t>
-      </w:r>
-      <w:r>
-        <w:t>students</w:t>
-      </w:r>
-      <w:r>
-        <w:t xml:space="preserve"> who </w:t>
-      </w:r>
-      <w:r>
-        <w:t>can speak</w:t>
-      </w:r>
-      <w:r>
-        <w:t xml:space="preserve"> but are </w:t>
-      </w:r>
-      <w:r>
-        <w:t xml:space="preserve">incapable of writing or typing due to </w:t>
-      </w:r>
-      <w:r>
-        <w:t>disability</w:t>
+        <w:t xml:space="preserve">is provided by means of </w:t>
+      </w:r>
+      <w:r>
+        <w:t>a scrib</w:t>
+      </w:r>
+      <w:r>
+        <w:t>e</w:t>
       </w:r>
       <w:r>
         <w:t xml:space="preserve">. </w:t>
       </w:r>
       <w:r>
-        <w:t xml:space="preserve">Although well intentioned, using a scribe </w:t>
+        <w:t xml:space="preserve">Although well intentioned, </w:t>
+      </w:r>
+      <w:r>
+        <w:t>this arrangement</w:t>
+      </w:r>
+      <w:r>
+        <w:t xml:space="preserve"> </w:t>
       </w:r>
       <w:r>
         <w:t xml:space="preserve">demands extra human resources, </w:t>
@@ -737,7 +747,22 @@
         <w:t xml:space="preserve">can be </w:t>
       </w:r>
       <w:r>
-        <w:t xml:space="preserve">intimidating to some students. It would be more beneficial to the student if they could submit an answer to a prompt independently by verbally expressing their ideas and having them recorded, transcribed and then evaluated. </w:t>
+        <w:t xml:space="preserve">intimidating to some students. It would be more beneficial to the student if they could submit an answer to a prompt independently by verbally expressing their ideas </w:t>
+      </w:r>
+      <w:r>
+        <w:t>recording</w:t>
+      </w:r>
+      <w:r>
+        <w:t xml:space="preserve">, </w:t>
+      </w:r>
+      <w:r>
+        <w:t>transcribing and</w:t>
+      </w:r>
+      <w:r>
+        <w:t xml:space="preserve"> then having them evaluated</w:t>
+      </w:r>
+      <w:r>
+        <w:t xml:space="preserve">. </w:t>
       </w:r>
       <w:r>
         <w:t xml:space="preserve">There should also be a mechanism in place to allow students who are unable to be present at school to be able to under supervision write essays and share photographs or scan copies of these essays.  </w:t>
@@ -825,7 +850,19 @@
         <w:t>4</w:t>
       </w:r>
       <w:r>
-        <w:t>] reviewed several pretrained models in AES and discovered that BERT outperformed all of them achieving a QWK of 0.83. QWK (Quadratic weighted Kappa) evaluates the degree of agreement among human and AI scorers, it is a metric between 0 and 1, representing no agreement beyond chance and perfect agreement [5].</w:t>
+        <w:t>] reviewed several pretrained models in AES and discovered that BERT</w:t>
+      </w:r>
+      <w:r>
+        <w:t>, outperformed</w:t>
+      </w:r>
+      <w:r>
+        <w:t xml:space="preserve"> all of them achieving a QWK of 0.83. QWK (Quadratic weighted Kappa) evaluates the degree of agreement among human and AI scorers, it is a metric between 0 and 1, representing no agreement beyond chance and perfect agreement</w:t>
+      </w:r>
+      <w:r>
+        <w:t>, respectively</w:t>
+      </w:r>
+      <w:r>
+        <w:t xml:space="preserve"> [5].</w:t>
       </w:r>
     </w:p>
     <w:p>
@@ -836,7 +873,55 @@
         <w:t xml:space="preserve"> (don’t’ analyse documents sentence-by-sentence)</w:t>
       </w:r>
       <w:r>
-        <w:t xml:space="preserve"> and work by using an attention mechanism that relates each token in the text to every other token thus eliminating the need to sequentially scan through a sentence to understand the context in which a token occurs.  As effective as stand-alone neural approaches are, they are usually criticized for their lack of readability and interpretability by humans. A dense vector can contain several numerical values relating to a feature or combination of features. These numbers have not positional significance to humans as compared to handcrafted features. [</w:t>
+        <w:t xml:space="preserve"> and work by using an attention mechanism that relates each token in the text to every other token thus eliminating the need to sequentially scan through a sentence to understand the context in which a token occurs.  As effective as stand-alone neural approaches are, they are usually criticized for their lack of readability and interpretability by humans. A dense vector can contain several numerical values relating to a feature or combination of features. These numbers have not positional significance to humans as compared to handcrafted features</w:t>
+      </w:r>
+      <w:r>
+        <w:t xml:space="preserve"> as they are assigned based on weight adjustments influenced by gradient descent</w:t>
+      </w:r>
+      <w:r>
+        <w:t xml:space="preserve">. </w:t>
+      </w:r>
+      <w:r>
+        <w:t>Handcrafted features</w:t>
+      </w:r>
+      <w:r>
+        <w:t>,</w:t>
+      </w:r>
+      <w:r>
+        <w:t xml:space="preserve"> however, are values that are encoded into feature vectors for example the first dimension of a vector representing word count</w:t>
+      </w:r>
+      <w:r>
+        <w:t xml:space="preserve"> and the</w:t>
+      </w:r>
+      <w:r>
+        <w:t xml:space="preserve"> second</w:t>
+      </w:r>
+      <w:r>
+        <w:t>,</w:t>
+      </w:r>
+      <w:r>
+        <w:t xml:space="preserve"> sentence length and so on</w:t>
+      </w:r>
+      <w:r>
+        <w:t xml:space="preserve">. </w:t>
+      </w:r>
+      <w:r>
+        <w:t xml:space="preserve">  </w:t>
+      </w:r>
+      <w:r>
+        <w:t xml:space="preserve">These </w:t>
+      </w:r>
+      <w:r>
+        <w:t xml:space="preserve">are </w:t>
+      </w:r>
+      <w:r>
+        <w:t xml:space="preserve">then </w:t>
+      </w:r>
+      <w:r>
+        <w:t xml:space="preserve">fed to a neural network for processing. This way features have positional value and the output from processing is interpretable. </w:t>
+      </w:r>
+      <w:r>
+        <w:t>[</w:t>
       </w:r>
       <w:r>
         <w:t>6</w:t>
@@ -848,7 +933,11 @@
         <w:t>7</w:t>
       </w:r>
       <w:r>
-        <w:t xml:space="preserve">], proposed a technique of combining transformers with more traditional approaches like those that employ handcrafted features. [5] </w:t>
+        <w:t xml:space="preserve">], proposed a technique of combining </w:t>
+      </w:r>
+      <w:r>
+        <w:lastRenderedPageBreak/>
+        <w:t xml:space="preserve">transformers with more traditional approaches like those that employ handcrafted features. [5] </w:t>
       </w:r>
       <w:r>
         <w:t xml:space="preserve">argued that human evaluation remains important since expert markers can identify subtle linguistic and cognitive qualities that automated systems may </w:t>
@@ -874,7 +963,6 @@
     </w:p>
     <w:p>
       <w:r>
-        <w:lastRenderedPageBreak/>
         <w:t xml:space="preserve">Therefore, this research proposes a hybrid </w:t>
       </w:r>
       <w:r>
@@ -932,6 +1020,12 @@
         <w:t xml:space="preserve">. </w:t>
       </w:r>
     </w:p>
+    <w:p/>
+    <w:p>
+      <w:r>
+        <w:t>High-level System Architecture</w:t>
+      </w:r>
+    </w:p>
     <w:p>
       <w:r>
         <w:t xml:space="preserve">The proposed system will achieve accessibility by </w:t>
@@ -957,7 +1051,7 @@
         <w:ind w:right="971"/>
       </w:pPr>
       <w:r>
-        <w:t xml:space="preserve">Output from the speech-to-text and image-to-text models will be transformed into machine-readable text and fed as input to the transformer model for contextual and semantic analysis and final holistic scoring. This proposed three-model architecture, aims to investigate whether a hybrid multi-modal system can improve the accessibility, interpretability, readability and reliability of AES systems. </w:t>
+        <w:t xml:space="preserve">Output from the speech-to-text and image-to-text models will be transformed into machine-readable text and fed as input to the transformer model for contextual and semantic analysis and final holistic scoring. </w:t>
       </w:r>
     </w:p>
     <w:p>
@@ -1177,6 +1271,7 @@
         <w:t xml:space="preserve">xt </w:t>
       </w:r>
       <w:r>
+        <w:lastRenderedPageBreak/>
         <w:t>image datasets without any complex pre/post-processing steps</w:t>
       </w:r>
       <w:r>
@@ -1225,11 +1320,7 @@
         <w:t>2</w:t>
       </w:r>
       <w:r>
-        <w:t xml:space="preserve">] found </w:t>
-      </w:r>
-      <w:r>
-        <w:lastRenderedPageBreak/>
-        <w:t xml:space="preserve">that a Tr-OCR provides the best overall solution for reliable, high-accuracy container ISO code recognition with a recognition accuracy of 92% outperforming a </w:t>
+        <w:t xml:space="preserve">] found that a Tr-OCR provides the best overall solution for reliable, high-accuracy container ISO code recognition with a recognition accuracy of 92% outperforming a </w:t>
       </w:r>
       <w:proofErr w:type="spellStart"/>
       <w:r>
@@ -1366,7 +1457,13 @@
         <w:t xml:space="preserve"> error rate</w:t>
       </w:r>
       <w:r>
-        <w:t xml:space="preserve">)check [17] </w:t>
+        <w:t>)</w:t>
+      </w:r>
+      <w:r>
+        <w:t xml:space="preserve"> </w:t>
+      </w:r>
+      <w:r>
+        <w:t xml:space="preserve">check [17] </w:t>
       </w:r>
     </w:p>
     <w:p>
@@ -1426,13 +1523,22 @@
       </w:r>
       <w:proofErr w:type="spellEnd"/>
       <w:r>
-        <w:t xml:space="preserve"> gold standard), NVIDIA Canary-Queen(best for raw English accuracy), Distil-Whisper – (Best for low-Resource hardware)</w:t>
+        <w:t xml:space="preserve"> gold standard), NVIDIA Canary-</w:t>
+      </w:r>
+      <w:proofErr w:type="gramStart"/>
+      <w:r>
+        <w:t>Queen(</w:t>
+      </w:r>
+      <w:proofErr w:type="gramEnd"/>
+      <w:r>
+        <w:t>best for raw English accuracy), Distil-Whisper – (Best for low-Resource hardware)</w:t>
       </w:r>
     </w:p>
     <w:p/>
     <w:p/>
     <w:p>
       <w:r>
+        <w:lastRenderedPageBreak/>
         <w:t>Integration of pretrained models</w:t>
       </w:r>
     </w:p>
@@ -1449,7 +1555,6 @@
     </w:p>
     <w:p>
       <w:r>
-        <w:lastRenderedPageBreak/>
         <w:t>Does it upload essays in various formats?</w:t>
       </w:r>
     </w:p>

</xml_diff>

<commit_message>
Updated OCR section, added definition
</commit_message>
<xml_diff>
--- a/preliminary report/Final Project - Preliminary Report.docx
+++ b/preliminary report/Final Project - Preliminary Report.docx
@@ -137,7 +137,7 @@
             <w:rPr>
               <w:rFonts w:eastAsiaTheme="minorEastAsia"/>
               <w:noProof/>
-              <w:lang w:val="en-LC" w:eastAsia="en-LC"/>
+              <w:lang w:eastAsia="en-GB"/>
             </w:rPr>
           </w:pPr>
           <w:r>
@@ -149,7 +149,7 @@
           <w:r>
             <w:fldChar w:fldCharType="separate"/>
           </w:r>
-          <w:hyperlink w:anchor="_Toc232583040" w:history="1">
+          <w:hyperlink w:anchor="_Toc232841531" w:history="1">
             <w:r>
               <w:rPr>
                 <w:rStyle w:val="Hyperlink"/>
@@ -176,7 +176,7 @@
                 <w:noProof/>
                 <w:webHidden/>
               </w:rPr>
-              <w:instrText xml:space="preserve"> PAGEREF _Toc232583040 \h </w:instrText>
+              <w:instrText xml:space="preserve"> PAGEREF _Toc232841531 \h </w:instrText>
             </w:r>
             <w:r>
               <w:rPr>
@@ -216,10 +216,10 @@
             <w:rPr>
               <w:rFonts w:eastAsiaTheme="minorEastAsia"/>
               <w:noProof/>
-              <w:lang w:val="en-LC" w:eastAsia="en-LC"/>
+              <w:lang w:eastAsia="en-GB"/>
             </w:rPr>
           </w:pPr>
-          <w:hyperlink w:anchor="_Toc232583041" w:history="1">
+          <w:hyperlink w:anchor="_Toc232841532" w:history="1">
             <w:r>
               <w:rPr>
                 <w:rStyle w:val="Hyperlink"/>
@@ -246,7 +246,7 @@
                 <w:noProof/>
                 <w:webHidden/>
               </w:rPr>
-              <w:instrText xml:space="preserve"> PAGEREF _Toc232583041 \h </w:instrText>
+              <w:instrText xml:space="preserve"> PAGEREF _Toc232841532 \h </w:instrText>
             </w:r>
             <w:r>
               <w:rPr>
@@ -286,10 +286,10 @@
             <w:rPr>
               <w:rFonts w:eastAsiaTheme="minorEastAsia"/>
               <w:noProof/>
-              <w:lang w:val="en-LC" w:eastAsia="en-LC"/>
+              <w:lang w:eastAsia="en-GB"/>
             </w:rPr>
           </w:pPr>
-          <w:hyperlink w:anchor="_Toc232583042" w:history="1">
+          <w:hyperlink w:anchor="_Toc232841533" w:history="1">
             <w:r>
               <w:rPr>
                 <w:rStyle w:val="Hyperlink"/>
@@ -316,7 +316,7 @@
                 <w:noProof/>
                 <w:webHidden/>
               </w:rPr>
-              <w:instrText xml:space="preserve"> PAGEREF _Toc232583042 \h </w:instrText>
+              <w:instrText xml:space="preserve"> PAGEREF _Toc232841533 \h </w:instrText>
             </w:r>
             <w:r>
               <w:rPr>
@@ -356,10 +356,10 @@
             <w:rPr>
               <w:rFonts w:eastAsiaTheme="minorEastAsia"/>
               <w:noProof/>
-              <w:lang w:val="en-LC" w:eastAsia="en-LC"/>
+              <w:lang w:eastAsia="en-GB"/>
             </w:rPr>
           </w:pPr>
-          <w:hyperlink w:anchor="_Toc232583043" w:history="1">
+          <w:hyperlink w:anchor="_Toc232841534" w:history="1">
             <w:r>
               <w:rPr>
                 <w:rStyle w:val="Hyperlink"/>
@@ -386,7 +386,7 @@
                 <w:noProof/>
                 <w:webHidden/>
               </w:rPr>
-              <w:instrText xml:space="preserve"> PAGEREF _Toc232583043 \h </w:instrText>
+              <w:instrText xml:space="preserve"> PAGEREF _Toc232841534 \h </w:instrText>
             </w:r>
             <w:r>
               <w:rPr>
@@ -406,7 +406,7 @@
                 <w:noProof/>
                 <w:webHidden/>
               </w:rPr>
-              <w:t>5</w:t>
+              <w:t>6</w:t>
             </w:r>
             <w:r>
               <w:rPr>
@@ -426,10 +426,10 @@
             <w:rPr>
               <w:rFonts w:eastAsiaTheme="minorEastAsia"/>
               <w:noProof/>
-              <w:lang w:val="en-LC" w:eastAsia="en-LC"/>
+              <w:lang w:eastAsia="en-GB"/>
             </w:rPr>
           </w:pPr>
-          <w:hyperlink w:anchor="_Toc232583044" w:history="1">
+          <w:hyperlink w:anchor="_Toc232841535" w:history="1">
             <w:r>
               <w:rPr>
                 <w:rStyle w:val="Hyperlink"/>
@@ -456,7 +456,7 @@
                 <w:noProof/>
                 <w:webHidden/>
               </w:rPr>
-              <w:instrText xml:space="preserve"> PAGEREF _Toc232583044 \h </w:instrText>
+              <w:instrText xml:space="preserve"> PAGEREF _Toc232841535 \h </w:instrText>
             </w:r>
             <w:r>
               <w:rPr>
@@ -476,7 +476,7 @@
                 <w:noProof/>
                 <w:webHidden/>
               </w:rPr>
-              <w:t>8</w:t>
+              <w:t>9</w:t>
             </w:r>
             <w:r>
               <w:rPr>
@@ -496,10 +496,10 @@
             <w:rPr>
               <w:rFonts w:eastAsiaTheme="minorEastAsia"/>
               <w:noProof/>
-              <w:lang w:val="en-LC" w:eastAsia="en-LC"/>
+              <w:lang w:eastAsia="en-GB"/>
             </w:rPr>
           </w:pPr>
-          <w:hyperlink w:anchor="_Toc232583045" w:history="1">
+          <w:hyperlink w:anchor="_Toc232841536" w:history="1">
             <w:r>
               <w:rPr>
                 <w:rStyle w:val="Hyperlink"/>
@@ -526,7 +526,7 @@
                 <w:noProof/>
                 <w:webHidden/>
               </w:rPr>
-              <w:instrText xml:space="preserve"> PAGEREF _Toc232583045 \h </w:instrText>
+              <w:instrText xml:space="preserve"> PAGEREF _Toc232841536 \h </w:instrText>
             </w:r>
             <w:r>
               <w:rPr>
@@ -546,7 +546,7 @@
                 <w:noProof/>
                 <w:webHidden/>
               </w:rPr>
-              <w:t>9</w:t>
+              <w:t>10</w:t>
             </w:r>
             <w:r>
               <w:rPr>
@@ -579,7 +579,7 @@
       <w:pPr>
         <w:pStyle w:val="Heading2"/>
       </w:pPr>
-      <w:bookmarkStart w:id="0" w:name="_Toc232583040"/>
+      <w:bookmarkStart w:id="0" w:name="_Toc232841531"/>
       <w:r>
         <w:lastRenderedPageBreak/>
         <w:t>Introduction</w:t>
@@ -708,63 +708,57 @@
         <w:t xml:space="preserve">accessibility </w:t>
       </w:r>
       <w:r>
-        <w:t xml:space="preserve">for students </w:t>
-      </w:r>
-      <w:r>
-        <w:t>who can speak but are incapable of writing or typing due to disability</w:t>
+        <w:t xml:space="preserve">for students who can speak but are incapable of writing or typing due to disability </w:t>
+      </w:r>
+      <w:r>
+        <w:t xml:space="preserve">is provided by means of </w:t>
+      </w:r>
+      <w:r>
+        <w:t>a scrib</w:t>
+      </w:r>
+      <w:r>
+        <w:t>e</w:t>
+      </w:r>
+      <w:r>
+        <w:t xml:space="preserve">. </w:t>
+      </w:r>
+      <w:r>
+        <w:t xml:space="preserve">Although well intentioned, </w:t>
+      </w:r>
+      <w:r>
+        <w:t>this arrangement</w:t>
       </w:r>
       <w:r>
         <w:t xml:space="preserve"> </w:t>
       </w:r>
       <w:r>
-        <w:t xml:space="preserve">is provided by means of </w:t>
-      </w:r>
-      <w:r>
-        <w:t>a scrib</w:t>
-      </w:r>
-      <w:r>
-        <w:t>e</w:t>
+        <w:t xml:space="preserve">demands extra human resources, </w:t>
+      </w:r>
+      <w:r>
+        <w:t xml:space="preserve">is time consuming and </w:t>
+      </w:r>
+      <w:r>
+        <w:t xml:space="preserve">can be </w:t>
+      </w:r>
+      <w:r>
+        <w:t xml:space="preserve">intimidating to some students. It would be more beneficial to the student if they could submit an answer to a prompt independently by verbally expressing their ideas </w:t>
+      </w:r>
+      <w:r>
+        <w:t>recording</w:t>
+      </w:r>
+      <w:r>
+        <w:t xml:space="preserve">, </w:t>
+      </w:r>
+      <w:r>
+        <w:t>transcribing and</w:t>
+      </w:r>
+      <w:r>
+        <w:t xml:space="preserve"> then having them evaluated</w:t>
       </w:r>
       <w:r>
         <w:t xml:space="preserve">. </w:t>
       </w:r>
       <w:r>
-        <w:t xml:space="preserve">Although well intentioned, </w:t>
-      </w:r>
-      <w:r>
-        <w:t>this arrangement</w:t>
-      </w:r>
-      <w:r>
-        <w:t xml:space="preserve"> </w:t>
-      </w:r>
-      <w:r>
-        <w:t xml:space="preserve">demands extra human resources, </w:t>
-      </w:r>
-      <w:r>
-        <w:t xml:space="preserve">is time consuming and </w:t>
-      </w:r>
-      <w:r>
-        <w:t xml:space="preserve">can be </w:t>
-      </w:r>
-      <w:r>
-        <w:t xml:space="preserve">intimidating to some students. It would be more beneficial to the student if they could submit an answer to a prompt independently by verbally expressing their ideas </w:t>
-      </w:r>
-      <w:r>
-        <w:t>recording</w:t>
-      </w:r>
-      <w:r>
-        <w:t xml:space="preserve">, </w:t>
-      </w:r>
-      <w:r>
-        <w:t>transcribing and</w:t>
-      </w:r>
-      <w:r>
-        <w:t xml:space="preserve"> then having them evaluated</w:t>
-      </w:r>
-      <w:r>
-        <w:t xml:space="preserve">. </w:t>
-      </w:r>
-      <w:r>
         <w:t xml:space="preserve">There should also be a mechanism in place to allow students who are unable to be present at school to be able to under supervision write essays and share photographs or scan copies of these essays.  </w:t>
       </w:r>
     </w:p>
@@ -777,7 +771,7 @@
       <w:pPr>
         <w:pStyle w:val="Heading2"/>
       </w:pPr>
-      <w:bookmarkStart w:id="1" w:name="_Toc232583041"/>
+      <w:bookmarkStart w:id="1" w:name="_Toc232841532"/>
       <w:r>
         <w:lastRenderedPageBreak/>
         <w:t>Literature Review</w:t>
@@ -1058,12 +1052,12 @@
       <w:pPr>
         <w:pStyle w:val="Heading3"/>
       </w:pPr>
-      <w:bookmarkStart w:id="2" w:name="_Toc232583042"/>
     </w:p>
     <w:p>
       <w:pPr>
         <w:pStyle w:val="Heading3"/>
       </w:pPr>
+      <w:bookmarkStart w:id="2" w:name="_Toc232841533"/>
       <w:r>
         <w:t>Optical Character Recognition (OCR)</w:t>
       </w:r>
@@ -1475,7 +1469,7 @@
       <w:pPr>
         <w:pStyle w:val="Heading3"/>
       </w:pPr>
-      <w:bookmarkStart w:id="3" w:name="_Toc232583043"/>
+      <w:bookmarkStart w:id="3" w:name="_Toc232841534"/>
       <w:r>
         <w:t>Speech-To-Text</w:t>
       </w:r>
@@ -1489,7 +1483,11 @@
         <w:t>What is a speech-to-text system?</w:t>
       </w:r>
     </w:p>
-    <w:p/>
+    <w:p>
+      <w:r>
+        <w:t xml:space="preserve">[1] for STT the system accepts an audio input signal from either a person or a machine and detects and converts individual words and phrases into text. </w:t>
+      </w:r>
+    </w:p>
     <w:p>
       <w:r>
         <w:t>What is the performance of current speech-to-text models?</w:t>
@@ -1673,7 +1671,7 @@
       <w:pPr>
         <w:pStyle w:val="Heading2"/>
       </w:pPr>
-      <w:bookmarkStart w:id="4" w:name="_Toc232583044"/>
+      <w:bookmarkStart w:id="4" w:name="_Toc232841535"/>
       <w:r>
         <w:lastRenderedPageBreak/>
         <w:t>Feature Prototype</w:t>
@@ -1713,7 +1711,7 @@
       <w:pPr>
         <w:pStyle w:val="Heading2"/>
       </w:pPr>
-      <w:bookmarkStart w:id="5" w:name="_Toc232583045"/>
+      <w:bookmarkStart w:id="5" w:name="_Toc232841536"/>
       <w:r>
         <w:lastRenderedPageBreak/>
         <w:t>REFERENCE LIST</w:t>

</xml_diff>

<commit_message>
Updated ASR, Multimodal and Evaluation sections
</commit_message>
<xml_diff>
--- a/preliminary report/Final Project - Preliminary Report.docx
+++ b/preliminary report/Final Project - Preliminary Report.docx
@@ -5,6 +5,7 @@
     <w:p>
       <w:pPr>
         <w:pStyle w:val="Title"/>
+        <w:spacing w:line="360" w:lineRule="auto"/>
         <w:jc w:val="center"/>
       </w:pPr>
       <w:r>
@@ -14,16 +15,26 @@
     <w:p>
       <w:pPr>
         <w:pStyle w:val="Title"/>
+        <w:spacing w:line="360" w:lineRule="auto"/>
         <w:jc w:val="center"/>
       </w:pPr>
       <w:r>
         <w:t>CM 3070</w:t>
       </w:r>
     </w:p>
-    <w:p/>
-    <w:p/>
-    <w:p>
-      <w:pPr>
+    <w:p>
+      <w:pPr>
+        <w:spacing w:line="360" w:lineRule="auto"/>
+      </w:pPr>
+    </w:p>
+    <w:p>
+      <w:pPr>
+        <w:spacing w:line="360" w:lineRule="auto"/>
+      </w:pPr>
+    </w:p>
+    <w:p>
+      <w:pPr>
+        <w:spacing w:line="360" w:lineRule="auto"/>
         <w:jc w:val="center"/>
         <w:rPr>
           <w:sz w:val="40"/>
@@ -33,6 +44,7 @@
     </w:p>
     <w:p>
       <w:pPr>
+        <w:spacing w:line="360" w:lineRule="auto"/>
         <w:jc w:val="center"/>
         <w:rPr>
           <w:sz w:val="40"/>
@@ -42,6 +54,7 @@
     </w:p>
     <w:p>
       <w:pPr>
+        <w:spacing w:line="360" w:lineRule="auto"/>
         <w:jc w:val="center"/>
         <w:rPr>
           <w:sz w:val="40"/>
@@ -51,6 +64,7 @@
     </w:p>
     <w:p>
       <w:pPr>
+        <w:spacing w:line="360" w:lineRule="auto"/>
         <w:jc w:val="center"/>
         <w:rPr>
           <w:sz w:val="40"/>
@@ -60,6 +74,7 @@
     </w:p>
     <w:p>
       <w:pPr>
+        <w:spacing w:line="360" w:lineRule="auto"/>
         <w:jc w:val="center"/>
         <w:rPr>
           <w:sz w:val="40"/>
@@ -69,6 +84,7 @@
     </w:p>
     <w:p>
       <w:pPr>
+        <w:spacing w:line="360" w:lineRule="auto"/>
         <w:jc w:val="center"/>
         <w:rPr>
           <w:sz w:val="40"/>
@@ -84,6 +100,9 @@
       </w:r>
     </w:p>
     <w:p>
+      <w:pPr>
+        <w:spacing w:line="360" w:lineRule="auto"/>
+      </w:pPr>
       <w:r>
         <w:br w:type="page"/>
       </w:r>
@@ -116,6 +135,7 @@
         <w:p>
           <w:pPr>
             <w:pStyle w:val="TOCHeading"/>
+            <w:spacing w:line="360" w:lineRule="auto"/>
           </w:pPr>
           <w:r>
             <w:t>Table of Contents</w:t>
@@ -123,6 +143,7 @@
         </w:p>
         <w:p>
           <w:pPr>
+            <w:spacing w:line="360" w:lineRule="auto"/>
             <w:rPr>
               <w:lang w:val="en-US"/>
             </w:rPr>
@@ -149,7 +170,7 @@
           <w:r>
             <w:fldChar w:fldCharType="separate"/>
           </w:r>
-          <w:hyperlink w:anchor="_Toc232841531" w:history="1">
+          <w:hyperlink w:anchor="_Toc232887176" w:history="1">
             <w:r>
               <w:rPr>
                 <w:rStyle w:val="Hyperlink"/>
@@ -176,7 +197,7 @@
                 <w:noProof/>
                 <w:webHidden/>
               </w:rPr>
-              <w:instrText xml:space="preserve"> PAGEREF _Toc232841531 \h </w:instrText>
+              <w:instrText xml:space="preserve"> PAGEREF _Toc232887176 \h </w:instrText>
             </w:r>
             <w:r>
               <w:rPr>
@@ -219,7 +240,7 @@
               <w:lang w:eastAsia="en-GB"/>
             </w:rPr>
           </w:pPr>
-          <w:hyperlink w:anchor="_Toc232841532" w:history="1">
+          <w:hyperlink w:anchor="_Toc232887177" w:history="1">
             <w:r>
               <w:rPr>
                 <w:rStyle w:val="Hyperlink"/>
@@ -246,7 +267,7 @@
                 <w:noProof/>
                 <w:webHidden/>
               </w:rPr>
-              <w:instrText xml:space="preserve"> PAGEREF _Toc232841532 \h </w:instrText>
+              <w:instrText xml:space="preserve"> PAGEREF _Toc232887177 \h </w:instrText>
             </w:r>
             <w:r>
               <w:rPr>
@@ -266,7 +287,7 @@
                 <w:noProof/>
                 <w:webHidden/>
               </w:rPr>
-              <w:t>4</w:t>
+              <w:t>5</w:t>
             </w:r>
             <w:r>
               <w:rPr>
@@ -289,7 +310,7 @@
               <w:lang w:eastAsia="en-GB"/>
             </w:rPr>
           </w:pPr>
-          <w:hyperlink w:anchor="_Toc232841533" w:history="1">
+          <w:hyperlink w:anchor="_Toc232887178" w:history="1">
             <w:r>
               <w:rPr>
                 <w:rStyle w:val="Hyperlink"/>
@@ -316,7 +337,7 @@
                 <w:noProof/>
                 <w:webHidden/>
               </w:rPr>
-              <w:instrText xml:space="preserve"> PAGEREF _Toc232841533 \h </w:instrText>
+              <w:instrText xml:space="preserve"> PAGEREF _Toc232887178 \h </w:instrText>
             </w:r>
             <w:r>
               <w:rPr>
@@ -336,7 +357,7 @@
                 <w:noProof/>
                 <w:webHidden/>
               </w:rPr>
-              <w:t>5</w:t>
+              <w:t>7</w:t>
             </w:r>
             <w:r>
               <w:rPr>
@@ -359,13 +380,13 @@
               <w:lang w:eastAsia="en-GB"/>
             </w:rPr>
           </w:pPr>
-          <w:hyperlink w:anchor="_Toc232841534" w:history="1">
+          <w:hyperlink w:anchor="_Toc232887179" w:history="1">
             <w:r>
               <w:rPr>
                 <w:rStyle w:val="Hyperlink"/>
                 <w:noProof/>
               </w:rPr>
-              <w:t>Speech-To-Text (STT)</w:t>
+              <w:t>Automated Speech Recognition (ASR), Speech-To-Text (STT)</w:t>
             </w:r>
             <w:r>
               <w:rPr>
@@ -386,7 +407,7 @@
                 <w:noProof/>
                 <w:webHidden/>
               </w:rPr>
-              <w:instrText xml:space="preserve"> PAGEREF _Toc232841534 \h </w:instrText>
+              <w:instrText xml:space="preserve"> PAGEREF _Toc232887179 \h </w:instrText>
             </w:r>
             <w:r>
               <w:rPr>
@@ -406,7 +427,7 @@
                 <w:noProof/>
                 <w:webHidden/>
               </w:rPr>
-              <w:t>6</w:t>
+              <w:t>8</w:t>
             </w:r>
             <w:r>
               <w:rPr>
@@ -429,13 +450,13 @@
               <w:lang w:eastAsia="en-GB"/>
             </w:rPr>
           </w:pPr>
-          <w:hyperlink w:anchor="_Toc232841535" w:history="1">
+          <w:hyperlink w:anchor="_Toc232887180" w:history="1">
             <w:r>
               <w:rPr>
                 <w:rStyle w:val="Hyperlink"/>
                 <w:noProof/>
               </w:rPr>
-              <w:t>Feature Prototype</w:t>
+              <w:t>Multimodal</w:t>
             </w:r>
             <w:r>
               <w:rPr>
@@ -456,7 +477,7 @@
                 <w:noProof/>
                 <w:webHidden/>
               </w:rPr>
-              <w:instrText xml:space="preserve"> PAGEREF _Toc232841535 \h </w:instrText>
+              <w:instrText xml:space="preserve"> PAGEREF _Toc232887180 \h </w:instrText>
             </w:r>
             <w:r>
               <w:rPr>
@@ -499,13 +520,13 @@
               <w:lang w:eastAsia="en-GB"/>
             </w:rPr>
           </w:pPr>
-          <w:hyperlink w:anchor="_Toc232841536" w:history="1">
+          <w:hyperlink w:anchor="_Toc232887181" w:history="1">
             <w:r>
               <w:rPr>
                 <w:rStyle w:val="Hyperlink"/>
                 <w:noProof/>
               </w:rPr>
-              <w:t>REFERENCE LIST</w:t>
+              <w:t>Evaluation plan</w:t>
             </w:r>
             <w:r>
               <w:rPr>
@@ -526,7 +547,7 @@
                 <w:noProof/>
                 <w:webHidden/>
               </w:rPr>
-              <w:instrText xml:space="preserve"> PAGEREF _Toc232841536 \h </w:instrText>
+              <w:instrText xml:space="preserve"> PAGEREF _Toc232887181 \h </w:instrText>
             </w:r>
             <w:r>
               <w:rPr>
@@ -558,6 +579,219 @@
           </w:hyperlink>
         </w:p>
         <w:p>
+          <w:pPr>
+            <w:pStyle w:val="TOC2"/>
+            <w:tabs>
+              <w:tab w:val="right" w:leader="dot" w:pos="9016"/>
+            </w:tabs>
+            <w:rPr>
+              <w:rFonts w:eastAsiaTheme="minorEastAsia"/>
+              <w:noProof/>
+              <w:lang w:eastAsia="en-GB"/>
+            </w:rPr>
+          </w:pPr>
+          <w:hyperlink w:anchor="_Toc232887182" w:history="1">
+            <w:r>
+              <w:rPr>
+                <w:rStyle w:val="Hyperlink"/>
+                <w:noProof/>
+              </w:rPr>
+              <w:t>Design</w:t>
+            </w:r>
+            <w:r>
+              <w:rPr>
+                <w:noProof/>
+                <w:webHidden/>
+              </w:rPr>
+              <w:tab/>
+            </w:r>
+            <w:r>
+              <w:rPr>
+                <w:noProof/>
+                <w:webHidden/>
+              </w:rPr>
+              <w:fldChar w:fldCharType="begin"/>
+            </w:r>
+            <w:r>
+              <w:rPr>
+                <w:noProof/>
+                <w:webHidden/>
+              </w:rPr>
+              <w:instrText xml:space="preserve"> PAGEREF _Toc232887182 \h </w:instrText>
+            </w:r>
+            <w:r>
+              <w:rPr>
+                <w:noProof/>
+                <w:webHidden/>
+              </w:rPr>
+            </w:r>
+            <w:r>
+              <w:rPr>
+                <w:noProof/>
+                <w:webHidden/>
+              </w:rPr>
+              <w:fldChar w:fldCharType="separate"/>
+            </w:r>
+            <w:r>
+              <w:rPr>
+                <w:noProof/>
+                <w:webHidden/>
+              </w:rPr>
+              <w:t>12</w:t>
+            </w:r>
+            <w:r>
+              <w:rPr>
+                <w:noProof/>
+                <w:webHidden/>
+              </w:rPr>
+              <w:fldChar w:fldCharType="end"/>
+            </w:r>
+          </w:hyperlink>
+        </w:p>
+        <w:p>
+          <w:pPr>
+            <w:pStyle w:val="TOC2"/>
+            <w:tabs>
+              <w:tab w:val="right" w:leader="dot" w:pos="9016"/>
+            </w:tabs>
+            <w:rPr>
+              <w:rFonts w:eastAsiaTheme="minorEastAsia"/>
+              <w:noProof/>
+              <w:lang w:eastAsia="en-GB"/>
+            </w:rPr>
+          </w:pPr>
+          <w:hyperlink w:anchor="_Toc232887183" w:history="1">
+            <w:r>
+              <w:rPr>
+                <w:rStyle w:val="Hyperlink"/>
+                <w:noProof/>
+              </w:rPr>
+              <w:t>Feature Prototype</w:t>
+            </w:r>
+            <w:r>
+              <w:rPr>
+                <w:noProof/>
+                <w:webHidden/>
+              </w:rPr>
+              <w:tab/>
+            </w:r>
+            <w:r>
+              <w:rPr>
+                <w:noProof/>
+                <w:webHidden/>
+              </w:rPr>
+              <w:fldChar w:fldCharType="begin"/>
+            </w:r>
+            <w:r>
+              <w:rPr>
+                <w:noProof/>
+                <w:webHidden/>
+              </w:rPr>
+              <w:instrText xml:space="preserve"> PAGEREF _Toc232887183 \h </w:instrText>
+            </w:r>
+            <w:r>
+              <w:rPr>
+                <w:noProof/>
+                <w:webHidden/>
+              </w:rPr>
+            </w:r>
+            <w:r>
+              <w:rPr>
+                <w:noProof/>
+                <w:webHidden/>
+              </w:rPr>
+              <w:fldChar w:fldCharType="separate"/>
+            </w:r>
+            <w:r>
+              <w:rPr>
+                <w:noProof/>
+                <w:webHidden/>
+              </w:rPr>
+              <w:t>13</w:t>
+            </w:r>
+            <w:r>
+              <w:rPr>
+                <w:noProof/>
+                <w:webHidden/>
+              </w:rPr>
+              <w:fldChar w:fldCharType="end"/>
+            </w:r>
+          </w:hyperlink>
+        </w:p>
+        <w:p>
+          <w:pPr>
+            <w:pStyle w:val="TOC2"/>
+            <w:tabs>
+              <w:tab w:val="right" w:leader="dot" w:pos="9016"/>
+            </w:tabs>
+            <w:rPr>
+              <w:rFonts w:eastAsiaTheme="minorEastAsia"/>
+              <w:noProof/>
+              <w:lang w:eastAsia="en-GB"/>
+            </w:rPr>
+          </w:pPr>
+          <w:hyperlink w:anchor="_Toc232887184" w:history="1">
+            <w:r>
+              <w:rPr>
+                <w:rStyle w:val="Hyperlink"/>
+                <w:noProof/>
+              </w:rPr>
+              <w:t>REFERENCE LIST</w:t>
+            </w:r>
+            <w:r>
+              <w:rPr>
+                <w:noProof/>
+                <w:webHidden/>
+              </w:rPr>
+              <w:tab/>
+            </w:r>
+            <w:r>
+              <w:rPr>
+                <w:noProof/>
+                <w:webHidden/>
+              </w:rPr>
+              <w:fldChar w:fldCharType="begin"/>
+            </w:r>
+            <w:r>
+              <w:rPr>
+                <w:noProof/>
+                <w:webHidden/>
+              </w:rPr>
+              <w:instrText xml:space="preserve"> PAGEREF _Toc232887184 \h </w:instrText>
+            </w:r>
+            <w:r>
+              <w:rPr>
+                <w:noProof/>
+                <w:webHidden/>
+              </w:rPr>
+            </w:r>
+            <w:r>
+              <w:rPr>
+                <w:noProof/>
+                <w:webHidden/>
+              </w:rPr>
+              <w:fldChar w:fldCharType="separate"/>
+            </w:r>
+            <w:r>
+              <w:rPr>
+                <w:noProof/>
+                <w:webHidden/>
+              </w:rPr>
+              <w:t>14</w:t>
+            </w:r>
+            <w:r>
+              <w:rPr>
+                <w:noProof/>
+                <w:webHidden/>
+              </w:rPr>
+              <w:fldChar w:fldCharType="end"/>
+            </w:r>
+          </w:hyperlink>
+        </w:p>
+        <w:p>
+          <w:pPr>
+            <w:spacing w:line="360" w:lineRule="auto"/>
+          </w:pPr>
           <w:r>
             <w:rPr>
               <w:b/>
@@ -569,8 +803,15 @@
         </w:p>
       </w:sdtContent>
     </w:sdt>
-    <w:p/>
-    <w:p>
+    <w:p>
+      <w:pPr>
+        <w:spacing w:line="360" w:lineRule="auto"/>
+      </w:pPr>
+    </w:p>
+    <w:p>
+      <w:pPr>
+        <w:spacing w:line="360" w:lineRule="auto"/>
+      </w:pPr>
       <w:r>
         <w:br w:type="page"/>
       </w:r>
@@ -578,22 +819,31 @@
     <w:p>
       <w:pPr>
         <w:pStyle w:val="Heading2"/>
-      </w:pPr>
-      <w:bookmarkStart w:id="0" w:name="_Toc232841531"/>
+        <w:spacing w:line="360" w:lineRule="auto"/>
+      </w:pPr>
+      <w:bookmarkStart w:id="0" w:name="_Toc232887176"/>
       <w:r>
         <w:lastRenderedPageBreak/>
         <w:t>Introduction</w:t>
       </w:r>
       <w:bookmarkEnd w:id="0"/>
     </w:p>
-    <w:p/>
-    <w:p>
+    <w:p>
+      <w:pPr>
+        <w:spacing w:line="360" w:lineRule="auto"/>
+      </w:pPr>
+    </w:p>
+    <w:p>
+      <w:pPr>
+        <w:spacing w:line="360" w:lineRule="auto"/>
+      </w:pPr>
       <w:r>
         <w:t>Proposed System</w:t>
       </w:r>
     </w:p>
     <w:p>
       <w:pPr>
+        <w:spacing w:line="360" w:lineRule="auto"/>
         <w:ind w:right="971"/>
       </w:pPr>
       <w:r>
@@ -641,6 +891,7 @@
     </w:p>
     <w:p>
       <w:pPr>
+        <w:spacing w:line="360" w:lineRule="auto"/>
         <w:ind w:right="971"/>
       </w:pPr>
       <w:r>
@@ -649,6 +900,7 @@
     </w:p>
     <w:p>
       <w:pPr>
+        <w:spacing w:line="360" w:lineRule="auto"/>
         <w:ind w:right="971"/>
       </w:pPr>
       <w:r>
@@ -657,11 +909,13 @@
     </w:p>
     <w:p>
       <w:pPr>
+        <w:spacing w:line="360" w:lineRule="auto"/>
         <w:ind w:right="971"/>
       </w:pPr>
     </w:p>
     <w:p>
       <w:pPr>
+        <w:spacing w:line="360" w:lineRule="auto"/>
         <w:ind w:right="971"/>
       </w:pPr>
       <w:r>
@@ -670,6 +924,7 @@
     </w:p>
     <w:p>
       <w:pPr>
+        <w:spacing w:line="360" w:lineRule="auto"/>
         <w:ind w:right="971"/>
       </w:pPr>
       <w:r>
@@ -690,6 +945,7 @@
     </w:p>
     <w:p>
       <w:pPr>
+        <w:spacing w:line="360" w:lineRule="auto"/>
         <w:ind w:right="971"/>
       </w:pPr>
       <w:r>
@@ -759,10 +1015,17 @@
         <w:t xml:space="preserve">. </w:t>
       </w:r>
       <w:r>
-        <w:t xml:space="preserve">There should also be a mechanism in place to allow students who are unable to be present at school to be able to under supervision write essays and share photographs or scan copies of these essays.  </w:t>
-      </w:r>
-    </w:p>
-    <w:p>
+        <w:t xml:space="preserve">There should also be </w:t>
+      </w:r>
+      <w:r>
+        <w:lastRenderedPageBreak/>
+        <w:t xml:space="preserve">a mechanism in place to allow students who are unable to be present at school to be able to under supervision write essays and share photographs or scan copies of these essays.  </w:t>
+      </w:r>
+    </w:p>
+    <w:p>
+      <w:pPr>
+        <w:spacing w:line="360" w:lineRule="auto"/>
+      </w:pPr>
       <w:r>
         <w:br w:type="page"/>
       </w:r>
@@ -770,17 +1033,23 @@
     <w:p>
       <w:pPr>
         <w:pStyle w:val="Heading2"/>
-      </w:pPr>
-      <w:bookmarkStart w:id="1" w:name="_Toc232841532"/>
+        <w:spacing w:line="360" w:lineRule="auto"/>
+      </w:pPr>
+      <w:bookmarkStart w:id="1" w:name="_Toc232887177"/>
       <w:r>
         <w:lastRenderedPageBreak/>
         <w:t>Literature Review</w:t>
       </w:r>
       <w:bookmarkEnd w:id="1"/>
     </w:p>
-    <w:p/>
-    <w:p>
-      <w:pPr>
+    <w:p>
+      <w:pPr>
+        <w:spacing w:line="360" w:lineRule="auto"/>
+      </w:pPr>
+    </w:p>
+    <w:p>
+      <w:pPr>
+        <w:spacing w:line="360" w:lineRule="auto"/>
         <w:ind w:right="971"/>
       </w:pPr>
       <w:r>
@@ -789,6 +1058,7 @@
     </w:p>
     <w:p>
       <w:pPr>
+        <w:spacing w:line="360" w:lineRule="auto"/>
         <w:ind w:right="971"/>
       </w:pPr>
       <w:r>
@@ -796,887 +1066,961 @@
       </w:r>
     </w:p>
     <w:p>
-      <w:r>
-        <w:t xml:space="preserve">What is AES? </w:t>
-      </w:r>
-    </w:p>
-    <w:p>
-      <w:r>
-        <w:t>According to [</w:t>
-      </w:r>
-      <w:r>
-        <w:t>3</w:t>
-      </w:r>
-      <w:r>
-        <w:t>] Automated essay scoring refers to the process of grading student essays without human interference. An AES system takes as input an essay written for a given prompt (the topic) and then assigns a numeric score to the essay reflecting its quality, based on traits such as content, grammar and organization. [</w:t>
-      </w:r>
-      <w:r>
-        <w:t>3</w:t>
-      </w:r>
-      <w:r>
-        <w:t>] proposed a system that uses a neural approach which holistically scores an essay. A holistic score is a single numeric value assigned to an essay after evaluation, reflecting its quality, without providing evidence of how the score was obtained</w:t>
-      </w:r>
-      <w:r>
-        <w:t xml:space="preserve"> [</w:t>
-      </w:r>
-      <w:r>
-        <w:t>4</w:t>
-      </w:r>
-      <w:r>
-        <w:t>]</w:t>
-      </w:r>
-      <w:r>
-        <w:t>. Neural approaches engineer features like sentence length and number of paragraphs and encode these in dense numerical feature vectors. This enables them to iteratively adjust weights to learn a model that can then generalise to score new essay. These models have performed better than their predecessors according to [5], in some cases achieving QWK scores of 0.72 [7] and above.</w:t>
-      </w:r>
-      <w:r>
-        <w:t xml:space="preserve"> </w:t>
-      </w:r>
-      <w:r>
-        <w:t xml:space="preserve"> [</w:t>
-      </w:r>
-      <w:r>
-        <w:t>1</w:t>
-      </w:r>
-      <w:r>
-        <w:t>] compared the performance of three neural approaches LSTM, Bi-LSTM and BERT a transformer model and concluded that the transformer model offered superior performance. [</w:t>
-      </w:r>
-      <w:r>
-        <w:t>4</w:t>
-      </w:r>
-      <w:r>
-        <w:t>] reviewed several pretrained models in AES and discovered that BERT</w:t>
-      </w:r>
-      <w:r>
-        <w:t>, outperformed</w:t>
-      </w:r>
-      <w:r>
-        <w:t xml:space="preserve"> all of them achieving a QWK of 0.83. QWK (Quadratic weighted Kappa) evaluates the degree of agreement among human and AI scorers, it is a metric between 0 and 1, representing no agreement beyond chance and perfect agreement</w:t>
-      </w:r>
-      <w:r>
-        <w:t>, respectively</w:t>
-      </w:r>
-      <w:r>
-        <w:t xml:space="preserve"> [5].</w:t>
-      </w:r>
-    </w:p>
-    <w:p>
-      <w:r>
-        <w:t>Transformer models are non-sequential</w:t>
-      </w:r>
-      <w:r>
-        <w:t xml:space="preserve"> (don’t’ analyse documents sentence-by-sentence)</w:t>
-      </w:r>
-      <w:r>
-        <w:t xml:space="preserve"> and work by using an attention mechanism that relates each token in the text to every other token thus eliminating the need to sequentially scan through a sentence to understand the context in which a token occurs.  As effective as stand-alone neural approaches are, they are usually criticized for their lack of readability and interpretability by humans. A dense vector can contain several numerical values relating to a feature or combination of features. These numbers have not positional significance to humans as compared to handcrafted features</w:t>
-      </w:r>
-      <w:r>
-        <w:t xml:space="preserve"> as they are assigned based on weight adjustments influenced by gradient descent</w:t>
-      </w:r>
-      <w:r>
-        <w:t xml:space="preserve">. </w:t>
-      </w:r>
-      <w:r>
-        <w:t>Handcrafted features</w:t>
-      </w:r>
-      <w:r>
-        <w:t>,</w:t>
-      </w:r>
-      <w:r>
-        <w:t xml:space="preserve"> however, are values that are encoded into feature vectors for example the first dimension of a vector representing word count</w:t>
-      </w:r>
-      <w:r>
-        <w:t xml:space="preserve"> and the</w:t>
-      </w:r>
-      <w:r>
-        <w:t xml:space="preserve"> second</w:t>
-      </w:r>
-      <w:r>
-        <w:t>,</w:t>
-      </w:r>
-      <w:r>
-        <w:t xml:space="preserve"> sentence length and so on</w:t>
-      </w:r>
-      <w:r>
-        <w:t xml:space="preserve">. </w:t>
-      </w:r>
-      <w:r>
-        <w:t xml:space="preserve">  </w:t>
-      </w:r>
-      <w:r>
-        <w:t xml:space="preserve">These </w:t>
-      </w:r>
-      <w:r>
-        <w:t xml:space="preserve">are </w:t>
-      </w:r>
-      <w:r>
-        <w:t xml:space="preserve">then </w:t>
-      </w:r>
-      <w:r>
-        <w:t xml:space="preserve">fed to a neural network for processing. This way features have positional value and the output from processing is interpretable. </w:t>
-      </w:r>
-      <w:r>
-        <w:t>[</w:t>
-      </w:r>
-      <w:r>
-        <w:t>6</w:t>
-      </w:r>
-      <w:r>
-        <w:t>] suggests not relying solely on transformer models and like [</w:t>
-      </w:r>
-      <w:r>
-        <w:t>7</w:t>
-      </w:r>
-      <w:r>
-        <w:t xml:space="preserve">], proposed a technique of combining </w:t>
-      </w:r>
-      <w:r>
-        <w:lastRenderedPageBreak/>
-        <w:t xml:space="preserve">transformers with more traditional approaches like those that employ handcrafted features. [5] </w:t>
-      </w:r>
-      <w:r>
-        <w:t xml:space="preserve">argued that human evaluation remains important since expert markers can identify subtle linguistic and cognitive qualities that automated systems may </w:t>
-      </w:r>
-      <w:r>
-        <w:t>overlook</w:t>
-      </w:r>
-      <w:r>
-        <w:t>. [</w:t>
-      </w:r>
-      <w:r>
-        <w:t>7</w:t>
-      </w:r>
-      <w:r>
-        <w:t>] indicated that when models work in combination the results are more promising. [</w:t>
-      </w:r>
-      <w:r>
-        <w:t>8</w:t>
-      </w:r>
-      <w:r>
-        <w:t xml:space="preserve">] used a hybrid model – LSTM and Word Embedding and achieved a QWK of 0.94. </w:t>
-      </w:r>
-    </w:p>
-    <w:p>
-      <w:r>
-        <w:t xml:space="preserve">Therefore, this research proposes a hybrid </w:t>
-      </w:r>
-      <w:r>
-        <w:t xml:space="preserve">approach </w:t>
-      </w:r>
-      <w:r>
-        <w:t xml:space="preserve">for scoring essays </w:t>
-      </w:r>
-      <w:r>
-        <w:t>that will utilise handcrafted features and a transformer model</w:t>
-      </w:r>
-      <w:r>
-        <w:t xml:space="preserve"> t</w:t>
-      </w:r>
-      <w:r>
-        <w:t xml:space="preserve">o create a </w:t>
-      </w:r>
-      <w:r>
-        <w:t xml:space="preserve">transparent </w:t>
-      </w:r>
-      <w:r>
-        <w:t xml:space="preserve">system that can holistically score and essay while </w:t>
-      </w:r>
-      <w:r>
-        <w:t>providing a breakdown of the contribution each trait gives to the holistic score</w:t>
-      </w:r>
-      <w:r>
-        <w:t xml:space="preserve">. This approach is </w:t>
-      </w:r>
-      <w:r>
-        <w:t>supported by the conclusion reached by [</w:t>
-      </w:r>
-      <w:r>
-        <w:t>6</w:t>
-      </w:r>
-      <w:r>
-        <w:t>], [</w:t>
-      </w:r>
-      <w:r>
-        <w:t>7</w:t>
-      </w:r>
-      <w:r>
-        <w:t>] and [</w:t>
-      </w:r>
-      <w:r>
-        <w:t>8</w:t>
-      </w:r>
-      <w:r>
-        <w:t xml:space="preserve">] after evaluating the performance of stand-alone models in comparison to </w:t>
-      </w:r>
-      <w:r>
-        <w:t>hybrid ones</w:t>
-      </w:r>
-      <w:r>
-        <w:t xml:space="preserve">. </w:t>
-      </w:r>
-    </w:p>
-    <w:p/>
-    <w:p>
-      <w:r>
-        <w:t>High-level System Architecture</w:t>
-      </w:r>
-    </w:p>
-    <w:p>
-      <w:r>
-        <w:t xml:space="preserve">The proposed system will achieve accessibility by </w:t>
-      </w:r>
-      <w:r>
-        <w:t>utilizing pretrained</w:t>
-      </w:r>
-      <w:r>
-        <w:t xml:space="preserve"> OCR </w:t>
-      </w:r>
-      <w:r>
-        <w:t xml:space="preserve">and a speech-to-text (STT) models </w:t>
-      </w:r>
-      <w:r>
-        <w:t xml:space="preserve">to allow </w:t>
-      </w:r>
-      <w:r>
-        <w:t xml:space="preserve">audio-transcribed, typed and scanned images of handwritten essays to be uploaded for evaluation. </w:t>
-      </w:r>
-    </w:p>
-    <w:p>
-      <w:pPr>
-        <w:ind w:right="971"/>
-      </w:pPr>
-      <w:r>
-        <w:t xml:space="preserve">Output from the speech-to-text and image-to-text models will be transformed into machine-readable text and fed as input to the transformer model for contextual and semantic analysis and final holistic scoring. </w:t>
-      </w:r>
-    </w:p>
-    <w:p>
-      <w:pPr>
-        <w:pStyle w:val="Heading3"/>
-      </w:pPr>
-    </w:p>
-    <w:p>
-      <w:pPr>
-        <w:pStyle w:val="Heading3"/>
-      </w:pPr>
-      <w:bookmarkStart w:id="2" w:name="_Toc232841533"/>
-      <w:r>
-        <w:t>Optical Character Recognition (OCR)</w:t>
-      </w:r>
-      <w:bookmarkEnd w:id="2"/>
-    </w:p>
-    <w:p>
-      <w:pPr>
+      <w:pPr>
+        <w:spacing w:line="360" w:lineRule="auto"/>
         <w:rPr>
           <w:b/>
           <w:bCs/>
         </w:rPr>
       </w:pPr>
-    </w:p>
-    <w:p>
-      <w:pPr>
+      <w:r>
         <w:rPr>
           <w:b/>
           <w:bCs/>
         </w:rPr>
-      </w:pPr>
-      <w:r>
+        <w:t xml:space="preserve">What is AES? </w:t>
+      </w:r>
+    </w:p>
+    <w:p>
+      <w:pPr>
+        <w:spacing w:line="360" w:lineRule="auto"/>
+      </w:pPr>
+      <w:r>
+        <w:t>According to [</w:t>
+      </w:r>
+      <w:r>
+        <w:t>3</w:t>
+      </w:r>
+      <w:r>
+        <w:t>] Automated essay scoring refers to the process of grading student essays without human interference. An AES system takes as input an essay written for a given prompt (the topic) and then assigns a numeric score to the essay reflecting its quality, based on traits such as content, grammar and organization. [</w:t>
+      </w:r>
+      <w:r>
+        <w:t>3</w:t>
+      </w:r>
+      <w:r>
+        <w:t>] proposed a system that uses a neural approach which holistically scores an essay. A holistic score is a single numeric value assigned to an essay after evaluation, reflecting its quality, without providing evidence of how the score was obtained</w:t>
+      </w:r>
+      <w:r>
+        <w:t xml:space="preserve"> [</w:t>
+      </w:r>
+      <w:r>
+        <w:t>4</w:t>
+      </w:r>
+      <w:r>
+        <w:t>]</w:t>
+      </w:r>
+      <w:r>
+        <w:t>. Neural approaches engineer features like sentence length and number of paragraphs and encode these in dense numerical feature vectors. This enables them to iteratively adjust weights to learn a model that can then generalise to score new essay. These models have performed better than their predecessors according to [5], in some cases achieving QWK scores of 0.72 [7] and above.</w:t>
+      </w:r>
+      <w:r>
+        <w:t xml:space="preserve"> </w:t>
+      </w:r>
+      <w:r>
+        <w:t xml:space="preserve"> [</w:t>
+      </w:r>
+      <w:r>
+        <w:t>1</w:t>
+      </w:r>
+      <w:r>
+        <w:t>] compared the performance of three neural approaches LSTM, Bi-LSTM and BERT a transformer model and concluded that the transformer model offered superior performance. [</w:t>
+      </w:r>
+      <w:r>
+        <w:t>4</w:t>
+      </w:r>
+      <w:r>
+        <w:t>] reviewed several pretrained models in AES and discovered that BERT</w:t>
+      </w:r>
+      <w:r>
+        <w:t>, outperformed</w:t>
+      </w:r>
+      <w:r>
+        <w:t xml:space="preserve"> all of them achieving a QWK of 0.83. QWK (Quadratic weighted Kappa) evaluates the degree of agreement among human and AI scorers, it is a metric between 0 and 1, representing no agreement beyond chance and perfect agreement</w:t>
+      </w:r>
+      <w:r>
+        <w:t>, respectively</w:t>
+      </w:r>
+      <w:r>
+        <w:t xml:space="preserve"> [5].</w:t>
+      </w:r>
+    </w:p>
+    <w:p>
+      <w:pPr>
+        <w:spacing w:line="360" w:lineRule="auto"/>
+      </w:pPr>
+      <w:r>
+        <w:t xml:space="preserve">Transformer models work by using an attention mechanism that relates each token in the text to every other token thus </w:t>
+      </w:r>
+      <w:r>
+        <w:t>enabling them to capture long-range contextual dependencies</w:t>
+      </w:r>
+      <w:r>
+        <w:t xml:space="preserve">.  As effective as stand-alone neural approaches are, they are usually criticized for their lack of readability and interpretability by humans. A dense vector can contain several numerical values relating to a feature or combination of features. These </w:t>
+      </w:r>
+      <w:r>
+        <w:lastRenderedPageBreak/>
+        <w:t>numbers have not positional significance to humans as compared to handcrafted features</w:t>
+      </w:r>
+      <w:r>
+        <w:t xml:space="preserve"> as they are assigned based on weight adjustments influenced by gradient descent</w:t>
+      </w:r>
+      <w:r>
+        <w:t xml:space="preserve">. </w:t>
+      </w:r>
+      <w:r>
+        <w:t>Handcrafted features</w:t>
+      </w:r>
+      <w:r>
+        <w:t>,</w:t>
+      </w:r>
+      <w:r>
+        <w:t xml:space="preserve"> however, are values that are encoded into feature vectors for example the first dimension of a vector representing word count</w:t>
+      </w:r>
+      <w:r>
+        <w:t xml:space="preserve"> and the</w:t>
+      </w:r>
+      <w:r>
+        <w:t xml:space="preserve"> second</w:t>
+      </w:r>
+      <w:r>
+        <w:t>,</w:t>
+      </w:r>
+      <w:r>
+        <w:t xml:space="preserve"> sentence length and so on</w:t>
+      </w:r>
+      <w:r>
+        <w:t xml:space="preserve">. </w:t>
+      </w:r>
+      <w:r>
+        <w:t xml:space="preserve">  </w:t>
+      </w:r>
+      <w:r>
+        <w:t xml:space="preserve">These </w:t>
+      </w:r>
+      <w:r>
+        <w:t xml:space="preserve">are </w:t>
+      </w:r>
+      <w:r>
+        <w:t xml:space="preserve">then </w:t>
+      </w:r>
+      <w:r>
+        <w:t xml:space="preserve">fed to a neural network for processing. This way features have positional value and the output from processing is interpretable. </w:t>
+      </w:r>
+      <w:r>
+        <w:t>[</w:t>
+      </w:r>
+      <w:r>
+        <w:t>6</w:t>
+      </w:r>
+      <w:r>
+        <w:t>] suggests not relying solely on transformer models and like [</w:t>
+      </w:r>
+      <w:r>
+        <w:t>7</w:t>
+      </w:r>
+      <w:r>
+        <w:t xml:space="preserve">], proposed a technique of combining transformers with more traditional approaches like those that employ handcrafted features. [5] </w:t>
+      </w:r>
+      <w:r>
+        <w:t xml:space="preserve">argued that human evaluation remains important since expert markers can identify subtle linguistic and cognitive qualities that automated systems may </w:t>
+      </w:r>
+      <w:r>
+        <w:t>overlook</w:t>
+      </w:r>
+      <w:r>
+        <w:t>. [</w:t>
+      </w:r>
+      <w:r>
+        <w:t>7</w:t>
+      </w:r>
+      <w:r>
+        <w:t>] indicated that when models work in combination the results are more promising. [</w:t>
+      </w:r>
+      <w:r>
+        <w:t>8</w:t>
+      </w:r>
+      <w:r>
+        <w:t xml:space="preserve">] used a hybrid model – LSTM and Word Embedding and achieved a QWK of 0.94. </w:t>
+      </w:r>
+    </w:p>
+    <w:p>
+      <w:pPr>
+        <w:spacing w:line="360" w:lineRule="auto"/>
+      </w:pPr>
+      <w:r>
+        <w:t xml:space="preserve">Therefore, this research proposes a hybrid </w:t>
+      </w:r>
+      <w:r>
+        <w:t xml:space="preserve">approach </w:t>
+      </w:r>
+      <w:r>
+        <w:t xml:space="preserve">for scoring essays </w:t>
+      </w:r>
+      <w:r>
+        <w:t>that will utilise handcrafted features and a transformer model</w:t>
+      </w:r>
+      <w:r>
+        <w:t xml:space="preserve"> t</w:t>
+      </w:r>
+      <w:r>
+        <w:t xml:space="preserve">o create a </w:t>
+      </w:r>
+      <w:r>
+        <w:t xml:space="preserve">transparent </w:t>
+      </w:r>
+      <w:r>
+        <w:t xml:space="preserve">system that can holistically score and essay while </w:t>
+      </w:r>
+      <w:r>
+        <w:t>providing a breakdown of the contribution each trait gives to the holistic score</w:t>
+      </w:r>
+      <w:r>
+        <w:t xml:space="preserve">. This approach is </w:t>
+      </w:r>
+      <w:r>
+        <w:t>supported by the conclusion reached by [</w:t>
+      </w:r>
+      <w:r>
+        <w:t>6</w:t>
+      </w:r>
+      <w:r>
+        <w:t>], [</w:t>
+      </w:r>
+      <w:r>
+        <w:t>7</w:t>
+      </w:r>
+      <w:r>
+        <w:t>] and [</w:t>
+      </w:r>
+      <w:r>
+        <w:t>8</w:t>
+      </w:r>
+      <w:r>
+        <w:t xml:space="preserve">] after evaluating the performance of stand-alone models in comparison to </w:t>
+      </w:r>
+      <w:r>
+        <w:t>hybrid ones</w:t>
+      </w:r>
+      <w:r>
+        <w:t xml:space="preserve">. </w:t>
+      </w:r>
+    </w:p>
+    <w:p>
+      <w:pPr>
+        <w:spacing w:line="360" w:lineRule="auto"/>
+      </w:pPr>
+    </w:p>
+    <w:p>
+      <w:pPr>
+        <w:spacing w:line="360" w:lineRule="auto"/>
         <w:rPr>
           <w:b/>
           <w:bCs/>
         </w:rPr>
-        <w:t>What is OCR?</w:t>
-      </w:r>
-    </w:p>
-    <w:p>
-      <w:r>
-        <w:t xml:space="preserve">Jain et. al. </w:t>
-      </w:r>
-      <w:r>
-        <w:t>[</w:t>
-      </w:r>
-      <w:r>
-        <w:t>9</w:t>
-      </w:r>
-      <w:r>
-        <w:t>]</w:t>
-      </w:r>
-      <w:r>
-        <w:t xml:space="preserve"> </w:t>
-      </w:r>
-      <w:r>
-        <w:t>defines</w:t>
-      </w:r>
-      <w:r>
-        <w:t xml:space="preserve"> OCR as a computational technology that extracts text in an editable format from PDF files, scanned or hand-written documents, images etc</w:t>
-      </w:r>
-      <w:r>
-        <w:t xml:space="preserve">. </w:t>
-      </w:r>
-      <w:r>
-        <w:t xml:space="preserve">Li et al. </w:t>
-      </w:r>
-      <w:r>
-        <w:t>[1</w:t>
-      </w:r>
-      <w:r>
-        <w:t>0</w:t>
-      </w:r>
-      <w:r>
-        <w:t>]</w:t>
-      </w:r>
-      <w:r>
-        <w:t xml:space="preserve"> describe traditional OCR systems as comprising two modules</w:t>
-      </w:r>
-      <w:r>
-        <w:t>: a text detection module and a text recognition module. Text detection localizes all text blocks at word-level or text</w:t>
-      </w:r>
-      <w:r>
-        <w:t>-</w:t>
-      </w:r>
-      <w:r>
-        <w:t>line</w:t>
-      </w:r>
-      <w:r>
-        <w:t xml:space="preserve"> </w:t>
-      </w:r>
-      <w:r>
-        <w:t xml:space="preserve">level while text recognition aims to understand the text image content and transcribe the visual signals </w:t>
-      </w:r>
-      <w:r>
-        <w:t>into</w:t>
-      </w:r>
-      <w:r>
-        <w:t xml:space="preserve"> natural language tokens.</w:t>
-      </w:r>
-      <w:r>
-        <w:t xml:space="preserve"> Mostafa et al </w:t>
-      </w:r>
-      <w:r>
-        <w:t>[</w:t>
-      </w:r>
-      <w:r>
-        <w:t>11</w:t>
-      </w:r>
-      <w:r>
-        <w:t>]</w:t>
-      </w:r>
-      <w:r>
-        <w:t xml:space="preserve"> </w:t>
-      </w:r>
-      <w:r>
-        <w:t>summarized</w:t>
-      </w:r>
-      <w:r>
-        <w:t xml:space="preserve"> work done </w:t>
-      </w:r>
-      <w:r>
-        <w:t>using OCR</w:t>
-      </w:r>
-      <w:r>
-        <w:t xml:space="preserve"> </w:t>
-      </w:r>
-      <w:r>
-        <w:t>to digitize</w:t>
-      </w:r>
-      <w:r>
-        <w:t xml:space="preserve"> Bangla scripts</w:t>
-      </w:r>
-      <w:r>
-        <w:t xml:space="preserve"> - a diverse and complicated language in written form.</w:t>
-      </w:r>
-      <w:r>
-        <w:t xml:space="preserve"> </w:t>
-      </w:r>
-      <w:r>
-        <w:t xml:space="preserve">They concluded that </w:t>
-      </w:r>
-      <w:r>
-        <w:t>CNN architectures are the most accurate tried and tested method for that task. [</w:t>
-      </w:r>
-      <w:r>
-        <w:t>11</w:t>
-      </w:r>
-      <w:r>
-        <w:t xml:space="preserve">] also stated that using </w:t>
-      </w:r>
-      <w:r>
-        <w:t>an RNN layer like LSTM or GRU alongside the base</w:t>
-      </w:r>
-      <w:r>
-        <w:t xml:space="preserve"> </w:t>
-      </w:r>
-      <w:r>
-        <w:t>CNN-based architecture</w:t>
-      </w:r>
-      <w:r>
-        <w:t xml:space="preserve"> can further improve the accuracy</w:t>
-      </w:r>
-      <w:r>
-        <w:t xml:space="preserve"> of the CNN</w:t>
-      </w:r>
-      <w:r>
-        <w:t>.</w:t>
-      </w:r>
-      <w:r>
-        <w:t xml:space="preserve"> </w:t>
-      </w:r>
-      <w:r>
-        <w:t xml:space="preserve">They stated that </w:t>
-      </w:r>
-      <w:r>
-        <w:t xml:space="preserve">the </w:t>
-      </w:r>
-      <w:r>
-        <w:t>transformer models showed</w:t>
-      </w:r>
-      <w:r>
-        <w:t xml:space="preserve"> promise</w:t>
-      </w:r>
-      <w:r>
-        <w:t xml:space="preserve"> but </w:t>
-      </w:r>
-      <w:r>
-        <w:t>also acknowledged</w:t>
-      </w:r>
-      <w:r>
-        <w:t xml:space="preserve"> that there is no empirical evidence</w:t>
-      </w:r>
-      <w:r>
-        <w:t xml:space="preserve"> of Bangla scripts being extracted with them. </w:t>
-      </w:r>
-      <w:r>
-        <w:t xml:space="preserve"> </w:t>
-      </w:r>
-      <w:r>
-        <w:t>[1</w:t>
-      </w:r>
-      <w:r>
-        <w:t>0</w:t>
-      </w:r>
-      <w:r>
-        <w:t>]</w:t>
-      </w:r>
-      <w:r>
-        <w:t xml:space="preserve"> achieved </w:t>
-      </w:r>
-      <w:r>
-        <w:t>state-of-the-art results on printed, handwritten and scene te</w:t>
-      </w:r>
-      <w:r>
-        <w:t xml:space="preserve">xt </w:t>
-      </w:r>
-      <w:r>
-        <w:lastRenderedPageBreak/>
-        <w:t>image datasets without any complex pre/post-processing steps</w:t>
-      </w:r>
-      <w:r>
-        <w:t xml:space="preserve"> with Tr-OCR, an end-to-end Transformer-based model</w:t>
-      </w:r>
-      <w:r>
-        <w:t xml:space="preserve">. </w:t>
-      </w:r>
-      <w:r>
-        <w:t>The model</w:t>
-      </w:r>
-      <w:r>
-        <w:t xml:space="preserve"> </w:t>
-      </w:r>
-      <w:r>
-        <w:t>achieved world-level precision, recall and f1 scores of 96.59, 96.57 and 96.58 respectively on the</w:t>
-      </w:r>
-      <w:r>
-        <w:t xml:space="preserve"> SROIE</w:t>
-      </w:r>
-      <w:r>
-        <w:t xml:space="preserve"> (Scanned Receipts OCR and Image formation Extraction) dataset</w:t>
-      </w:r>
-      <w:r>
-        <w:t xml:space="preserve"> and</w:t>
-      </w:r>
-      <w:r>
-        <w:t xml:space="preserve"> achieved a state-of-the art CER</w:t>
-      </w:r>
-      <w:r>
-        <w:t xml:space="preserve"> (Character Error Rate)</w:t>
-      </w:r>
-      <w:r>
-        <w:t xml:space="preserve"> of 2.89</w:t>
-      </w:r>
-      <w:r>
-        <w:t xml:space="preserve"> on the IAM Handwriting Dataset</w:t>
-      </w:r>
-      <w:r>
-        <w:t xml:space="preserve">. </w:t>
-      </w:r>
-      <w:r>
-        <w:t>A study carried out by [1</w:t>
-      </w:r>
-      <w:r>
-        <w:t>2</w:t>
-      </w:r>
-      <w:r>
-        <w:t xml:space="preserve">] found that a Tr-OCR provides the best overall solution for reliable, high-accuracy container ISO code recognition with a recognition accuracy of 92% outperforming a </w:t>
-      </w:r>
-      <w:proofErr w:type="spellStart"/>
-      <w:r>
-        <w:t>PaddleOCR</w:t>
-      </w:r>
-      <w:proofErr w:type="spellEnd"/>
-      <w:r>
-        <w:t xml:space="preserve"> a hybrid CNN-Transformer model.</w:t>
-      </w:r>
-      <w:r>
-        <w:t xml:space="preserve"> </w:t>
-      </w:r>
-      <w:r>
-        <w:t>[</w:t>
-      </w:r>
-      <w:r>
-        <w:t>13</w:t>
-      </w:r>
-      <w:r>
-        <w:t>] Tr</w:t>
-      </w:r>
-      <w:r>
-        <w:t>-OCR also outperformed Tesseract</w:t>
-      </w:r>
-      <w:r>
-        <w:t>, a model using three types of LSTM-based models</w:t>
-      </w:r>
-      <w:r>
-        <w:t xml:space="preserve"> and</w:t>
-      </w:r>
-      <w:r>
-        <w:t xml:space="preserve"> Easy-OCR in recognizing </w:t>
-      </w:r>
-      <w:r>
-        <w:t xml:space="preserve">crossed-out </w:t>
-      </w:r>
-      <w:r>
-        <w:t>text.</w:t>
-      </w:r>
-    </w:p>
-    <w:p>
-      <w:pPr>
+      </w:pPr>
+      <w:r>
         <w:rPr>
           <w:b/>
           <w:bCs/>
         </w:rPr>
-      </w:pPr>
-      <w:r>
+        <w:t>High-level System Architecture</w:t>
+      </w:r>
+    </w:p>
+    <w:p>
+      <w:pPr>
+        <w:spacing w:line="360" w:lineRule="auto"/>
+      </w:pPr>
+      <w:r>
+        <w:t xml:space="preserve">The proposed system will achieve accessibility by </w:t>
+      </w:r>
+      <w:r>
+        <w:t>utilizing pretrained</w:t>
+      </w:r>
+      <w:r>
+        <w:t xml:space="preserve"> OCR </w:t>
+      </w:r>
+      <w:r>
+        <w:t xml:space="preserve">and a speech-to-text (STT) models </w:t>
+      </w:r>
+      <w:r>
+        <w:t xml:space="preserve">to allow </w:t>
+      </w:r>
+      <w:r>
+        <w:t xml:space="preserve">audio-transcribed, typed and scanned images of handwritten essays to be uploaded for evaluation. </w:t>
+      </w:r>
+    </w:p>
+    <w:p>
+      <w:pPr>
+        <w:spacing w:line="360" w:lineRule="auto"/>
+        <w:ind w:right="971"/>
+      </w:pPr>
+      <w:r>
+        <w:t xml:space="preserve">Output from the speech-to-text and image-to-text models will be transformed into machine-readable text and fed as input to the transformer model for contextual and semantic analysis and final holistic scoring. </w:t>
+      </w:r>
+    </w:p>
+    <w:p>
+      <w:pPr>
         <w:rPr>
-          <w:b/>
-          <w:bCs/>
+          <w:rFonts w:eastAsiaTheme="majorEastAsia" w:cstheme="majorBidi"/>
+          <w:color w:val="0F4761" w:themeColor="accent1" w:themeShade="BF"/>
+          <w:sz w:val="28"/>
+          <w:szCs w:val="28"/>
         </w:rPr>
-        <w:t xml:space="preserve">What </w:t>
-      </w:r>
-      <w:r>
+      </w:pPr>
+      <w:r>
+        <w:br w:type="page"/>
+      </w:r>
+    </w:p>
+    <w:p>
+      <w:pPr>
+        <w:pStyle w:val="Heading3"/>
+        <w:spacing w:line="360" w:lineRule="auto"/>
+      </w:pPr>
+      <w:bookmarkStart w:id="2" w:name="_Toc232887178"/>
+      <w:r>
+        <w:lastRenderedPageBreak/>
+        <w:t>Optical Character Recognition (OCR)</w:t>
+      </w:r>
+      <w:bookmarkEnd w:id="2"/>
+    </w:p>
+    <w:p/>
+    <w:p>
+      <w:pPr>
+        <w:spacing w:line="360" w:lineRule="auto"/>
+      </w:pPr>
+      <w:r>
+        <w:t xml:space="preserve">Jain et. al. </w:t>
+      </w:r>
+      <w:r>
+        <w:t>[</w:t>
+      </w:r>
+      <w:r>
+        <w:t>9</w:t>
+      </w:r>
+      <w:r>
+        <w:t>]</w:t>
+      </w:r>
+      <w:r>
+        <w:t xml:space="preserve"> </w:t>
+      </w:r>
+      <w:r>
+        <w:t>defines</w:t>
+      </w:r>
+      <w:r>
+        <w:t xml:space="preserve"> OCR as a computational technology that extracts text in an editable format from PDF files, scanned or hand-written documents, images etc</w:t>
+      </w:r>
+      <w:r>
+        <w:t xml:space="preserve">. </w:t>
+      </w:r>
+      <w:r>
+        <w:t xml:space="preserve">Li et al. </w:t>
+      </w:r>
+      <w:r>
+        <w:t>[1</w:t>
+      </w:r>
+      <w:r>
+        <w:t>0</w:t>
+      </w:r>
+      <w:r>
+        <w:t>]</w:t>
+      </w:r>
+      <w:r>
+        <w:t xml:space="preserve"> describe traditional OCR systems as comprising two modules</w:t>
+      </w:r>
+      <w:r>
+        <w:t>: a text detection module and a text recognition module. Text detection localizes all text blocks at word-level or text</w:t>
+      </w:r>
+      <w:r>
+        <w:t>-</w:t>
+      </w:r>
+      <w:r>
+        <w:t>line</w:t>
+      </w:r>
+      <w:r>
+        <w:t xml:space="preserve"> </w:t>
+      </w:r>
+      <w:r>
+        <w:t xml:space="preserve">level while text recognition aims to understand the text image content and transcribe the visual signals </w:t>
+      </w:r>
+      <w:r>
+        <w:t>into</w:t>
+      </w:r>
+      <w:r>
+        <w:t xml:space="preserve"> natural language tokens.</w:t>
+      </w:r>
+      <w:r>
+        <w:t xml:space="preserve"> Mostafa et al </w:t>
+      </w:r>
+      <w:r>
+        <w:t>[</w:t>
+      </w:r>
+      <w:r>
+        <w:t>11</w:t>
+      </w:r>
+      <w:r>
+        <w:t>]</w:t>
+      </w:r>
+      <w:r>
+        <w:t xml:space="preserve"> </w:t>
+      </w:r>
+      <w:r>
+        <w:t>summarized</w:t>
+      </w:r>
+      <w:r>
+        <w:t xml:space="preserve"> work done </w:t>
+      </w:r>
+      <w:r>
+        <w:t>using OCR</w:t>
+      </w:r>
+      <w:r>
+        <w:t xml:space="preserve"> </w:t>
+      </w:r>
+      <w:r>
+        <w:t>to digitize</w:t>
+      </w:r>
+      <w:r>
+        <w:t xml:space="preserve"> Bangla scripts</w:t>
+      </w:r>
+      <w:r>
+        <w:t xml:space="preserve"> - a diverse and complicated language in written form.</w:t>
+      </w:r>
+      <w:r>
+        <w:t xml:space="preserve"> </w:t>
+      </w:r>
+      <w:r>
+        <w:t xml:space="preserve">They concluded that </w:t>
+      </w:r>
+      <w:r>
+        <w:t>CNN architectures are the most accurate tried and tested method for that task. [</w:t>
+      </w:r>
+      <w:r>
+        <w:t>11</w:t>
+      </w:r>
+      <w:r>
+        <w:t xml:space="preserve">] also stated that using </w:t>
+      </w:r>
+      <w:r>
+        <w:t>an RNN layer like LSTM or GRU alongside the base</w:t>
+      </w:r>
+      <w:r>
+        <w:t xml:space="preserve"> </w:t>
+      </w:r>
+      <w:r>
+        <w:t>CNN-based architecture</w:t>
+      </w:r>
+      <w:r>
+        <w:t xml:space="preserve"> can further improve the accuracy</w:t>
+      </w:r>
+      <w:r>
+        <w:t xml:space="preserve"> of the CNN</w:t>
+      </w:r>
+      <w:r>
+        <w:t>.</w:t>
+      </w:r>
+      <w:r>
+        <w:t xml:space="preserve"> </w:t>
+      </w:r>
+      <w:r>
+        <w:t xml:space="preserve">They stated that </w:t>
+      </w:r>
+      <w:r>
+        <w:t xml:space="preserve">the </w:t>
+      </w:r>
+      <w:r>
+        <w:t>transformer models showed</w:t>
+      </w:r>
+      <w:r>
+        <w:t xml:space="preserve"> promise</w:t>
+      </w:r>
+      <w:r>
+        <w:t xml:space="preserve"> but </w:t>
+      </w:r>
+      <w:r>
+        <w:t>also acknowledged</w:t>
+      </w:r>
+      <w:r>
+        <w:t xml:space="preserve"> that there is no empirical evidence</w:t>
+      </w:r>
+      <w:r>
+        <w:t xml:space="preserve"> of Bangla scripts being extracted with them. </w:t>
+      </w:r>
+      <w:r>
+        <w:t xml:space="preserve"> </w:t>
+      </w:r>
+      <w:r>
+        <w:t>[1</w:t>
+      </w:r>
+      <w:r>
+        <w:t>0</w:t>
+      </w:r>
+      <w:r>
+        <w:t>]</w:t>
+      </w:r>
+      <w:r>
+        <w:t xml:space="preserve"> achieved </w:t>
+      </w:r>
+      <w:r>
+        <w:t>state-of-the-art results on printed, handwritten and scene te</w:t>
+      </w:r>
+      <w:r>
+        <w:t xml:space="preserve">xt </w:t>
+      </w:r>
+      <w:r>
+        <w:t>image datasets without any complex pre/post-processing steps</w:t>
+      </w:r>
+      <w:r>
+        <w:t xml:space="preserve"> with Tr-OCR, an end-to-end Transformer-based model</w:t>
+      </w:r>
+      <w:r>
+        <w:t xml:space="preserve">. </w:t>
+      </w:r>
+      <w:r>
+        <w:t>The model</w:t>
+      </w:r>
+      <w:r>
+        <w:t xml:space="preserve"> </w:t>
+      </w:r>
+      <w:r>
+        <w:t>achieved world-level precision, recall and f1 scores of 96.59, 96.57 and 96.58 respectively on the</w:t>
+      </w:r>
+      <w:r>
+        <w:t xml:space="preserve"> SROIE</w:t>
+      </w:r>
+      <w:r>
+        <w:t xml:space="preserve"> (Scanned Receipts OCR and Image formation Extraction) dataset</w:t>
+      </w:r>
+      <w:r>
+        <w:t xml:space="preserve"> and</w:t>
+      </w:r>
+      <w:r>
+        <w:t xml:space="preserve"> achieved a state-of-the art CER</w:t>
+      </w:r>
+      <w:r>
+        <w:t xml:space="preserve"> (Character Error Rate)</w:t>
+      </w:r>
+      <w:r>
+        <w:t xml:space="preserve"> of 2.89</w:t>
+      </w:r>
+      <w:r>
+        <w:t xml:space="preserve"> on the IAM Handwriting Dataset</w:t>
+      </w:r>
+      <w:r>
+        <w:t xml:space="preserve">. </w:t>
+      </w:r>
+      <w:r>
+        <w:t>A study carried out by [1</w:t>
+      </w:r>
+      <w:r>
+        <w:t>2</w:t>
+      </w:r>
+      <w:r>
+        <w:t>] found that a Tr-OCR provides the best overall solution for reliable, high-accuracy container ISO code recognition with a recognition accuracy of 92% outperforming a PaddleOCR</w:t>
+      </w:r>
+      <w:r>
+        <w:t xml:space="preserve"> a hybrid CNN-Transformer model.</w:t>
+      </w:r>
+      <w:r>
+        <w:t xml:space="preserve"> </w:t>
+      </w:r>
+      <w:r>
+        <w:t>[</w:t>
+      </w:r>
+      <w:r>
+        <w:t>13</w:t>
+      </w:r>
+      <w:r>
+        <w:t>] Tr</w:t>
+      </w:r>
+      <w:r>
+        <w:t>-OCR also outperformed Tesseract</w:t>
+      </w:r>
+      <w:r>
+        <w:t>, a model using three types of LSTM-based models</w:t>
+      </w:r>
+      <w:r>
+        <w:t xml:space="preserve"> and</w:t>
+      </w:r>
+      <w:r>
+        <w:t xml:space="preserve"> Easy-OCR in recognizing </w:t>
+      </w:r>
+      <w:r>
+        <w:t xml:space="preserve">crossed-out </w:t>
+      </w:r>
+      <w:r>
+        <w:t>text.</w:t>
+      </w:r>
+    </w:p>
+    <w:p>
+      <w:pPr>
         <w:rPr>
-          <w:b/>
-          <w:bCs/>
+          <w:rFonts w:eastAsiaTheme="majorEastAsia" w:cstheme="majorBidi"/>
+          <w:color w:val="0F4761" w:themeColor="accent1" w:themeShade="BF"/>
+          <w:sz w:val="28"/>
+          <w:szCs w:val="28"/>
         </w:rPr>
-        <w:t>do these metrics mean</w:t>
-      </w:r>
-      <w:r>
-        <w:rPr>
-          <w:b/>
-          <w:bCs/>
-        </w:rPr>
-        <w:t>?</w:t>
-      </w:r>
-    </w:p>
-    <w:p>
-      <w:r>
-        <w:t>A</w:t>
-      </w:r>
-      <w:r>
-        <w:t>ccuracy rate is a measure of the number of correct classifications over the entire test set, indicating the strength of the classifier [</w:t>
-      </w:r>
-      <w:r>
-        <w:t>14</w:t>
-      </w:r>
-      <w:r>
-        <w:t>]. [</w:t>
-      </w:r>
-      <w:r>
-        <w:t>15</w:t>
-      </w:r>
-      <w:r>
-        <w:t>] Precision is the fraction of correctly predicted, positive results</w:t>
-      </w:r>
-      <w:r>
-        <w:t xml:space="preserve"> out of the sum of all positive predictions (true positives + false positives)</w:t>
-      </w:r>
-      <w:r>
-        <w:t xml:space="preserve">. This number is useful in situations where the false-positives outnumber the false-negatives. A high-precision value suggests that the model makes accurate positive predictions. </w:t>
-      </w:r>
-      <w:r>
-        <w:t>Recall on the other hand [</w:t>
-      </w:r>
-      <w:r>
-        <w:t>16</w:t>
-      </w:r>
-      <w:r>
-        <w:t>] indicates how well the classifier labels as positive, cases that are positive, showing the ability to correctly identify cases that are positive. This measure is also described as sensitivity.[</w:t>
-      </w:r>
-      <w:r>
-        <w:t>15</w:t>
-      </w:r>
-      <w:r>
-        <w:t xml:space="preserve">] the F1-Score is a measure of the test’s accuracy and is calculated from </w:t>
-      </w:r>
-      <w:r>
-        <w:t>the precision</w:t>
-      </w:r>
-      <w:r>
-        <w:t xml:space="preserve"> and recall of the test. </w:t>
-      </w:r>
-    </w:p>
-    <w:p>
-      <w:r>
+      </w:pPr>
+      <w:r>
+        <w:br w:type="page"/>
+      </w:r>
+    </w:p>
+    <w:p>
+      <w:pPr>
+        <w:pStyle w:val="Heading3"/>
+        <w:spacing w:line="360" w:lineRule="auto"/>
+      </w:pPr>
+      <w:bookmarkStart w:id="3" w:name="_Toc232887179"/>
+      <w:r>
+        <w:lastRenderedPageBreak/>
+        <w:t xml:space="preserve">Automated Speech Recognition (ASR), </w:t>
+      </w:r>
+      <w:r>
+        <w:t>Speech-To-Text</w:t>
+      </w:r>
+      <w:r>
+        <w:t xml:space="preserve"> (STT)</w:t>
+      </w:r>
+      <w:bookmarkEnd w:id="3"/>
+    </w:p>
+    <w:p>
+      <w:pPr>
+        <w:spacing w:line="360" w:lineRule="auto"/>
+      </w:pPr>
+    </w:p>
+    <w:p>
+      <w:pPr>
+        <w:spacing w:line="360" w:lineRule="auto"/>
+      </w:pPr>
+      <w:r>
+        <w:t xml:space="preserve">[1] for STT the system accepts an audio input signal from either a person or a machine and detects and converts individual words and phrases into text. </w:t>
+      </w:r>
+      <w:r>
+        <w:t xml:space="preserve">[2] Advances in deep learning technology has profoundly transformed automatic speech recognition (ASR) over the past decade. </w:t>
+      </w:r>
+      <w:r>
+        <w:t xml:space="preserve">Historically, ASR systems were constructed from a complex pipeline of independently trained components such an acoustic model (AM), a Gaussian Mixture Model-Hidden Markov Model (GMM-HMM), a pronunciation model (lexicon) and a language model (LM). Like early AES system, features had to be hand engineered, which was tedious and did not scale </w:t>
+      </w:r>
+      <w:r>
+        <w:t>well</w:t>
+      </w:r>
+      <w:r>
+        <w:t xml:space="preserve">. </w:t>
+      </w:r>
+    </w:p>
+    <w:p>
+      <w:pPr>
+        <w:spacing w:line="360" w:lineRule="auto"/>
+      </w:pPr>
+      <w:r>
+        <w:t xml:space="preserve"> </w:t>
+      </w:r>
+      <w:r>
+        <w:t>[3] described how three major research group</w:t>
+      </w:r>
+      <w:r>
+        <w:t>s</w:t>
+      </w:r>
+      <w:r>
+        <w:t xml:space="preserve">- Microsoft Research (MSR), Google and IBM Research, achieved significant improvements in a variety of state-of-the-art ASR systems by replacing GMMs with DNNs. </w:t>
+      </w:r>
+      <w:r>
+        <w:t>According to [2] the modern era of ASR is defined by firstly, a shift towards end-to-end</w:t>
+      </w:r>
+      <w:r>
+        <w:t xml:space="preserve"> </w:t>
+      </w:r>
+      <w:r>
+        <w:t>(E2E) models – system</w:t>
+      </w:r>
+      <w:r>
+        <w:t>s</w:t>
+      </w:r>
+      <w:r>
+        <w:t xml:space="preserve"> that learn a direct mapping from acoustic features to text using a single, jointly optimized neural network which simplifies training and improves performance.  </w:t>
+      </w:r>
+      <w:r>
+        <w:t>S</w:t>
+      </w:r>
+      <w:r>
+        <w:t xml:space="preserve">econdly, </w:t>
+      </w:r>
+      <w:r>
+        <w:t xml:space="preserve">a shift in </w:t>
+      </w:r>
+      <w:r>
+        <w:t xml:space="preserve">the </w:t>
+      </w:r>
+      <w:r>
+        <w:t xml:space="preserve">data paradigm. Early deep learning system used supervised learning to train on </w:t>
+      </w:r>
+      <w:r>
+        <w:t>large</w:t>
+      </w:r>
+      <w:r>
+        <w:t xml:space="preserve"> dataset of labelled data. Modern systems have moved towards unlabelled data. Self-</w:t>
+      </w:r>
+      <w:r>
+        <w:t>supervised</w:t>
+      </w:r>
+      <w:r>
+        <w:t xml:space="preserve"> systems have demonstrated the ability to learn </w:t>
+      </w:r>
+      <w:r>
+        <w:t xml:space="preserve">from raw audio data while weakly supervised systems have demonstrated the ability to generalise to data it was never trained on. </w:t>
+      </w:r>
+      <w:r>
+        <w:t xml:space="preserve"> </w:t>
+      </w:r>
+      <w:r>
+        <w:t xml:space="preserve">[4] </w:t>
+      </w:r>
+      <w:r>
+        <w:t>One such model that exemplifies this shift is OpenAI’s Whisper</w:t>
+      </w:r>
+      <w:r>
+        <w:t>, a transformer</w:t>
+      </w:r>
+      <w:r>
+        <w:t xml:space="preserve">. </w:t>
+      </w:r>
+      <w:r>
+        <w:t xml:space="preserve">[5] </w:t>
+      </w:r>
+      <w:r>
+        <w:t>For translation tasks, the Transformer can be trained significantly faster than architectures based</w:t>
+      </w:r>
+      <w:r>
+        <w:t xml:space="preserve"> </w:t>
+      </w:r>
+      <w:r>
+        <w:t>on recurrent or convolutional layers.</w:t>
+      </w:r>
+      <w:r>
+        <w:t xml:space="preserve"> </w:t>
+      </w:r>
+      <w:r>
+        <w:t xml:space="preserve">The Wisper model trained on an enormous dataset of with 680,000 hours of labelled audio. </w:t>
+      </w:r>
+      <w:r>
+        <w:t>Whisper transcribed 950 out of 1000 words correctly in research carried out by [</w:t>
+      </w:r>
+      <w:r>
+        <w:t>6</w:t>
+      </w:r>
+      <w:r>
+        <w:t xml:space="preserve">] achieving 95% accuracy. </w:t>
+      </w:r>
+      <w:r>
+        <w:t xml:space="preserve">The model’s integration into classroom technology effectively supports students with diverse linguistic, cultural, and ability-based needs. Achieving high accuracy and frequency responsiveness. Whisper is a valuable tool for educators seeking to foster a more accessible learning </w:t>
+      </w:r>
+      <w:r>
+        <w:t>environment</w:t>
+      </w:r>
+      <w:r>
+        <w:t xml:space="preserve"> [6</w:t>
+      </w:r>
+      <w:r>
+        <w:t>]</w:t>
+      </w:r>
+      <w:r>
+        <w:t>.</w:t>
+      </w:r>
+    </w:p>
+    <w:p>
+      <w:pPr>
         <w:rPr>
           <w:highlight w:val="yellow"/>
         </w:rPr>
-        <w:t>Compare them using WER (word error rate) or (</w:t>
-      </w:r>
+      </w:pPr>
       <w:r>
         <w:rPr>
           <w:highlight w:val="yellow"/>
         </w:rPr>
-        <w:t>Character</w:t>
-      </w:r>
-      <w:r>
-        <w:rPr>
-          <w:highlight w:val="yellow"/>
-        </w:rPr>
-        <w:t xml:space="preserve"> error rate</w:t>
-      </w:r>
-      <w:r>
-        <w:t>)</w:t>
-      </w:r>
-      <w:r>
-        <w:t xml:space="preserve"> </w:t>
-      </w:r>
-      <w:r>
-        <w:t xml:space="preserve">check [17] </w:t>
+        <w:br w:type="page"/>
       </w:r>
     </w:p>
     <w:p>
       <w:pPr>
         <w:pStyle w:val="Heading2"/>
       </w:pPr>
-    </w:p>
-    <w:p>
-      <w:pPr>
-        <w:pStyle w:val="Heading3"/>
-      </w:pPr>
-      <w:bookmarkStart w:id="3" w:name="_Toc232841534"/>
-      <w:r>
-        <w:t>Speech-To-Text</w:t>
-      </w:r>
-      <w:r>
-        <w:t xml:space="preserve"> (STT)</w:t>
-      </w:r>
-      <w:bookmarkEnd w:id="3"/>
-    </w:p>
-    <w:p>
-      <w:r>
-        <w:t>What is a speech-to-text system?</w:t>
-      </w:r>
-    </w:p>
-    <w:p>
-      <w:r>
-        <w:t xml:space="preserve">[1] for STT the system accepts an audio input signal from either a person or a machine and detects and converts individual words and phrases into text. </w:t>
-      </w:r>
-    </w:p>
-    <w:p>
-      <w:r>
-        <w:t>What is the performance of current speech-to-text models?</w:t>
-      </w:r>
-    </w:p>
-    <w:p>
-      <w:r>
-        <w:t>What metrics do speech-to-text models use?</w:t>
-      </w:r>
-    </w:p>
-    <w:p>
-      <w:r>
-        <w:t>What are the limitations of speech-to-text models?</w:t>
-      </w:r>
-    </w:p>
-    <w:p>
-      <w:r>
-        <w:t xml:space="preserve">Why that speech-to-text-model? </w:t>
-      </w:r>
-      <w:r>
-        <w:t>Get literature comparing model performance</w:t>
-      </w:r>
-    </w:p>
-    <w:p>
-      <w:r>
-        <w:t>OpenAI whisper (</w:t>
-      </w:r>
-      <w:proofErr w:type="spellStart"/>
-      <w:r>
-        <w:t>academeic</w:t>
-      </w:r>
-      <w:proofErr w:type="spellEnd"/>
-      <w:r>
-        <w:t xml:space="preserve"> gold standard), NVIDIA Canary-</w:t>
-      </w:r>
-      <w:proofErr w:type="gramStart"/>
-      <w:r>
-        <w:t>Queen(</w:t>
-      </w:r>
-      <w:proofErr w:type="gramEnd"/>
-      <w:r>
-        <w:t>best for raw English accuracy), Distil-Whisper – (Best for low-Resource hardware)</w:t>
-      </w:r>
-    </w:p>
-    <w:p/>
-    <w:p/>
-    <w:p>
+      <w:bookmarkStart w:id="4" w:name="_Toc232887180"/>
       <w:r>
         <w:lastRenderedPageBreak/>
-        <w:t>Integration of pretrained models</w:t>
-      </w:r>
-    </w:p>
-    <w:p>
-      <w:r>
-        <w:t xml:space="preserve">Limitations of AES, QWK, OCR, STT, </w:t>
-      </w:r>
-    </w:p>
-    <w:p/>
-    <w:p>
-      <w:r>
-        <w:t>Evaluation plan</w:t>
-      </w:r>
-    </w:p>
-    <w:p>
-      <w:r>
-        <w:t>Does it upload essays in various formats?</w:t>
-      </w:r>
-    </w:p>
-    <w:p>
-      <w:r>
-        <w:t xml:space="preserve">Does </w:t>
-      </w:r>
-      <w:proofErr w:type="spellStart"/>
-      <w:r>
-        <w:t>ocr</w:t>
-      </w:r>
-      <w:proofErr w:type="spellEnd"/>
-      <w:r>
-        <w:t xml:space="preserve"> work? What is the output? What is the </w:t>
-      </w:r>
-      <w:proofErr w:type="spellStart"/>
-      <w:r>
-        <w:t>wer</w:t>
-      </w:r>
-      <w:proofErr w:type="spellEnd"/>
-      <w:r>
-        <w:t xml:space="preserve"> and </w:t>
-      </w:r>
-      <w:proofErr w:type="spellStart"/>
-      <w:r>
-        <w:t>cer</w:t>
-      </w:r>
-      <w:proofErr w:type="spellEnd"/>
-      <w:r>
-        <w:t>?</w:t>
-      </w:r>
-    </w:p>
-    <w:p>
-      <w:r>
-        <w:t xml:space="preserve">Does the </w:t>
-      </w:r>
-      <w:proofErr w:type="spellStart"/>
-      <w:r>
-        <w:t>stt</w:t>
-      </w:r>
-      <w:proofErr w:type="spellEnd"/>
-      <w:r>
-        <w:t xml:space="preserve"> work, what is the output, what is the error rate?</w:t>
-      </w:r>
-    </w:p>
-    <w:p>
-      <w:r>
-        <w:t xml:space="preserve">Does the </w:t>
-      </w:r>
-      <w:proofErr w:type="spellStart"/>
-      <w:r>
-        <w:t>aes</w:t>
-      </w:r>
-      <w:proofErr w:type="spellEnd"/>
-      <w:r>
-        <w:t xml:space="preserve"> work, does it output a holistic score, doe it output trait scores?</w:t>
-      </w:r>
-    </w:p>
-    <w:p/>
-    <w:p>
-      <w:r>
-        <w:t>How to mitigate against OCR and STT input errors to AES</w:t>
-      </w:r>
-      <w:r>
-        <w:br w:type="page"/>
-      </w:r>
-    </w:p>
-    <w:p>
-      <w:r>
-        <w:lastRenderedPageBreak/>
-        <w:t xml:space="preserve">Design </w:t>
-      </w:r>
-    </w:p>
-    <w:p>
-      <w:r>
-        <w:t>Website front end</w:t>
-      </w:r>
-    </w:p>
-    <w:p>
-      <w:r>
-        <w:t xml:space="preserve">Logic – </w:t>
-      </w:r>
-      <w:proofErr w:type="spellStart"/>
-      <w:r>
-        <w:t>aes</w:t>
-      </w:r>
-      <w:proofErr w:type="spellEnd"/>
-      <w:r>
-        <w:t xml:space="preserve">, </w:t>
-      </w:r>
-      <w:proofErr w:type="spellStart"/>
-      <w:r>
-        <w:t>ocr</w:t>
-      </w:r>
-      <w:proofErr w:type="spellEnd"/>
-      <w:r>
-        <w:t xml:space="preserve">, </w:t>
-      </w:r>
-      <w:proofErr w:type="spellStart"/>
-      <w:r>
-        <w:t>stt</w:t>
-      </w:r>
-      <w:proofErr w:type="spellEnd"/>
-    </w:p>
-    <w:p>
-      <w:r>
-        <w:t>Back end – db (might not be necessary as the performance is all that matters)</w:t>
-      </w:r>
-    </w:p>
-    <w:p>
-      <w:r>
-        <w:br w:type="page"/>
-      </w:r>
-    </w:p>
-    <w:p>
-      <w:pPr>
-        <w:pStyle w:val="Heading2"/>
-      </w:pPr>
-      <w:bookmarkStart w:id="4" w:name="_Toc232841535"/>
-      <w:r>
-        <w:lastRenderedPageBreak/>
-        <w:t>Feature Prototype</w:t>
+        <w:t>Multimodal</w:t>
       </w:r>
       <w:bookmarkEnd w:id="4"/>
+    </w:p>
+    <w:p>
+      <w:pPr>
+        <w:spacing w:line="360" w:lineRule="auto"/>
+      </w:pPr>
+    </w:p>
+    <w:p>
+      <w:pPr>
+        <w:spacing w:line="360" w:lineRule="auto"/>
+      </w:pPr>
+      <w:r>
+        <w:t xml:space="preserve">A search of </w:t>
+      </w:r>
+      <w:r>
+        <w:t>Google Scholar, IEEExplore and querying current AI applications like ChatGPT and Gemini with search strings like “multimodal AES” and “accessible multimodal AES” reveals that such systems are still quite rare. This presents a gap revealing that most AES systems ignore input equity. This research intends to fill this gap by implementing an accessible, interpretable, hybrid, multimodal AES system</w:t>
+      </w:r>
+      <w:r>
+        <w:t xml:space="preserve"> by orchestrating three pre-trained models – an OCR, ASR and a transformer model. </w:t>
+      </w:r>
+    </w:p>
+    <w:p>
+      <w:pPr>
+        <w:spacing w:line="360" w:lineRule="auto"/>
+      </w:pPr>
+      <w:r>
+        <w:t>[1] propose</w:t>
+      </w:r>
+      <w:r>
+        <w:t>d</w:t>
+      </w:r>
+      <w:r>
+        <w:t xml:space="preserve"> a multimodal AES system that uses a MLLM to process graphics e.g. a scenery along with text. This system although multimodal, is still not accessible and like other AES systems ignores input equity. The system proposed here orchestrates a transform model for AES which has the same capability of the system proposed by [1] – they orchestrate GPT-4o, as the MLLM. The dataset uses for their experiment is limited in that it does not cover complex visual inputs such as film frames. </w:t>
+      </w:r>
+      <w:r>
+        <w:t xml:space="preserve">[2] proposed a bi-modal system the orchestrated three pretrained transformer models. This </w:t>
+      </w:r>
+      <w:r>
+        <w:t>system’s architecture is more congruent with w</w:t>
+      </w:r>
+      <w:r>
+        <w:t>hat is being proposed in this research – a</w:t>
+      </w:r>
+      <w:r>
+        <w:t>n</w:t>
+      </w:r>
+      <w:r>
+        <w:t xml:space="preserve"> OCR model to convert text from scanned essays to </w:t>
+      </w:r>
+      <w:r>
+        <w:t xml:space="preserve">digital text for processing, and a transformer model for essay scoring. </w:t>
+      </w:r>
+    </w:p>
+    <w:p>
+      <w:pPr>
+        <w:spacing w:line="360" w:lineRule="auto"/>
+      </w:pPr>
+    </w:p>
+    <w:p>
+      <w:pPr>
+        <w:spacing w:line="360" w:lineRule="auto"/>
+      </w:pPr>
+      <w:r>
+        <w:t>To do:</w:t>
+      </w:r>
+    </w:p>
+    <w:p>
+      <w:pPr>
+        <w:pStyle w:val="ListParagraph"/>
+        <w:numPr>
+          <w:ilvl w:val="0"/>
+          <w:numId w:val="3"/>
+        </w:numPr>
+        <w:spacing w:line="360" w:lineRule="auto"/>
+      </w:pPr>
+      <w:r>
+        <w:t>Add more example systems for comparison/critique to this section</w:t>
+      </w:r>
+    </w:p>
+    <w:p>
+      <w:pPr>
+        <w:pStyle w:val="ListParagraph"/>
+        <w:numPr>
+          <w:ilvl w:val="0"/>
+          <w:numId w:val="3"/>
+        </w:numPr>
+        <w:spacing w:line="360" w:lineRule="auto"/>
+      </w:pPr>
+      <w:r>
+        <w:t>Speak about integration, benefits and drawbacks</w:t>
+      </w:r>
+    </w:p>
+    <w:p>
+      <w:pPr>
+        <w:pStyle w:val="ListParagraph"/>
+        <w:numPr>
+          <w:ilvl w:val="0"/>
+          <w:numId w:val="3"/>
+        </w:numPr>
+        <w:spacing w:line="360" w:lineRule="auto"/>
+      </w:pPr>
+      <w:r>
+        <w:t>Outline pipeline with diagrams</w:t>
+      </w:r>
+    </w:p>
+    <w:p>
+      <w:pPr>
+        <w:pStyle w:val="ListParagraph"/>
+        <w:numPr>
+          <w:ilvl w:val="0"/>
+          <w:numId w:val="3"/>
+        </w:numPr>
+        <w:spacing w:line="360" w:lineRule="auto"/>
+      </w:pPr>
+      <w:r>
+        <w:t>Talk about errors from ocr and asr and impact on aes</w:t>
+      </w:r>
+    </w:p>
+    <w:p>
+      <w:pPr>
+        <w:pStyle w:val="ListParagraph"/>
+        <w:numPr>
+          <w:ilvl w:val="0"/>
+          <w:numId w:val="3"/>
+        </w:numPr>
+        <w:spacing w:line="360" w:lineRule="auto"/>
+      </w:pPr>
+      <w:r>
+        <w:t>Specify transformer model, limitations and adv</w:t>
+      </w:r>
+    </w:p>
+    <w:p>
+      <w:pPr>
+        <w:pStyle w:val="ListParagraph"/>
+        <w:numPr>
+          <w:ilvl w:val="0"/>
+          <w:numId w:val="3"/>
+        </w:numPr>
+        <w:spacing w:line="360" w:lineRule="auto"/>
+      </w:pPr>
+      <w:r>
+        <w:t>Specify ocr model, limitations and so on</w:t>
+      </w:r>
+    </w:p>
+    <w:p>
+      <w:pPr>
+        <w:pStyle w:val="ListParagraph"/>
+        <w:numPr>
+          <w:ilvl w:val="0"/>
+          <w:numId w:val="3"/>
+        </w:numPr>
+        <w:spacing w:line="360" w:lineRule="auto"/>
+      </w:pPr>
+      <w:r>
+        <w:t>Specify asr model, limitation and so on</w:t>
+      </w:r>
+    </w:p>
+    <w:p>
+      <w:pPr>
+        <w:pStyle w:val="ListParagraph"/>
+        <w:numPr>
+          <w:ilvl w:val="0"/>
+          <w:numId w:val="3"/>
+        </w:numPr>
+        <w:spacing w:line="360" w:lineRule="auto"/>
+      </w:pPr>
+      <w:r>
+        <w:t>Specify dataset and critique it</w:t>
+      </w:r>
+    </w:p>
+    <w:p>
+      <w:pPr>
+        <w:pStyle w:val="ListParagraph"/>
+        <w:spacing w:line="360" w:lineRule="auto"/>
+      </w:pPr>
     </w:p>
     <w:p>
       <w:pPr>
@@ -1687,23 +2031,8 @@
           <w:szCs w:val="32"/>
         </w:rPr>
       </w:pPr>
-      <w:proofErr w:type="spellStart"/>
-      <w:r>
-        <w:t>Aes</w:t>
-      </w:r>
-      <w:proofErr w:type="spellEnd"/>
-      <w:r>
-        <w:t xml:space="preserve">, transformer model outputting score after </w:t>
-      </w:r>
-      <w:proofErr w:type="spellStart"/>
-      <w:r>
-        <w:t>ocr</w:t>
-      </w:r>
-      <w:proofErr w:type="spellEnd"/>
-      <w:r>
-        <w:t xml:space="preserve"> inputs essay</w:t>
-      </w:r>
-      <w:r>
+      <w:r>
+        <w:lastRenderedPageBreak/>
         <w:br w:type="page"/>
       </w:r>
     </w:p>
@@ -1711,14 +2040,563 @@
       <w:pPr>
         <w:pStyle w:val="Heading2"/>
       </w:pPr>
-      <w:bookmarkStart w:id="5" w:name="_Toc232841536"/>
+      <w:bookmarkStart w:id="5" w:name="_Toc232887181"/>
+      <w:r>
+        <w:lastRenderedPageBreak/>
+        <w:t>Evaluation plan</w:t>
+      </w:r>
+      <w:bookmarkEnd w:id="5"/>
+    </w:p>
+    <w:p/>
+    <w:p>
+      <w:r>
+        <w:t xml:space="preserve">To evaluate the performance of the system </w:t>
+      </w:r>
+      <w:r>
+        <w:t>the following approach will be used:</w:t>
+      </w:r>
+    </w:p>
+    <w:p>
+      <w:r>
+        <w:rPr>
+          <w:b/>
+          <w:bCs/>
+        </w:rPr>
+        <w:t>OCR</w:t>
+      </w:r>
+      <w:r>
+        <w:t xml:space="preserve"> – the output from the OCR component will be text. The WER and CER will be used to evaluate the performance of this component</w:t>
+      </w:r>
+    </w:p>
+    <w:p>
+      <w:r>
+        <w:rPr>
+          <w:b/>
+          <w:bCs/>
+        </w:rPr>
+        <w:t>ASR</w:t>
+      </w:r>
+      <w:r>
+        <w:t>- the WER and CER and latency will be used to evaluate this component</w:t>
+      </w:r>
+    </w:p>
+    <w:p>
+      <w:r>
+        <w:rPr>
+          <w:b/>
+          <w:bCs/>
+        </w:rPr>
+        <w:t>AES</w:t>
+      </w:r>
+      <w:r>
+        <w:t xml:space="preserve"> – the QWK will be used to describe proximity of the system’s scores to that of human scorers. </w:t>
+      </w:r>
+    </w:p>
+    <w:p>
+      <w:pPr>
+        <w:spacing w:line="360" w:lineRule="auto"/>
+        <w:rPr>
+          <w:b/>
+          <w:bCs/>
+        </w:rPr>
+      </w:pPr>
+    </w:p>
+    <w:p>
+      <w:pPr>
+        <w:spacing w:line="360" w:lineRule="auto"/>
+        <w:rPr>
+          <w:b/>
+          <w:bCs/>
+        </w:rPr>
+      </w:pPr>
+      <w:r>
+        <w:rPr>
+          <w:b/>
+          <w:bCs/>
+        </w:rPr>
+        <w:t>Metrics</w:t>
+      </w:r>
+    </w:p>
+    <w:p>
+      <w:pPr>
+        <w:spacing w:line="360" w:lineRule="auto"/>
+        <w:rPr>
+          <w:b/>
+          <w:bCs/>
+        </w:rPr>
+      </w:pPr>
+      <w:r>
+        <w:rPr>
+          <w:b/>
+          <w:bCs/>
+        </w:rPr>
+        <w:t>Accuracy and Precision</w:t>
+      </w:r>
+    </w:p>
+    <w:p>
+      <w:pPr>
+        <w:spacing w:line="360" w:lineRule="auto"/>
+      </w:pPr>
+      <w:r>
+        <w:t xml:space="preserve">Accuracy rate is a measure of the number of correct classifications over the entire test set, indicating the strength of the classifier [14]. [15] Precision is the fraction of correctly predicted, positive results out of the sum of all positive predictions (true positives + false positives). This number is useful in situations where the false-positives outnumber the false-negatives. A high-precision value suggests that the model makes accurate positive predictions. Recall on the other hand [16] indicates how well the classifier labels as positive, cases that are positive, showing the ability to correctly identify cases that are positive. This measure is also described as sensitivity.[15] the F1-Score is a measure of the test’s accuracy and is calculated from the precision and recall of the test. </w:t>
+      </w:r>
+    </w:p>
+    <w:p>
+      <w:pPr>
+        <w:spacing w:line="360" w:lineRule="auto"/>
+        <w:rPr>
+          <w:b/>
+          <w:bCs/>
+        </w:rPr>
+      </w:pPr>
+      <w:r>
+        <w:rPr>
+          <w:b/>
+          <w:bCs/>
+        </w:rPr>
+        <w:t>Word Error Rate (WER)</w:t>
+      </w:r>
+    </w:p>
+    <w:p>
+      <w:pPr>
+        <w:spacing w:line="360" w:lineRule="auto"/>
+      </w:pPr>
+      <w:r>
+        <w:t xml:space="preserve">[17] </w:t>
+      </w:r>
+      <w:r>
+        <w:t xml:space="preserve">The WER metric is used to measure the percentage of words that are incorrectly recognized or translated by the OCR Engine compared to a reference (ground truth) text. </w:t>
+      </w:r>
+    </w:p>
+    <w:p>
+      <w:pPr>
+        <w:spacing w:line="360" w:lineRule="auto"/>
+        <w:rPr>
+          <w:rFonts w:eastAsiaTheme="minorEastAsia"/>
+        </w:rPr>
+      </w:pPr>
+      <w:r>
+        <w:t xml:space="preserve">The WER equation is as follows: WER = </w:t>
+      </w:r>
+      <m:oMath>
+        <m:f>
+          <m:fPr>
+            <m:ctrlPr>
+              <w:rPr>
+                <w:rFonts w:ascii="Cambria Math" w:hAnsi="Cambria Math"/>
+                <w:i/>
+              </w:rPr>
+            </m:ctrlPr>
+          </m:fPr>
+          <m:num>
+            <m:r>
+              <w:rPr>
+                <w:rFonts w:ascii="Cambria Math" w:hAnsi="Cambria Math"/>
+              </w:rPr>
+              <m:t>S+D+I</m:t>
+            </m:r>
+          </m:num>
+          <m:den>
+            <m:sSub>
+              <m:sSubPr>
+                <m:ctrlPr>
+                  <w:rPr>
+                    <w:rFonts w:ascii="Cambria Math" w:hAnsi="Cambria Math"/>
+                    <w:i/>
+                  </w:rPr>
+                </m:ctrlPr>
+              </m:sSubPr>
+              <m:e>
+                <m:r>
+                  <w:rPr>
+                    <w:rFonts w:ascii="Cambria Math" w:hAnsi="Cambria Math"/>
+                  </w:rPr>
+                  <m:t>N</m:t>
+                </m:r>
+              </m:e>
+              <m:sub>
+                <m:r>
+                  <w:rPr>
+                    <w:rFonts w:ascii="Cambria Math" w:hAnsi="Cambria Math"/>
+                  </w:rPr>
+                  <m:t>W</m:t>
+                </m:r>
+              </m:sub>
+            </m:sSub>
+          </m:den>
+        </m:f>
+        <m:r>
+          <w:rPr>
+            <w:rFonts w:ascii="Cambria Math" w:hAnsi="Cambria Math"/>
+          </w:rPr>
+          <m:t>*100</m:t>
+        </m:r>
+      </m:oMath>
+      <w:r>
+        <w:rPr>
+          <w:rFonts w:eastAsiaTheme="minorEastAsia"/>
+        </w:rPr>
+        <w:t>, where:</w:t>
+      </w:r>
+    </w:p>
+    <w:p>
+      <w:pPr>
+        <w:spacing w:line="360" w:lineRule="auto"/>
+        <w:rPr>
+          <w:rFonts w:eastAsiaTheme="minorEastAsia"/>
+        </w:rPr>
+      </w:pPr>
+      <w:r>
+        <w:rPr>
+          <w:rFonts w:eastAsiaTheme="minorEastAsia"/>
+          <w:b/>
+          <w:bCs/>
+        </w:rPr>
+        <w:t>S</w:t>
+      </w:r>
+      <w:r>
+        <w:rPr>
+          <w:rFonts w:eastAsiaTheme="minorEastAsia"/>
+        </w:rPr>
+        <w:t xml:space="preserve"> = number of word substitutions (words in the recognized text that are different from the ground truth)</w:t>
+      </w:r>
+    </w:p>
+    <w:p>
+      <w:pPr>
+        <w:spacing w:line="360" w:lineRule="auto"/>
+        <w:rPr>
+          <w:rFonts w:eastAsiaTheme="minorEastAsia"/>
+        </w:rPr>
+      </w:pPr>
+      <w:r>
+        <w:rPr>
+          <w:rFonts w:eastAsiaTheme="minorEastAsia"/>
+          <w:b/>
+          <w:bCs/>
+        </w:rPr>
+        <w:lastRenderedPageBreak/>
+        <w:t>D</w:t>
+      </w:r>
+      <w:r>
+        <w:rPr>
+          <w:rFonts w:eastAsiaTheme="minorEastAsia"/>
+        </w:rPr>
+        <w:t xml:space="preserve"> = number of word deletions (words missing in the recognized text but present in the ground truth text)</w:t>
+      </w:r>
+    </w:p>
+    <w:p>
+      <w:pPr>
+        <w:spacing w:line="360" w:lineRule="auto"/>
+      </w:pPr>
+      <w:r>
+        <w:rPr>
+          <w:rFonts w:eastAsiaTheme="minorEastAsia"/>
+          <w:b/>
+          <w:bCs/>
+        </w:rPr>
+        <w:t>I</w:t>
+      </w:r>
+      <w:r>
+        <w:rPr>
+          <w:rFonts w:eastAsiaTheme="minorEastAsia"/>
+        </w:rPr>
+        <w:t xml:space="preserve"> = number of word insertions (extra words present in the recognized text but not in the ground truth text)</w:t>
+      </w:r>
+    </w:p>
+    <w:p>
+      <w:pPr>
+        <w:spacing w:line="360" w:lineRule="auto"/>
+        <w:rPr>
+          <w:b/>
+          <w:bCs/>
+        </w:rPr>
+      </w:pPr>
+      <w:r>
+        <w:rPr>
+          <w:b/>
+          <w:bCs/>
+        </w:rPr>
+        <w:t>Character Error Rate (CER)</w:t>
+      </w:r>
+    </w:p>
+    <w:p>
+      <w:pPr>
+        <w:spacing w:line="360" w:lineRule="auto"/>
+      </w:pPr>
+      <w:r>
+        <w:t xml:space="preserve">[18] this metric counts any deletions, insertions or substitutions at the character level, enabling evaluation based on character-wise accuracy. CER works well in spotting symbol, typographical and abbreviation mistakes. </w:t>
+      </w:r>
+    </w:p>
+    <w:p>
+      <w:pPr>
+        <w:spacing w:line="360" w:lineRule="auto"/>
+      </w:pPr>
+      <w:r>
+        <w:t>[</w:t>
+      </w:r>
+      <w:r>
+        <w:t>17] The</w:t>
+      </w:r>
+      <w:r>
+        <w:t xml:space="preserve"> formula is as follows: </w:t>
+      </w:r>
+    </w:p>
+    <w:p>
+      <w:pPr>
+        <w:spacing w:line="360" w:lineRule="auto"/>
+      </w:pPr>
+      <w:r>
+        <w:t>C</w:t>
+      </w:r>
+      <w:r>
+        <w:t xml:space="preserve">ER = </w:t>
+      </w:r>
+      <m:oMath>
+        <m:f>
+          <m:fPr>
+            <m:ctrlPr>
+              <w:rPr>
+                <w:rFonts w:ascii="Cambria Math" w:hAnsi="Cambria Math"/>
+                <w:i/>
+              </w:rPr>
+            </m:ctrlPr>
+          </m:fPr>
+          <m:num>
+            <m:r>
+              <w:rPr>
+                <w:rFonts w:ascii="Cambria Math" w:hAnsi="Cambria Math"/>
+              </w:rPr>
+              <m:t>CRC</m:t>
+            </m:r>
+          </m:num>
+          <m:den>
+            <m:sSub>
+              <m:sSubPr>
+                <m:ctrlPr>
+                  <w:rPr>
+                    <w:rFonts w:ascii="Cambria Math" w:hAnsi="Cambria Math"/>
+                    <w:i/>
+                  </w:rPr>
+                </m:ctrlPr>
+              </m:sSubPr>
+              <m:e>
+                <m:r>
+                  <w:rPr>
+                    <w:rFonts w:ascii="Cambria Math" w:hAnsi="Cambria Math"/>
+                  </w:rPr>
+                  <m:t>N</m:t>
+                </m:r>
+              </m:e>
+              <m:sub>
+                <m:r>
+                  <w:rPr>
+                    <w:rFonts w:ascii="Cambria Math" w:hAnsi="Cambria Math"/>
+                  </w:rPr>
+                  <m:t>C</m:t>
+                </m:r>
+              </m:sub>
+            </m:sSub>
+          </m:den>
+        </m:f>
+        <m:r>
+          <w:rPr>
+            <w:rFonts w:ascii="Cambria Math" w:hAnsi="Cambria Math"/>
+          </w:rPr>
+          <m:t>*100</m:t>
+        </m:r>
+      </m:oMath>
+      <w:r>
+        <w:rPr>
+          <w:rFonts w:eastAsiaTheme="minorEastAsia"/>
+        </w:rPr>
+        <w:t>, where:</w:t>
+      </w:r>
+    </w:p>
+    <w:p>
+      <w:pPr>
+        <w:pStyle w:val="ListParagraph"/>
+        <w:numPr>
+          <w:ilvl w:val="0"/>
+          <w:numId w:val="2"/>
+        </w:numPr>
+        <w:spacing w:line="360" w:lineRule="auto"/>
+      </w:pPr>
+      <w:r>
+        <w:t>CRC = number of correctly recognized characters</w:t>
+      </w:r>
+    </w:p>
+    <w:p>
+      <w:pPr>
+        <w:pStyle w:val="ListParagraph"/>
+        <w:numPr>
+          <w:ilvl w:val="0"/>
+          <w:numId w:val="2"/>
+        </w:numPr>
+        <w:spacing w:line="360" w:lineRule="auto"/>
+      </w:pPr>
+      <w:r>
+        <w:t>N</w:t>
+      </w:r>
+      <w:r>
+        <w:rPr>
+          <w:vertAlign w:val="subscript"/>
+        </w:rPr>
+        <w:t>C</w:t>
+      </w:r>
+      <w:r>
+        <w:t xml:space="preserve"> = total number of characters in the ground truth text </w:t>
+      </w:r>
+    </w:p>
+    <w:p>
+      <w:pPr>
+        <w:spacing w:line="360" w:lineRule="auto"/>
+      </w:pPr>
+      <w:r>
+        <w:t>What metrics do speech-to-text models use?</w:t>
+      </w:r>
+    </w:p>
+    <w:p>
+      <w:pPr>
+        <w:spacing w:line="360" w:lineRule="auto"/>
+      </w:pPr>
+      <w:r>
+        <w:t>What are the limitations of speech-to-text models?</w:t>
+      </w:r>
+    </w:p>
+    <w:p>
+      <w:pPr>
+        <w:spacing w:line="360" w:lineRule="auto"/>
+      </w:pPr>
+      <w:r>
+        <w:t>Why that speech-to-text-model? Get literature comparing model performance</w:t>
+      </w:r>
+    </w:p>
+    <w:p>
+      <w:pPr>
+        <w:spacing w:line="360" w:lineRule="auto"/>
+      </w:pPr>
+      <w:r>
+        <w:t>OpenAI whisper (academeic gold standard), NVIDIA Canary-Queen(best for raw English accuracy), Distil-Whisper – (Best for low-Resource hardware)</w:t>
+      </w:r>
+    </w:p>
+    <w:p>
+      <w:pPr>
+        <w:spacing w:line="360" w:lineRule="auto"/>
+      </w:pPr>
+    </w:p>
+    <w:p>
+      <w:pPr>
+        <w:spacing w:line="360" w:lineRule="auto"/>
+      </w:pPr>
+      <w:r>
+        <w:t>How to mitigate against OCR and STT input errors to AES</w:t>
+      </w:r>
+      <w:r>
+        <w:br w:type="page"/>
+      </w:r>
+    </w:p>
+    <w:p>
+      <w:pPr>
+        <w:pStyle w:val="Heading2"/>
+      </w:pPr>
+      <w:bookmarkStart w:id="6" w:name="_Toc232887182"/>
+      <w:r>
+        <w:lastRenderedPageBreak/>
+        <w:t>Design</w:t>
+      </w:r>
+      <w:bookmarkEnd w:id="6"/>
+      <w:r>
+        <w:t xml:space="preserve"> </w:t>
+      </w:r>
+    </w:p>
+    <w:p/>
+    <w:p>
+      <w:pPr>
+        <w:spacing w:line="360" w:lineRule="auto"/>
+      </w:pPr>
+      <w:r>
+        <w:t>Website front end</w:t>
+      </w:r>
+    </w:p>
+    <w:p>
+      <w:pPr>
+        <w:spacing w:line="360" w:lineRule="auto"/>
+      </w:pPr>
+      <w:r>
+        <w:t>Logic – aes, ocr, stt</w:t>
+      </w:r>
+    </w:p>
+    <w:p>
+      <w:pPr>
+        <w:spacing w:line="360" w:lineRule="auto"/>
+      </w:pPr>
+      <w:r>
+        <w:t>Back end – db (might not be necessary as the performance is all that matters)</w:t>
+      </w:r>
+    </w:p>
+    <w:p>
+      <w:pPr>
+        <w:spacing w:line="360" w:lineRule="auto"/>
+      </w:pPr>
+      <w:r>
+        <w:t>Integration of pretrained models</w:t>
+      </w:r>
+    </w:p>
+    <w:p>
+      <w:pPr>
+        <w:spacing w:line="360" w:lineRule="auto"/>
+      </w:pPr>
+      <w:r>
+        <w:br w:type="page"/>
+      </w:r>
+    </w:p>
+    <w:p>
+      <w:pPr>
+        <w:pStyle w:val="Heading2"/>
+        <w:spacing w:line="360" w:lineRule="auto"/>
+      </w:pPr>
+      <w:bookmarkStart w:id="7" w:name="_Toc232887183"/>
+      <w:r>
+        <w:lastRenderedPageBreak/>
+        <w:t>Feature Prototype</w:t>
+      </w:r>
+      <w:bookmarkEnd w:id="7"/>
+    </w:p>
+    <w:p/>
+    <w:p>
+      <w:pPr>
+        <w:spacing w:line="360" w:lineRule="auto"/>
+        <w:rPr>
+          <w:rFonts w:asciiTheme="majorHAnsi" w:eastAsiaTheme="majorEastAsia" w:hAnsiTheme="majorHAnsi" w:cstheme="majorBidi"/>
+          <w:color w:val="0F4761" w:themeColor="accent1" w:themeShade="BF"/>
+          <w:sz w:val="32"/>
+          <w:szCs w:val="32"/>
+        </w:rPr>
+      </w:pPr>
+      <w:r>
+        <w:t>Aes, transformer model outputting score after ocr inputs essay</w:t>
+      </w:r>
+      <w:r>
+        <w:br w:type="page"/>
+      </w:r>
+    </w:p>
+    <w:p>
+      <w:pPr>
+        <w:pStyle w:val="Heading2"/>
+        <w:spacing w:line="360" w:lineRule="auto"/>
+      </w:pPr>
+      <w:bookmarkStart w:id="8" w:name="_Toc232887184"/>
       <w:r>
         <w:lastRenderedPageBreak/>
         <w:t>REFERENCE LIST</w:t>
       </w:r>
-      <w:bookmarkEnd w:id="5"/>
-    </w:p>
-    <w:p/>
+      <w:bookmarkEnd w:id="8"/>
+    </w:p>
+    <w:p>
+      <w:pPr>
+        <w:spacing w:line="360" w:lineRule="auto"/>
+      </w:pPr>
+    </w:p>
     <w:sectPr>
       <w:footerReference w:type="default" r:id="rId8"/>
       <w:pgSz w:w="11906" w:h="16838"/>
@@ -1936,8 +2814,240 @@
       </w:pPr>
     </w:lvl>
   </w:abstractNum>
+  <w:abstractNum w:abstractNumId="1" w15:restartNumberingAfterBreak="0">
+    <w:nsid w:val="65DE470F"/>
+    <w:multiLevelType w:val="hybridMultilevel"/>
+    <w:tmpl w:val="B78E431A"/>
+    <w:lvl w:ilvl="0" w:tplc="08090001">
+      <w:start w:val="1"/>
+      <w:numFmt w:val="bullet"/>
+      <w:lvlText w:val=""/>
+      <w:lvlJc w:val="left"/>
+      <w:pPr>
+        <w:ind w:left="720" w:hanging="360"/>
+      </w:pPr>
+      <w:rPr>
+        <w:rFonts w:ascii="Symbol" w:hAnsi="Symbol" w:hint="default"/>
+      </w:rPr>
+    </w:lvl>
+    <w:lvl w:ilvl="1" w:tplc="08090003" w:tentative="1">
+      <w:start w:val="1"/>
+      <w:numFmt w:val="bullet"/>
+      <w:lvlText w:val="o"/>
+      <w:lvlJc w:val="left"/>
+      <w:pPr>
+        <w:ind w:left="1440" w:hanging="360"/>
+      </w:pPr>
+      <w:rPr>
+        <w:rFonts w:ascii="Courier New" w:hAnsi="Courier New" w:cs="Courier New" w:hint="default"/>
+      </w:rPr>
+    </w:lvl>
+    <w:lvl w:ilvl="2" w:tplc="08090005" w:tentative="1">
+      <w:start w:val="1"/>
+      <w:numFmt w:val="bullet"/>
+      <w:lvlText w:val=""/>
+      <w:lvlJc w:val="left"/>
+      <w:pPr>
+        <w:ind w:left="2160" w:hanging="360"/>
+      </w:pPr>
+      <w:rPr>
+        <w:rFonts w:ascii="Wingdings" w:hAnsi="Wingdings" w:hint="default"/>
+      </w:rPr>
+    </w:lvl>
+    <w:lvl w:ilvl="3" w:tplc="08090001" w:tentative="1">
+      <w:start w:val="1"/>
+      <w:numFmt w:val="bullet"/>
+      <w:lvlText w:val=""/>
+      <w:lvlJc w:val="left"/>
+      <w:pPr>
+        <w:ind w:left="2880" w:hanging="360"/>
+      </w:pPr>
+      <w:rPr>
+        <w:rFonts w:ascii="Symbol" w:hAnsi="Symbol" w:hint="default"/>
+      </w:rPr>
+    </w:lvl>
+    <w:lvl w:ilvl="4" w:tplc="08090003" w:tentative="1">
+      <w:start w:val="1"/>
+      <w:numFmt w:val="bullet"/>
+      <w:lvlText w:val="o"/>
+      <w:lvlJc w:val="left"/>
+      <w:pPr>
+        <w:ind w:left="3600" w:hanging="360"/>
+      </w:pPr>
+      <w:rPr>
+        <w:rFonts w:ascii="Courier New" w:hAnsi="Courier New" w:cs="Courier New" w:hint="default"/>
+      </w:rPr>
+    </w:lvl>
+    <w:lvl w:ilvl="5" w:tplc="08090005" w:tentative="1">
+      <w:start w:val="1"/>
+      <w:numFmt w:val="bullet"/>
+      <w:lvlText w:val=""/>
+      <w:lvlJc w:val="left"/>
+      <w:pPr>
+        <w:ind w:left="4320" w:hanging="360"/>
+      </w:pPr>
+      <w:rPr>
+        <w:rFonts w:ascii="Wingdings" w:hAnsi="Wingdings" w:hint="default"/>
+      </w:rPr>
+    </w:lvl>
+    <w:lvl w:ilvl="6" w:tplc="08090001" w:tentative="1">
+      <w:start w:val="1"/>
+      <w:numFmt w:val="bullet"/>
+      <w:lvlText w:val=""/>
+      <w:lvlJc w:val="left"/>
+      <w:pPr>
+        <w:ind w:left="5040" w:hanging="360"/>
+      </w:pPr>
+      <w:rPr>
+        <w:rFonts w:ascii="Symbol" w:hAnsi="Symbol" w:hint="default"/>
+      </w:rPr>
+    </w:lvl>
+    <w:lvl w:ilvl="7" w:tplc="08090003" w:tentative="1">
+      <w:start w:val="1"/>
+      <w:numFmt w:val="bullet"/>
+      <w:lvlText w:val="o"/>
+      <w:lvlJc w:val="left"/>
+      <w:pPr>
+        <w:ind w:left="5760" w:hanging="360"/>
+      </w:pPr>
+      <w:rPr>
+        <w:rFonts w:ascii="Courier New" w:hAnsi="Courier New" w:cs="Courier New" w:hint="default"/>
+      </w:rPr>
+    </w:lvl>
+    <w:lvl w:ilvl="8" w:tplc="08090005" w:tentative="1">
+      <w:start w:val="1"/>
+      <w:numFmt w:val="bullet"/>
+      <w:lvlText w:val=""/>
+      <w:lvlJc w:val="left"/>
+      <w:pPr>
+        <w:ind w:left="6480" w:hanging="360"/>
+      </w:pPr>
+      <w:rPr>
+        <w:rFonts w:ascii="Wingdings" w:hAnsi="Wingdings" w:hint="default"/>
+      </w:rPr>
+    </w:lvl>
+  </w:abstractNum>
+  <w:abstractNum w:abstractNumId="2" w15:restartNumberingAfterBreak="0">
+    <w:nsid w:val="69C20DB5"/>
+    <w:multiLevelType w:val="hybridMultilevel"/>
+    <w:tmpl w:val="25DEFF8E"/>
+    <w:lvl w:ilvl="0" w:tplc="08090001">
+      <w:start w:val="1"/>
+      <w:numFmt w:val="bullet"/>
+      <w:lvlText w:val=""/>
+      <w:lvlJc w:val="left"/>
+      <w:pPr>
+        <w:ind w:left="720" w:hanging="360"/>
+      </w:pPr>
+      <w:rPr>
+        <w:rFonts w:ascii="Symbol" w:hAnsi="Symbol" w:hint="default"/>
+      </w:rPr>
+    </w:lvl>
+    <w:lvl w:ilvl="1" w:tplc="08090003" w:tentative="1">
+      <w:start w:val="1"/>
+      <w:numFmt w:val="bullet"/>
+      <w:lvlText w:val="o"/>
+      <w:lvlJc w:val="left"/>
+      <w:pPr>
+        <w:ind w:left="1440" w:hanging="360"/>
+      </w:pPr>
+      <w:rPr>
+        <w:rFonts w:ascii="Courier New" w:hAnsi="Courier New" w:cs="Courier New" w:hint="default"/>
+      </w:rPr>
+    </w:lvl>
+    <w:lvl w:ilvl="2" w:tplc="08090005" w:tentative="1">
+      <w:start w:val="1"/>
+      <w:numFmt w:val="bullet"/>
+      <w:lvlText w:val=""/>
+      <w:lvlJc w:val="left"/>
+      <w:pPr>
+        <w:ind w:left="2160" w:hanging="360"/>
+      </w:pPr>
+      <w:rPr>
+        <w:rFonts w:ascii="Wingdings" w:hAnsi="Wingdings" w:hint="default"/>
+      </w:rPr>
+    </w:lvl>
+    <w:lvl w:ilvl="3" w:tplc="08090001" w:tentative="1">
+      <w:start w:val="1"/>
+      <w:numFmt w:val="bullet"/>
+      <w:lvlText w:val=""/>
+      <w:lvlJc w:val="left"/>
+      <w:pPr>
+        <w:ind w:left="2880" w:hanging="360"/>
+      </w:pPr>
+      <w:rPr>
+        <w:rFonts w:ascii="Symbol" w:hAnsi="Symbol" w:hint="default"/>
+      </w:rPr>
+    </w:lvl>
+    <w:lvl w:ilvl="4" w:tplc="08090003" w:tentative="1">
+      <w:start w:val="1"/>
+      <w:numFmt w:val="bullet"/>
+      <w:lvlText w:val="o"/>
+      <w:lvlJc w:val="left"/>
+      <w:pPr>
+        <w:ind w:left="3600" w:hanging="360"/>
+      </w:pPr>
+      <w:rPr>
+        <w:rFonts w:ascii="Courier New" w:hAnsi="Courier New" w:cs="Courier New" w:hint="default"/>
+      </w:rPr>
+    </w:lvl>
+    <w:lvl w:ilvl="5" w:tplc="08090005" w:tentative="1">
+      <w:start w:val="1"/>
+      <w:numFmt w:val="bullet"/>
+      <w:lvlText w:val=""/>
+      <w:lvlJc w:val="left"/>
+      <w:pPr>
+        <w:ind w:left="4320" w:hanging="360"/>
+      </w:pPr>
+      <w:rPr>
+        <w:rFonts w:ascii="Wingdings" w:hAnsi="Wingdings" w:hint="default"/>
+      </w:rPr>
+    </w:lvl>
+    <w:lvl w:ilvl="6" w:tplc="08090001" w:tentative="1">
+      <w:start w:val="1"/>
+      <w:numFmt w:val="bullet"/>
+      <w:lvlText w:val=""/>
+      <w:lvlJc w:val="left"/>
+      <w:pPr>
+        <w:ind w:left="5040" w:hanging="360"/>
+      </w:pPr>
+      <w:rPr>
+        <w:rFonts w:ascii="Symbol" w:hAnsi="Symbol" w:hint="default"/>
+      </w:rPr>
+    </w:lvl>
+    <w:lvl w:ilvl="7" w:tplc="08090003" w:tentative="1">
+      <w:start w:val="1"/>
+      <w:numFmt w:val="bullet"/>
+      <w:lvlText w:val="o"/>
+      <w:lvlJc w:val="left"/>
+      <w:pPr>
+        <w:ind w:left="5760" w:hanging="360"/>
+      </w:pPr>
+      <w:rPr>
+        <w:rFonts w:ascii="Courier New" w:hAnsi="Courier New" w:cs="Courier New" w:hint="default"/>
+      </w:rPr>
+    </w:lvl>
+    <w:lvl w:ilvl="8" w:tplc="08090005" w:tentative="1">
+      <w:start w:val="1"/>
+      <w:numFmt w:val="bullet"/>
+      <w:lvlText w:val=""/>
+      <w:lvlJc w:val="left"/>
+      <w:pPr>
+        <w:ind w:left="6480" w:hanging="360"/>
+      </w:pPr>
+      <w:rPr>
+        <w:rFonts w:ascii="Wingdings" w:hAnsi="Wingdings" w:hint="default"/>
+      </w:rPr>
+    </w:lvl>
+  </w:abstractNum>
   <w:num w:numId="1" w16cid:durableId="408817448">
     <w:abstractNumId w:val="0"/>
+  </w:num>
+  <w:num w:numId="2" w16cid:durableId="1625887844">
+    <w:abstractNumId w:val="2"/>
+  </w:num>
+  <w:num w:numId="3" w16cid:durableId="1615869907">
+    <w:abstractNumId w:val="1"/>
   </w:num>
 </w:numbering>
 </file>
@@ -2543,7 +3653,6 @@
   <w:style w:type="character" w:default="1" w:styleId="DefaultParagraphFont">
     <w:name w:val="Default Paragraph Font"/>
     <w:uiPriority w:val="1"/>
-    <w:semiHidden/>
     <w:unhideWhenUsed/>
   </w:style>
   <w:style w:type="table" w:default="1" w:styleId="TableNormal">
@@ -2956,6 +4065,16 @@
     <w:uiPriority w:val="99"/>
     <w:rsid w:val="00FD3203"/>
   </w:style>
+  <w:style w:type="character" w:styleId="PlaceholderText">
+    <w:name w:val="Placeholder Text"/>
+    <w:basedOn w:val="DefaultParagraphFont"/>
+    <w:uiPriority w:val="99"/>
+    <w:semiHidden/>
+    <w:rsid w:val="00FE37D4"/>
+    <w:rPr>
+      <w:color w:val="666666"/>
+    </w:rPr>
+  </w:style>
 </w:styles>
 </file>
 

</xml_diff>

<commit_message>
Updated evaluation plan, added mitigation plan, design and multimodal
</commit_message>
<xml_diff>
--- a/preliminary report/Final Project - Preliminary Report.docx
+++ b/preliminary report/Final Project - Preliminary Report.docx
@@ -1613,8 +1613,13 @@
         <w:t>2</w:t>
       </w:r>
       <w:r>
-        <w:t>] found that a Tr-OCR provides the best overall solution for reliable, high-accuracy container ISO code recognition with a recognition accuracy of 92% outperforming a PaddleOCR</w:t>
-      </w:r>
+        <w:t xml:space="preserve">] found that a Tr-OCR provides the best overall solution for reliable, high-accuracy container ISO code recognition with a recognition accuracy of 92% outperforming a </w:t>
+      </w:r>
+      <w:proofErr w:type="spellStart"/>
+      <w:r>
+        <w:t>PaddleOCR</w:t>
+      </w:r>
+      <w:proofErr w:type="spellEnd"/>
       <w:r>
         <w:t xml:space="preserve"> a hybrid CNN-Transformer model.</w:t>
       </w:r>
@@ -1696,10 +1701,7 @@
         <w:t xml:space="preserve">[2] Advances in deep learning technology has profoundly transformed automatic speech recognition (ASR) over the past decade. </w:t>
       </w:r>
       <w:r>
-        <w:t xml:space="preserve">Historically, ASR systems were constructed from a complex pipeline of independently trained components such an acoustic model (AM), a Gaussian Mixture Model-Hidden Markov Model (GMM-HMM), a pronunciation model (lexicon) and a language model (LM). Like early AES system, features had to be hand engineered, which was tedious and did not scale </w:t>
-      </w:r>
-      <w:r>
-        <w:t>well</w:t>
+        <w:t>Historically, ASR systems were constructed from a complex pipeline of independently trained components such an acoustic model (AM), a Gaussian Mixture Model-Hidden Markov Model (GMM-HMM), a pronunciation model (lexicon) and a language model (LM). Like early AES system, features had to be hand engineered, which was tedious and did not scale well</w:t>
       </w:r>
       <w:r>
         <w:t xml:space="preserve">. </w:t>
@@ -1847,24 +1849,176 @@
         <w:t>Multimodal</w:t>
       </w:r>
       <w:bookmarkEnd w:id="4"/>
-    </w:p>
-    <w:p>
-      <w:pPr>
-        <w:spacing w:line="360" w:lineRule="auto"/>
-      </w:pPr>
-    </w:p>
-    <w:p>
-      <w:pPr>
-        <w:spacing w:line="360" w:lineRule="auto"/>
-      </w:pPr>
-      <w:r>
-        <w:t xml:space="preserve">A search of </w:t>
-      </w:r>
-      <w:r>
-        <w:t>Google Scholar, IEEExplore and querying current AI applications like ChatGPT and Gemini with search strings like “multimodal AES” and “accessible multimodal AES” reveals that such systems are still quite rare. This presents a gap revealing that most AES systems ignore input equity. This research intends to fill this gap by implementing an accessible, interpretable, hybrid, multimodal AES system</w:t>
-      </w:r>
-      <w:r>
-        <w:t xml:space="preserve"> by orchestrating three pre-trained models – an OCR, ASR and a transformer model. </w:t>
+      <w:r>
+        <w:t xml:space="preserve"> Systems</w:t>
+      </w:r>
+    </w:p>
+    <w:p>
+      <w:pPr>
+        <w:spacing w:line="360" w:lineRule="auto"/>
+      </w:pPr>
+    </w:p>
+    <w:p>
+      <w:pPr>
+        <w:spacing w:line="360" w:lineRule="auto"/>
+      </w:pPr>
+      <w:r>
+        <w:t>A</w:t>
+      </w:r>
+      <w:r>
+        <w:t>n</w:t>
+      </w:r>
+      <w:r>
+        <w:t xml:space="preserve"> </w:t>
+      </w:r>
+      <w:r>
+        <w:t xml:space="preserve">extensive </w:t>
+      </w:r>
+      <w:r>
+        <w:t xml:space="preserve">search of </w:t>
+      </w:r>
+      <w:r>
+        <w:t>Google Scholar, IEE</w:t>
+      </w:r>
+      <w:r>
+        <w:t xml:space="preserve">E </w:t>
+      </w:r>
+      <w:r>
+        <w:t>Explore</w:t>
+      </w:r>
+      <w:r>
+        <w:t xml:space="preserve">, ACM and similar services </w:t>
+      </w:r>
+      <w:r>
+        <w:t>and querying</w:t>
+      </w:r>
+      <w:r>
+        <w:t xml:space="preserve"> current AI applications like ChatGPT and Gemini with </w:t>
+      </w:r>
+      <w:r>
+        <w:t>the search terms</w:t>
+      </w:r>
+      <w:r>
+        <w:t xml:space="preserve"> “multimodal AES</w:t>
+      </w:r>
+      <w:r>
+        <w:t>”, “</w:t>
+      </w:r>
+      <w:r>
+        <w:t>accessible multimodal AES”</w:t>
+      </w:r>
+      <w:r>
+        <w:t xml:space="preserve"> and “hybrid multimodal </w:t>
+      </w:r>
+      <w:r>
+        <w:t>AES” reveals</w:t>
+      </w:r>
+      <w:r>
+        <w:t xml:space="preserve"> that such systems are </w:t>
+      </w:r>
+      <w:r>
+        <w:t xml:space="preserve">exceptionally </w:t>
+      </w:r>
+      <w:r>
+        <w:t xml:space="preserve">rare. </w:t>
+      </w:r>
+      <w:r>
+        <w:t>The results</w:t>
+      </w:r>
+      <w:r>
+        <w:t xml:space="preserve"> returned were of systems that orchestrate</w:t>
+      </w:r>
+      <w:r>
+        <w:t>d at most</w:t>
+      </w:r>
+      <w:r>
+        <w:t xml:space="preserve"> two AI models</w:t>
+      </w:r>
+      <w:r>
+        <w:t xml:space="preserve"> o</w:t>
+      </w:r>
+      <w:r>
+        <w:t>f</w:t>
+      </w:r>
+      <w:r>
+        <w:t xml:space="preserve"> disparate modality</w:t>
+      </w:r>
+      <w:r>
+        <w:t xml:space="preserve">. </w:t>
+      </w:r>
+      <w:r>
+        <w:t xml:space="preserve">This </w:t>
+      </w:r>
+      <w:r>
+        <w:t xml:space="preserve">indicates </w:t>
+      </w:r>
+      <w:r>
+        <w:t xml:space="preserve">a gap </w:t>
+      </w:r>
+      <w:r>
+        <w:t xml:space="preserve">in current AES technology </w:t>
+      </w:r>
+      <w:r>
+        <w:t xml:space="preserve">revealing that most AES systems ignore input equity. </w:t>
+      </w:r>
+      <w:r>
+        <w:t>There</w:t>
+      </w:r>
+      <w:r>
+        <w:t xml:space="preserve"> are</w:t>
+      </w:r>
+      <w:r>
+        <w:t xml:space="preserve"> however commercially available multimodal system</w:t>
+      </w:r>
+      <w:r>
+        <w:t>s</w:t>
+      </w:r>
+      <w:r>
+        <w:t xml:space="preserve"> such as </w:t>
+      </w:r>
+      <w:proofErr w:type="spellStart"/>
+      <w:r>
+        <w:t>IntelliMetric</w:t>
+      </w:r>
+      <w:proofErr w:type="spellEnd"/>
+      <w:r>
+        <w:t xml:space="preserve"> and []. These applications are not open-source, and their architectures not freely available for analysis. My</w:t>
+      </w:r>
+      <w:r>
+        <w:t xml:space="preserve"> research</w:t>
+      </w:r>
+      <w:r>
+        <w:t xml:space="preserve"> project intends</w:t>
+      </w:r>
+      <w:r>
+        <w:t xml:space="preserve"> to fill </w:t>
+      </w:r>
+      <w:r>
+        <w:t>the</w:t>
+      </w:r>
+      <w:r>
+        <w:t xml:space="preserve"> gap by implementing an accessible, interpretable, hybrid, multimodal AES system</w:t>
+      </w:r>
+      <w:r>
+        <w:t xml:space="preserve"> by orchestrating three pre-trained models – an OCR, ASR and a transformer model</w:t>
+      </w:r>
+      <w:r>
+        <w:t xml:space="preserve"> that accepts as input, written, typed and spoken essays and transparently scores them. </w:t>
+      </w:r>
+      <w:r>
+        <w:t xml:space="preserve"> </w:t>
+      </w:r>
+      <w:r>
+        <w:t xml:space="preserve">Following are some multimodal systems that share some similarity with my proposed system </w:t>
+      </w:r>
+      <w:r>
+        <w:rPr>
+          <w:highlight w:val="yellow"/>
+        </w:rPr>
+        <w:t>but however, fail to provide in entirety for all input modalities, catering to students who have writing disabilities.</w:t>
+      </w:r>
+      <w:r>
+        <w:t xml:space="preserve"> </w:t>
       </w:r>
     </w:p>
     <w:p>
@@ -1878,25 +2032,205 @@
         <w:t>d</w:t>
       </w:r>
       <w:r>
-        <w:t xml:space="preserve"> a multimodal AES system that uses a MLLM to process graphics e.g. a scenery along with text. This system although multimodal, is still not accessible and like other AES systems ignores input equity. The system proposed here orchestrates a transform model for AES which has the same capability of the system proposed by [1] – they orchestrate GPT-4o, as the MLLM. The dataset uses for their experiment is limited in that it does not cover complex visual inputs such as film frames. </w:t>
-      </w:r>
-      <w:r>
-        <w:t xml:space="preserve">[2] proposed a bi-modal system the orchestrated three pretrained transformer models. This </w:t>
+        <w:t xml:space="preserve"> a multimodal AES system</w:t>
+      </w:r>
+      <w:r>
+        <w:t xml:space="preserve"> called CAFES</w:t>
+      </w:r>
+      <w:r>
+        <w:t xml:space="preserve"> that uses a MLLM to process graphics e.g. a scenery along with text. This system although multimodal, is still not </w:t>
+      </w:r>
+      <w:r>
+        <w:t xml:space="preserve">designed to cater to students with disabilities, as it, </w:t>
+      </w:r>
+      <w:r>
+        <w:t>like other AES systems ignores input equity. The system orchestrate</w:t>
+      </w:r>
+      <w:r>
+        <w:t>s</w:t>
+      </w:r>
+      <w:r>
+        <w:t xml:space="preserve"> GPT-4o, as the MLLM. The dataset use</w:t>
+      </w:r>
+      <w:r>
+        <w:t>d</w:t>
+      </w:r>
+      <w:r>
+        <w:t xml:space="preserve"> for their experiment is </w:t>
+      </w:r>
+      <w:r>
+        <w:t>ESSAYJUDGE dataset</w:t>
+      </w:r>
+      <w:r>
+        <w:t xml:space="preserve"> which</w:t>
+      </w:r>
+      <w:r>
+        <w:t xml:space="preserve"> consists</w:t>
+      </w:r>
+      <w:r>
+        <w:t xml:space="preserve"> </w:t>
+      </w:r>
+      <w:r>
+        <w:t>of 1,054 multimodal essays written at the university</w:t>
+      </w:r>
+      <w:r>
+        <w:t xml:space="preserve"> </w:t>
+      </w:r>
+      <w:r>
+        <w:t>level.</w:t>
+      </w:r>
+      <w:r>
+        <w:t xml:space="preserve"> This dataset is </w:t>
+      </w:r>
+      <w:r>
+        <w:t>limited in that it does not cover complex visual inputs such as film frames.</w:t>
+      </w:r>
+    </w:p>
+    <w:p>
+      <w:pPr>
+        <w:spacing w:line="360" w:lineRule="auto"/>
+      </w:pPr>
+      <w:r>
+        <w:t>[7</w:t>
+      </w:r>
+      <w:r>
+        <w:t>] developed</w:t>
+      </w:r>
+      <w:r>
+        <w:t xml:space="preserve"> a multimodal system </w:t>
+      </w:r>
+      <w:proofErr w:type="spellStart"/>
+      <w:r>
+        <w:t>ExaGrade</w:t>
+      </w:r>
+      <w:proofErr w:type="spellEnd"/>
+      <w:r>
+        <w:t xml:space="preserve"> the integrates optical character recognition (OCR) with the generative pre-trained transformer (GPT). The platform integrates two pre-trained models - HandwritingOCR to extract text from handwritten exam papers and like [1] employs GPT-4 to evaluate and score student responses. The platform offers features such as exam creation where for MCQs and TFs the teacher supplies the answers. Student exam completion using handwritten or online modalities. </w:t>
+      </w:r>
+    </w:p>
+    <w:p>
+      <w:pPr>
+        <w:spacing w:line="360" w:lineRule="auto"/>
+      </w:pPr>
+      <w:r>
+        <w:lastRenderedPageBreak/>
+        <w:t xml:space="preserve">The platform is describes as being accessible, however, accessibility only encompasses availability online at GitHub since the platform is released as an open-source </w:t>
+      </w:r>
+      <w:r>
+        <w:t>project [7]</w:t>
+      </w:r>
+      <w:r>
+        <w:t xml:space="preserve">. </w:t>
+      </w:r>
+      <w:proofErr w:type="spellStart"/>
+      <w:r>
+        <w:t>ExaGrade</w:t>
+      </w:r>
+      <w:proofErr w:type="spellEnd"/>
+      <w:r>
+        <w:t xml:space="preserve"> is not accessible to students with writing disabilities. </w:t>
+      </w:r>
+      <w:r>
+        <w:t xml:space="preserve">Notably absent </w:t>
+      </w:r>
+      <w:r>
+        <w:t>from the system is a means to input an essay</w:t>
+      </w:r>
+      <w:r>
+        <w:t xml:space="preserve"> in audible form. </w:t>
+      </w:r>
+    </w:p>
+    <w:p>
+      <w:pPr>
+        <w:spacing w:line="360" w:lineRule="auto"/>
+      </w:pPr>
+      <w:r>
+        <w:t xml:space="preserve"> </w:t>
+      </w:r>
+      <w:r>
+        <w:t xml:space="preserve">[2] proposed </w:t>
+      </w:r>
+      <w:proofErr w:type="spellStart"/>
+      <w:r>
+        <w:t>VisualAES</w:t>
+      </w:r>
+      <w:proofErr w:type="spellEnd"/>
+      <w:r>
+        <w:t xml:space="preserve">, </w:t>
+      </w:r>
+      <w:r>
+        <w:t xml:space="preserve">a bi-modal system </w:t>
+      </w:r>
+      <w:r>
+        <w:t>that utilizes both textual and visual features for handwritten essay scoring. It</w:t>
+      </w:r>
+      <w:r>
+        <w:t xml:space="preserve"> orchestrate</w:t>
+      </w:r>
+      <w:r>
+        <w:t>s</w:t>
+      </w:r>
+      <w:r>
+        <w:t xml:space="preserve"> three pretrained transformer</w:t>
+      </w:r>
+      <w:r>
+        <w:t>-based models as the backbone and extends them to take both textual features and visual features extracted by Faster R-CNN</w:t>
+      </w:r>
+      <w:r>
+        <w:t xml:space="preserve">. </w:t>
+      </w:r>
+      <w:r>
+        <w:t xml:space="preserve">The system then uses a stacking ensemble model to robustly map their output to a final score. </w:t>
+      </w:r>
+      <w:r>
+        <w:t xml:space="preserve">This </w:t>
       </w:r>
       <w:r>
         <w:t>system’s architecture is more congruent with w</w:t>
       </w:r>
       <w:r>
-        <w:t>hat is being proposed in this research – a</w:t>
-      </w:r>
-      <w:r>
-        <w:t>n</w:t>
+        <w:t xml:space="preserve">hat is being proposed in this research – </w:t>
+      </w:r>
+      <w:r>
+        <w:t>and</w:t>
       </w:r>
       <w:r>
         <w:t xml:space="preserve"> OCR model to convert text from scanned essays to </w:t>
       </w:r>
       <w:r>
         <w:t xml:space="preserve">digital text for processing, and a transformer model for essay scoring. </w:t>
+      </w:r>
+      <w:proofErr w:type="spellStart"/>
+      <w:r>
+        <w:t>VisualAES</w:t>
+      </w:r>
+      <w:proofErr w:type="spellEnd"/>
+      <w:r>
+        <w:t xml:space="preserve"> was evaluated with the Automated Student Assessment Prize (ASAP) dataset and their own handwritten Chinese Student’s handwritten essay dataset (</w:t>
+      </w:r>
+      <w:proofErr w:type="spellStart"/>
+      <w:r>
+        <w:t>ChnStd</w:t>
+      </w:r>
+      <w:proofErr w:type="spellEnd"/>
+      <w:r>
+        <w:t xml:space="preserve">). Their results showed that their system outperformed all state-of-the-art methods on both datasets. </w:t>
+      </w:r>
+      <w:proofErr w:type="spellStart"/>
+      <w:r>
+        <w:t>VisualAES</w:t>
+      </w:r>
+      <w:proofErr w:type="spellEnd"/>
+      <w:r>
+        <w:t xml:space="preserve"> like CAFES does not provide accessibility for students suffering writing disability.</w:t>
+      </w:r>
+    </w:p>
+    <w:p>
+      <w:pPr>
+        <w:spacing w:line="360" w:lineRule="auto"/>
+      </w:pPr>
+      <w:r>
+        <w:t xml:space="preserve">[6] developed an inclusive learning classroom using OpenAI Whisper model. The model was selected to promote diversity and inclusivity in education through real-time transcription and translation for students with diverse linguistic and cultural abilities and backgrounds. The results were encouraging as the model achieved high accuracy especially in an environment where ambient noise did not alter the audio signal input. This system however is limited in input modality as it only focuses on audio transcription with no allocation made for submission of handwritten work. </w:t>
       </w:r>
     </w:p>
     <w:p>
@@ -1961,8 +2295,29 @@
         <w:spacing w:line="360" w:lineRule="auto"/>
       </w:pPr>
       <w:r>
-        <w:t>Talk about errors from ocr and asr and impact on aes</w:t>
-      </w:r>
+        <w:t xml:space="preserve">Talk about errors from </w:t>
+      </w:r>
+      <w:proofErr w:type="spellStart"/>
+      <w:r>
+        <w:t>ocr</w:t>
+      </w:r>
+      <w:proofErr w:type="spellEnd"/>
+      <w:r>
+        <w:t xml:space="preserve"> and </w:t>
+      </w:r>
+      <w:proofErr w:type="spellStart"/>
+      <w:r>
+        <w:t>asr</w:t>
+      </w:r>
+      <w:proofErr w:type="spellEnd"/>
+      <w:r>
+        <w:t xml:space="preserve"> and impact on </w:t>
+      </w:r>
+      <w:proofErr w:type="spellStart"/>
+      <w:r>
+        <w:t>aes</w:t>
+      </w:r>
+      <w:proofErr w:type="spellEnd"/>
     </w:p>
     <w:p>
       <w:pPr>
@@ -1979,6 +2334,34 @@
     </w:p>
     <w:p>
       <w:pPr>
+        <w:spacing w:line="360" w:lineRule="auto"/>
+        <w:ind w:left="360"/>
+      </w:pPr>
+      <w:r>
+        <w:lastRenderedPageBreak/>
+        <w:t>Limitations of OCR</w:t>
+      </w:r>
+    </w:p>
+    <w:p>
+      <w:pPr>
+        <w:spacing w:line="360" w:lineRule="auto"/>
+        <w:ind w:left="360"/>
+      </w:pPr>
+      <w:r>
+        <w:t>Limitations of ASR (STT)</w:t>
+      </w:r>
+    </w:p>
+    <w:p>
+      <w:pPr>
+        <w:spacing w:line="360" w:lineRule="auto"/>
+        <w:ind w:left="360"/>
+      </w:pPr>
+      <w:r>
+        <w:t xml:space="preserve">Limitations of Transformers </w:t>
+      </w:r>
+    </w:p>
+    <w:p>
+      <w:pPr>
         <w:pStyle w:val="ListParagraph"/>
         <w:numPr>
           <w:ilvl w:val="0"/>
@@ -2000,7 +2383,15 @@
         <w:spacing w:line="360" w:lineRule="auto"/>
       </w:pPr>
       <w:r>
-        <w:t>Specify asr model, limitation and so on</w:t>
+        <w:t xml:space="preserve">Specify </w:t>
+      </w:r>
+      <w:proofErr w:type="spellStart"/>
+      <w:r>
+        <w:t>asr</w:t>
+      </w:r>
+      <w:proofErr w:type="spellEnd"/>
+      <w:r>
+        <w:t xml:space="preserve"> model, limitation and so on</w:t>
       </w:r>
     </w:p>
     <w:p>
@@ -2015,6 +2406,37 @@
       <w:r>
         <w:t>Specify dataset and critique it</w:t>
       </w:r>
+    </w:p>
+    <w:p>
+      <w:pPr>
+        <w:pStyle w:val="ListParagraph"/>
+        <w:numPr>
+          <w:ilvl w:val="0"/>
+          <w:numId w:val="3"/>
+        </w:numPr>
+        <w:spacing w:line="360" w:lineRule="auto"/>
+      </w:pPr>
+      <w:r>
+        <w:t xml:space="preserve">Paper 7 speaks about how gpt-4 has limitations, use to contrast with </w:t>
+      </w:r>
+      <w:proofErr w:type="spellStart"/>
+      <w:r>
+        <w:t>deberta</w:t>
+      </w:r>
+      <w:proofErr w:type="spellEnd"/>
+      <w:r>
+        <w:t xml:space="preserve"> to show advantage</w:t>
+      </w:r>
+    </w:p>
+    <w:p>
+      <w:pPr>
+        <w:pStyle w:val="ListParagraph"/>
+        <w:numPr>
+          <w:ilvl w:val="0"/>
+          <w:numId w:val="3"/>
+        </w:numPr>
+        <w:spacing w:line="360" w:lineRule="auto"/>
+      </w:pPr>
     </w:p>
     <w:p>
       <w:pPr>
@@ -2032,7 +2454,6 @@
         </w:rPr>
       </w:pPr>
       <w:r>
-        <w:lastRenderedPageBreak/>
         <w:br w:type="page"/>
       </w:r>
     </w:p>
@@ -2095,11 +2516,133 @@
     <w:p>
       <w:pPr>
         <w:spacing w:line="360" w:lineRule="auto"/>
+      </w:pPr>
+      <w:r>
         <w:rPr>
           <w:b/>
           <w:bCs/>
         </w:rPr>
-      </w:pPr>
+        <w:t>Datasets –</w:t>
+      </w:r>
+      <w:r>
+        <w:t xml:space="preserve"> ASAP, IELTS (pic one)</w:t>
+      </w:r>
+    </w:p>
+    <w:p>
+      <w:pPr>
+        <w:spacing w:line="360" w:lineRule="auto"/>
+      </w:pPr>
+      <w:r>
+        <w:t>Testing Plan – have at least 10 people each write  5 of the essays in the dataset, each belonging to a different prompt, have them then read and record their voice then have the system process the essays (mics will be of disparate quality replicating real-world quality and potential shoddy equipment, also recording is not studio quality so background will be present, classrooms are not necessarily 100% quiet, have them take pics with their phones (the lighting will not be consistent so the test will replicate real-world conditions)</w:t>
+      </w:r>
+    </w:p>
+    <w:p>
+      <w:pPr>
+        <w:spacing w:line="360" w:lineRule="auto"/>
+      </w:pPr>
+      <w:r>
+        <w:t>Compare:</w:t>
+      </w:r>
+    </w:p>
+    <w:p>
+      <w:pPr>
+        <w:pStyle w:val="ListParagraph"/>
+        <w:numPr>
+          <w:ilvl w:val="0"/>
+          <w:numId w:val="4"/>
+        </w:numPr>
+        <w:spacing w:line="360" w:lineRule="auto"/>
+      </w:pPr>
+      <w:r>
+        <w:t>Essay score from dataset after essay</w:t>
+      </w:r>
+      <w:r>
+        <w:t xml:space="preserve">s </w:t>
+      </w:r>
+      <w:r>
+        <w:t xml:space="preserve">fed directly to </w:t>
+      </w:r>
+      <w:proofErr w:type="spellStart"/>
+      <w:r>
+        <w:t>aes</w:t>
+      </w:r>
+      <w:proofErr w:type="spellEnd"/>
+      <w:r>
+        <w:t xml:space="preserve"> with </w:t>
+      </w:r>
+    </w:p>
+    <w:p>
+      <w:pPr>
+        <w:pStyle w:val="ListParagraph"/>
+        <w:numPr>
+          <w:ilvl w:val="0"/>
+          <w:numId w:val="4"/>
+        </w:numPr>
+        <w:spacing w:line="360" w:lineRule="auto"/>
+      </w:pPr>
+      <w:r>
+        <w:t>Transcribed essay</w:t>
+      </w:r>
+      <w:r>
+        <w:t>s</w:t>
+      </w:r>
+      <w:r>
+        <w:t xml:space="preserve"> fed from </w:t>
+      </w:r>
+      <w:proofErr w:type="spellStart"/>
+      <w:r>
+        <w:t>asr</w:t>
+      </w:r>
+      <w:proofErr w:type="spellEnd"/>
+    </w:p>
+    <w:p>
+      <w:pPr>
+        <w:pStyle w:val="ListParagraph"/>
+        <w:numPr>
+          <w:ilvl w:val="0"/>
+          <w:numId w:val="4"/>
+        </w:numPr>
+        <w:spacing w:line="360" w:lineRule="auto"/>
+      </w:pPr>
+      <w:r>
+        <w:t>Scanned and digitized handwritten essay</w:t>
+      </w:r>
+      <w:r>
+        <w:t>s</w:t>
+      </w:r>
+      <w:r>
+        <w:t xml:space="preserve"> from </w:t>
+      </w:r>
+      <w:proofErr w:type="spellStart"/>
+      <w:r>
+        <w:t>ocr</w:t>
+      </w:r>
+      <w:proofErr w:type="spellEnd"/>
+    </w:p>
+    <w:p>
+      <w:pPr>
+        <w:rPr>
+          <w:rFonts w:eastAsiaTheme="majorEastAsia" w:cstheme="majorBidi"/>
+          <w:color w:val="0F4761" w:themeColor="accent1" w:themeShade="BF"/>
+          <w:sz w:val="28"/>
+          <w:szCs w:val="28"/>
+        </w:rPr>
+      </w:pPr>
+      <w:r>
+        <w:br w:type="page"/>
+      </w:r>
+    </w:p>
+    <w:p>
+      <w:pPr>
+        <w:pStyle w:val="Heading3"/>
+      </w:pPr>
+      <w:r>
+        <w:lastRenderedPageBreak/>
+        <w:t xml:space="preserve">Evaluation </w:t>
+      </w:r>
+      <w:r>
+        <w:t>Metrics</w:t>
+      </w:r>
     </w:p>
     <w:p>
       <w:pPr>
@@ -2109,13 +2652,6 @@
           <w:bCs/>
         </w:rPr>
       </w:pPr>
-      <w:r>
-        <w:rPr>
-          <w:b/>
-          <w:bCs/>
-        </w:rPr>
-        <w:t>Metrics</w:t>
-      </w:r>
     </w:p>
     <w:p>
       <w:pPr>
@@ -2274,7 +2810,6 @@
           <w:b/>
           <w:bCs/>
         </w:rPr>
-        <w:lastRenderedPageBreak/>
         <w:t>D</w:t>
       </w:r>
       <w:r>
@@ -2332,6 +2867,7 @@
         <w:spacing w:line="360" w:lineRule="auto"/>
       </w:pPr>
       <w:r>
+        <w:lastRenderedPageBreak/>
         <w:t>[</w:t>
       </w:r>
       <w:r>
@@ -2346,10 +2882,7 @@
         <w:spacing w:line="360" w:lineRule="auto"/>
       </w:pPr>
       <w:r>
-        <w:t>C</w:t>
-      </w:r>
-      <w:r>
-        <w:t xml:space="preserve">ER = </w:t>
+        <w:t xml:space="preserve">CER = </w:t>
       </w:r>
       <m:oMath>
         <m:f>
@@ -2422,7 +2955,14 @@
         <w:spacing w:line="360" w:lineRule="auto"/>
       </w:pPr>
       <w:r>
-        <w:t>CRC = number of correctly recognized characters</w:t>
+        <w:rPr>
+          <w:b/>
+          <w:bCs/>
+        </w:rPr>
+        <w:t xml:space="preserve">CRC </w:t>
+      </w:r>
+      <w:r>
+        <w:t>= number of correctly recognized characters</w:t>
       </w:r>
     </w:p>
     <w:p>
@@ -2435,10 +2975,16 @@
         <w:spacing w:line="360" w:lineRule="auto"/>
       </w:pPr>
       <w:r>
+        <w:rPr>
+          <w:b/>
+          <w:bCs/>
+        </w:rPr>
         <w:t>N</w:t>
       </w:r>
       <w:r>
         <w:rPr>
+          <w:b/>
+          <w:bCs/>
           <w:vertAlign w:val="subscript"/>
         </w:rPr>
         <w:t>C</w:t>
@@ -2476,7 +3022,75 @@
         <w:spacing w:line="360" w:lineRule="auto"/>
       </w:pPr>
       <w:r>
-        <w:t>OpenAI whisper (academeic gold standard), NVIDIA Canary-Queen(best for raw English accuracy), Distil-Whisper – (Best for low-Resource hardware)</w:t>
+        <w:t>OpenAI whisper (</w:t>
+      </w:r>
+      <w:r>
+        <w:t>academic</w:t>
+      </w:r>
+      <w:r>
+        <w:t xml:space="preserve"> gold standard), NVIDIA Canary-Queen(best for raw English accuracy), Distil-Whisper – (Best for low-Resource hardware)</w:t>
+      </w:r>
+    </w:p>
+    <w:p>
+      <w:pPr>
+        <w:spacing w:line="360" w:lineRule="auto"/>
+      </w:pPr>
+    </w:p>
+    <w:p>
+      <w:pPr>
+        <w:spacing w:line="360" w:lineRule="auto"/>
+        <w:rPr>
+          <w:b/>
+          <w:bCs/>
+        </w:rPr>
+      </w:pPr>
+      <w:r>
+        <w:rPr>
+          <w:b/>
+          <w:bCs/>
+        </w:rPr>
+        <w:t>Mitigation Plan</w:t>
+      </w:r>
+    </w:p>
+    <w:p>
+      <w:pPr>
+        <w:spacing w:line="360" w:lineRule="auto"/>
+      </w:pPr>
+      <w:r>
+        <w:t xml:space="preserve">One of the major caveats that this integrated system poses is error propagation through the pipeline. Since the AES does not originate the </w:t>
+      </w:r>
+      <w:r>
+        <w:t xml:space="preserve">text that </w:t>
+      </w:r>
+      <w:r>
+        <w:t>it is fed, it is likely that mistakes from either the audio transcription done by the ASR or from recognition and digitization by the OCR, will flow as input to the AES</w:t>
+      </w:r>
+      <w:r>
+        <w:t xml:space="preserve"> system core</w:t>
+      </w:r>
+      <w:r>
+        <w:t>. Thus erroneous, spurious results are inevitable in the output, essay score, from the integrated system</w:t>
+      </w:r>
+      <w:r>
+        <w:t>, reducing its accuracy and reliability</w:t>
+      </w:r>
+      <w:r>
+        <w:t>. It is incumbent on the designer to mitigate error</w:t>
+      </w:r>
+      <w:r>
+        <w:t>s</w:t>
+      </w:r>
+      <w:r>
+        <w:t xml:space="preserve"> propagation by reducing</w:t>
+      </w:r>
+      <w:r>
+        <w:t xml:space="preserve"> them</w:t>
+      </w:r>
+      <w:r>
+        <w:t xml:space="preserve"> at the component level. </w:t>
+      </w:r>
+      <w:r>
+        <w:t>Errors are inevitable since no system functions perfectly; therefore, the system must have contingency built in so the core is notified and factors this information in is evaluation.</w:t>
       </w:r>
     </w:p>
     <w:p>
@@ -2523,7 +3137,122 @@
         <w:spacing w:line="360" w:lineRule="auto"/>
       </w:pPr>
       <w:r>
-        <w:t>Logic – aes, ocr, stt</w:t>
+        <w:t xml:space="preserve">Pipeline: </w:t>
+      </w:r>
+    </w:p>
+    <w:p>
+      <w:pPr>
+        <w:pStyle w:val="ListParagraph"/>
+        <w:numPr>
+          <w:ilvl w:val="0"/>
+          <w:numId w:val="5"/>
+        </w:numPr>
+        <w:spacing w:line="360" w:lineRule="auto"/>
+      </w:pPr>
+      <w:r>
+        <w:t>(draw diagram) (</w:t>
+      </w:r>
+      <w:proofErr w:type="spellStart"/>
+      <w:r>
+        <w:t>ocr</w:t>
+      </w:r>
+      <w:proofErr w:type="spellEnd"/>
+      <w:r>
+        <w:t xml:space="preserve"> -&gt; </w:t>
+      </w:r>
+      <w:proofErr w:type="spellStart"/>
+      <w:r>
+        <w:t>aes</w:t>
+      </w:r>
+      <w:proofErr w:type="spellEnd"/>
+      <w:r>
+        <w:t xml:space="preserve"> &lt;- </w:t>
+      </w:r>
+      <w:proofErr w:type="spellStart"/>
+      <w:r>
+        <w:t>asr</w:t>
+      </w:r>
+      <w:proofErr w:type="spellEnd"/>
+      <w:r>
+        <w:t>) -&gt; interpretable essay score</w:t>
+      </w:r>
+    </w:p>
+    <w:p>
+      <w:pPr>
+        <w:pStyle w:val="ListParagraph"/>
+        <w:numPr>
+          <w:ilvl w:val="0"/>
+          <w:numId w:val="5"/>
+        </w:numPr>
+        <w:spacing w:line="360" w:lineRule="auto"/>
+      </w:pPr>
+      <w:r>
+        <w:t>How will the system be accessed</w:t>
+      </w:r>
+    </w:p>
+    <w:p>
+      <w:pPr>
+        <w:pStyle w:val="ListParagraph"/>
+        <w:numPr>
+          <w:ilvl w:val="1"/>
+          <w:numId w:val="5"/>
+        </w:numPr>
+        <w:spacing w:line="360" w:lineRule="auto"/>
+      </w:pPr>
+      <w:r>
+        <w:t>Online</w:t>
+      </w:r>
+    </w:p>
+    <w:p>
+      <w:pPr>
+        <w:pStyle w:val="ListParagraph"/>
+        <w:numPr>
+          <w:ilvl w:val="1"/>
+          <w:numId w:val="5"/>
+        </w:numPr>
+        <w:spacing w:line="360" w:lineRule="auto"/>
+      </w:pPr>
+      <w:r>
+        <w:t>Offline</w:t>
+      </w:r>
+    </w:p>
+    <w:p>
+      <w:pPr>
+        <w:pStyle w:val="ListParagraph"/>
+        <w:numPr>
+          <w:ilvl w:val="0"/>
+          <w:numId w:val="5"/>
+        </w:numPr>
+        <w:spacing w:line="360" w:lineRule="auto"/>
+      </w:pPr>
+      <w:r>
+        <w:t>Where will the components be hosted:</w:t>
+      </w:r>
+    </w:p>
+    <w:p>
+      <w:pPr>
+        <w:pStyle w:val="ListParagraph"/>
+        <w:numPr>
+          <w:ilvl w:val="1"/>
+          <w:numId w:val="5"/>
+        </w:numPr>
+        <w:spacing w:line="360" w:lineRule="auto"/>
+      </w:pPr>
+      <w:r>
+        <w:t>On the user’s pc</w:t>
+      </w:r>
+    </w:p>
+    <w:p>
+      <w:pPr>
+        <w:pStyle w:val="ListParagraph"/>
+        <w:numPr>
+          <w:ilvl w:val="1"/>
+          <w:numId w:val="5"/>
+        </w:numPr>
+        <w:spacing w:line="360" w:lineRule="auto"/>
+      </w:pPr>
+      <w:r>
+        <w:t xml:space="preserve">Online </w:t>
       </w:r>
     </w:p>
     <w:p>
@@ -2573,8 +3302,21 @@
           <w:szCs w:val="32"/>
         </w:rPr>
       </w:pPr>
-      <w:r>
-        <w:t>Aes, transformer model outputting score after ocr inputs essay</w:t>
+      <w:proofErr w:type="spellStart"/>
+      <w:r>
+        <w:t>Aes</w:t>
+      </w:r>
+      <w:proofErr w:type="spellEnd"/>
+      <w:r>
+        <w:t xml:space="preserve">, transformer model outputting score after </w:t>
+      </w:r>
+      <w:proofErr w:type="spellStart"/>
+      <w:r>
+        <w:t>ocr</w:t>
+      </w:r>
+      <w:proofErr w:type="spellEnd"/>
+      <w:r>
+        <w:t xml:space="preserve"> inputs essay</w:t>
       </w:r>
       <w:r>
         <w:br w:type="page"/>
@@ -2592,10 +3334,63 @@
       </w:r>
       <w:bookmarkEnd w:id="8"/>
     </w:p>
-    <w:p>
-      <w:pPr>
-        <w:spacing w:line="360" w:lineRule="auto"/>
-      </w:pPr>
+    <w:p/>
+    <w:p>
+      <w:pPr>
+        <w:spacing w:line="360" w:lineRule="auto"/>
+      </w:pPr>
+      <w:proofErr w:type="spellStart"/>
+      <w:r>
+        <w:t>microsoft</w:t>
+      </w:r>
+      <w:proofErr w:type="spellEnd"/>
+      <w:r>
+        <w:t>/deberta-v3-base</w:t>
+      </w:r>
+    </w:p>
+    <w:p>
+      <w:pPr>
+        <w:spacing w:line="360" w:lineRule="auto"/>
+      </w:pPr>
+      <w:proofErr w:type="spellStart"/>
+      <w:r>
+        <w:t>microsoft</w:t>
+      </w:r>
+      <w:proofErr w:type="spellEnd"/>
+      <w:r>
+        <w:t>/</w:t>
+      </w:r>
+      <w:proofErr w:type="spellStart"/>
+      <w:r>
+        <w:t>trocr</w:t>
+      </w:r>
+      <w:proofErr w:type="spellEnd"/>
+      <w:r>
+        <w:t>-base-handwritten</w:t>
+      </w:r>
+    </w:p>
+    <w:p>
+      <w:pPr>
+        <w:spacing w:line="360" w:lineRule="auto"/>
+      </w:pPr>
+      <w:proofErr w:type="spellStart"/>
+      <w:r>
+        <w:t>openai</w:t>
+      </w:r>
+      <w:proofErr w:type="spellEnd"/>
+      <w:r>
+        <w:t>/whisper-</w:t>
+      </w:r>
+      <w:proofErr w:type="spellStart"/>
+      <w:r>
+        <w:t>base.en</w:t>
+      </w:r>
+      <w:proofErr w:type="spellEnd"/>
+    </w:p>
+    <w:p>
+      <w:r>
+        <w:br w:type="page"/>
+      </w:r>
     </w:p>
     <w:sectPr>
       <w:footerReference w:type="default" r:id="rId8"/>
@@ -2729,95 +3524,9 @@
 <file path=word/numbering.xml><?xml version="1.0" encoding="utf-8"?>
 <w:numbering xmlns:wpc="http://schemas.microsoft.com/office/word/2010/wordprocessingCanvas" xmlns:cx="http://schemas.microsoft.com/office/drawing/2014/chartex" xmlns:cx1="http://schemas.microsoft.com/office/drawing/2015/9/8/chartex" xmlns:cx2="http://schemas.microsoft.com/office/drawing/2015/10/21/chartex" xmlns:cx3="http://schemas.microsoft.com/office/drawing/2016/5/9/chartex" xmlns:cx4="http://schemas.microsoft.com/office/drawing/2016/5/10/chartex" xmlns:cx5="http://schemas.microsoft.com/office/drawing/2016/5/11/chartex" xmlns:cx6="http://schemas.microsoft.com/office/drawing/2016/5/12/chartex" xmlns:cx7="http://schemas.microsoft.com/office/drawing/2016/5/13/chartex" xmlns:cx8="http://schemas.microsoft.com/office/drawing/2016/5/14/chartex" xmlns:mc="http://schemas.openxmlformats.org/markup-compatibility/2006" xmlns:aink="http://schemas.microsoft.com/office/drawing/2016/ink" xmlns:am3d="http://schemas.microsoft.com/office/drawing/2017/model3d" xmlns:o="urn:schemas-microsoft-com:office:office" xmlns:oel="http://schemas.microsoft.com/office/2019/extlst" xmlns:r="http://schemas.openxmlformats.org/officeDocument/2006/relationships" xmlns:m="http://schemas.openxmlformats.org/officeDocument/2006/math" xmlns:v="urn:schemas-microsoft-com:vml" xmlns:wp14="http://schemas.microsoft.com/office/word/2010/wordprocessingDrawing" xmlns:wp="http://schemas.openxmlformats.org/drawingml/2006/wordprocessingDrawing" xmlns:w10="urn:schemas-microsoft-com:office:word" xmlns:w="http://schemas.openxmlformats.org/wordprocessingml/2006/main" xmlns:w14="http://schemas.microsoft.com/office/word/2010/wordml" xmlns:w15="http://schemas.microsoft.com/office/word/2012/wordml" xmlns:w16cex="http://schemas.microsoft.com/office/word/2018/wordml/cex" xmlns:w16cid="http://schemas.microsoft.com/office/word/2016/wordml/cid" xmlns:w16="http://schemas.microsoft.com/office/word/2018/wordml" xmlns:w16du="http://schemas.microsoft.com/office/word/2023/wordml/word16du" xmlns:w16sdtdh="http://schemas.microsoft.com/office/word/2020/wordml/sdtdatahash" xmlns:w16sdtfl="http://schemas.microsoft.com/office/word/2024/wordml/sdtformatlock" xmlns:w16se="http://schemas.microsoft.com/office/word/2015/wordml/symex" xmlns:wpg="http://schemas.microsoft.com/office/word/2010/wordprocessingGroup" xmlns:wpi="http://schemas.microsoft.com/office/word/2010/wordprocessingInk" xmlns:wne="http://schemas.microsoft.com/office/word/2006/wordml" xmlns:wps="http://schemas.microsoft.com/office/word/2010/wordprocessingShape" mc:Ignorable="w14 w15 w16se w16cid w16 w16cex w16sdtdh w16sdtfl w16du wp14">
   <w:abstractNum w:abstractNumId="0" w15:restartNumberingAfterBreak="0">
-    <w:nsid w:val="1B584821"/>
+    <w:nsid w:val="02070084"/>
     <w:multiLevelType w:val="hybridMultilevel"/>
-    <w:tmpl w:val="D3B676AC"/>
-    <w:lvl w:ilvl="0" w:tplc="0809000F">
-      <w:start w:val="1"/>
-      <w:numFmt w:val="decimal"/>
-      <w:lvlText w:val="%1."/>
-      <w:lvlJc w:val="left"/>
-      <w:pPr>
-        <w:ind w:left="780" w:hanging="360"/>
-      </w:pPr>
-    </w:lvl>
-    <w:lvl w:ilvl="1" w:tplc="08090019" w:tentative="1">
-      <w:start w:val="1"/>
-      <w:numFmt w:val="lowerLetter"/>
-      <w:lvlText w:val="%2."/>
-      <w:lvlJc w:val="left"/>
-      <w:pPr>
-        <w:ind w:left="1500" w:hanging="360"/>
-      </w:pPr>
-    </w:lvl>
-    <w:lvl w:ilvl="2" w:tplc="0809001B" w:tentative="1">
-      <w:start w:val="1"/>
-      <w:numFmt w:val="lowerRoman"/>
-      <w:lvlText w:val="%3."/>
-      <w:lvlJc w:val="right"/>
-      <w:pPr>
-        <w:ind w:left="2220" w:hanging="180"/>
-      </w:pPr>
-    </w:lvl>
-    <w:lvl w:ilvl="3" w:tplc="0809000F" w:tentative="1">
-      <w:start w:val="1"/>
-      <w:numFmt w:val="decimal"/>
-      <w:lvlText w:val="%4."/>
-      <w:lvlJc w:val="left"/>
-      <w:pPr>
-        <w:ind w:left="2940" w:hanging="360"/>
-      </w:pPr>
-    </w:lvl>
-    <w:lvl w:ilvl="4" w:tplc="08090019" w:tentative="1">
-      <w:start w:val="1"/>
-      <w:numFmt w:val="lowerLetter"/>
-      <w:lvlText w:val="%5."/>
-      <w:lvlJc w:val="left"/>
-      <w:pPr>
-        <w:ind w:left="3660" w:hanging="360"/>
-      </w:pPr>
-    </w:lvl>
-    <w:lvl w:ilvl="5" w:tplc="0809001B" w:tentative="1">
-      <w:start w:val="1"/>
-      <w:numFmt w:val="lowerRoman"/>
-      <w:lvlText w:val="%6."/>
-      <w:lvlJc w:val="right"/>
-      <w:pPr>
-        <w:ind w:left="4380" w:hanging="180"/>
-      </w:pPr>
-    </w:lvl>
-    <w:lvl w:ilvl="6" w:tplc="0809000F" w:tentative="1">
-      <w:start w:val="1"/>
-      <w:numFmt w:val="decimal"/>
-      <w:lvlText w:val="%7."/>
-      <w:lvlJc w:val="left"/>
-      <w:pPr>
-        <w:ind w:left="5100" w:hanging="360"/>
-      </w:pPr>
-    </w:lvl>
-    <w:lvl w:ilvl="7" w:tplc="08090019" w:tentative="1">
-      <w:start w:val="1"/>
-      <w:numFmt w:val="lowerLetter"/>
-      <w:lvlText w:val="%8."/>
-      <w:lvlJc w:val="left"/>
-      <w:pPr>
-        <w:ind w:left="5820" w:hanging="360"/>
-      </w:pPr>
-    </w:lvl>
-    <w:lvl w:ilvl="8" w:tplc="0809001B" w:tentative="1">
-      <w:start w:val="1"/>
-      <w:numFmt w:val="lowerRoman"/>
-      <w:lvlText w:val="%9."/>
-      <w:lvlJc w:val="right"/>
-      <w:pPr>
-        <w:ind w:left="6540" w:hanging="180"/>
-      </w:pPr>
-    </w:lvl>
-  </w:abstractNum>
-  <w:abstractNum w:abstractNumId="1" w15:restartNumberingAfterBreak="0">
-    <w:nsid w:val="65DE470F"/>
-    <w:multiLevelType w:val="hybridMultilevel"/>
-    <w:tmpl w:val="B78E431A"/>
+    <w:tmpl w:val="02BC4420"/>
     <w:lvl w:ilvl="0" w:tplc="08090001">
       <w:start w:val="1"/>
       <w:numFmt w:val="bullet"/>
@@ -2927,10 +3636,209 @@
       </w:rPr>
     </w:lvl>
   </w:abstractNum>
+  <w:abstractNum w:abstractNumId="1" w15:restartNumberingAfterBreak="0">
+    <w:nsid w:val="1B584821"/>
+    <w:multiLevelType w:val="hybridMultilevel"/>
+    <w:tmpl w:val="D3B676AC"/>
+    <w:lvl w:ilvl="0" w:tplc="0809000F">
+      <w:start w:val="1"/>
+      <w:numFmt w:val="decimal"/>
+      <w:lvlText w:val="%1."/>
+      <w:lvlJc w:val="left"/>
+      <w:pPr>
+        <w:ind w:left="780" w:hanging="360"/>
+      </w:pPr>
+    </w:lvl>
+    <w:lvl w:ilvl="1" w:tplc="08090019" w:tentative="1">
+      <w:start w:val="1"/>
+      <w:numFmt w:val="lowerLetter"/>
+      <w:lvlText w:val="%2."/>
+      <w:lvlJc w:val="left"/>
+      <w:pPr>
+        <w:ind w:left="1500" w:hanging="360"/>
+      </w:pPr>
+    </w:lvl>
+    <w:lvl w:ilvl="2" w:tplc="0809001B" w:tentative="1">
+      <w:start w:val="1"/>
+      <w:numFmt w:val="lowerRoman"/>
+      <w:lvlText w:val="%3."/>
+      <w:lvlJc w:val="right"/>
+      <w:pPr>
+        <w:ind w:left="2220" w:hanging="180"/>
+      </w:pPr>
+    </w:lvl>
+    <w:lvl w:ilvl="3" w:tplc="0809000F" w:tentative="1">
+      <w:start w:val="1"/>
+      <w:numFmt w:val="decimal"/>
+      <w:lvlText w:val="%4."/>
+      <w:lvlJc w:val="left"/>
+      <w:pPr>
+        <w:ind w:left="2940" w:hanging="360"/>
+      </w:pPr>
+    </w:lvl>
+    <w:lvl w:ilvl="4" w:tplc="08090019" w:tentative="1">
+      <w:start w:val="1"/>
+      <w:numFmt w:val="lowerLetter"/>
+      <w:lvlText w:val="%5."/>
+      <w:lvlJc w:val="left"/>
+      <w:pPr>
+        <w:ind w:left="3660" w:hanging="360"/>
+      </w:pPr>
+    </w:lvl>
+    <w:lvl w:ilvl="5" w:tplc="0809001B" w:tentative="1">
+      <w:start w:val="1"/>
+      <w:numFmt w:val="lowerRoman"/>
+      <w:lvlText w:val="%6."/>
+      <w:lvlJc w:val="right"/>
+      <w:pPr>
+        <w:ind w:left="4380" w:hanging="180"/>
+      </w:pPr>
+    </w:lvl>
+    <w:lvl w:ilvl="6" w:tplc="0809000F" w:tentative="1">
+      <w:start w:val="1"/>
+      <w:numFmt w:val="decimal"/>
+      <w:lvlText w:val="%7."/>
+      <w:lvlJc w:val="left"/>
+      <w:pPr>
+        <w:ind w:left="5100" w:hanging="360"/>
+      </w:pPr>
+    </w:lvl>
+    <w:lvl w:ilvl="7" w:tplc="08090019" w:tentative="1">
+      <w:start w:val="1"/>
+      <w:numFmt w:val="lowerLetter"/>
+      <w:lvlText w:val="%8."/>
+      <w:lvlJc w:val="left"/>
+      <w:pPr>
+        <w:ind w:left="5820" w:hanging="360"/>
+      </w:pPr>
+    </w:lvl>
+    <w:lvl w:ilvl="8" w:tplc="0809001B" w:tentative="1">
+      <w:start w:val="1"/>
+      <w:numFmt w:val="lowerRoman"/>
+      <w:lvlText w:val="%9."/>
+      <w:lvlJc w:val="right"/>
+      <w:pPr>
+        <w:ind w:left="6540" w:hanging="180"/>
+      </w:pPr>
+    </w:lvl>
+  </w:abstractNum>
   <w:abstractNum w:abstractNumId="2" w15:restartNumberingAfterBreak="0">
-    <w:nsid w:val="69C20DB5"/>
+    <w:nsid w:val="65582D2B"/>
     <w:multiLevelType w:val="hybridMultilevel"/>
-    <w:tmpl w:val="25DEFF8E"/>
+    <w:tmpl w:val="0F02FED8"/>
+    <w:lvl w:ilvl="0" w:tplc="08090001">
+      <w:start w:val="1"/>
+      <w:numFmt w:val="bullet"/>
+      <w:lvlText w:val=""/>
+      <w:lvlJc w:val="left"/>
+      <w:pPr>
+        <w:ind w:left="720" w:hanging="360"/>
+      </w:pPr>
+      <w:rPr>
+        <w:rFonts w:ascii="Symbol" w:hAnsi="Symbol" w:hint="default"/>
+      </w:rPr>
+    </w:lvl>
+    <w:lvl w:ilvl="1" w:tplc="08090003">
+      <w:start w:val="1"/>
+      <w:numFmt w:val="bullet"/>
+      <w:lvlText w:val="o"/>
+      <w:lvlJc w:val="left"/>
+      <w:pPr>
+        <w:ind w:left="1440" w:hanging="360"/>
+      </w:pPr>
+      <w:rPr>
+        <w:rFonts w:ascii="Courier New" w:hAnsi="Courier New" w:cs="Courier New" w:hint="default"/>
+      </w:rPr>
+    </w:lvl>
+    <w:lvl w:ilvl="2" w:tplc="08090005" w:tentative="1">
+      <w:start w:val="1"/>
+      <w:numFmt w:val="bullet"/>
+      <w:lvlText w:val=""/>
+      <w:lvlJc w:val="left"/>
+      <w:pPr>
+        <w:ind w:left="2160" w:hanging="360"/>
+      </w:pPr>
+      <w:rPr>
+        <w:rFonts w:ascii="Wingdings" w:hAnsi="Wingdings" w:hint="default"/>
+      </w:rPr>
+    </w:lvl>
+    <w:lvl w:ilvl="3" w:tplc="08090001" w:tentative="1">
+      <w:start w:val="1"/>
+      <w:numFmt w:val="bullet"/>
+      <w:lvlText w:val=""/>
+      <w:lvlJc w:val="left"/>
+      <w:pPr>
+        <w:ind w:left="2880" w:hanging="360"/>
+      </w:pPr>
+      <w:rPr>
+        <w:rFonts w:ascii="Symbol" w:hAnsi="Symbol" w:hint="default"/>
+      </w:rPr>
+    </w:lvl>
+    <w:lvl w:ilvl="4" w:tplc="08090003" w:tentative="1">
+      <w:start w:val="1"/>
+      <w:numFmt w:val="bullet"/>
+      <w:lvlText w:val="o"/>
+      <w:lvlJc w:val="left"/>
+      <w:pPr>
+        <w:ind w:left="3600" w:hanging="360"/>
+      </w:pPr>
+      <w:rPr>
+        <w:rFonts w:ascii="Courier New" w:hAnsi="Courier New" w:cs="Courier New" w:hint="default"/>
+      </w:rPr>
+    </w:lvl>
+    <w:lvl w:ilvl="5" w:tplc="08090005" w:tentative="1">
+      <w:start w:val="1"/>
+      <w:numFmt w:val="bullet"/>
+      <w:lvlText w:val=""/>
+      <w:lvlJc w:val="left"/>
+      <w:pPr>
+        <w:ind w:left="4320" w:hanging="360"/>
+      </w:pPr>
+      <w:rPr>
+        <w:rFonts w:ascii="Wingdings" w:hAnsi="Wingdings" w:hint="default"/>
+      </w:rPr>
+    </w:lvl>
+    <w:lvl w:ilvl="6" w:tplc="08090001" w:tentative="1">
+      <w:start w:val="1"/>
+      <w:numFmt w:val="bullet"/>
+      <w:lvlText w:val=""/>
+      <w:lvlJc w:val="left"/>
+      <w:pPr>
+        <w:ind w:left="5040" w:hanging="360"/>
+      </w:pPr>
+      <w:rPr>
+        <w:rFonts w:ascii="Symbol" w:hAnsi="Symbol" w:hint="default"/>
+      </w:rPr>
+    </w:lvl>
+    <w:lvl w:ilvl="7" w:tplc="08090003" w:tentative="1">
+      <w:start w:val="1"/>
+      <w:numFmt w:val="bullet"/>
+      <w:lvlText w:val="o"/>
+      <w:lvlJc w:val="left"/>
+      <w:pPr>
+        <w:ind w:left="5760" w:hanging="360"/>
+      </w:pPr>
+      <w:rPr>
+        <w:rFonts w:ascii="Courier New" w:hAnsi="Courier New" w:cs="Courier New" w:hint="default"/>
+      </w:rPr>
+    </w:lvl>
+    <w:lvl w:ilvl="8" w:tplc="08090005" w:tentative="1">
+      <w:start w:val="1"/>
+      <w:numFmt w:val="bullet"/>
+      <w:lvlText w:val=""/>
+      <w:lvlJc w:val="left"/>
+      <w:pPr>
+        <w:ind w:left="6480" w:hanging="360"/>
+      </w:pPr>
+      <w:rPr>
+        <w:rFonts w:ascii="Wingdings" w:hAnsi="Wingdings" w:hint="default"/>
+      </w:rPr>
+    </w:lvl>
+  </w:abstractNum>
+  <w:abstractNum w:abstractNumId="3" w15:restartNumberingAfterBreak="0">
+    <w:nsid w:val="65DE470F"/>
+    <w:multiLevelType w:val="hybridMultilevel"/>
+    <w:tmpl w:val="B78E431A"/>
     <w:lvl w:ilvl="0" w:tplc="08090001">
       <w:start w:val="1"/>
       <w:numFmt w:val="bullet"/>
@@ -3040,14 +3948,133 @@
       </w:rPr>
     </w:lvl>
   </w:abstractNum>
+  <w:abstractNum w:abstractNumId="4" w15:restartNumberingAfterBreak="0">
+    <w:nsid w:val="69C20DB5"/>
+    <w:multiLevelType w:val="hybridMultilevel"/>
+    <w:tmpl w:val="25DEFF8E"/>
+    <w:lvl w:ilvl="0" w:tplc="08090001">
+      <w:start w:val="1"/>
+      <w:numFmt w:val="bullet"/>
+      <w:lvlText w:val=""/>
+      <w:lvlJc w:val="left"/>
+      <w:pPr>
+        <w:ind w:left="720" w:hanging="360"/>
+      </w:pPr>
+      <w:rPr>
+        <w:rFonts w:ascii="Symbol" w:hAnsi="Symbol" w:hint="default"/>
+      </w:rPr>
+    </w:lvl>
+    <w:lvl w:ilvl="1" w:tplc="08090003" w:tentative="1">
+      <w:start w:val="1"/>
+      <w:numFmt w:val="bullet"/>
+      <w:lvlText w:val="o"/>
+      <w:lvlJc w:val="left"/>
+      <w:pPr>
+        <w:ind w:left="1440" w:hanging="360"/>
+      </w:pPr>
+      <w:rPr>
+        <w:rFonts w:ascii="Courier New" w:hAnsi="Courier New" w:cs="Courier New" w:hint="default"/>
+      </w:rPr>
+    </w:lvl>
+    <w:lvl w:ilvl="2" w:tplc="08090005" w:tentative="1">
+      <w:start w:val="1"/>
+      <w:numFmt w:val="bullet"/>
+      <w:lvlText w:val=""/>
+      <w:lvlJc w:val="left"/>
+      <w:pPr>
+        <w:ind w:left="2160" w:hanging="360"/>
+      </w:pPr>
+      <w:rPr>
+        <w:rFonts w:ascii="Wingdings" w:hAnsi="Wingdings" w:hint="default"/>
+      </w:rPr>
+    </w:lvl>
+    <w:lvl w:ilvl="3" w:tplc="08090001" w:tentative="1">
+      <w:start w:val="1"/>
+      <w:numFmt w:val="bullet"/>
+      <w:lvlText w:val=""/>
+      <w:lvlJc w:val="left"/>
+      <w:pPr>
+        <w:ind w:left="2880" w:hanging="360"/>
+      </w:pPr>
+      <w:rPr>
+        <w:rFonts w:ascii="Symbol" w:hAnsi="Symbol" w:hint="default"/>
+      </w:rPr>
+    </w:lvl>
+    <w:lvl w:ilvl="4" w:tplc="08090003" w:tentative="1">
+      <w:start w:val="1"/>
+      <w:numFmt w:val="bullet"/>
+      <w:lvlText w:val="o"/>
+      <w:lvlJc w:val="left"/>
+      <w:pPr>
+        <w:ind w:left="3600" w:hanging="360"/>
+      </w:pPr>
+      <w:rPr>
+        <w:rFonts w:ascii="Courier New" w:hAnsi="Courier New" w:cs="Courier New" w:hint="default"/>
+      </w:rPr>
+    </w:lvl>
+    <w:lvl w:ilvl="5" w:tplc="08090005" w:tentative="1">
+      <w:start w:val="1"/>
+      <w:numFmt w:val="bullet"/>
+      <w:lvlText w:val=""/>
+      <w:lvlJc w:val="left"/>
+      <w:pPr>
+        <w:ind w:left="4320" w:hanging="360"/>
+      </w:pPr>
+      <w:rPr>
+        <w:rFonts w:ascii="Wingdings" w:hAnsi="Wingdings" w:hint="default"/>
+      </w:rPr>
+    </w:lvl>
+    <w:lvl w:ilvl="6" w:tplc="08090001" w:tentative="1">
+      <w:start w:val="1"/>
+      <w:numFmt w:val="bullet"/>
+      <w:lvlText w:val=""/>
+      <w:lvlJc w:val="left"/>
+      <w:pPr>
+        <w:ind w:left="5040" w:hanging="360"/>
+      </w:pPr>
+      <w:rPr>
+        <w:rFonts w:ascii="Symbol" w:hAnsi="Symbol" w:hint="default"/>
+      </w:rPr>
+    </w:lvl>
+    <w:lvl w:ilvl="7" w:tplc="08090003" w:tentative="1">
+      <w:start w:val="1"/>
+      <w:numFmt w:val="bullet"/>
+      <w:lvlText w:val="o"/>
+      <w:lvlJc w:val="left"/>
+      <w:pPr>
+        <w:ind w:left="5760" w:hanging="360"/>
+      </w:pPr>
+      <w:rPr>
+        <w:rFonts w:ascii="Courier New" w:hAnsi="Courier New" w:cs="Courier New" w:hint="default"/>
+      </w:rPr>
+    </w:lvl>
+    <w:lvl w:ilvl="8" w:tplc="08090005" w:tentative="1">
+      <w:start w:val="1"/>
+      <w:numFmt w:val="bullet"/>
+      <w:lvlText w:val=""/>
+      <w:lvlJc w:val="left"/>
+      <w:pPr>
+        <w:ind w:left="6480" w:hanging="360"/>
+      </w:pPr>
+      <w:rPr>
+        <w:rFonts w:ascii="Wingdings" w:hAnsi="Wingdings" w:hint="default"/>
+      </w:rPr>
+    </w:lvl>
+  </w:abstractNum>
   <w:num w:numId="1" w16cid:durableId="408817448">
+    <w:abstractNumId w:val="1"/>
+  </w:num>
+  <w:num w:numId="2" w16cid:durableId="1625887844">
+    <w:abstractNumId w:val="4"/>
+  </w:num>
+  <w:num w:numId="3" w16cid:durableId="1615869907">
+    <w:abstractNumId w:val="3"/>
+  </w:num>
+  <w:num w:numId="4" w16cid:durableId="1774739438">
     <w:abstractNumId w:val="0"/>
   </w:num>
-  <w:num w:numId="2" w16cid:durableId="1625887844">
+  <w:num w:numId="5" w16cid:durableId="290677251">
     <w:abstractNumId w:val="2"/>
-  </w:num>
-  <w:num w:numId="3" w16cid:durableId="1615869907">
-    <w:abstractNumId w:val="1"/>
   </w:num>
 </w:numbering>
 </file>
@@ -3653,6 +4680,7 @@
   <w:style w:type="character" w:default="1" w:styleId="DefaultParagraphFont">
     <w:name w:val="Default Paragraph Font"/>
     <w:uiPriority w:val="1"/>
+    <w:semiHidden/>
     <w:unhideWhenUsed/>
   </w:style>
   <w:style w:type="table" w:default="1" w:styleId="TableNormal">

</xml_diff>

<commit_message>
Updated design section, added project management section
</commit_message>
<xml_diff>
--- a/preliminary report/Final Project - Preliminary Report.docx
+++ b/preliminary report/Final Project - Preliminary Report.docx
@@ -873,17 +873,40 @@
       <w:r>
         <w:t xml:space="preserve">orchestrates </w:t>
       </w:r>
-      <w:r>
-        <w:t xml:space="preserve">an OCR, STT and Transformer model providing accessibility for students and interpretability, readability and automation </w:t>
-      </w:r>
-      <w:r>
-        <w:t xml:space="preserve">to </w:t>
-      </w:r>
-      <w:r>
-        <w:t xml:space="preserve">support </w:t>
-      </w:r>
-      <w:r>
-        <w:t>human scorers</w:t>
+      <w:proofErr w:type="gramStart"/>
+      <w:r>
+        <w:t>a</w:t>
+      </w:r>
+      <w:proofErr w:type="gramEnd"/>
+      <w:r>
+        <w:t xml:space="preserve"> </w:t>
+      </w:r>
+      <w:r>
+        <w:t xml:space="preserve">OCR, </w:t>
+      </w:r>
+      <w:r>
+        <w:t>STT and</w:t>
+      </w:r>
+      <w:r>
+        <w:t xml:space="preserve"> Transformer </w:t>
+      </w:r>
+      <w:r>
+        <w:t>model, providing</w:t>
+      </w:r>
+      <w:r>
+        <w:t xml:space="preserve"> accessibility for students and interpretability, readability and automation </w:t>
+      </w:r>
+      <w:r>
+        <w:t xml:space="preserve">in </w:t>
+      </w:r>
+      <w:r>
+        <w:t>support</w:t>
+      </w:r>
+      <w:r>
+        <w:t xml:space="preserve"> of human</w:t>
+      </w:r>
+      <w:r>
+        <w:t xml:space="preserve"> scorers</w:t>
       </w:r>
       <w:r>
         <w:t>.</w:t>
@@ -1415,6 +1438,17 @@
         <w:t xml:space="preserve">Li et al. </w:t>
       </w:r>
       <w:r>
+        <w:t xml:space="preserve">[5 from multimodal] traditional OCR is primarily oriented toward printed text but has been modified to recognize handwritten text giving rise to the synonym </w:t>
+      </w:r>
+      <w:proofErr w:type="spellStart"/>
+      <w:r>
+        <w:t>HandwrittenOCR</w:t>
+      </w:r>
+      <w:proofErr w:type="spellEnd"/>
+      <w:r>
+        <w:t xml:space="preserve">. </w:t>
+      </w:r>
+      <w:r>
         <w:t>[1</w:t>
       </w:r>
       <w:r>
@@ -1424,7 +1458,13 @@
         <w:t>]</w:t>
       </w:r>
       <w:r>
-        <w:t xml:space="preserve"> describe traditional OCR systems as comprising two modules</w:t>
+        <w:t xml:space="preserve"> describe</w:t>
+      </w:r>
+      <w:r>
+        <w:t>s</w:t>
+      </w:r>
+      <w:r>
+        <w:t xml:space="preserve"> traditional OCR systems as comprising two modules</w:t>
       </w:r>
       <w:r>
         <w:t>: a text detection module and a text recognition module. Text detection localizes all text blocks at word-level or text</w:t>
@@ -2012,9 +2052,6 @@
         <w:t xml:space="preserve">Following are some multimodal systems that share some similarity with my proposed system </w:t>
       </w:r>
       <w:r>
-        <w:rPr>
-          <w:highlight w:val="yellow"/>
-        </w:rPr>
         <w:t>but however, fail to provide in entirety for all input modalities, catering to students who have writing disabilities.</w:t>
       </w:r>
       <w:r>
@@ -2038,13 +2075,7 @@
         <w:t xml:space="preserve"> called CAFES</w:t>
       </w:r>
       <w:r>
-        <w:t xml:space="preserve"> that uses a MLLM to process graphics e.g. a scenery along with text. This system although multimodal, is still not </w:t>
-      </w:r>
-      <w:r>
-        <w:t xml:space="preserve">designed to cater to students with disabilities, as it, </w:t>
-      </w:r>
-      <w:r>
-        <w:t>like other AES systems ignores input equity. The system orchestrate</w:t>
+        <w:t xml:space="preserve"> that uses a MLLM to process graphics e.g. a scenery along with text. The system orchestrate</w:t>
       </w:r>
       <w:r>
         <w:t>s</w:t>
@@ -2085,6 +2116,12 @@
       <w:r>
         <w:t>limited in that it does not cover complex visual inputs such as film frames.</w:t>
       </w:r>
+      <w:r>
+        <w:t xml:space="preserve"> </w:t>
+      </w:r>
+      <w:r>
+        <w:t>This system although multimodal, is still not designed to cater to students with disabilities, as it, like other AES systems ignores input equity.</w:t>
+      </w:r>
     </w:p>
     <w:p>
       <w:pPr>
@@ -2114,7 +2151,21 @@
       </w:pPr>
       <w:r>
         <w:lastRenderedPageBreak/>
-        <w:t xml:space="preserve">The platform is describes as being accessible, however, accessibility only encompasses availability online at GitHub since the platform is released as an open-source </w:t>
+        <w:t xml:space="preserve">The platform </w:t>
+      </w:r>
+      <w:r>
+        <w:t>is described as</w:t>
+      </w:r>
+      <w:r>
+        <w:t xml:space="preserve"> </w:t>
+      </w:r>
+      <w:proofErr w:type="gramStart"/>
+      <w:r>
+        <w:t>accessible,</w:t>
+      </w:r>
+      <w:proofErr w:type="gramEnd"/>
+      <w:r>
+        <w:t xml:space="preserve"> however, accessibility only encompasses availability online at GitHub since the platform is released as an open-source </w:t>
       </w:r>
       <w:r>
         <w:t>project [7]</w:t>
@@ -2237,14 +2288,33 @@
       <w:pPr>
         <w:spacing w:line="360" w:lineRule="auto"/>
       </w:pPr>
-    </w:p>
-    <w:p>
-      <w:pPr>
-        <w:spacing w:line="360" w:lineRule="auto"/>
-      </w:pPr>
-      <w:r>
-        <w:t>To do:</w:t>
-      </w:r>
+      <w:r>
+        <w:t>[5] developed a system for investigating the possibility of automatically grading handwritten essays by leveraging OCR together with a fine-tuned and trained Large Language Model (LLM)</w:t>
+      </w:r>
+      <w:r>
+        <w:t xml:space="preserve"> </w:t>
+      </w:r>
+      <w:r>
+        <w:t xml:space="preserve">Mistral 7b. According to the BERT Score analysis, the precision, recall and F1 scores were observed to be consistent over all the essays. The F1 score of 85.78% demonstrates the model’s overall stability in replicating human-grading decisions with a high degree of consistency. The system used a Moodle plugin that integrated Mistral 7b into the Platform. There is no mention of inclusivity in the system developed </w:t>
+      </w:r>
+      <w:r>
+        <w:t>by [</w:t>
+      </w:r>
+      <w:r>
+        <w:t xml:space="preserve">5] </w:t>
+      </w:r>
+      <w:r>
+        <w:t xml:space="preserve">showing once again that most modern AES systems focus on the </w:t>
+      </w:r>
+      <w:r>
+        <w:lastRenderedPageBreak/>
+        <w:t xml:space="preserve">quality of essay scoring and do not priority input equity, emphasizing the need for an integrated system. </w:t>
+      </w:r>
+    </w:p>
+    <w:p>
+      <w:pPr>
+        <w:spacing w:line="360" w:lineRule="auto"/>
+      </w:pPr>
     </w:p>
     <w:p>
       <w:pPr>
@@ -2256,7 +2326,7 @@
         <w:spacing w:line="360" w:lineRule="auto"/>
       </w:pPr>
       <w:r>
-        <w:t>Add more example systems for comparison/critique to this section</w:t>
+        <w:t>Limitations of OCR</w:t>
       </w:r>
     </w:p>
     <w:p>
@@ -2269,7 +2339,7 @@
         <w:spacing w:line="360" w:lineRule="auto"/>
       </w:pPr>
       <w:r>
-        <w:t>Speak about integration, benefits and drawbacks</w:t>
+        <w:t>Limitations of ASR (STT)</w:t>
       </w:r>
     </w:p>
     <w:p>
@@ -2282,116 +2352,7 @@
         <w:spacing w:line="360" w:lineRule="auto"/>
       </w:pPr>
       <w:r>
-        <w:t>Outline pipeline with diagrams</w:t>
-      </w:r>
-    </w:p>
-    <w:p>
-      <w:pPr>
-        <w:pStyle w:val="ListParagraph"/>
-        <w:numPr>
-          <w:ilvl w:val="0"/>
-          <w:numId w:val="3"/>
-        </w:numPr>
-        <w:spacing w:line="360" w:lineRule="auto"/>
-      </w:pPr>
-      <w:r>
-        <w:t xml:space="preserve">Talk about errors from </w:t>
-      </w:r>
-      <w:proofErr w:type="spellStart"/>
-      <w:r>
-        <w:t>ocr</w:t>
-      </w:r>
-      <w:proofErr w:type="spellEnd"/>
-      <w:r>
-        <w:t xml:space="preserve"> and </w:t>
-      </w:r>
-      <w:proofErr w:type="spellStart"/>
-      <w:r>
-        <w:t>asr</w:t>
-      </w:r>
-      <w:proofErr w:type="spellEnd"/>
-      <w:r>
-        <w:t xml:space="preserve"> and impact on </w:t>
-      </w:r>
-      <w:proofErr w:type="spellStart"/>
-      <w:r>
-        <w:t>aes</w:t>
-      </w:r>
-      <w:proofErr w:type="spellEnd"/>
-    </w:p>
-    <w:p>
-      <w:pPr>
-        <w:pStyle w:val="ListParagraph"/>
-        <w:numPr>
-          <w:ilvl w:val="0"/>
-          <w:numId w:val="3"/>
-        </w:numPr>
-        <w:spacing w:line="360" w:lineRule="auto"/>
-      </w:pPr>
-      <w:r>
-        <w:t>Specify transformer model, limitations and adv</w:t>
-      </w:r>
-    </w:p>
-    <w:p>
-      <w:pPr>
-        <w:spacing w:line="360" w:lineRule="auto"/>
-        <w:ind w:left="360"/>
-      </w:pPr>
-      <w:r>
-        <w:lastRenderedPageBreak/>
-        <w:t>Limitations of OCR</w:t>
-      </w:r>
-    </w:p>
-    <w:p>
-      <w:pPr>
-        <w:spacing w:line="360" w:lineRule="auto"/>
-        <w:ind w:left="360"/>
-      </w:pPr>
-      <w:r>
-        <w:t>Limitations of ASR (STT)</w:t>
-      </w:r>
-    </w:p>
-    <w:p>
-      <w:pPr>
-        <w:spacing w:line="360" w:lineRule="auto"/>
-        <w:ind w:left="360"/>
-      </w:pPr>
-      <w:r>
         <w:t xml:space="preserve">Limitations of Transformers </w:t>
-      </w:r>
-    </w:p>
-    <w:p>
-      <w:pPr>
-        <w:pStyle w:val="ListParagraph"/>
-        <w:numPr>
-          <w:ilvl w:val="0"/>
-          <w:numId w:val="3"/>
-        </w:numPr>
-        <w:spacing w:line="360" w:lineRule="auto"/>
-      </w:pPr>
-      <w:r>
-        <w:t>Specify ocr model, limitations and so on</w:t>
-      </w:r>
-    </w:p>
-    <w:p>
-      <w:pPr>
-        <w:pStyle w:val="ListParagraph"/>
-        <w:numPr>
-          <w:ilvl w:val="0"/>
-          <w:numId w:val="3"/>
-        </w:numPr>
-        <w:spacing w:line="360" w:lineRule="auto"/>
-      </w:pPr>
-      <w:r>
-        <w:t xml:space="preserve">Specify </w:t>
-      </w:r>
-      <w:proofErr w:type="spellStart"/>
-      <w:r>
-        <w:t>asr</w:t>
-      </w:r>
-      <w:proofErr w:type="spellEnd"/>
-      <w:r>
-        <w:t xml:space="preserve"> model, limitation and so on</w:t>
       </w:r>
     </w:p>
     <w:p>
@@ -3028,7 +2989,15 @@
         <w:t>academic</w:t>
       </w:r>
       <w:r>
-        <w:t xml:space="preserve"> gold standard), NVIDIA Canary-Queen(best for raw English accuracy), Distil-Whisper – (Best for low-Resource hardware)</w:t>
+        <w:t xml:space="preserve"> gold standard), NVIDIA Canary-</w:t>
+      </w:r>
+      <w:proofErr w:type="gramStart"/>
+      <w:r>
+        <w:t>Queen(</w:t>
+      </w:r>
+      <w:proofErr w:type="gramEnd"/>
+      <w:r>
+        <w:t>best for raw English accuracy), Distil-Whisper – (Best for low-Resource hardware)</w:t>
       </w:r>
     </w:p>
     <w:p>
@@ -3090,7 +3059,13 @@
         <w:t xml:space="preserve"> at the component level. </w:t>
       </w:r>
       <w:r>
-        <w:t>Errors are inevitable since no system functions perfectly; therefore, the system must have contingency built in so the core is notified and factors this information in is evaluation.</w:t>
+        <w:t xml:space="preserve">Errors are inevitable since no system functions perfectly; therefore, the system must have contingency built </w:t>
+      </w:r>
+      <w:r>
+        <w:t>in,</w:t>
+      </w:r>
+      <w:r>
+        <w:t xml:space="preserve"> so the core is notified and factors this information in is evaluation.</w:t>
       </w:r>
     </w:p>
     <w:p>
@@ -3124,6 +3099,21 @@
       </w:r>
     </w:p>
     <w:p/>
+    <w:p>
+      <w:pPr>
+        <w:rPr>
+          <w:b/>
+          <w:bCs/>
+        </w:rPr>
+      </w:pPr>
+      <w:r>
+        <w:rPr>
+          <w:b/>
+          <w:bCs/>
+        </w:rPr>
+        <w:t>In-scope</w:t>
+      </w:r>
+    </w:p>
     <w:p>
       <w:pPr>
         <w:spacing w:line="360" w:lineRule="auto"/>
@@ -3276,6 +3266,57 @@
         <w:spacing w:line="360" w:lineRule="auto"/>
       </w:pPr>
       <w:r>
+        <w:t>Storage considerations (size of models and dataset)</w:t>
+      </w:r>
+    </w:p>
+    <w:p>
+      <w:pPr>
+        <w:spacing w:line="360" w:lineRule="auto"/>
+        <w:rPr>
+          <w:b/>
+          <w:bCs/>
+        </w:rPr>
+      </w:pPr>
+      <w:r>
+        <w:rPr>
+          <w:b/>
+          <w:bCs/>
+        </w:rPr>
+        <w:t>Out of scope</w:t>
+      </w:r>
+    </w:p>
+    <w:p>
+      <w:pPr>
+        <w:spacing w:line="360" w:lineRule="auto"/>
+      </w:pPr>
+      <w:r>
+        <w:t>Multiple choice exams</w:t>
+      </w:r>
+    </w:p>
+    <w:p>
+      <w:pPr>
+        <w:spacing w:line="360" w:lineRule="auto"/>
+      </w:pPr>
+      <w:r>
+        <w:t>Long answer questions in response to prompts</w:t>
+      </w:r>
+    </w:p>
+    <w:p>
+      <w:pPr>
+        <w:spacing w:line="360" w:lineRule="auto"/>
+      </w:pPr>
+      <w:r>
+        <w:t>Reading comprehension exercises</w:t>
+      </w:r>
+    </w:p>
+    <w:p>
+      <w:pPr>
+        <w:spacing w:line="360" w:lineRule="auto"/>
+      </w:pPr>
+      <w:r>
+        <w:t xml:space="preserve">Essays with visual prompts/visual content such a scene along with a prompt requiring students write about the scene. </w:t>
+      </w:r>
+      <w:r>
         <w:br w:type="page"/>
       </w:r>
     </w:p>
@@ -3291,7 +3332,88 @@
       </w:r>
       <w:bookmarkEnd w:id="7"/>
     </w:p>
+    <w:p>
+      <w:pPr>
+        <w:spacing w:line="360" w:lineRule="auto"/>
+      </w:pPr>
+      <w:proofErr w:type="spellStart"/>
+      <w:r>
+        <w:t>microsoft</w:t>
+      </w:r>
+      <w:proofErr w:type="spellEnd"/>
+      <w:r>
+        <w:t>/deberta-v3-base</w:t>
+      </w:r>
+    </w:p>
+    <w:p>
+      <w:pPr>
+        <w:spacing w:line="360" w:lineRule="auto"/>
+      </w:pPr>
+      <w:proofErr w:type="spellStart"/>
+      <w:r>
+        <w:t>microsoft</w:t>
+      </w:r>
+      <w:proofErr w:type="spellEnd"/>
+      <w:r>
+        <w:t>/</w:t>
+      </w:r>
+      <w:proofErr w:type="spellStart"/>
+      <w:r>
+        <w:t>trocr</w:t>
+      </w:r>
+      <w:proofErr w:type="spellEnd"/>
+      <w:r>
+        <w:t>-base-handwritten</w:t>
+      </w:r>
+    </w:p>
+    <w:p>
+      <w:pPr>
+        <w:spacing w:line="360" w:lineRule="auto"/>
+      </w:pPr>
+      <w:proofErr w:type="spellStart"/>
+      <w:r>
+        <w:t>openai</w:t>
+      </w:r>
+      <w:proofErr w:type="spellEnd"/>
+      <w:r>
+        <w:t>/whisper-</w:t>
+      </w:r>
+      <w:proofErr w:type="spellStart"/>
+      <w:proofErr w:type="gramStart"/>
+      <w:r>
+        <w:t>base.en</w:t>
+      </w:r>
+      <w:proofErr w:type="spellEnd"/>
+      <w:proofErr w:type="gramEnd"/>
+    </w:p>
     <w:p/>
+    <w:p>
+      <w:r>
+        <w:br w:type="page"/>
+      </w:r>
+    </w:p>
+    <w:p>
+      <w:pPr>
+        <w:spacing w:line="360" w:lineRule="auto"/>
+      </w:pPr>
+      <w:r>
+        <w:lastRenderedPageBreak/>
+        <w:t>Project Management</w:t>
+      </w:r>
+    </w:p>
+    <w:p>
+      <w:pPr>
+        <w:spacing w:line="360" w:lineRule="auto"/>
+      </w:pPr>
+      <w:proofErr w:type="spellStart"/>
+      <w:r>
+        <w:t>Dealdlines</w:t>
+      </w:r>
+      <w:proofErr w:type="spellEnd"/>
+      <w:r>
+        <w:t>, Milestones, Key Dates</w:t>
+      </w:r>
+    </w:p>
     <w:p>
       <w:pPr>
         <w:spacing w:line="360" w:lineRule="auto"/>
@@ -3302,21 +3424,8 @@
           <w:szCs w:val="32"/>
         </w:rPr>
       </w:pPr>
-      <w:proofErr w:type="spellStart"/>
-      <w:r>
-        <w:t>Aes</w:t>
-      </w:r>
-      <w:proofErr w:type="spellEnd"/>
-      <w:r>
-        <w:t xml:space="preserve">, transformer model outputting score after </w:t>
-      </w:r>
-      <w:proofErr w:type="spellStart"/>
-      <w:r>
-        <w:t>ocr</w:t>
-      </w:r>
-      <w:proofErr w:type="spellEnd"/>
-      <w:r>
-        <w:t xml:space="preserve"> inputs essay</w:t>
+      <w:r>
+        <w:t>Gantt Chart, Critical Path Analysis</w:t>
       </w:r>
       <w:r>
         <w:br w:type="page"/>
@@ -3335,58 +3444,6 @@
       <w:bookmarkEnd w:id="8"/>
     </w:p>
     <w:p/>
-    <w:p>
-      <w:pPr>
-        <w:spacing w:line="360" w:lineRule="auto"/>
-      </w:pPr>
-      <w:proofErr w:type="spellStart"/>
-      <w:r>
-        <w:t>microsoft</w:t>
-      </w:r>
-      <w:proofErr w:type="spellEnd"/>
-      <w:r>
-        <w:t>/deberta-v3-base</w:t>
-      </w:r>
-    </w:p>
-    <w:p>
-      <w:pPr>
-        <w:spacing w:line="360" w:lineRule="auto"/>
-      </w:pPr>
-      <w:proofErr w:type="spellStart"/>
-      <w:r>
-        <w:t>microsoft</w:t>
-      </w:r>
-      <w:proofErr w:type="spellEnd"/>
-      <w:r>
-        <w:t>/</w:t>
-      </w:r>
-      <w:proofErr w:type="spellStart"/>
-      <w:r>
-        <w:t>trocr</w:t>
-      </w:r>
-      <w:proofErr w:type="spellEnd"/>
-      <w:r>
-        <w:t>-base-handwritten</w:t>
-      </w:r>
-    </w:p>
-    <w:p>
-      <w:pPr>
-        <w:spacing w:line="360" w:lineRule="auto"/>
-      </w:pPr>
-      <w:proofErr w:type="spellStart"/>
-      <w:r>
-        <w:t>openai</w:t>
-      </w:r>
-      <w:proofErr w:type="spellEnd"/>
-      <w:r>
-        <w:t>/whisper-</w:t>
-      </w:r>
-      <w:proofErr w:type="spellStart"/>
-      <w:r>
-        <w:t>base.en</w:t>
-      </w:r>
-      <w:proofErr w:type="spellEnd"/>
-    </w:p>
     <w:p>
       <w:r>
         <w:br w:type="page"/>

</xml_diff>

<commit_message>
Added references to reference list
</commit_message>
<xml_diff>
--- a/preliminary report/Final Project - Preliminary Report.docx
+++ b/preliminary report/Final Project - Preliminary Report.docx
@@ -170,7 +170,7 @@
           <w:r>
             <w:fldChar w:fldCharType="separate"/>
           </w:r>
-          <w:hyperlink w:anchor="_Toc232887176" w:history="1">
+          <w:hyperlink w:anchor="_Toc233058942" w:history="1">
             <w:r>
               <w:rPr>
                 <w:rStyle w:val="Hyperlink"/>
@@ -197,7 +197,7 @@
                 <w:noProof/>
                 <w:webHidden/>
               </w:rPr>
-              <w:instrText xml:space="preserve"> PAGEREF _Toc232887176 \h </w:instrText>
+              <w:instrText xml:space="preserve"> PAGEREF _Toc233058942 \h </w:instrText>
             </w:r>
             <w:r>
               <w:rPr>
@@ -240,7 +240,7 @@
               <w:lang w:eastAsia="en-GB"/>
             </w:rPr>
           </w:pPr>
-          <w:hyperlink w:anchor="_Toc232887177" w:history="1">
+          <w:hyperlink w:anchor="_Toc233058943" w:history="1">
             <w:r>
               <w:rPr>
                 <w:rStyle w:val="Hyperlink"/>
@@ -267,7 +267,7 @@
                 <w:noProof/>
                 <w:webHidden/>
               </w:rPr>
-              <w:instrText xml:space="preserve"> PAGEREF _Toc232887177 \h </w:instrText>
+              <w:instrText xml:space="preserve"> PAGEREF _Toc233058943 \h </w:instrText>
             </w:r>
             <w:r>
               <w:rPr>
@@ -310,7 +310,7 @@
               <w:lang w:eastAsia="en-GB"/>
             </w:rPr>
           </w:pPr>
-          <w:hyperlink w:anchor="_Toc232887178" w:history="1">
+          <w:hyperlink w:anchor="_Toc233058944" w:history="1">
             <w:r>
               <w:rPr>
                 <w:rStyle w:val="Hyperlink"/>
@@ -337,7 +337,7 @@
                 <w:noProof/>
                 <w:webHidden/>
               </w:rPr>
-              <w:instrText xml:space="preserve"> PAGEREF _Toc232887178 \h </w:instrText>
+              <w:instrText xml:space="preserve"> PAGEREF _Toc233058944 \h </w:instrText>
             </w:r>
             <w:r>
               <w:rPr>
@@ -380,7 +380,7 @@
               <w:lang w:eastAsia="en-GB"/>
             </w:rPr>
           </w:pPr>
-          <w:hyperlink w:anchor="_Toc232887179" w:history="1">
+          <w:hyperlink w:anchor="_Toc233058945" w:history="1">
             <w:r>
               <w:rPr>
                 <w:rStyle w:val="Hyperlink"/>
@@ -407,7 +407,7 @@
                 <w:noProof/>
                 <w:webHidden/>
               </w:rPr>
-              <w:instrText xml:space="preserve"> PAGEREF _Toc232887179 \h </w:instrText>
+              <w:instrText xml:space="preserve"> PAGEREF _Toc233058945 \h </w:instrText>
             </w:r>
             <w:r>
               <w:rPr>
@@ -450,13 +450,13 @@
               <w:lang w:eastAsia="en-GB"/>
             </w:rPr>
           </w:pPr>
-          <w:hyperlink w:anchor="_Toc232887180" w:history="1">
+          <w:hyperlink w:anchor="_Toc233058946" w:history="1">
             <w:r>
               <w:rPr>
                 <w:rStyle w:val="Hyperlink"/>
                 <w:noProof/>
               </w:rPr>
-              <w:t>Multimodal</w:t>
+              <w:t>Multimodal Systems</w:t>
             </w:r>
             <w:r>
               <w:rPr>
@@ -477,7 +477,7 @@
                 <w:noProof/>
                 <w:webHidden/>
               </w:rPr>
-              <w:instrText xml:space="preserve"> PAGEREF _Toc232887180 \h </w:instrText>
+              <w:instrText xml:space="preserve"> PAGEREF _Toc233058946 \h </w:instrText>
             </w:r>
             <w:r>
               <w:rPr>
@@ -520,7 +520,7 @@
               <w:lang w:eastAsia="en-GB"/>
             </w:rPr>
           </w:pPr>
-          <w:hyperlink w:anchor="_Toc232887181" w:history="1">
+          <w:hyperlink w:anchor="_Toc233058947" w:history="1">
             <w:r>
               <w:rPr>
                 <w:rStyle w:val="Hyperlink"/>
@@ -547,7 +547,7 @@
                 <w:noProof/>
                 <w:webHidden/>
               </w:rPr>
-              <w:instrText xml:space="preserve"> PAGEREF _Toc232887181 \h </w:instrText>
+              <w:instrText xml:space="preserve"> PAGEREF _Toc233058947 \h </w:instrText>
             </w:r>
             <w:r>
               <w:rPr>
@@ -567,7 +567,77 @@
                 <w:noProof/>
                 <w:webHidden/>
               </w:rPr>
-              <w:t>10</w:t>
+              <w:t>12</w:t>
+            </w:r>
+            <w:r>
+              <w:rPr>
+                <w:noProof/>
+                <w:webHidden/>
+              </w:rPr>
+              <w:fldChar w:fldCharType="end"/>
+            </w:r>
+          </w:hyperlink>
+        </w:p>
+        <w:p>
+          <w:pPr>
+            <w:pStyle w:val="TOC3"/>
+            <w:tabs>
+              <w:tab w:val="right" w:leader="dot" w:pos="9016"/>
+            </w:tabs>
+            <w:rPr>
+              <w:rFonts w:eastAsiaTheme="minorEastAsia"/>
+              <w:noProof/>
+              <w:lang w:eastAsia="en-GB"/>
+            </w:rPr>
+          </w:pPr>
+          <w:hyperlink w:anchor="_Toc233058948" w:history="1">
+            <w:r>
+              <w:rPr>
+                <w:rStyle w:val="Hyperlink"/>
+                <w:noProof/>
+              </w:rPr>
+              <w:t>Evaluation Metrics</w:t>
+            </w:r>
+            <w:r>
+              <w:rPr>
+                <w:noProof/>
+                <w:webHidden/>
+              </w:rPr>
+              <w:tab/>
+            </w:r>
+            <w:r>
+              <w:rPr>
+                <w:noProof/>
+                <w:webHidden/>
+              </w:rPr>
+              <w:fldChar w:fldCharType="begin"/>
+            </w:r>
+            <w:r>
+              <w:rPr>
+                <w:noProof/>
+                <w:webHidden/>
+              </w:rPr>
+              <w:instrText xml:space="preserve"> PAGEREF _Toc233058948 \h </w:instrText>
+            </w:r>
+            <w:r>
+              <w:rPr>
+                <w:noProof/>
+                <w:webHidden/>
+              </w:rPr>
+            </w:r>
+            <w:r>
+              <w:rPr>
+                <w:noProof/>
+                <w:webHidden/>
+              </w:rPr>
+              <w:fldChar w:fldCharType="separate"/>
+            </w:r>
+            <w:r>
+              <w:rPr>
+                <w:noProof/>
+                <w:webHidden/>
+              </w:rPr>
+              <w:t>13</w:t>
             </w:r>
             <w:r>
               <w:rPr>
@@ -590,7 +660,7 @@
               <w:lang w:eastAsia="en-GB"/>
             </w:rPr>
           </w:pPr>
-          <w:hyperlink w:anchor="_Toc232887182" w:history="1">
+          <w:hyperlink w:anchor="_Toc233058949" w:history="1">
             <w:r>
               <w:rPr>
                 <w:rStyle w:val="Hyperlink"/>
@@ -617,7 +687,7 @@
                 <w:noProof/>
                 <w:webHidden/>
               </w:rPr>
-              <w:instrText xml:space="preserve"> PAGEREF _Toc232887182 \h </w:instrText>
+              <w:instrText xml:space="preserve"> PAGEREF _Toc233058949 \h </w:instrText>
             </w:r>
             <w:r>
               <w:rPr>
@@ -637,7 +707,7 @@
                 <w:noProof/>
                 <w:webHidden/>
               </w:rPr>
-              <w:t>12</w:t>
+              <w:t>15</w:t>
             </w:r>
             <w:r>
               <w:rPr>
@@ -660,7 +730,7 @@
               <w:lang w:eastAsia="en-GB"/>
             </w:rPr>
           </w:pPr>
-          <w:hyperlink w:anchor="_Toc232887183" w:history="1">
+          <w:hyperlink w:anchor="_Toc233058950" w:history="1">
             <w:r>
               <w:rPr>
                 <w:rStyle w:val="Hyperlink"/>
@@ -687,7 +757,7 @@
                 <w:noProof/>
                 <w:webHidden/>
               </w:rPr>
-              <w:instrText xml:space="preserve"> PAGEREF _Toc232887183 \h </w:instrText>
+              <w:instrText xml:space="preserve"> PAGEREF _Toc233058950 \h </w:instrText>
             </w:r>
             <w:r>
               <w:rPr>
@@ -707,7 +777,7 @@
                 <w:noProof/>
                 <w:webHidden/>
               </w:rPr>
-              <w:t>13</w:t>
+              <w:t>17</w:t>
             </w:r>
             <w:r>
               <w:rPr>
@@ -730,12 +800,82 @@
               <w:lang w:eastAsia="en-GB"/>
             </w:rPr>
           </w:pPr>
-          <w:hyperlink w:anchor="_Toc232887184" w:history="1">
+          <w:hyperlink w:anchor="_Toc233058951" w:history="1">
             <w:r>
               <w:rPr>
                 <w:rStyle w:val="Hyperlink"/>
                 <w:noProof/>
               </w:rPr>
+              <w:t>Project Management</w:t>
+            </w:r>
+            <w:r>
+              <w:rPr>
+                <w:noProof/>
+                <w:webHidden/>
+              </w:rPr>
+              <w:tab/>
+            </w:r>
+            <w:r>
+              <w:rPr>
+                <w:noProof/>
+                <w:webHidden/>
+              </w:rPr>
+              <w:fldChar w:fldCharType="begin"/>
+            </w:r>
+            <w:r>
+              <w:rPr>
+                <w:noProof/>
+                <w:webHidden/>
+              </w:rPr>
+              <w:instrText xml:space="preserve"> PAGEREF _Toc233058951 \h </w:instrText>
+            </w:r>
+            <w:r>
+              <w:rPr>
+                <w:noProof/>
+                <w:webHidden/>
+              </w:rPr>
+            </w:r>
+            <w:r>
+              <w:rPr>
+                <w:noProof/>
+                <w:webHidden/>
+              </w:rPr>
+              <w:fldChar w:fldCharType="separate"/>
+            </w:r>
+            <w:r>
+              <w:rPr>
+                <w:noProof/>
+                <w:webHidden/>
+              </w:rPr>
+              <w:t>18</w:t>
+            </w:r>
+            <w:r>
+              <w:rPr>
+                <w:noProof/>
+                <w:webHidden/>
+              </w:rPr>
+              <w:fldChar w:fldCharType="end"/>
+            </w:r>
+          </w:hyperlink>
+        </w:p>
+        <w:p>
+          <w:pPr>
+            <w:pStyle w:val="TOC2"/>
+            <w:tabs>
+              <w:tab w:val="right" w:leader="dot" w:pos="9016"/>
+            </w:tabs>
+            <w:rPr>
+              <w:rFonts w:eastAsiaTheme="minorEastAsia"/>
+              <w:noProof/>
+              <w:lang w:eastAsia="en-GB"/>
+            </w:rPr>
+          </w:pPr>
+          <w:hyperlink w:anchor="_Toc233058952" w:history="1">
+            <w:r>
+              <w:rPr>
+                <w:rStyle w:val="Hyperlink"/>
+                <w:noProof/>
+              </w:rPr>
               <w:t>REFERENCE LIST</w:t>
             </w:r>
             <w:r>
@@ -757,7 +897,7 @@
                 <w:noProof/>
                 <w:webHidden/>
               </w:rPr>
-              <w:instrText xml:space="preserve"> PAGEREF _Toc232887184 \h </w:instrText>
+              <w:instrText xml:space="preserve"> PAGEREF _Toc233058952 \h </w:instrText>
             </w:r>
             <w:r>
               <w:rPr>
@@ -777,7 +917,7 @@
                 <w:noProof/>
                 <w:webHidden/>
               </w:rPr>
-              <w:t>14</w:t>
+              <w:t>19</w:t>
             </w:r>
             <w:r>
               <w:rPr>
@@ -821,7 +961,7 @@
         <w:pStyle w:val="Heading2"/>
         <w:spacing w:line="360" w:lineRule="auto"/>
       </w:pPr>
-      <w:bookmarkStart w:id="0" w:name="_Toc232887176"/>
+      <w:bookmarkStart w:id="0" w:name="_Toc233058942"/>
       <w:r>
         <w:lastRenderedPageBreak/>
         <w:t>Introduction</w:t>
@@ -873,11 +1013,9 @@
       <w:r>
         <w:t xml:space="preserve">orchestrates </w:t>
       </w:r>
-      <w:proofErr w:type="gramStart"/>
-      <w:r>
-        <w:t>a</w:t>
-      </w:r>
-      <w:proofErr w:type="gramEnd"/>
+      <w:r>
+        <w:t>an</w:t>
+      </w:r>
       <w:r>
         <w:t xml:space="preserve"> </w:t>
       </w:r>
@@ -1058,7 +1196,7 @@
         <w:pStyle w:val="Heading2"/>
         <w:spacing w:line="360" w:lineRule="auto"/>
       </w:pPr>
-      <w:bookmarkStart w:id="1" w:name="_Toc232887177"/>
+      <w:bookmarkStart w:id="1" w:name="_Toc233058943"/>
       <w:r>
         <w:lastRenderedPageBreak/>
         <w:t>Literature Review</w:t>
@@ -1325,59 +1463,6 @@
       </w:r>
       <w:r>
         <w:t xml:space="preserve">. </w:t>
-      </w:r>
-    </w:p>
-    <w:p>
-      <w:pPr>
-        <w:spacing w:line="360" w:lineRule="auto"/>
-      </w:pPr>
-    </w:p>
-    <w:p>
-      <w:pPr>
-        <w:spacing w:line="360" w:lineRule="auto"/>
-        <w:rPr>
-          <w:b/>
-          <w:bCs/>
-        </w:rPr>
-      </w:pPr>
-      <w:r>
-        <w:rPr>
-          <w:b/>
-          <w:bCs/>
-        </w:rPr>
-        <w:t>High-level System Architecture</w:t>
-      </w:r>
-    </w:p>
-    <w:p>
-      <w:pPr>
-        <w:spacing w:line="360" w:lineRule="auto"/>
-      </w:pPr>
-      <w:r>
-        <w:t xml:space="preserve">The proposed system will achieve accessibility by </w:t>
-      </w:r>
-      <w:r>
-        <w:t>utilizing pretrained</w:t>
-      </w:r>
-      <w:r>
-        <w:t xml:space="preserve"> OCR </w:t>
-      </w:r>
-      <w:r>
-        <w:t xml:space="preserve">and a speech-to-text (STT) models </w:t>
-      </w:r>
-      <w:r>
-        <w:t xml:space="preserve">to allow </w:t>
-      </w:r>
-      <w:r>
-        <w:t xml:space="preserve">audio-transcribed, typed and scanned images of handwritten essays to be uploaded for evaluation. </w:t>
-      </w:r>
-    </w:p>
-    <w:p>
-      <w:pPr>
-        <w:spacing w:line="360" w:lineRule="auto"/>
-        <w:ind w:right="971"/>
-      </w:pPr>
-      <w:r>
-        <w:t xml:space="preserve">Output from the speech-to-text and image-to-text models will be transformed into machine-readable text and fed as input to the transformer model for contextual and semantic analysis and final holistic scoring. </w:t>
       </w:r>
     </w:p>
     <w:p>
@@ -1398,7 +1483,7 @@
         <w:pStyle w:val="Heading3"/>
         <w:spacing w:line="360" w:lineRule="auto"/>
       </w:pPr>
-      <w:bookmarkStart w:id="2" w:name="_Toc232887178"/>
+      <w:bookmarkStart w:id="2" w:name="_Toc233058944"/>
       <w:r>
         <w:lastRenderedPageBreak/>
         <w:t>Optical Character Recognition (OCR)</w:t>
@@ -1411,7 +1496,7 @@
         <w:spacing w:line="360" w:lineRule="auto"/>
       </w:pPr>
       <w:r>
-        <w:t xml:space="preserve">Jain et. al. </w:t>
+        <w:t xml:space="preserve"> </w:t>
       </w:r>
       <w:r>
         <w:t>[</w:t>
@@ -1438,15 +1523,27 @@
         <w:t xml:space="preserve">Li et al. </w:t>
       </w:r>
       <w:r>
+        <w:rPr>
+          <w:highlight w:val="yellow"/>
+        </w:rPr>
         <w:t xml:space="preserve">[5 from multimodal] traditional OCR is primarily oriented toward printed text but has been modified to recognize handwritten text giving rise to the synonym </w:t>
       </w:r>
       <w:proofErr w:type="spellStart"/>
       <w:r>
+        <w:rPr>
+          <w:highlight w:val="yellow"/>
+        </w:rPr>
         <w:t>HandwrittenOCR</w:t>
       </w:r>
       <w:proofErr w:type="spellEnd"/>
       <w:r>
-        <w:t xml:space="preserve">. </w:t>
+        <w:rPr>
+          <w:highlight w:val="yellow"/>
+        </w:rPr>
+        <w:t>.</w:t>
+      </w:r>
+      <w:r>
+        <w:t xml:space="preserve"> </w:t>
       </w:r>
       <w:r>
         <w:t>[1</w:t>
@@ -1712,7 +1809,7 @@
         <w:pStyle w:val="Heading3"/>
         <w:spacing w:line="360" w:lineRule="auto"/>
       </w:pPr>
-      <w:bookmarkStart w:id="3" w:name="_Toc232887179"/>
+      <w:bookmarkStart w:id="3" w:name="_Toc233058945"/>
       <w:r>
         <w:lastRenderedPageBreak/>
         <w:t xml:space="preserve">Automated Speech Recognition (ASR), </w:t>
@@ -1735,10 +1832,25 @@
         <w:spacing w:line="360" w:lineRule="auto"/>
       </w:pPr>
       <w:r>
-        <w:t xml:space="preserve">[1] for STT the system accepts an audio input signal from either a person or a machine and detects and converts individual words and phrases into text. </w:t>
-      </w:r>
-      <w:r>
-        <w:t xml:space="preserve">[2] Advances in deep learning technology has profoundly transformed automatic speech recognition (ASR) over the past decade. </w:t>
+        <w:t>[1</w:t>
+      </w:r>
+      <w:r>
+        <w:t>4</w:t>
+      </w:r>
+      <w:r>
+        <w:t xml:space="preserve">] for STT the system accepts an audio input signal from either a person or a machine and detects and converts individual words and phrases into text. </w:t>
+      </w:r>
+      <w:r>
+        <w:t>[</w:t>
+      </w:r>
+      <w:r>
+        <w:t>1</w:t>
+      </w:r>
+      <w:r>
+        <w:t>5</w:t>
+      </w:r>
+      <w:r>
+        <w:t xml:space="preserve">] Advances in deep learning technology has profoundly transformed automatic speech recognition (ASR) over the past decade. </w:t>
       </w:r>
       <w:r>
         <w:t>Historically, ASR systems were constructed from a complex pipeline of independently trained components such an acoustic model (AM), a Gaussian Mixture Model-Hidden Markov Model (GMM-HMM), a pronunciation model (lexicon) and a language model (LM). Like early AES system, features had to be hand engineered, which was tedious and did not scale well</w:t>
@@ -1755,7 +1867,16 @@
         <w:t xml:space="preserve"> </w:t>
       </w:r>
       <w:r>
-        <w:t>[3] described how three major research group</w:t>
+        <w:t>[</w:t>
+      </w:r>
+      <w:r>
+        <w:t>1</w:t>
+      </w:r>
+      <w:r>
+        <w:t>6</w:t>
+      </w:r>
+      <w:r>
+        <w:t>] described how three major research group</w:t>
       </w:r>
       <w:r>
         <w:t>s</w:t>
@@ -1764,7 +1885,16 @@
         <w:t xml:space="preserve">- Microsoft Research (MSR), Google and IBM Research, achieved significant improvements in a variety of state-of-the-art ASR systems by replacing GMMs with DNNs. </w:t>
       </w:r>
       <w:r>
-        <w:t>According to [2] the modern era of ASR is defined by firstly, a shift towards end-to-end</w:t>
+        <w:t>According to [</w:t>
+      </w:r>
+      <w:r>
+        <w:t>1</w:t>
+      </w:r>
+      <w:r>
+        <w:t>5</w:t>
+      </w:r>
+      <w:r>
+        <w:t>] the modern era of ASR is defined by firstly, a shift towards end-to-end</w:t>
       </w:r>
       <w:r>
         <w:t xml:space="preserve"> </w:t>
@@ -1812,7 +1942,13 @@
         <w:t xml:space="preserve"> </w:t>
       </w:r>
       <w:r>
-        <w:t xml:space="preserve">[4] </w:t>
+        <w:t>[</w:t>
+      </w:r>
+      <w:r>
+        <w:t>17</w:t>
+      </w:r>
+      <w:r>
+        <w:t xml:space="preserve">] </w:t>
       </w:r>
       <w:r>
         <w:t>One such model that exemplifies this shift is OpenAI’s Whisper</w:t>
@@ -1824,7 +1960,13 @@
         <w:t xml:space="preserve">. </w:t>
       </w:r>
       <w:r>
-        <w:t xml:space="preserve">[5] </w:t>
+        <w:t>[</w:t>
+      </w:r>
+      <w:r>
+        <w:t>18</w:t>
+      </w:r>
+      <w:r>
+        <w:t xml:space="preserve">] </w:t>
       </w:r>
       <w:r>
         <w:t>For translation tasks, the Transformer can be trained significantly faster than architectures based</w:t>
@@ -1845,7 +1987,7 @@
         <w:t>Whisper transcribed 950 out of 1000 words correctly in research carried out by [</w:t>
       </w:r>
       <w:r>
-        <w:t>6</w:t>
+        <w:t>19</w:t>
       </w:r>
       <w:r>
         <w:t xml:space="preserve">] achieving 95% accuracy. </w:t>
@@ -1857,7 +1999,10 @@
         <w:t>environment</w:t>
       </w:r>
       <w:r>
-        <w:t xml:space="preserve"> [6</w:t>
+        <w:t xml:space="preserve"> [</w:t>
+      </w:r>
+      <w:r>
+        <w:t>19</w:t>
       </w:r>
       <w:r>
         <w:t>]</w:t>
@@ -1883,15 +2028,15 @@
       <w:pPr>
         <w:pStyle w:val="Heading2"/>
       </w:pPr>
-      <w:bookmarkStart w:id="4" w:name="_Toc232887180"/>
+      <w:bookmarkStart w:id="4" w:name="_Toc233058946"/>
       <w:r>
         <w:lastRenderedPageBreak/>
         <w:t>Multimodal</w:t>
       </w:r>
+      <w:r>
+        <w:t xml:space="preserve"> Systems</w:t>
+      </w:r>
       <w:bookmarkEnd w:id="4"/>
-      <w:r>
-        <w:t xml:space="preserve"> Systems</w:t>
-      </w:r>
     </w:p>
     <w:p>
       <w:pPr>
@@ -2063,7 +2208,13 @@
         <w:spacing w:line="360" w:lineRule="auto"/>
       </w:pPr>
       <w:r>
-        <w:t>[1] propose</w:t>
+        <w:t>[</w:t>
+      </w:r>
+      <w:r>
+        <w:t>20</w:t>
+      </w:r>
+      <w:r>
+        <w:t>] propose</w:t>
       </w:r>
       <w:r>
         <w:t>d</w:t>
@@ -2117,18 +2268,18 @@
         <w:t>limited in that it does not cover complex visual inputs such as film frames.</w:t>
       </w:r>
       <w:r>
-        <w:t xml:space="preserve"> </w:t>
-      </w:r>
-      <w:r>
-        <w:t>This system although multimodal, is still not designed to cater to students with disabilities, as it, like other AES systems ignores input equity.</w:t>
-      </w:r>
-    </w:p>
-    <w:p>
-      <w:pPr>
-        <w:spacing w:line="360" w:lineRule="auto"/>
-      </w:pPr>
-      <w:r>
-        <w:t>[7</w:t>
+        <w:t xml:space="preserve"> This system although multimodal, is still not designed to cater to students with disabilities, as it, like other AES systems ignores input equity.</w:t>
+      </w:r>
+    </w:p>
+    <w:p>
+      <w:pPr>
+        <w:spacing w:line="360" w:lineRule="auto"/>
+      </w:pPr>
+      <w:r>
+        <w:t>[</w:t>
+      </w:r>
+      <w:r>
+        <w:t>21</w:t>
       </w:r>
       <w:r>
         <w:t>] developed</w:t>
@@ -2142,7 +2293,21 @@
       </w:r>
       <w:proofErr w:type="spellEnd"/>
       <w:r>
-        <w:t xml:space="preserve"> the integrates optical character recognition (OCR) with the generative pre-trained transformer (GPT). The platform integrates two pre-trained models - HandwritingOCR to extract text from handwritten exam papers and like [1] employs GPT-4 to evaluate and score student responses. The platform offers features such as exam creation where for MCQs and TFs the teacher supplies the answers. Student exam completion using handwritten or online modalities. </w:t>
+        <w:t xml:space="preserve"> the integrates optical character recognition (OCR) with the generative pre-trained transformer (GPT). The platform integrates two pre-trained models - </w:t>
+      </w:r>
+      <w:proofErr w:type="spellStart"/>
+      <w:r>
+        <w:t>HandwritingOCR</w:t>
+      </w:r>
+      <w:proofErr w:type="spellEnd"/>
+      <w:r>
+        <w:t xml:space="preserve"> to extract text from handwritten exam papers and like [</w:t>
+      </w:r>
+      <w:r>
+        <w:t>20</w:t>
+      </w:r>
+      <w:r>
+        <w:t xml:space="preserve">] employs GPT-4 to evaluate and score student responses. The platform offers features such as exam creation where for MCQs and TFs the teacher supplies the answers. Student exam completion using handwritten or online modalities. </w:t>
       </w:r>
     </w:p>
     <w:p>
@@ -2159,16 +2324,20 @@
       <w:r>
         <w:t xml:space="preserve"> </w:t>
       </w:r>
-      <w:proofErr w:type="gramStart"/>
-      <w:r>
-        <w:t>accessible,</w:t>
-      </w:r>
-      <w:proofErr w:type="gramEnd"/>
+      <w:r>
+        <w:t>accessible;</w:t>
+      </w:r>
       <w:r>
         <w:t xml:space="preserve"> however, accessibility only encompasses availability online at GitHub since the platform is released as an open-source </w:t>
       </w:r>
       <w:r>
-        <w:t>project [7]</w:t>
+        <w:t>project [</w:t>
+      </w:r>
+      <w:r>
+        <w:t>21</w:t>
+      </w:r>
+      <w:r>
+        <w:t>]</w:t>
       </w:r>
       <w:r>
         <w:t xml:space="preserve">. </w:t>
@@ -2199,7 +2368,13 @@
         <w:t xml:space="preserve"> </w:t>
       </w:r>
       <w:r>
-        <w:t xml:space="preserve">[2] proposed </w:t>
+        <w:t>[2</w:t>
+      </w:r>
+      <w:r>
+        <w:t>2</w:t>
+      </w:r>
+      <w:r>
+        <w:t xml:space="preserve">] proposed </w:t>
       </w:r>
       <w:proofErr w:type="spellStart"/>
       <w:r>
@@ -2281,15 +2456,27 @@
         <w:spacing w:line="360" w:lineRule="auto"/>
       </w:pPr>
       <w:r>
-        <w:t xml:space="preserve">[6] developed an inclusive learning classroom using OpenAI Whisper model. The model was selected to promote diversity and inclusivity in education through real-time transcription and translation for students with diverse linguistic and cultural abilities and backgrounds. The results were encouraging as the model achieved high accuracy especially in an environment where ambient noise did not alter the audio signal input. This system however is limited in input modality as it only focuses on audio transcription with no allocation made for submission of handwritten work. </w:t>
-      </w:r>
-    </w:p>
-    <w:p>
-      <w:pPr>
-        <w:spacing w:line="360" w:lineRule="auto"/>
-      </w:pPr>
-      <w:r>
-        <w:t>[5] developed a system for investigating the possibility of automatically grading handwritten essays by leveraging OCR together with a fine-tuned and trained Large Language Model (LLM)</w:t>
+        <w:t>[</w:t>
+      </w:r>
+      <w:r>
+        <w:t>19</w:t>
+      </w:r>
+      <w:r>
+        <w:t xml:space="preserve">] developed an inclusive learning classroom using OpenAI Whisper model. The model was selected to promote diversity and inclusivity in education through real-time transcription and translation for students with diverse linguistic and cultural abilities and backgrounds. The results were encouraging as the model achieved high accuracy especially in an environment where ambient noise did not alter the audio signal input. This system however is limited in input modality as it only focuses on audio transcription with no allocation made for submission of handwritten work. </w:t>
+      </w:r>
+    </w:p>
+    <w:p>
+      <w:pPr>
+        <w:spacing w:line="360" w:lineRule="auto"/>
+      </w:pPr>
+      <w:r>
+        <w:t>[</w:t>
+      </w:r>
+      <w:r>
+        <w:t>23</w:t>
+      </w:r>
+      <w:r>
+        <w:t>] developed a system for investigating the possibility of automatically grading handwritten essays by leveraging OCR together with a fine-tuned and trained Large Language Model (LLM)</w:t>
       </w:r>
       <w:r>
         <w:t xml:space="preserve"> </w:t>
@@ -2301,7 +2488,10 @@
         <w:t>by [</w:t>
       </w:r>
       <w:r>
-        <w:t xml:space="preserve">5] </w:t>
+        <w:t>23</w:t>
+      </w:r>
+      <w:r>
+        <w:t xml:space="preserve">] </w:t>
       </w:r>
       <w:r>
         <w:t xml:space="preserve">showing once again that most modern AES systems focus on the </w:t>
@@ -2315,6 +2505,30 @@
       <w:pPr>
         <w:spacing w:line="360" w:lineRule="auto"/>
       </w:pPr>
+    </w:p>
+    <w:p>
+      <w:pPr>
+        <w:spacing w:line="360" w:lineRule="auto"/>
+      </w:pPr>
+      <w:r>
+        <w:t>Limitations of OCR</w:t>
+      </w:r>
+    </w:p>
+    <w:p>
+      <w:pPr>
+        <w:spacing w:line="360" w:lineRule="auto"/>
+      </w:pPr>
+      <w:r>
+        <w:t>Limitations of ASR (STT)</w:t>
+      </w:r>
+    </w:p>
+    <w:p>
+      <w:pPr>
+        <w:spacing w:line="360" w:lineRule="auto"/>
+      </w:pPr>
+      <w:r>
+        <w:t xml:space="preserve">Limitations of Transformers </w:t>
+      </w:r>
     </w:p>
     <w:p>
       <w:pPr>
@@ -2326,7 +2540,7 @@
         <w:spacing w:line="360" w:lineRule="auto"/>
       </w:pPr>
       <w:r>
-        <w:t>Limitations of OCR</w:t>
+        <w:t>Specify dataset and critique it</w:t>
       </w:r>
     </w:p>
     <w:p>
@@ -2339,7 +2553,15 @@
         <w:spacing w:line="360" w:lineRule="auto"/>
       </w:pPr>
       <w:r>
-        <w:t>Limitations of ASR (STT)</w:t>
+        <w:t xml:space="preserve">Paper 7 speaks about how gpt-4 has limitations, use to contrast with </w:t>
+      </w:r>
+      <w:proofErr w:type="spellStart"/>
+      <w:r>
+        <w:t>deberta</w:t>
+      </w:r>
+      <w:proofErr w:type="spellEnd"/>
+      <w:r>
+        <w:t xml:space="preserve"> to show advantage</w:t>
       </w:r>
     </w:p>
     <w:p>
@@ -2351,53 +2573,6 @@
         </w:numPr>
         <w:spacing w:line="360" w:lineRule="auto"/>
       </w:pPr>
-      <w:r>
-        <w:t xml:space="preserve">Limitations of Transformers </w:t>
-      </w:r>
-    </w:p>
-    <w:p>
-      <w:pPr>
-        <w:pStyle w:val="ListParagraph"/>
-        <w:numPr>
-          <w:ilvl w:val="0"/>
-          <w:numId w:val="3"/>
-        </w:numPr>
-        <w:spacing w:line="360" w:lineRule="auto"/>
-      </w:pPr>
-      <w:r>
-        <w:t>Specify dataset and critique it</w:t>
-      </w:r>
-    </w:p>
-    <w:p>
-      <w:pPr>
-        <w:pStyle w:val="ListParagraph"/>
-        <w:numPr>
-          <w:ilvl w:val="0"/>
-          <w:numId w:val="3"/>
-        </w:numPr>
-        <w:spacing w:line="360" w:lineRule="auto"/>
-      </w:pPr>
-      <w:r>
-        <w:t xml:space="preserve">Paper 7 speaks about how gpt-4 has limitations, use to contrast with </w:t>
-      </w:r>
-      <w:proofErr w:type="spellStart"/>
-      <w:r>
-        <w:t>deberta</w:t>
-      </w:r>
-      <w:proofErr w:type="spellEnd"/>
-      <w:r>
-        <w:t xml:space="preserve"> to show advantage</w:t>
-      </w:r>
-    </w:p>
-    <w:p>
-      <w:pPr>
-        <w:pStyle w:val="ListParagraph"/>
-        <w:numPr>
-          <w:ilvl w:val="0"/>
-          <w:numId w:val="3"/>
-        </w:numPr>
-        <w:spacing w:line="360" w:lineRule="auto"/>
-      </w:pPr>
     </w:p>
     <w:p>
       <w:pPr>
@@ -2422,7 +2597,7 @@
       <w:pPr>
         <w:pStyle w:val="Heading2"/>
       </w:pPr>
-      <w:bookmarkStart w:id="5" w:name="_Toc232887181"/>
+      <w:bookmarkStart w:id="5" w:name="_Toc233058947"/>
       <w:r>
         <w:lastRenderedPageBreak/>
         <w:t>Evaluation plan</w:t>
@@ -2597,6 +2772,7 @@
       <w:pPr>
         <w:pStyle w:val="Heading3"/>
       </w:pPr>
+      <w:bookmarkStart w:id="6" w:name="_Toc233058948"/>
       <w:r>
         <w:lastRenderedPageBreak/>
         <w:t xml:space="preserve">Evaluation </w:t>
@@ -2604,6 +2780,7 @@
       <w:r>
         <w:t>Metrics</w:t>
       </w:r>
+      <w:bookmarkEnd w:id="6"/>
     </w:p>
     <w:p>
       <w:pPr>
@@ -3088,15 +3265,135 @@
       <w:pPr>
         <w:pStyle w:val="Heading2"/>
       </w:pPr>
-      <w:bookmarkStart w:id="6" w:name="_Toc232887182"/>
+      <w:bookmarkStart w:id="7" w:name="_Toc233058949"/>
       <w:r>
         <w:lastRenderedPageBreak/>
         <w:t>Design</w:t>
       </w:r>
-      <w:bookmarkEnd w:id="6"/>
+      <w:bookmarkEnd w:id="7"/>
       <w:r>
         <w:t xml:space="preserve"> </w:t>
       </w:r>
+    </w:p>
+    <w:p>
+      <w:pPr>
+        <w:spacing w:line="360" w:lineRule="auto"/>
+      </w:pPr>
+    </w:p>
+    <w:p>
+      <w:pPr>
+        <w:spacing w:line="360" w:lineRule="auto"/>
+        <w:rPr>
+          <w:b/>
+          <w:bCs/>
+        </w:rPr>
+      </w:pPr>
+      <w:r>
+        <w:rPr>
+          <w:b/>
+          <w:bCs/>
+        </w:rPr>
+        <w:t>High-level System Architecture</w:t>
+      </w:r>
+    </w:p>
+    <w:p>
+      <w:pPr>
+        <w:spacing w:line="360" w:lineRule="auto"/>
+        <w:rPr>
+          <w:b/>
+          <w:bCs/>
+        </w:rPr>
+      </w:pPr>
+    </w:p>
+    <w:p>
+      <w:pPr>
+        <w:spacing w:line="360" w:lineRule="auto"/>
+      </w:pPr>
+      <w:r>
+        <w:t xml:space="preserve">The proposed system will achieve accessibility by utilizing pretrained OCR and a speech-to-text (STT) models to allow audio-transcribed, typed and scanned images of handwritten essays to be uploaded for evaluation. </w:t>
+      </w:r>
+    </w:p>
+    <w:p>
+      <w:pPr>
+        <w:spacing w:line="360" w:lineRule="auto"/>
+        <w:ind w:right="971"/>
+      </w:pPr>
+      <w:r>
+        <w:t xml:space="preserve">Output from the speech-to-text and image-to-text models will be transformed into machine-readable text and fed as input to the transformer model for contextual and semantic analysis and final holistic scoring. </w:t>
+      </w:r>
+    </w:p>
+    <w:p>
+      <w:pPr>
+        <w:spacing w:line="360" w:lineRule="auto"/>
+        <w:ind w:right="971"/>
+      </w:pPr>
+    </w:p>
+    <w:p>
+      <w:r>
+        <w:rPr>
+          <w:b/>
+          <w:bCs/>
+        </w:rPr>
+        <w:t>Pipeline</w:t>
+      </w:r>
+      <w:r>
+        <w:t>:</w:t>
+      </w:r>
+    </w:p>
+    <w:p/>
+    <w:p>
+      <w:pPr>
+        <w:spacing w:line="360" w:lineRule="auto"/>
+      </w:pPr>
+      <w:proofErr w:type="spellStart"/>
+      <w:r>
+        <w:t>microsoft</w:t>
+      </w:r>
+      <w:proofErr w:type="spellEnd"/>
+      <w:r>
+        <w:t>/deberta-v3-base</w:t>
+      </w:r>
+    </w:p>
+    <w:p>
+      <w:pPr>
+        <w:spacing w:line="360" w:lineRule="auto"/>
+      </w:pPr>
+      <w:proofErr w:type="spellStart"/>
+      <w:r>
+        <w:t>microsoft</w:t>
+      </w:r>
+      <w:proofErr w:type="spellEnd"/>
+      <w:r>
+        <w:t>/</w:t>
+      </w:r>
+      <w:proofErr w:type="spellStart"/>
+      <w:r>
+        <w:t>trocr</w:t>
+      </w:r>
+      <w:proofErr w:type="spellEnd"/>
+      <w:r>
+        <w:t>-base-handwritten</w:t>
+      </w:r>
+    </w:p>
+    <w:p>
+      <w:pPr>
+        <w:spacing w:line="360" w:lineRule="auto"/>
+      </w:pPr>
+      <w:proofErr w:type="spellStart"/>
+      <w:r>
+        <w:t>openai</w:t>
+      </w:r>
+      <w:proofErr w:type="spellEnd"/>
+      <w:r>
+        <w:t>/whisper-</w:t>
+      </w:r>
+      <w:proofErr w:type="spellStart"/>
+      <w:proofErr w:type="gramStart"/>
+      <w:r>
+        <w:t>base.en</w:t>
+      </w:r>
+      <w:proofErr w:type="spellEnd"/>
+      <w:proofErr w:type="gramEnd"/>
     </w:p>
     <w:p/>
     <w:p>
@@ -3250,7 +3547,16 @@
         <w:spacing w:line="360" w:lineRule="auto"/>
       </w:pPr>
       <w:r>
-        <w:t>Back end – db (might not be necessary as the performance is all that matters)</w:t>
+        <w:lastRenderedPageBreak/>
+        <w:t xml:space="preserve">Back end – </w:t>
+      </w:r>
+      <w:proofErr w:type="spellStart"/>
+      <w:r>
+        <w:t>db</w:t>
+      </w:r>
+      <w:proofErr w:type="spellEnd"/>
+      <w:r>
+        <w:t xml:space="preserve"> (might not be necessary as the performance is all that matters)</w:t>
       </w:r>
     </w:p>
     <w:p>
@@ -3277,11 +3583,20 @@
           <w:bCs/>
         </w:rPr>
       </w:pPr>
-      <w:r>
+    </w:p>
+    <w:p>
+      <w:pPr>
+        <w:spacing w:line="360" w:lineRule="auto"/>
         <w:rPr>
           <w:b/>
           <w:bCs/>
         </w:rPr>
+      </w:pPr>
+      <w:r>
+        <w:rPr>
+          <w:b/>
+          <w:bCs/>
+        </w:rPr>
         <w:t>Out of scope</w:t>
       </w:r>
     </w:p>
@@ -3325,68 +3640,31 @@
         <w:pStyle w:val="Heading2"/>
         <w:spacing w:line="360" w:lineRule="auto"/>
       </w:pPr>
-      <w:bookmarkStart w:id="7" w:name="_Toc232887183"/>
+      <w:bookmarkStart w:id="8" w:name="_Toc233058950"/>
       <w:r>
         <w:lastRenderedPageBreak/>
         <w:t>Feature Prototype</w:t>
       </w:r>
-      <w:bookmarkEnd w:id="7"/>
-    </w:p>
-    <w:p>
-      <w:pPr>
-        <w:spacing w:line="360" w:lineRule="auto"/>
-      </w:pPr>
+      <w:bookmarkEnd w:id="8"/>
+    </w:p>
+    <w:p>
+      <w:r>
+        <w:t xml:space="preserve">Demonstrate how the AES scores essays from ASAP dataset submitted in digital format and </w:t>
+      </w:r>
       <w:proofErr w:type="spellStart"/>
       <w:r>
-        <w:t>microsoft</w:t>
+        <w:t>calu</w:t>
+      </w:r>
+      <w:r>
+        <w:t>late</w:t>
       </w:r>
       <w:proofErr w:type="spellEnd"/>
       <w:r>
-        <w:t>/deberta-v3-base</w:t>
-      </w:r>
-    </w:p>
-    <w:p>
-      <w:pPr>
-        <w:spacing w:line="360" w:lineRule="auto"/>
-      </w:pPr>
-      <w:proofErr w:type="spellStart"/>
-      <w:r>
-        <w:t>microsoft</w:t>
-      </w:r>
-      <w:proofErr w:type="spellEnd"/>
-      <w:r>
-        <w:t>/</w:t>
-      </w:r>
-      <w:proofErr w:type="spellStart"/>
-      <w:r>
-        <w:t>trocr</w:t>
-      </w:r>
-      <w:proofErr w:type="spellEnd"/>
-      <w:r>
-        <w:t>-base-handwritten</w:t>
-      </w:r>
-    </w:p>
-    <w:p>
-      <w:pPr>
-        <w:spacing w:line="360" w:lineRule="auto"/>
-      </w:pPr>
-      <w:proofErr w:type="spellStart"/>
-      <w:r>
-        <w:t>openai</w:t>
-      </w:r>
-      <w:proofErr w:type="spellEnd"/>
-      <w:r>
-        <w:t>/whisper-</w:t>
-      </w:r>
-      <w:proofErr w:type="spellStart"/>
-      <w:proofErr w:type="gramStart"/>
-      <w:r>
-        <w:t>base.en</w:t>
-      </w:r>
-      <w:proofErr w:type="spellEnd"/>
-      <w:proofErr w:type="gramEnd"/>
+        <w:t xml:space="preserve"> QWK score and give brief analysis of results, use holistic score for now, and handcrafted features later</w:t>
+      </w:r>
     </w:p>
     <w:p/>
+    <w:p/>
     <w:p>
       <w:r>
         <w:br w:type="page"/>
@@ -3394,12 +3672,21 @@
     </w:p>
     <w:p>
       <w:pPr>
-        <w:spacing w:line="360" w:lineRule="auto"/>
-      </w:pPr>
+        <w:pStyle w:val="Heading2"/>
+      </w:pPr>
+      <w:bookmarkStart w:id="9" w:name="_Toc233058951"/>
       <w:r>
         <w:lastRenderedPageBreak/>
         <w:t>Project Management</w:t>
       </w:r>
+      <w:bookmarkEnd w:id="9"/>
+    </w:p>
+    <w:p>
+      <w:proofErr w:type="spellStart"/>
+      <w:r>
+        <w:t>Github</w:t>
+      </w:r>
+      <w:proofErr w:type="spellEnd"/>
     </w:p>
     <w:p>
       <w:pPr>
@@ -3436,17 +3723,867 @@
         <w:pStyle w:val="Heading2"/>
         <w:spacing w:line="360" w:lineRule="auto"/>
       </w:pPr>
-      <w:bookmarkStart w:id="8" w:name="_Toc232887184"/>
+      <w:bookmarkStart w:id="10" w:name="_Toc233058952"/>
       <w:r>
         <w:lastRenderedPageBreak/>
         <w:t>REFERENCE LIST</w:t>
       </w:r>
-      <w:bookmarkEnd w:id="8"/>
+      <w:bookmarkEnd w:id="10"/>
     </w:p>
     <w:p/>
     <w:p>
       <w:r>
-        <w:br w:type="page"/>
+        <w:rPr>
+          <w:b/>
+          <w:bCs/>
+        </w:rPr>
+        <w:t>[1]</w:t>
+      </w:r>
+      <w:r>
+        <w:t xml:space="preserve"> I. M. G. S. Artha, A. S. Kusuma, and P. </w:t>
+      </w:r>
+      <w:proofErr w:type="spellStart"/>
+      <w:r>
+        <w:t>Sugiartawan</w:t>
+      </w:r>
+      <w:proofErr w:type="spellEnd"/>
+      <w:r>
+        <w:t xml:space="preserve">, "A Comparative Study of Semantic Similarity, Rubric-Based, Generative AI, and Hybrid Scoring Methods for Automated Essay Evaluation," in </w:t>
+      </w:r>
+      <w:r>
+        <w:rPr>
+          <w:i/>
+          <w:iCs/>
+        </w:rPr>
+        <w:t>Proc. 2026 International Seminar on Intelligent Business and Edge-Computing Research (ISIBER)</w:t>
+      </w:r>
+      <w:r>
+        <w:t xml:space="preserve">, 2026, pp. 656–661, </w:t>
+      </w:r>
+      <w:proofErr w:type="spellStart"/>
+      <w:r>
+        <w:t>doi</w:t>
+      </w:r>
+      <w:proofErr w:type="spellEnd"/>
+      <w:r>
+        <w:t>: 10.1109/ISIBER68248.2026.11470541.</w:t>
+      </w:r>
+    </w:p>
+    <w:p>
+      <w:r>
+        <w:rPr>
+          <w:b/>
+          <w:bCs/>
+        </w:rPr>
+        <w:t>[2]</w:t>
+      </w:r>
+      <w:r>
+        <w:t xml:space="preserve"> K. S. S. Han and M. T. Myint, "A Comparative Study of LSTM, Bi-LSTM, and BERT for Automated Essay Scoring," in </w:t>
+      </w:r>
+      <w:r>
+        <w:rPr>
+          <w:i/>
+          <w:iCs/>
+        </w:rPr>
+        <w:t>Proc. 2024 5th International Conference on Advanced Information Technologies (ICAIT)</w:t>
+      </w:r>
+      <w:r>
+        <w:t xml:space="preserve">, 2024, pp. 1–6, </w:t>
+      </w:r>
+      <w:proofErr w:type="spellStart"/>
+      <w:r>
+        <w:t>doi</w:t>
+      </w:r>
+      <w:proofErr w:type="spellEnd"/>
+      <w:r>
+        <w:t>: 10.1109/ICAIT65209.2024.10754925.</w:t>
+      </w:r>
+    </w:p>
+    <w:p>
+      <w:r>
+        <w:rPr>
+          <w:b/>
+          <w:bCs/>
+        </w:rPr>
+        <w:t>[3]</w:t>
+      </w:r>
+      <w:r>
+        <w:t xml:space="preserve"> K. Taghipour and H. T. Ng, "A Neural Approach to Automated Essay Scoring," in </w:t>
+      </w:r>
+      <w:r>
+        <w:rPr>
+          <w:i/>
+          <w:iCs/>
+        </w:rPr>
+        <w:t>Proceedings of the 2016 Conference on Empirical Methods in Natural Language Processing (EMNLP)</w:t>
+      </w:r>
+      <w:r>
+        <w:t xml:space="preserve">, Austin, TX, USA, Nov. 2016, pp. 1882–1891, </w:t>
+      </w:r>
+      <w:proofErr w:type="spellStart"/>
+      <w:r>
+        <w:t>doi</w:t>
+      </w:r>
+      <w:proofErr w:type="spellEnd"/>
+      <w:r>
+        <w:t>: 10.18653/v1/D16-1193.</w:t>
+      </w:r>
+    </w:p>
+    <w:p>
+      <w:r>
+        <w:rPr>
+          <w:b/>
+          <w:bCs/>
+        </w:rPr>
+        <w:t>[4]</w:t>
+      </w:r>
+      <w:r>
+        <w:t xml:space="preserve"> A. M. </w:t>
+      </w:r>
+      <w:proofErr w:type="spellStart"/>
+      <w:r>
+        <w:t>Elmassry</w:t>
+      </w:r>
+      <w:proofErr w:type="spellEnd"/>
+      <w:r>
+        <w:t xml:space="preserve">, N. Zaki, N. Alsheikh, and M. </w:t>
+      </w:r>
+      <w:proofErr w:type="spellStart"/>
+      <w:r>
+        <w:t>Mediani</w:t>
+      </w:r>
+      <w:proofErr w:type="spellEnd"/>
+      <w:r>
+        <w:t xml:space="preserve">, "A Systematic Review of Pretrained Models in Automated Essay Scoring," </w:t>
+      </w:r>
+      <w:r>
+        <w:rPr>
+          <w:i/>
+          <w:iCs/>
+        </w:rPr>
+        <w:t>IEEE Access</w:t>
+      </w:r>
+      <w:r>
+        <w:t xml:space="preserve">, vol. 13, pp. 121902–121917, 2025, </w:t>
+      </w:r>
+      <w:proofErr w:type="spellStart"/>
+      <w:r>
+        <w:t>doi</w:t>
+      </w:r>
+      <w:proofErr w:type="spellEnd"/>
+      <w:r>
+        <w:t>: 10.1109/ACCESS.2025.3584784.</w:t>
+      </w:r>
+    </w:p>
+    <w:p>
+      <w:r>
+        <w:rPr>
+          <w:b/>
+          <w:bCs/>
+        </w:rPr>
+        <w:t>[5]</w:t>
+      </w:r>
+      <w:r>
+        <w:t xml:space="preserve"> W. Xu, R. Mahmud, and W. L. Hoo, "A Systematic Literature Review: Are Automated Essay Scoring Systems Competent in Real-Life Education </w:t>
+      </w:r>
+      <w:proofErr w:type="gramStart"/>
+      <w:r>
+        <w:t>Scenarios?,</w:t>
+      </w:r>
+      <w:proofErr w:type="gramEnd"/>
+      <w:r>
+        <w:t xml:space="preserve">" </w:t>
+      </w:r>
+      <w:r>
+        <w:rPr>
+          <w:i/>
+          <w:iCs/>
+        </w:rPr>
+        <w:t>IEEE Access</w:t>
+      </w:r>
+      <w:r>
+        <w:t xml:space="preserve">, vol. 12, pp. 77639–77657, 2024, </w:t>
+      </w:r>
+      <w:proofErr w:type="spellStart"/>
+      <w:r>
+        <w:t>doi</w:t>
+      </w:r>
+      <w:proofErr w:type="spellEnd"/>
+      <w:r>
+        <w:t>: 10.1109/ACCESS.2024.3399163.</w:t>
+      </w:r>
+    </w:p>
+    <w:p>
+      <w:r>
+        <w:rPr>
+          <w:b/>
+          <w:bCs/>
+        </w:rPr>
+        <w:t>[6]</w:t>
+      </w:r>
+      <w:r>
+        <w:t xml:space="preserve"> P. Lagakis and S. </w:t>
+      </w:r>
+      <w:proofErr w:type="spellStart"/>
+      <w:r>
+        <w:t>Demetriadis</w:t>
+      </w:r>
+      <w:proofErr w:type="spellEnd"/>
+      <w:r>
+        <w:t xml:space="preserve">, "Automated Essay Scoring: A Review of the Field," in </w:t>
+      </w:r>
+      <w:r>
+        <w:rPr>
+          <w:i/>
+          <w:iCs/>
+        </w:rPr>
+        <w:t>Proc. 2021 International Conference on Computer, Information and Telecommunication Systems (CITS)</w:t>
+      </w:r>
+      <w:r>
+        <w:t xml:space="preserve">, Istanbul, Turkey, Jul. 2021, pp. 1–5, </w:t>
+      </w:r>
+      <w:proofErr w:type="spellStart"/>
+      <w:r>
+        <w:t>doi</w:t>
+      </w:r>
+      <w:proofErr w:type="spellEnd"/>
+      <w:r>
+        <w:t>: 10.1109/CITS52676.2021.9618476</w:t>
+      </w:r>
+    </w:p>
+    <w:p>
+      <w:r>
+        <w:rPr>
+          <w:b/>
+          <w:bCs/>
+        </w:rPr>
+        <w:t>[7]</w:t>
+      </w:r>
+      <w:r>
+        <w:t xml:space="preserve"> J. Yang, "Automated Essay Scoring in Education," in </w:t>
+      </w:r>
+      <w:r>
+        <w:rPr>
+          <w:i/>
+          <w:iCs/>
+        </w:rPr>
+        <w:t>Proc. 2024 4th International Conference on Educational Technology (ICET)</w:t>
+      </w:r>
+      <w:r>
+        <w:t xml:space="preserve">, 2024, pp. 170–175, </w:t>
+      </w:r>
+      <w:proofErr w:type="spellStart"/>
+      <w:r>
+        <w:t>doi</w:t>
+      </w:r>
+      <w:proofErr w:type="spellEnd"/>
+      <w:r>
+        <w:t>: 10.1109/ICET62460.2024.10868446.</w:t>
+      </w:r>
+    </w:p>
+    <w:p>
+      <w:r>
+        <w:rPr>
+          <w:b/>
+          <w:bCs/>
+        </w:rPr>
+        <w:t>[8]</w:t>
+      </w:r>
+      <w:r>
+        <w:t xml:space="preserve"> R. Dadi and S. K. </w:t>
+      </w:r>
+      <w:proofErr w:type="spellStart"/>
+      <w:r>
+        <w:t>Sanampudi</w:t>
+      </w:r>
+      <w:proofErr w:type="spellEnd"/>
+      <w:r>
+        <w:t xml:space="preserve">, "A Robust Model for Automated Essay Scoring System," in </w:t>
+      </w:r>
+      <w:r>
+        <w:rPr>
+          <w:i/>
+          <w:iCs/>
+        </w:rPr>
+        <w:t>Proc. 2024 International Conference on Computational Intelligence and Sustainable Engineering Solutions (CISES)</w:t>
+      </w:r>
+      <w:r>
+        <w:t xml:space="preserve">, 2024, pp. 1–6, </w:t>
+      </w:r>
+      <w:proofErr w:type="spellStart"/>
+      <w:r>
+        <w:t>doi</w:t>
+      </w:r>
+      <w:proofErr w:type="spellEnd"/>
+      <w:r>
+        <w:t>: 10.1109/CISES62520.2024.10712145.</w:t>
+      </w:r>
+    </w:p>
+    <w:p>
+      <w:r>
+        <w:rPr>
+          <w:b/>
+          <w:bCs/>
+        </w:rPr>
+        <w:t>[9]</w:t>
+      </w:r>
+      <w:r>
+        <w:t xml:space="preserve"> P. Jain, K. Taneja, and H. Taneja, "Which OCR Toolset is Good and Why? A Comparative Study," in </w:t>
+      </w:r>
+      <w:r>
+        <w:rPr>
+          <w:i/>
+          <w:iCs/>
+        </w:rPr>
+        <w:t>Proc. 2021 International Conference on Computational Performance Evaluation (</w:t>
+      </w:r>
+      <w:proofErr w:type="spellStart"/>
+      <w:r>
+        <w:rPr>
+          <w:i/>
+          <w:iCs/>
+        </w:rPr>
+        <w:t>ComPE</w:t>
+      </w:r>
+      <w:proofErr w:type="spellEnd"/>
+      <w:r>
+        <w:rPr>
+          <w:i/>
+          <w:iCs/>
+        </w:rPr>
+        <w:t>)</w:t>
+      </w:r>
+      <w:r>
+        <w:t xml:space="preserve">, Shillong, India, 2021, pp. 640–646, </w:t>
+      </w:r>
+      <w:proofErr w:type="spellStart"/>
+      <w:r>
+        <w:t>doi</w:t>
+      </w:r>
+      <w:proofErr w:type="spellEnd"/>
+      <w:r>
+        <w:t>: 10.1109/ComPE53109.2021.9752243.</w:t>
+      </w:r>
+    </w:p>
+    <w:p>
+      <w:r>
+        <w:rPr>
+          <w:b/>
+          <w:bCs/>
+        </w:rPr>
+        <w:lastRenderedPageBreak/>
+        <w:t>[10]</w:t>
+      </w:r>
+      <w:r>
+        <w:t xml:space="preserve"> M. Li, T. </w:t>
+      </w:r>
+      <w:proofErr w:type="spellStart"/>
+      <w:r>
+        <w:t>Lv</w:t>
+      </w:r>
+      <w:proofErr w:type="spellEnd"/>
+      <w:r>
+        <w:t>, J. Chen, L. Cui, Y. Lu, D. Florencio, C. Zhang, Z. Li, and F. Wei, "</w:t>
+      </w:r>
+      <w:proofErr w:type="spellStart"/>
+      <w:r>
+        <w:t>TrOCR</w:t>
+      </w:r>
+      <w:proofErr w:type="spellEnd"/>
+      <w:r>
+        <w:t xml:space="preserve">: Transformer-Based Optical Character Recognition with Pre-trained Models," </w:t>
+      </w:r>
+      <w:proofErr w:type="spellStart"/>
+      <w:r>
+        <w:rPr>
+          <w:i/>
+          <w:iCs/>
+        </w:rPr>
+        <w:t>arXiv</w:t>
+      </w:r>
+      <w:proofErr w:type="spellEnd"/>
+      <w:r>
+        <w:rPr>
+          <w:i/>
+          <w:iCs/>
+        </w:rPr>
+        <w:t xml:space="preserve"> preprint arXiv:2109.10282</w:t>
+      </w:r>
+      <w:r>
+        <w:t>, 2021.</w:t>
+      </w:r>
+    </w:p>
+    <w:p>
+      <w:r>
+        <w:rPr>
+          <w:b/>
+          <w:bCs/>
+        </w:rPr>
+        <w:t>[11]</w:t>
+      </w:r>
+      <w:r>
+        <w:t xml:space="preserve"> M. T. Mostafa, E. R. Rhythm, M. H. K. Mehedi, and A. A. Rasel, "Advancements in Optical Character Recognition for Bangla Scripts," in </w:t>
+      </w:r>
+      <w:r>
+        <w:rPr>
+          <w:i/>
+          <w:iCs/>
+        </w:rPr>
+        <w:t>Proc. 2023 International Conference on Electrical, Computer and Communication Engineering (ECCE)</w:t>
+      </w:r>
+      <w:r>
+        <w:t>, 2023, pp. 1–6.</w:t>
+      </w:r>
+    </w:p>
+    <w:p>
+      <w:r>
+        <w:rPr>
+          <w:b/>
+          <w:bCs/>
+        </w:rPr>
+        <w:t>[12]</w:t>
+      </w:r>
+      <w:r>
+        <w:t xml:space="preserve"> J. Q. Cheok, K. C. Lim, and C. E. Si, "Maximizing Recognition Reliability: </w:t>
+      </w:r>
+      <w:proofErr w:type="spellStart"/>
+      <w:r>
+        <w:t>TrOCR</w:t>
+      </w:r>
+      <w:proofErr w:type="spellEnd"/>
+      <w:r>
+        <w:t xml:space="preserve"> Outperforms </w:t>
+      </w:r>
+      <w:proofErr w:type="spellStart"/>
+      <w:r>
+        <w:t>PaddleOCR</w:t>
+      </w:r>
+      <w:proofErr w:type="spellEnd"/>
+      <w:r>
+        <w:t xml:space="preserve"> in Challenging Container Automation Environments," </w:t>
+      </w:r>
+      <w:r>
+        <w:rPr>
+          <w:i/>
+          <w:iCs/>
+        </w:rPr>
+        <w:t>International Journal of Research and Innovation in Social Science (IJRISS)</w:t>
+      </w:r>
+      <w:r>
+        <w:t xml:space="preserve">, vol. 9, no. 11, 2025, Art. no. 91100629, </w:t>
+      </w:r>
+      <w:proofErr w:type="spellStart"/>
+      <w:r>
+        <w:t>doi</w:t>
+      </w:r>
+      <w:proofErr w:type="spellEnd"/>
+      <w:r>
+        <w:t>: 10.47772/IJRISS.2025.91100629.</w:t>
+      </w:r>
+    </w:p>
+    <w:p>
+      <w:r>
+        <w:rPr>
+          <w:b/>
+          <w:bCs/>
+        </w:rPr>
+        <w:t>[13]</w:t>
+      </w:r>
+      <w:r>
+        <w:t xml:space="preserve"> K. C. Kirana, A. </w:t>
+      </w:r>
+      <w:proofErr w:type="spellStart"/>
+      <w:r>
+        <w:t>Maqbullah</w:t>
+      </w:r>
+      <w:proofErr w:type="spellEnd"/>
+      <w:r>
+        <w:t xml:space="preserve">, I. </w:t>
+      </w:r>
+      <w:proofErr w:type="spellStart"/>
+      <w:r>
+        <w:t>Kumalasari</w:t>
+      </w:r>
+      <w:proofErr w:type="spellEnd"/>
+      <w:r>
+        <w:t xml:space="preserve">, A. F. </w:t>
+      </w:r>
+      <w:proofErr w:type="spellStart"/>
+      <w:r>
+        <w:t>Shobari</w:t>
+      </w:r>
+      <w:proofErr w:type="spellEnd"/>
+      <w:r>
+        <w:t xml:space="preserve">, G. Q. </w:t>
+      </w:r>
+      <w:proofErr w:type="spellStart"/>
+      <w:r>
+        <w:t>Oktagalu</w:t>
+      </w:r>
+      <w:proofErr w:type="spellEnd"/>
+      <w:r>
+        <w:t xml:space="preserve">, and B. Hidayat, "Comparison of Tesseract OCR, Easy OCR, and Transformer OCR on Handwritten Image," in </w:t>
+      </w:r>
+      <w:r>
+        <w:rPr>
+          <w:i/>
+          <w:iCs/>
+        </w:rPr>
+        <w:t>Proc. 2024 International Conference on Electrical Engineering, Computer Science and Informatics (EECSI)</w:t>
+      </w:r>
+      <w:r>
+        <w:t>, 2024, pp. 1–6.</w:t>
+      </w:r>
+    </w:p>
+    <w:p>
+      <w:r>
+        <w:rPr>
+          <w:b/>
+          <w:bCs/>
+        </w:rPr>
+        <w:t>[14]</w:t>
+      </w:r>
+      <w:r>
+        <w:t xml:space="preserve"> A. Elakkiya, K. Jaya Surya, K. Venkatesh, and S. Aakash, "Implementation of Speech to Text Conversion Using Hidden Markov Model," </w:t>
+      </w:r>
+      <w:r>
+        <w:rPr>
+          <w:i/>
+          <w:iCs/>
+        </w:rPr>
+        <w:t>Proc. 2023 International Conference on Intelligent Computing and Control Systems (ICICCS)</w:t>
+      </w:r>
+      <w:r>
+        <w:t>, 2023, pp. 1–5.</w:t>
+      </w:r>
+    </w:p>
+    <w:p>
+      <w:r>
+        <w:rPr>
+          <w:b/>
+          <w:bCs/>
+        </w:rPr>
+        <w:t>[15]</w:t>
+      </w:r>
+      <w:r>
+        <w:t xml:space="preserve"> M. S. </w:t>
+      </w:r>
+      <w:proofErr w:type="spellStart"/>
+      <w:r>
+        <w:t>Tabrej</w:t>
+      </w:r>
+      <w:proofErr w:type="spellEnd"/>
+      <w:r>
+        <w:t xml:space="preserve">, K. J. Deb, M. A. Hakim, and S. Goswami, "Automatic Speech Recognition in the Modern Era: Architectures, Training, and Evaluation," </w:t>
+      </w:r>
+      <w:r>
+        <w:rPr>
+          <w:i/>
+          <w:iCs/>
+        </w:rPr>
+        <w:t>Proc. 2023 International Conference on Artificial Intelligence and Data Engineering (AIDE)</w:t>
+      </w:r>
+      <w:r>
+        <w:t>, 2023, pp. 1–6.</w:t>
+      </w:r>
+    </w:p>
+    <w:p>
+      <w:r>
+        <w:rPr>
+          <w:b/>
+          <w:bCs/>
+        </w:rPr>
+        <w:t>[16]</w:t>
+      </w:r>
+      <w:r>
+        <w:t xml:space="preserve"> G. Hinton, L. Deng, D. Yu, G. E. Dahl, A.-r. Mohamed, N. Jaitly, A. Senior, V. Vanhoucke, P. Nguyen, T. N. Sainath, and B. Kingsbury, "Deep Neural Networks for Acoustic </w:t>
+      </w:r>
+      <w:proofErr w:type="spellStart"/>
+      <w:r>
+        <w:t>Modeling</w:t>
+      </w:r>
+      <w:proofErr w:type="spellEnd"/>
+      <w:r>
+        <w:t xml:space="preserve"> in Speech Recognition," </w:t>
+      </w:r>
+      <w:r>
+        <w:rPr>
+          <w:i/>
+          <w:iCs/>
+        </w:rPr>
+        <w:t>IEEE Signal Processing Magazine</w:t>
+      </w:r>
+      <w:r>
+        <w:t xml:space="preserve">, vol. 29, no. 6, pp. 82–97, 2012, </w:t>
+      </w:r>
+      <w:proofErr w:type="spellStart"/>
+      <w:r>
+        <w:t>doi</w:t>
+      </w:r>
+      <w:proofErr w:type="spellEnd"/>
+      <w:r>
+        <w:t>: 10.1109/MSP.2012.2205597.</w:t>
+      </w:r>
+    </w:p>
+    <w:p>
+      <w:r>
+        <w:rPr>
+          <w:b/>
+          <w:bCs/>
+        </w:rPr>
+        <w:t>[17]</w:t>
+      </w:r>
+      <w:r>
+        <w:t xml:space="preserve"> A. Radford, J. Kim, T. Xu, G. Brockman, C. McLeavey, and I. </w:t>
+      </w:r>
+      <w:proofErr w:type="spellStart"/>
+      <w:r>
+        <w:t>Sutskever</w:t>
+      </w:r>
+      <w:proofErr w:type="spellEnd"/>
+      <w:r>
+        <w:t xml:space="preserve">, "Robust Speech Recognition via Large-Scale Weak Supervision," </w:t>
+      </w:r>
+      <w:proofErr w:type="spellStart"/>
+      <w:r>
+        <w:rPr>
+          <w:i/>
+          <w:iCs/>
+        </w:rPr>
+        <w:t>arXiv</w:t>
+      </w:r>
+      <w:proofErr w:type="spellEnd"/>
+      <w:r>
+        <w:rPr>
+          <w:i/>
+          <w:iCs/>
+        </w:rPr>
+        <w:t xml:space="preserve"> preprint arXiv:2212.04356</w:t>
+      </w:r>
+      <w:r>
+        <w:t>, 2022.</w:t>
+      </w:r>
+    </w:p>
+    <w:p>
+      <w:r>
+        <w:rPr>
+          <w:b/>
+          <w:bCs/>
+        </w:rPr>
+        <w:t>[18]</w:t>
+      </w:r>
+      <w:r>
+        <w:t xml:space="preserve"> A. Vaswani, N. </w:t>
+      </w:r>
+      <w:proofErr w:type="spellStart"/>
+      <w:r>
+        <w:t>Shazeer</w:t>
+      </w:r>
+      <w:proofErr w:type="spellEnd"/>
+      <w:r>
+        <w:t xml:space="preserve">, N. Parmar, J. </w:t>
+      </w:r>
+      <w:proofErr w:type="spellStart"/>
+      <w:r>
+        <w:t>Uszkoreit</w:t>
+      </w:r>
+      <w:proofErr w:type="spellEnd"/>
+      <w:r>
+        <w:t xml:space="preserve">, L. Jones, A. N. Gomez, Ł. Kaiser, and I. </w:t>
+      </w:r>
+      <w:proofErr w:type="spellStart"/>
+      <w:r>
+        <w:t>Polosukhin</w:t>
+      </w:r>
+      <w:proofErr w:type="spellEnd"/>
+      <w:r>
+        <w:t xml:space="preserve">, "Attention Is All You Need," in </w:t>
+      </w:r>
+      <w:r>
+        <w:rPr>
+          <w:i/>
+          <w:iCs/>
+        </w:rPr>
+        <w:t>Advances in Neural Information Processing Systems (</w:t>
+      </w:r>
+      <w:proofErr w:type="spellStart"/>
+      <w:r>
+        <w:rPr>
+          <w:i/>
+          <w:iCs/>
+        </w:rPr>
+        <w:t>NeurIPS</w:t>
+      </w:r>
+      <w:proofErr w:type="spellEnd"/>
+      <w:r>
+        <w:rPr>
+          <w:i/>
+          <w:iCs/>
+        </w:rPr>
+        <w:t>)</w:t>
+      </w:r>
+      <w:r>
+        <w:t>, 2017, pp. 5998–6008.</w:t>
+      </w:r>
+    </w:p>
+    <w:p>
+      <w:r>
+        <w:rPr>
+          <w:b/>
+          <w:bCs/>
+        </w:rPr>
+        <w:t>[19]</w:t>
+      </w:r>
+      <w:r>
+        <w:t xml:space="preserve"> K. Hlongwane, S. Mthethwa, and L. Manqele, "Enhancing Diversity in Inclusive Learning Classroom Using OpenAI Whisper Model," in </w:t>
+      </w:r>
+      <w:r>
+        <w:rPr>
+          <w:i/>
+          <w:iCs/>
+        </w:rPr>
+        <w:t>IST-Africa 2025 Conference Proceedings</w:t>
+      </w:r>
+      <w:r>
+        <w:t>, M. Cunningham and P. Cunningham, Eds., IST-Africa Institute and IIMC, 2025, ISBN: 978-1-905824-75-5.</w:t>
+      </w:r>
+    </w:p>
+    <w:p>
+      <w:r>
+        <w:rPr>
+          <w:b/>
+          <w:bCs/>
+        </w:rPr>
+        <w:lastRenderedPageBreak/>
+        <w:t>[20]</w:t>
+      </w:r>
+      <w:r>
+        <w:t xml:space="preserve"> J. Su, Y. Yan, Z. Gao, H. Zhang, X. Liu, and X. Hu, "Multi-Granular Multimodal Essay Scoring," </w:t>
+      </w:r>
+      <w:proofErr w:type="spellStart"/>
+      <w:r>
+        <w:rPr>
+          <w:i/>
+          <w:iCs/>
+        </w:rPr>
+        <w:t>arXiv</w:t>
+      </w:r>
+      <w:proofErr w:type="spellEnd"/>
+      <w:r>
+        <w:rPr>
+          <w:i/>
+          <w:iCs/>
+        </w:rPr>
+        <w:t xml:space="preserve"> preprint arXiv:2505.13965</w:t>
+      </w:r>
+      <w:r>
+        <w:t>, 2025.</w:t>
+      </w:r>
+    </w:p>
+    <w:p>
+      <w:r>
+        <w:rPr>
+          <w:b/>
+          <w:bCs/>
+        </w:rPr>
+        <w:t>[21]</w:t>
+      </w:r>
+      <w:r>
+        <w:t xml:space="preserve"> A. </w:t>
+      </w:r>
+      <w:proofErr w:type="spellStart"/>
+      <w:r>
+        <w:t>Algablan</w:t>
+      </w:r>
+      <w:proofErr w:type="spellEnd"/>
+      <w:r>
+        <w:t xml:space="preserve">, R. Alshammari, and S. </w:t>
+      </w:r>
+      <w:proofErr w:type="spellStart"/>
+      <w:r>
+        <w:t>Alresaini</w:t>
+      </w:r>
+      <w:proofErr w:type="spellEnd"/>
+      <w:r>
+        <w:t xml:space="preserve">, "Scoring Students’ Answers Using OCR and GPT," </w:t>
+      </w:r>
+      <w:r>
+        <w:rPr>
+          <w:i/>
+          <w:iCs/>
+        </w:rPr>
+        <w:t>in Proc. 2026 IEEE 5th International Conference on Computing and Machine Intelligence (ICMI)</w:t>
+      </w:r>
+      <w:r>
+        <w:t xml:space="preserve">, 2026, </w:t>
+      </w:r>
+      <w:proofErr w:type="spellStart"/>
+      <w:r>
+        <w:t>doi</w:t>
+      </w:r>
+      <w:proofErr w:type="spellEnd"/>
+      <w:r>
+        <w:t>: 10.1109/ICMI68585.2026.11539856.</w:t>
+      </w:r>
+    </w:p>
+    <w:p>
+      <w:r>
+        <w:rPr>
+          <w:b/>
+          <w:bCs/>
+        </w:rPr>
+        <w:t>[22]</w:t>
+      </w:r>
+      <w:r>
+        <w:t xml:space="preserve"> J. Gao, Q. Yang, Y. Zhang, L. Zhang, and S. Wang, "A Bi-modal Automated Essay Scoring System for Handwritten Essays," in </w:t>
+      </w:r>
+      <w:r>
+        <w:rPr>
+          <w:i/>
+          <w:iCs/>
+        </w:rPr>
+        <w:t>Proceedings of the 2021 International Joint Conference on Neural Networks (IJCNN)</w:t>
+      </w:r>
+      <w:r>
+        <w:t xml:space="preserve">, 2021, </w:t>
+      </w:r>
+      <w:proofErr w:type="spellStart"/>
+      <w:r>
+        <w:t>doi</w:t>
+      </w:r>
+      <w:proofErr w:type="spellEnd"/>
+      <w:r>
+        <w:t>: 10.1109/IJCNN52387.2021.9533505.</w:t>
+      </w:r>
+    </w:p>
+    <w:p>
+      <w:r>
+        <w:rPr>
+          <w:b/>
+          <w:bCs/>
+        </w:rPr>
+        <w:t>[23]</w:t>
+      </w:r>
+      <w:r>
+        <w:t xml:space="preserve"> C. A. L. Baclayon, K. O. R. Costelo, J. J. L. Flores, and C. L. C. Sta. Romana, "Automated Handwritten Essay Evaluation in Moodle: Leveraging Google Vision OCR and Mistral 7B," in </w:t>
+      </w:r>
+      <w:r>
+        <w:rPr>
+          <w:i/>
+          <w:iCs/>
+        </w:rPr>
+        <w:t>Proceedings of ICDTE 2024</w:t>
+      </w:r>
+      <w:r>
+        <w:t xml:space="preserve">, ACM, Berlin, Germany, Aug. 07–09, 2024, </w:t>
+      </w:r>
+      <w:proofErr w:type="spellStart"/>
+      <w:r>
+        <w:t>doi</w:t>
+      </w:r>
+      <w:proofErr w:type="spellEnd"/>
+      <w:r>
+        <w:t>: 10.1145/3696230.3696256.</w:t>
       </w:r>
     </w:p>
     <w:sectPr>
@@ -4737,7 +5874,6 @@
   <w:style w:type="character" w:default="1" w:styleId="DefaultParagraphFont">
     <w:name w:val="Default Paragraph Font"/>
     <w:uiPriority w:val="1"/>
-    <w:semiHidden/>
     <w:unhideWhenUsed/>
   </w:style>
   <w:style w:type="table" w:default="1" w:styleId="TableNormal">

</xml_diff>

<commit_message>
Limitations -> Challenges and consideration for component selection
</commit_message>
<xml_diff>
--- a/preliminary report/Final Project - Preliminary Report.docx
+++ b/preliminary report/Final Project - Preliminary Report.docx
@@ -2162,12 +2162,26 @@
         <w:t xml:space="preserve"> such as </w:t>
       </w:r>
       <w:proofErr w:type="spellStart"/>
+      <w:proofErr w:type="gramStart"/>
       <w:r>
         <w:t>IntelliMetric</w:t>
       </w:r>
       <w:proofErr w:type="spellEnd"/>
       <w:r>
-        <w:t xml:space="preserve"> and []. These applications are not open-source, and their architectures not freely available for analysis. My</w:t>
+        <w:t xml:space="preserve">, </w:t>
+      </w:r>
+      <w:r>
+        <w:t xml:space="preserve"> </w:t>
+      </w:r>
+      <w:r>
+        <w:t>whose</w:t>
+      </w:r>
+      <w:proofErr w:type="gramEnd"/>
+      <w:r>
+        <w:t xml:space="preserve"> architectures are not</w:t>
+      </w:r>
+      <w:r>
+        <w:t xml:space="preserve"> freely available for analysis. My</w:t>
       </w:r>
       <w:r>
         <w:t xml:space="preserve"> research</w:t>
@@ -2505,6 +2519,752 @@
       <w:pPr>
         <w:spacing w:line="360" w:lineRule="auto"/>
       </w:pPr>
+      <w:r>
+        <w:t xml:space="preserve">Challenges and consideration for component selection </w:t>
+      </w:r>
+    </w:p>
+    <w:p>
+      <w:pPr>
+        <w:spacing w:line="360" w:lineRule="auto"/>
+      </w:pPr>
+      <w:r>
+        <w:t xml:space="preserve">The datasets </w:t>
+      </w:r>
+    </w:p>
+    <w:p>
+      <w:pPr>
+        <w:spacing w:line="360" w:lineRule="auto"/>
+      </w:pPr>
+      <w:r>
+        <w:t xml:space="preserve">According to </w:t>
+      </w:r>
+      <w:r>
+        <w:t>[6]</w:t>
+      </w:r>
+      <w:r>
+        <w:t>,</w:t>
+      </w:r>
+      <w:r>
+        <w:t xml:space="preserve"> </w:t>
+      </w:r>
+      <w:r>
+        <w:t>t</w:t>
+      </w:r>
+      <w:r>
+        <w:t xml:space="preserve">he aspects of an essay that refer to its content quality </w:t>
+      </w:r>
+      <w:r>
+        <w:t xml:space="preserve">still pose a challenge to </w:t>
+      </w:r>
+      <w:r>
+        <w:t>AES</w:t>
+      </w:r>
+      <w:r>
+        <w:t xml:space="preserve"> system</w:t>
+      </w:r>
+      <w:r>
+        <w:t>s</w:t>
+      </w:r>
+      <w:r>
+        <w:t xml:space="preserve">. For example, even the most elaborate AES systems currently have trouble accurately evaluating </w:t>
+      </w:r>
+      <w:r>
+        <w:t>the</w:t>
+      </w:r>
+      <w:r>
+        <w:t xml:space="preserve"> coherence and persuasiveness of an essay, or an argument’s clarity, and that is due to </w:t>
+      </w:r>
+      <w:r>
+        <w:t xml:space="preserve">two </w:t>
+      </w:r>
+      <w:r>
+        <w:t xml:space="preserve">main reasons: </w:t>
+      </w:r>
+      <w:r>
+        <w:t>(1)</w:t>
+      </w:r>
+      <w:r>
+        <w:t xml:space="preserve"> such aspects are very hard to model, and </w:t>
+      </w:r>
+      <w:r>
+        <w:t>(2)</w:t>
+      </w:r>
+      <w:r>
+        <w:t xml:space="preserve"> the lack of datasets that provide human-graded dimension-specific data, especially compared to those that provide holistic scoring.</w:t>
+      </w:r>
+      <w:r>
+        <w:t xml:space="preserve"> </w:t>
+      </w:r>
+      <w:r>
+        <w:t xml:space="preserve">[4] </w:t>
+      </w:r>
+      <w:r>
+        <w:t xml:space="preserve">indicates that the problem originates </w:t>
+      </w:r>
+      <w:r>
+        <w:t xml:space="preserve">from </w:t>
+      </w:r>
+      <w:r>
+        <w:t>AES</w:t>
+      </w:r>
+      <w:r>
+        <w:t xml:space="preserve"> studies </w:t>
+      </w:r>
+      <w:r>
+        <w:t xml:space="preserve">that </w:t>
+      </w:r>
+      <w:r>
+        <w:t>rel</w:t>
+      </w:r>
+      <w:r>
+        <w:t>y</w:t>
+      </w:r>
+      <w:r>
+        <w:t xml:space="preserve"> </w:t>
+      </w:r>
+      <w:r>
+        <w:t xml:space="preserve">heavily </w:t>
+      </w:r>
+      <w:r>
+        <w:t xml:space="preserve">on the ASAP dataset as the primary benchmark, highlighting the limited options available. </w:t>
+      </w:r>
+      <w:r>
+        <w:t>Additionally</w:t>
+      </w:r>
+      <w:r>
+        <w:t>, most publicly available datasets are tailored toward English-language assessment e.g.</w:t>
+      </w:r>
+      <w:r>
+        <w:t>,</w:t>
+      </w:r>
+      <w:r>
+        <w:t xml:space="preserve"> TOEFL11, CELA</w:t>
+      </w:r>
+      <w:r>
+        <w:t>,</w:t>
+      </w:r>
+      <w:r>
+        <w:t xml:space="preserve"> or the Cambridge English assessment datasets.</w:t>
+      </w:r>
+      <w:r>
+        <w:t xml:space="preserve"> [20] </w:t>
+      </w:r>
+      <w:r>
+        <w:t xml:space="preserve">further emphasizes this limitation, </w:t>
+      </w:r>
+      <w:r>
+        <w:t>describ</w:t>
+      </w:r>
+      <w:r>
+        <w:t xml:space="preserve">ing </w:t>
+      </w:r>
+      <w:r>
+        <w:t>the ASAP and its</w:t>
+      </w:r>
+      <w:r>
+        <w:t xml:space="preserve"> extended version, ASAP++, </w:t>
+      </w:r>
+      <w:r>
+        <w:t xml:space="preserve">as both </w:t>
+      </w:r>
+      <w:r>
+        <w:t>containing few</w:t>
+      </w:r>
+      <w:r>
+        <w:t xml:space="preserve"> topics.  ASAP+</w:t>
+      </w:r>
+      <w:r>
+        <w:t>+ adds</w:t>
+      </w:r>
+      <w:r>
+        <w:t xml:space="preserve"> trait-level </w:t>
+      </w:r>
+      <w:r>
+        <w:t>annotations but</w:t>
+      </w:r>
+      <w:r>
+        <w:t xml:space="preserve"> merges key content traits into a single</w:t>
+      </w:r>
+      <w:r>
+        <w:t xml:space="preserve"> </w:t>
+      </w:r>
+      <w:r>
+        <w:t>“CONTENT”</w:t>
+      </w:r>
+      <w:r>
+        <w:t xml:space="preserve"> label, </w:t>
+      </w:r>
+      <w:r>
+        <w:t>decreasing</w:t>
+      </w:r>
+      <w:r>
+        <w:t xml:space="preserve"> granularity and interpretability</w:t>
+      </w:r>
+      <w:r>
+        <w:t xml:space="preserve">. </w:t>
+      </w:r>
+      <w:r>
+        <w:t>The TOEFL11 dataset</w:t>
+      </w:r>
+      <w:r>
+        <w:t>, similarly, uses</w:t>
+      </w:r>
+      <w:r>
+        <w:t xml:space="preserve"> only coarse-grained</w:t>
+      </w:r>
+      <w:r>
+        <w:t xml:space="preserve"> </w:t>
+      </w:r>
+      <w:r>
+        <w:t>proficiency labels (low / medium / high)</w:t>
+      </w:r>
+      <w:r>
+        <w:t xml:space="preserve">. </w:t>
+      </w:r>
+      <w:r>
+        <w:t xml:space="preserve">Thus, models trained on the TOEFL11 dataset will inherently produce results that are difficult to interpret due to the granularity of the training data. </w:t>
+      </w:r>
+    </w:p>
+    <w:p>
+      <w:pPr>
+        <w:spacing w:line="360" w:lineRule="auto"/>
+      </w:pPr>
+      <w:r>
+        <w:t xml:space="preserve"> [4</w:t>
+      </w:r>
+      <w:r>
+        <w:t xml:space="preserve">] </w:t>
+      </w:r>
+      <w:r>
+        <w:t>a</w:t>
+      </w:r>
+      <w:r>
+        <w:t>lso</w:t>
+      </w:r>
+      <w:r>
+        <w:t xml:space="preserve"> points out that </w:t>
+      </w:r>
+      <w:r>
+        <w:t>the</w:t>
+      </w:r>
+      <w:r>
+        <w:t xml:space="preserve"> </w:t>
+      </w:r>
+      <w:r>
+        <w:t xml:space="preserve">dataset availability and diversity issue is </w:t>
+      </w:r>
+      <w:r>
+        <w:t>not limited</w:t>
+      </w:r>
+      <w:r>
+        <w:t xml:space="preserve"> </w:t>
+      </w:r>
+      <w:r>
+        <w:t xml:space="preserve">to </w:t>
+      </w:r>
+      <w:r>
+        <w:t>the field of research,</w:t>
+      </w:r>
+      <w:r>
+        <w:t xml:space="preserve"> but </w:t>
+      </w:r>
+      <w:r>
+        <w:t>extends to</w:t>
+      </w:r>
+      <w:r>
+        <w:t xml:space="preserve"> commercial products, which primarily focus on English-language datasets</w:t>
+      </w:r>
+      <w:r>
+        <w:t xml:space="preserve">. </w:t>
+      </w:r>
+      <w:r>
+        <w:t xml:space="preserve">The </w:t>
+      </w:r>
+      <w:r>
+        <w:t>quality, quantity and availability of the data is fundamental to the model’s performance. It is fitting to consider available models, discuss the impact the limited datasets have on them and propose the best option to provide a reliable, interpretable trait scoring</w:t>
+      </w:r>
+      <w:r>
+        <w:t>.</w:t>
+      </w:r>
+      <w:r>
+        <w:t xml:space="preserve"> </w:t>
+      </w:r>
+    </w:p>
+    <w:p>
+      <w:pPr>
+        <w:spacing w:line="360" w:lineRule="auto"/>
+        <w:rPr>
+          <w:b/>
+          <w:bCs/>
+        </w:rPr>
+      </w:pPr>
+      <w:r>
+        <w:rPr>
+          <w:b/>
+          <w:bCs/>
+        </w:rPr>
+        <w:t>The models</w:t>
+      </w:r>
+    </w:p>
+    <w:p>
+      <w:pPr>
+        <w:spacing w:line="360" w:lineRule="auto"/>
+      </w:pPr>
+      <w:r>
+        <w:t xml:space="preserve">[4] </w:t>
+      </w:r>
+      <w:r>
+        <w:t xml:space="preserve">presents some of the issues with </w:t>
+      </w:r>
+      <w:r>
+        <w:t>Transformers pretrained models</w:t>
+      </w:r>
+      <w:r>
+        <w:t xml:space="preserve"> as having a closed</w:t>
+      </w:r>
+      <w:r>
+        <w:t xml:space="preserve">-box nature, high computational requirements, longer training times and the </w:t>
+      </w:r>
+      <w:r>
+        <w:lastRenderedPageBreak/>
+        <w:t xml:space="preserve">need for large datasets. Additionally, </w:t>
+      </w:r>
+      <w:r>
+        <w:t>issues presented are data</w:t>
+      </w:r>
+      <w:r>
+        <w:t xml:space="preserve"> quality, biases in training data, generalization, and overfitting </w:t>
+      </w:r>
+      <w:r>
+        <w:t xml:space="preserve">which </w:t>
+      </w:r>
+      <w:r>
+        <w:t>still pos</w:t>
+      </w:r>
+      <w:r>
+        <w:t>e</w:t>
+      </w:r>
+      <w:r>
+        <w:t xml:space="preserve"> significant obstacles that need to be addressed. [21] </w:t>
+      </w:r>
+      <w:r>
+        <w:t>gives a specific example revealing</w:t>
+      </w:r>
+      <w:r>
+        <w:t xml:space="preserve"> a significant divergence in scoring accuracy when </w:t>
+      </w:r>
+      <w:r>
+        <w:t xml:space="preserve">the </w:t>
+      </w:r>
+      <w:r>
+        <w:t>GPT model was applied to open-ended, domain</w:t>
+      </w:r>
+      <w:r>
+        <w:t>-</w:t>
+      </w:r>
+      <w:r>
+        <w:t xml:space="preserve">specific questions. The model struggled to provide equitable partial credit, a pedagogical necessity that often requires subtle contextual understanding and inference of student intent – qualities that go beyond simple semantic matching. </w:t>
+      </w:r>
+      <w:r>
+        <w:t xml:space="preserve">This again shows how the model’s performance is a direct reflection on the quality, diversity and quantity of training data. </w:t>
+      </w:r>
+      <w:r>
+        <w:t xml:space="preserve">[21] </w:t>
+      </w:r>
+      <w:r>
+        <w:t>cited</w:t>
+      </w:r>
+      <w:r>
+        <w:t xml:space="preserve"> three studies </w:t>
+      </w:r>
+      <w:r>
+        <w:t>that showed</w:t>
+      </w:r>
+      <w:r>
+        <w:t xml:space="preserve"> the limitations of ChatGPT as an AES tool. The results indicate</w:t>
+      </w:r>
+      <w:r>
+        <w:t>d</w:t>
+      </w:r>
+      <w:r>
+        <w:t xml:space="preserve"> that ChatGPT often scores lower </w:t>
+      </w:r>
+      <w:r>
+        <w:t xml:space="preserve">than human scorers </w:t>
+      </w:r>
+      <w:r>
+        <w:t xml:space="preserve">and its evaluation is inconsistent due to variations in its scoring mechanism, training data, model updates and ingrained randomness. Additionally, the consistency of ChatGPT’s scores over multiple evaluations was low, indicating variability and raising concerns about its reliability. </w:t>
+      </w:r>
+    </w:p>
+    <w:p>
+      <w:pPr>
+        <w:spacing w:line="360" w:lineRule="auto"/>
+      </w:pPr>
+      <w:r>
+        <w:t xml:space="preserve">Therefore, to </w:t>
+      </w:r>
+      <w:r>
+        <w:t>provide</w:t>
+      </w:r>
+      <w:r>
+        <w:t xml:space="preserve"> a more granular </w:t>
+      </w:r>
+      <w:r>
+        <w:t xml:space="preserve">essay </w:t>
+      </w:r>
+      <w:r>
+        <w:t xml:space="preserve">evaluation and overcome the limitations of </w:t>
+      </w:r>
+      <w:r>
+        <w:t>data availability</w:t>
+      </w:r>
+      <w:r>
+        <w:t>, this research will implement a transformer model in the essay processing pipeline as the final step before the end user receives a breakdown of how the traits are scored</w:t>
+      </w:r>
+      <w:r>
+        <w:t xml:space="preserve">. </w:t>
+      </w:r>
+      <w:r>
+        <w:t xml:space="preserve"> </w:t>
+      </w:r>
+      <w:proofErr w:type="spellStart"/>
+      <w:r>
+        <w:t>DeBERTa</w:t>
+      </w:r>
+      <w:proofErr w:type="spellEnd"/>
+      <w:r>
+        <w:t xml:space="preserve"> (Decoding enhanced BERT with disentanglement attention) </w:t>
+      </w:r>
+      <w:r>
+        <w:t>is an improvement of</w:t>
+      </w:r>
+      <w:r>
+        <w:t xml:space="preserve"> previous state-of-the-art pre-trained </w:t>
+      </w:r>
+      <w:r>
+        <w:t xml:space="preserve">transformer </w:t>
+      </w:r>
+      <w:r>
+        <w:t xml:space="preserve">models </w:t>
+      </w:r>
+      <w:r>
+        <w:t>such as</w:t>
+      </w:r>
+      <w:r>
+        <w:t xml:space="preserve"> </w:t>
+      </w:r>
+      <w:proofErr w:type="spellStart"/>
+      <w:r>
+        <w:t>RoBERTa</w:t>
+      </w:r>
+      <w:proofErr w:type="spellEnd"/>
+      <w:r>
+        <w:t xml:space="preserve"> </w:t>
+      </w:r>
+      <w:r>
+        <w:t>[24]</w:t>
+      </w:r>
+      <w:r>
+        <w:t>. Unlike it</w:t>
+      </w:r>
+      <w:r>
+        <w:t>s predecessor</w:t>
+      </w:r>
+      <w:r>
+        <w:t>,</w:t>
+      </w:r>
+      <w:r>
+        <w:t xml:space="preserve"> </w:t>
+      </w:r>
+      <w:r>
+        <w:t>BERT</w:t>
+      </w:r>
+      <w:r>
+        <w:t>, it uses</w:t>
+      </w:r>
+      <w:r>
+        <w:t xml:space="preserve"> two novel techniques: a disentanglement attention mechanism and an enhanced mask decoder. </w:t>
+      </w:r>
+      <w:r>
+        <w:t>DeBERTa</w:t>
+      </w:r>
+      <w:r>
+        <w:t>,</w:t>
+      </w:r>
+      <w:r>
+        <w:t xml:space="preserve"> </w:t>
+      </w:r>
+      <w:r>
+        <w:t xml:space="preserve">after training on 78GB of data, outperformed </w:t>
+      </w:r>
+      <w:proofErr w:type="spellStart"/>
+      <w:r>
+        <w:t>RoBERTa</w:t>
+      </w:r>
+      <w:proofErr w:type="spellEnd"/>
+      <w:r>
+        <w:t>,</w:t>
+      </w:r>
+      <w:r>
+        <w:t xml:space="preserve"> which trained on 160GB</w:t>
+      </w:r>
+      <w:r>
+        <w:t xml:space="preserve"> of data</w:t>
+      </w:r>
+      <w:r>
+        <w:t>.</w:t>
+      </w:r>
+    </w:p>
+    <w:p>
+      <w:r>
+        <w:t>Unlike BERT where each word in the input layer is represented using</w:t>
+      </w:r>
+      <w:r>
+        <w:t xml:space="preserve"> </w:t>
+      </w:r>
+      <w:r>
+        <w:t>a vector which is the sum of its word (content) embedding and position embedding, each word in</w:t>
+      </w:r>
+      <w:r>
+        <w:t xml:space="preserve"> </w:t>
+      </w:r>
+      <w:proofErr w:type="spellStart"/>
+      <w:r>
+        <w:t>DeBERTa</w:t>
+      </w:r>
+      <w:proofErr w:type="spellEnd"/>
+      <w:r>
+        <w:t xml:space="preserve"> is represented using two vectors that encode its content and position, respectively, and the</w:t>
+      </w:r>
+      <w:r>
+        <w:t xml:space="preserve"> </w:t>
+      </w:r>
+      <w:r>
+        <w:t>attention weights among words are computed using disentangled matrices based on their contents</w:t>
+      </w:r>
+      <w:r>
+        <w:t xml:space="preserve"> </w:t>
+      </w:r>
+      <w:r>
+        <w:t>and relative positions, respectively. This is motivated by the observation that the attention weight of a</w:t>
+      </w:r>
+      <w:r>
+        <w:t xml:space="preserve"> </w:t>
+      </w:r>
+      <w:r>
+        <w:t>word pair depends on not only their contents but their relative positions.</w:t>
+      </w:r>
+      <w:r>
+        <w:t xml:space="preserve"> </w:t>
+      </w:r>
+      <w:r>
+        <w:rPr>
+          <w:highlight w:val="yellow"/>
+        </w:rPr>
+        <w:t xml:space="preserve">Explain why Roberta is superior explain its </w:t>
+      </w:r>
+      <w:proofErr w:type="gramStart"/>
+      <w:r>
+        <w:rPr>
+          <w:highlight w:val="yellow"/>
+        </w:rPr>
+        <w:t>two  techniques</w:t>
+      </w:r>
+      <w:proofErr w:type="gramEnd"/>
+      <w:r>
+        <w:rPr>
+          <w:highlight w:val="yellow"/>
+        </w:rPr>
+        <w:t>.</w:t>
+      </w:r>
+      <w:r>
+        <w:t xml:space="preserve"> </w:t>
+      </w:r>
+      <w:r>
+        <w:br w:type="page"/>
+      </w:r>
+    </w:p>
+    <w:p>
+      <w:pPr>
+        <w:spacing w:line="360" w:lineRule="auto"/>
+      </w:pPr>
+      <w:r>
+        <w:lastRenderedPageBreak/>
+        <w:t xml:space="preserve"> </w:t>
+      </w:r>
+      <w:proofErr w:type="spellStart"/>
+      <w:r>
+        <w:t>DeBERTa</w:t>
+      </w:r>
+      <w:proofErr w:type="spellEnd"/>
+      <w:r>
+        <w:t xml:space="preserve"> also</w:t>
+      </w:r>
+      <w:r>
+        <w:t xml:space="preserve"> surpassed human scoring on the </w:t>
+      </w:r>
+      <w:proofErr w:type="spellStart"/>
+      <w:r>
+        <w:t>S</w:t>
+      </w:r>
+      <w:r>
+        <w:t>uper</w:t>
+      </w:r>
+      <w:r>
+        <w:t>GLUE</w:t>
+      </w:r>
+      <w:proofErr w:type="spellEnd"/>
+      <w:r>
+        <w:t xml:space="preserve"> benchmarks for the first time since 202</w:t>
+      </w:r>
+      <w:r>
+        <w:t>1</w:t>
+      </w:r>
+      <w:r>
+        <w:t xml:space="preserve"> [24]</w:t>
+      </w:r>
+      <w:r>
+        <w:t>. This benchmark includes a wide range of task</w:t>
+      </w:r>
+      <w:r>
+        <w:t>s</w:t>
+      </w:r>
+      <w:r>
+        <w:t xml:space="preserve"> such as question answering, natural language inference</w:t>
+      </w:r>
+      <w:r>
+        <w:t>,</w:t>
+      </w:r>
+      <w:r>
+        <w:t xml:space="preserve"> and word sense disambiguation</w:t>
+      </w:r>
+      <w:r>
+        <w:t xml:space="preserve"> [24]</w:t>
+      </w:r>
+      <w:r>
+        <w:t xml:space="preserve">. </w:t>
+      </w:r>
+      <w:proofErr w:type="spellStart"/>
+      <w:r>
+        <w:t>DeBERTa</w:t>
+      </w:r>
+      <w:proofErr w:type="spellEnd"/>
+      <w:r>
+        <w:t xml:space="preserve"> is also freely available from the </w:t>
+      </w:r>
+      <w:proofErr w:type="spellStart"/>
+      <w:r>
+        <w:t>huggingface</w:t>
+      </w:r>
+      <w:proofErr w:type="spellEnd"/>
+      <w:r>
+        <w:t xml:space="preserve"> website and offered under the MIT licence</w:t>
+      </w:r>
+      <w:r>
+        <w:t>,</w:t>
+      </w:r>
+      <w:r>
+        <w:t xml:space="preserve"> facilitating freedom of modification and reproducibility.</w:t>
+      </w:r>
+      <w:r>
+        <w:t xml:space="preserve"> </w:t>
+      </w:r>
+      <w:proofErr w:type="spellStart"/>
+      <w:r>
+        <w:t>DeBERTa</w:t>
+      </w:r>
+      <w:proofErr w:type="spellEnd"/>
+      <w:r>
+        <w:t xml:space="preserve"> was selected </w:t>
+      </w:r>
+      <w:r>
+        <w:t>to form the</w:t>
+      </w:r>
+      <w:r>
+        <w:t xml:space="preserve"> core component for th</w:t>
+      </w:r>
+      <w:r>
+        <w:t>is</w:t>
+      </w:r>
+      <w:r>
+        <w:t xml:space="preserve"> AES system over more popular </w:t>
+      </w:r>
+      <w:r>
+        <w:t xml:space="preserve">candidate </w:t>
+      </w:r>
+      <w:r>
+        <w:t xml:space="preserve">models like BERT, </w:t>
+      </w:r>
+      <w:proofErr w:type="spellStart"/>
+      <w:r>
+        <w:t>RoBERTa</w:t>
+      </w:r>
+      <w:proofErr w:type="spellEnd"/>
+      <w:r>
+        <w:t xml:space="preserve"> and GPT 4</w:t>
+      </w:r>
+      <w:r>
+        <w:t>. This is because, i</w:t>
+      </w:r>
+      <w:r>
+        <w:t>ts</w:t>
+      </w:r>
+      <w:r>
+        <w:t xml:space="preserve"> performance is not as strongly coupled with the size of the training data as </w:t>
+      </w:r>
+      <w:r>
+        <w:t>these other models</w:t>
+      </w:r>
+      <w:r>
+        <w:t xml:space="preserve"> and has even surpassed human scorers on established benchmarks</w:t>
+      </w:r>
+      <w:r>
+        <w:t>, making it</w:t>
+      </w:r>
+      <w:r>
+        <w:t xml:space="preserve"> more suitable for </w:t>
+      </w:r>
+      <w:r>
+        <w:t xml:space="preserve">the </w:t>
+      </w:r>
+      <w:r>
+        <w:t>AES</w:t>
+      </w:r>
+      <w:r>
+        <w:t xml:space="preserve"> task</w:t>
+      </w:r>
+      <w:r>
+        <w:t xml:space="preserve">, to </w:t>
+      </w:r>
+      <w:r>
+        <w:t xml:space="preserve">compensate for </w:t>
+      </w:r>
+      <w:r>
+        <w:t>data</w:t>
+      </w:r>
+      <w:r>
+        <w:t>set</w:t>
+      </w:r>
+      <w:r>
+        <w:t xml:space="preserve"> limit</w:t>
+      </w:r>
+      <w:r>
+        <w:t>ation</w:t>
+      </w:r>
+      <w:r>
+        <w:t xml:space="preserve"> </w:t>
+      </w:r>
+      <w:r>
+        <w:t>discussed earlier</w:t>
+      </w:r>
+      <w:r>
+        <w:t xml:space="preserve">.  </w:t>
+      </w:r>
+    </w:p>
+    <w:p>
+      <w:pPr>
+        <w:spacing w:line="360" w:lineRule="auto"/>
+      </w:pPr>
     </w:p>
     <w:p>
       <w:pPr>
@@ -2518,6 +3278,16 @@
       <w:pPr>
         <w:spacing w:line="360" w:lineRule="auto"/>
       </w:pPr>
+    </w:p>
+    <w:p>
+      <w:pPr>
+        <w:spacing w:line="360" w:lineRule="auto"/>
+      </w:pPr>
+    </w:p>
+    <w:p>
+      <w:pPr>
+        <w:spacing w:line="360" w:lineRule="auto"/>
+      </w:pPr>
       <w:r>
         <w:t>Limitations of ASR (STT)</w:t>
       </w:r>
@@ -2526,59 +3296,249 @@
       <w:pPr>
         <w:spacing w:line="360" w:lineRule="auto"/>
       </w:pPr>
-      <w:r>
-        <w:t xml:space="preserve">Limitations of Transformers </w:t>
-      </w:r>
     </w:p>
     <w:p>
       <w:pPr>
         <w:pStyle w:val="ListParagraph"/>
-        <w:numPr>
-          <w:ilvl w:val="0"/>
-          <w:numId w:val="3"/>
-        </w:numPr>
-        <w:spacing w:line="360" w:lineRule="auto"/>
-      </w:pPr>
-      <w:r>
-        <w:t>Specify dataset and critique it</w:t>
-      </w:r>
-    </w:p>
-    <w:p>
-      <w:pPr>
-        <w:pStyle w:val="ListParagraph"/>
-        <w:numPr>
-          <w:ilvl w:val="0"/>
-          <w:numId w:val="3"/>
-        </w:numPr>
-        <w:spacing w:line="360" w:lineRule="auto"/>
-      </w:pPr>
-      <w:r>
-        <w:t xml:space="preserve">Paper 7 speaks about how gpt-4 has limitations, use to contrast with </w:t>
-      </w:r>
-      <w:proofErr w:type="spellStart"/>
-      <w:r>
-        <w:t>deberta</w:t>
-      </w:r>
-      <w:proofErr w:type="spellEnd"/>
-      <w:r>
-        <w:t xml:space="preserve"> to show advantage</w:t>
-      </w:r>
-    </w:p>
-    <w:p>
-      <w:pPr>
-        <w:pStyle w:val="ListParagraph"/>
-        <w:numPr>
-          <w:ilvl w:val="0"/>
-          <w:numId w:val="3"/>
-        </w:numPr>
-        <w:spacing w:line="360" w:lineRule="auto"/>
-      </w:pPr>
-    </w:p>
-    <w:p>
-      <w:pPr>
-        <w:pStyle w:val="ListParagraph"/>
-        <w:spacing w:line="360" w:lineRule="auto"/>
-      </w:pPr>
+        <w:spacing w:line="360" w:lineRule="auto"/>
+      </w:pPr>
+    </w:p>
+    <w:p>
+      <w:pPr>
+        <w:rPr>
+          <w:b/>
+          <w:bCs/>
+          <w:highlight w:val="yellow"/>
+        </w:rPr>
+      </w:pPr>
+      <w:r>
+        <w:rPr>
+          <w:b/>
+          <w:bCs/>
+          <w:highlight w:val="yellow"/>
+        </w:rPr>
+        <w:t>One More Section I Think You Should Add</w:t>
+      </w:r>
+    </w:p>
+    <w:p>
+      <w:pPr>
+        <w:rPr>
+          <w:b/>
+          <w:bCs/>
+          <w:highlight w:val="yellow"/>
+        </w:rPr>
+      </w:pPr>
+      <w:r>
+        <w:rPr>
+          <w:b/>
+          <w:bCs/>
+          <w:highlight w:val="yellow"/>
+        </w:rPr>
+        <w:t>Limitations of Multimodal Integrated Systems</w:t>
+      </w:r>
+    </w:p>
+    <w:p>
+      <w:pPr>
+        <w:rPr>
+          <w:highlight w:val="yellow"/>
+        </w:rPr>
+      </w:pPr>
+      <w:r>
+        <w:rPr>
+          <w:highlight w:val="yellow"/>
+        </w:rPr>
+        <w:t>This section would naturally precede your mitigation plan.</w:t>
+      </w:r>
+    </w:p>
+    <w:p>
+      <w:pPr>
+        <w:rPr>
+          <w:highlight w:val="yellow"/>
+        </w:rPr>
+      </w:pPr>
+      <w:r>
+        <w:rPr>
+          <w:highlight w:val="yellow"/>
+        </w:rPr>
+        <w:t>You could discuss:</w:t>
+      </w:r>
+    </w:p>
+    <w:p>
+      <w:pPr>
+        <w:rPr>
+          <w:b/>
+          <w:bCs/>
+          <w:highlight w:val="yellow"/>
+        </w:rPr>
+      </w:pPr>
+      <w:r>
+        <w:rPr>
+          <w:b/>
+          <w:bCs/>
+          <w:highlight w:val="yellow"/>
+        </w:rPr>
+        <w:t>Error Propagation</w:t>
+      </w:r>
+    </w:p>
+    <w:p>
+      <w:pPr>
+        <w:rPr>
+          <w:highlight w:val="yellow"/>
+        </w:rPr>
+      </w:pPr>
+      <w:r>
+        <w:rPr>
+          <w:highlight w:val="yellow"/>
+        </w:rPr>
+        <w:t>Mistakes in OCR and ASR are inherited by the AES model.</w:t>
+      </w:r>
+    </w:p>
+    <w:p>
+      <w:pPr>
+        <w:rPr>
+          <w:b/>
+          <w:bCs/>
+          <w:highlight w:val="yellow"/>
+        </w:rPr>
+      </w:pPr>
+      <w:r>
+        <w:rPr>
+          <w:b/>
+          <w:bCs/>
+          <w:highlight w:val="yellow"/>
+        </w:rPr>
+        <w:t>Increased System Complexity</w:t>
+      </w:r>
+    </w:p>
+    <w:p>
+      <w:pPr>
+        <w:rPr>
+          <w:highlight w:val="yellow"/>
+        </w:rPr>
+      </w:pPr>
+      <w:r>
+        <w:rPr>
+          <w:highlight w:val="yellow"/>
+        </w:rPr>
+        <w:t>Integrating multiple models increases implementation complexity and maintenance requirements.</w:t>
+      </w:r>
+    </w:p>
+    <w:p>
+      <w:pPr>
+        <w:rPr>
+          <w:b/>
+          <w:bCs/>
+          <w:highlight w:val="yellow"/>
+        </w:rPr>
+      </w:pPr>
+      <w:r>
+        <w:rPr>
+          <w:b/>
+          <w:bCs/>
+          <w:highlight w:val="yellow"/>
+        </w:rPr>
+        <w:t>Computational Overhead</w:t>
+      </w:r>
+    </w:p>
+    <w:p>
+      <w:pPr>
+        <w:rPr>
+          <w:highlight w:val="yellow"/>
+        </w:rPr>
+      </w:pPr>
+      <w:r>
+        <w:rPr>
+          <w:highlight w:val="yellow"/>
+        </w:rPr>
+        <w:lastRenderedPageBreak/>
+        <w:t>Running three models (</w:t>
+      </w:r>
+      <w:proofErr w:type="spellStart"/>
+      <w:r>
+        <w:rPr>
+          <w:highlight w:val="yellow"/>
+        </w:rPr>
+        <w:t>TrOCR</w:t>
+      </w:r>
+      <w:proofErr w:type="spellEnd"/>
+      <w:r>
+        <w:rPr>
+          <w:highlight w:val="yellow"/>
+        </w:rPr>
+        <w:t xml:space="preserve">, Whisper, and </w:t>
+      </w:r>
+      <w:proofErr w:type="spellStart"/>
+      <w:r>
+        <w:rPr>
+          <w:highlight w:val="yellow"/>
+        </w:rPr>
+        <w:t>DeBERTa</w:t>
+      </w:r>
+      <w:proofErr w:type="spellEnd"/>
+      <w:r>
+        <w:rPr>
+          <w:highlight w:val="yellow"/>
+        </w:rPr>
+        <w:t>) requires more memory and processing time than single-model systems.</w:t>
+      </w:r>
+    </w:p>
+    <w:p>
+      <w:pPr>
+        <w:rPr>
+          <w:b/>
+          <w:bCs/>
+          <w:highlight w:val="yellow"/>
+        </w:rPr>
+      </w:pPr>
+      <w:r>
+        <w:rPr>
+          <w:b/>
+          <w:bCs/>
+          <w:highlight w:val="yellow"/>
+        </w:rPr>
+        <w:t>Dependence on Pretrained Models</w:t>
+      </w:r>
+    </w:p>
+    <w:p>
+      <w:pPr>
+        <w:rPr>
+          <w:highlight w:val="yellow"/>
+        </w:rPr>
+      </w:pPr>
+      <w:r>
+        <w:rPr>
+          <w:highlight w:val="yellow"/>
+        </w:rPr>
+        <w:t>The system's performance depends heavily on the capabilities and biases of externally developed models.</w:t>
+      </w:r>
+    </w:p>
+    <w:p>
+      <w:pPr>
+        <w:rPr>
+          <w:b/>
+          <w:bCs/>
+          <w:highlight w:val="yellow"/>
+        </w:rPr>
+      </w:pPr>
+      <w:r>
+        <w:rPr>
+          <w:b/>
+          <w:bCs/>
+          <w:highlight w:val="yellow"/>
+        </w:rPr>
+        <w:t>Modality Imbalance</w:t>
+      </w:r>
+    </w:p>
+    <w:p>
+      <w:r>
+        <w:rPr>
+          <w:highlight w:val="yellow"/>
+        </w:rPr>
+        <w:t>Different input modalities may not contribute equally. Typed essays may produce better scores than handwritten or spoken essays because OCR and ASR introduce additional noise</w:t>
+      </w:r>
+      <w:r>
+        <w:t>.</w:t>
+      </w:r>
     </w:p>
     <w:p>
       <w:pPr>

</xml_diff>

<commit_message>
Updated Challenges and considerations... - datasets, models, limitations of ocr
</commit_message>
<xml_diff>
--- a/preliminary report/Final Project - Preliminary Report.docx
+++ b/preliminary report/Final Project - Preliminary Report.docx
@@ -986,6 +986,14 @@
         <w:spacing w:line="360" w:lineRule="auto"/>
         <w:ind w:right="971"/>
       </w:pPr>
+      <w:proofErr w:type="spellStart"/>
+      <w:r>
+        <w:t>BrainPower</w:t>
+      </w:r>
+      <w:proofErr w:type="spellEnd"/>
+      <w:r>
+        <w:t xml:space="preserve">- </w:t>
+      </w:r>
       <w:r>
         <w:t>A</w:t>
       </w:r>
@@ -1119,7 +1127,16 @@
         <w:t xml:space="preserve"> 35 students. This manual approach does not scale well if a teacher is assigned to more than one class. </w:t>
       </w:r>
       <w:r>
-        <w:t xml:space="preserve">I am a teacher and personally understand the stressful, time-consuming ordeal that my colleagues and I must endure when marking answers to open-ended questions, especially essay. Currently </w:t>
+        <w:t>As an educator, the author recognizes</w:t>
+      </w:r>
+      <w:r>
+        <w:t xml:space="preserve"> the stressful, time-consuming ordeal that </w:t>
+      </w:r>
+      <w:r>
+        <w:t>educators</w:t>
+      </w:r>
+      <w:r>
+        <w:t xml:space="preserve"> endure when marking answers to open-ended questions, especially essay. Currently </w:t>
       </w:r>
       <w:r>
         <w:t xml:space="preserve">accessibility </w:t>
@@ -1176,11 +1193,11 @@
         <w:t xml:space="preserve">. </w:t>
       </w:r>
       <w:r>
-        <w:t xml:space="preserve">There should also be </w:t>
+        <w:t xml:space="preserve">There should also be a </w:t>
       </w:r>
       <w:r>
         <w:lastRenderedPageBreak/>
-        <w:t xml:space="preserve">a mechanism in place to allow students who are unable to be present at school to be able to under supervision write essays and share photographs or scan copies of these essays.  </w:t>
+        <w:t xml:space="preserve">mechanism in place to allow students who are unable to be present at school to be able to under supervision write essays and share photographs or scan copies of these essays.  </w:t>
       </w:r>
     </w:p>
     <w:p>
@@ -1520,32 +1537,6 @@
         <w:t xml:space="preserve">. </w:t>
       </w:r>
       <w:r>
-        <w:t xml:space="preserve">Li et al. </w:t>
-      </w:r>
-      <w:r>
-        <w:rPr>
-          <w:highlight w:val="yellow"/>
-        </w:rPr>
-        <w:t xml:space="preserve">[5 from multimodal] traditional OCR is primarily oriented toward printed text but has been modified to recognize handwritten text giving rise to the synonym </w:t>
-      </w:r>
-      <w:proofErr w:type="spellStart"/>
-      <w:r>
-        <w:rPr>
-          <w:highlight w:val="yellow"/>
-        </w:rPr>
-        <w:t>HandwrittenOCR</w:t>
-      </w:r>
-      <w:proofErr w:type="spellEnd"/>
-      <w:r>
-        <w:rPr>
-          <w:highlight w:val="yellow"/>
-        </w:rPr>
-        <w:t>.</w:t>
-      </w:r>
-      <w:r>
-        <w:t xml:space="preserve"> </w:t>
-      </w:r>
-      <w:r>
         <w:t>[1</w:t>
       </w:r>
       <w:r>
@@ -2162,21 +2153,13 @@
         <w:t xml:space="preserve"> such as </w:t>
       </w:r>
       <w:proofErr w:type="spellStart"/>
-      <w:proofErr w:type="gramStart"/>
       <w:r>
         <w:t>IntelliMetric</w:t>
       </w:r>
       <w:proofErr w:type="spellEnd"/>
       <w:r>
-        <w:t xml:space="preserve">, </w:t>
-      </w:r>
-      <w:r>
-        <w:t xml:space="preserve"> </w:t>
-      </w:r>
-      <w:r>
-        <w:t>whose</w:t>
-      </w:r>
-      <w:proofErr w:type="gramEnd"/>
+        <w:t>®, whose</w:t>
+      </w:r>
       <w:r>
         <w:t xml:space="preserve"> architectures are not</w:t>
       </w:r>
@@ -2517,17 +2500,26 @@
     </w:p>
     <w:p>
       <w:pPr>
-        <w:spacing w:line="360" w:lineRule="auto"/>
+        <w:pStyle w:val="Heading2"/>
       </w:pPr>
       <w:r>
         <w:t xml:space="preserve">Challenges and consideration for component selection </w:t>
       </w:r>
     </w:p>
-    <w:p>
-      <w:pPr>
-        <w:spacing w:line="360" w:lineRule="auto"/>
-      </w:pPr>
-      <w:r>
+    <w:p/>
+    <w:p>
+      <w:pPr>
+        <w:spacing w:line="360" w:lineRule="auto"/>
+        <w:rPr>
+          <w:b/>
+          <w:bCs/>
+        </w:rPr>
+      </w:pPr>
+      <w:r>
+        <w:rPr>
+          <w:b/>
+          <w:bCs/>
+        </w:rPr>
         <w:t xml:space="preserve">The datasets </w:t>
       </w:r>
     </w:p>
@@ -2781,7 +2773,19 @@
         <w:t xml:space="preserve">The </w:t>
       </w:r>
       <w:r>
-        <w:t>quality, quantity and availability of the data is fundamental to the model’s performance. It is fitting to consider available models, discuss the impact the limited datasets have on them and propose the best option to provide a reliable, interpretable trait scoring</w:t>
+        <w:t>quality, quantity</w:t>
+      </w:r>
+      <w:r>
+        <w:t>,</w:t>
+      </w:r>
+      <w:r>
+        <w:t xml:space="preserve"> and availability of the data </w:t>
+      </w:r>
+      <w:r>
+        <w:t>are</w:t>
+      </w:r>
+      <w:r>
+        <w:t xml:space="preserve"> fundamental to the model’s performance. It is fitting to consider available models, discuss the impact the limited datasets have on them and propose the best option to provide reliable, interpretable trait scoring</w:t>
       </w:r>
       <w:r>
         <w:t>.</w:t>
@@ -2809,8 +2813,34 @@
     <w:p>
       <w:pPr>
         <w:spacing w:line="360" w:lineRule="auto"/>
-      </w:pPr>
-      <w:r>
+        <w:rPr>
+          <w:b/>
+          <w:bCs/>
+        </w:rPr>
+      </w:pPr>
+      <w:proofErr w:type="spellStart"/>
+      <w:r>
+        <w:rPr>
+          <w:b/>
+          <w:bCs/>
+        </w:rPr>
+        <w:t>DeBERTa</w:t>
+      </w:r>
+      <w:proofErr w:type="spellEnd"/>
+      <w:r>
+        <w:rPr>
+          <w:b/>
+          <w:bCs/>
+        </w:rPr>
+        <w:t xml:space="preserve"> for AES</w:t>
+      </w:r>
+    </w:p>
+    <w:p>
+      <w:pPr>
+        <w:spacing w:line="360" w:lineRule="auto"/>
+      </w:pPr>
+      <w:r>
+        <w:lastRenderedPageBreak/>
         <w:t xml:space="preserve">[4] </w:t>
       </w:r>
       <w:r>
@@ -2823,485 +2853,1122 @@
         <w:t xml:space="preserve"> as having a closed</w:t>
       </w:r>
       <w:r>
-        <w:t xml:space="preserve">-box nature, high computational requirements, longer training times and the </w:t>
+        <w:t xml:space="preserve">-box nature, high computational requirements, longer training times and the need for large datasets. Additionally, </w:t>
+      </w:r>
+      <w:r>
+        <w:t>issues presented are data</w:t>
+      </w:r>
+      <w:r>
+        <w:t xml:space="preserve"> quality, biases in training data, generalization, and overfitting </w:t>
+      </w:r>
+      <w:r>
+        <w:t xml:space="preserve">which </w:t>
+      </w:r>
+      <w:r>
+        <w:t>still pos</w:t>
+      </w:r>
+      <w:r>
+        <w:t>e</w:t>
+      </w:r>
+      <w:r>
+        <w:t xml:space="preserve"> significant obstacles that need to be addressed. [21] </w:t>
+      </w:r>
+      <w:r>
+        <w:t>gives a specific example revealing</w:t>
+      </w:r>
+      <w:r>
+        <w:t xml:space="preserve"> a significant divergence in scoring accuracy when </w:t>
+      </w:r>
+      <w:r>
+        <w:t xml:space="preserve">the </w:t>
+      </w:r>
+      <w:r>
+        <w:t>GPT model was applied to open-ended, domain</w:t>
+      </w:r>
+      <w:r>
+        <w:t>-</w:t>
+      </w:r>
+      <w:r>
+        <w:t xml:space="preserve">specific questions. The model struggled to provide equitable partial credit, a pedagogical necessity that often requires subtle contextual understanding and inference of student intent – qualities that go beyond simple semantic matching. </w:t>
+      </w:r>
+      <w:r>
+        <w:t>This again shows how the model’s performance is a direct reflection on the quality, diversity</w:t>
+      </w:r>
+      <w:r>
+        <w:t>,</w:t>
+      </w:r>
+      <w:r>
+        <w:t xml:space="preserve"> and quantity of training data. </w:t>
+      </w:r>
+      <w:r>
+        <w:t xml:space="preserve">[21] </w:t>
+      </w:r>
+      <w:r>
+        <w:t>cited</w:t>
+      </w:r>
+      <w:r>
+        <w:t xml:space="preserve"> three studies </w:t>
+      </w:r>
+      <w:r>
+        <w:t>that showed</w:t>
+      </w:r>
+      <w:r>
+        <w:t xml:space="preserve"> the limitations of ChatGPT as an AES tool. The results indicate</w:t>
+      </w:r>
+      <w:r>
+        <w:t>d</w:t>
+      </w:r>
+      <w:r>
+        <w:t xml:space="preserve"> that ChatGPT often scores lower </w:t>
+      </w:r>
+      <w:r>
+        <w:t xml:space="preserve">than human scorers </w:t>
+      </w:r>
+      <w:r>
+        <w:t>and its evaluation is inconsistent due to variations in its scoring mechanism, training data, model updates</w:t>
+      </w:r>
+      <w:r>
+        <w:t>,</w:t>
+      </w:r>
+      <w:r>
+        <w:t xml:space="preserve"> and ingrained randomness. Additionally, the consistency of ChatGPT’s scores over multiple evaluations was low, indicating variability and raising concerns about its reliability. </w:t>
+      </w:r>
+      <w:r>
+        <w:t>[</w:t>
+      </w:r>
+      <w:r>
+        <w:t>24</w:t>
+      </w:r>
+      <w:r>
+        <w:t xml:space="preserve">] explored the potential of using GPT-based models as an alternative solution to the data scarcity issue, comparing their performance to that of fine-tuning BERT models, which remains the state-of-the-art, in quantitative text analysis. They concluded that BERT models remain the overall go-to method for classification although GPT models can serve as alternatives on smaller tasks. GPT models are also easier to tweak, however, they are more expensive. </w:t>
+      </w:r>
+      <w:r>
+        <w:t xml:space="preserve">Due to the findings of [21] and [24] GPT will not be included in this system.  </w:t>
+      </w:r>
+    </w:p>
+    <w:p>
+      <w:pPr>
+        <w:spacing w:line="360" w:lineRule="auto"/>
+      </w:pPr>
+      <w:r>
+        <w:t xml:space="preserve"> </w:t>
+      </w:r>
+      <w:proofErr w:type="spellStart"/>
+      <w:r>
+        <w:t>DeBERTa</w:t>
+      </w:r>
+      <w:proofErr w:type="spellEnd"/>
+      <w:r>
+        <w:t xml:space="preserve"> (Decoding</w:t>
+      </w:r>
+      <w:r>
+        <w:t>-</w:t>
+      </w:r>
+      <w:r>
+        <w:t xml:space="preserve">enhanced BERT with </w:t>
+      </w:r>
+      <w:r>
+        <w:t>D</w:t>
+      </w:r>
+      <w:r>
+        <w:t>isentangle</w:t>
+      </w:r>
+      <w:r>
+        <w:t>d</w:t>
+      </w:r>
+      <w:r>
+        <w:t xml:space="preserve"> </w:t>
+      </w:r>
+      <w:r>
+        <w:t>A</w:t>
+      </w:r>
+      <w:r>
+        <w:t>ttention)</w:t>
+      </w:r>
+      <w:r>
+        <w:t xml:space="preserve"> </w:t>
+      </w:r>
+      <w:r>
+        <w:t>is</w:t>
+      </w:r>
+      <w:r>
+        <w:t xml:space="preserve"> an improvement of</w:t>
+      </w:r>
+      <w:r>
+        <w:t xml:space="preserve"> previous state-of-the-art pre-trained </w:t>
+      </w:r>
+      <w:r>
+        <w:t xml:space="preserve">transformer </w:t>
+      </w:r>
+      <w:r>
+        <w:t xml:space="preserve">models </w:t>
+      </w:r>
+      <w:r>
+        <w:t>such as</w:t>
+      </w:r>
+      <w:r>
+        <w:t xml:space="preserve"> </w:t>
+      </w:r>
+      <w:r>
+        <w:t xml:space="preserve">BERT and </w:t>
+      </w:r>
+      <w:proofErr w:type="spellStart"/>
+      <w:r>
+        <w:t>RoBERTa</w:t>
+      </w:r>
+      <w:proofErr w:type="spellEnd"/>
+      <w:r>
+        <w:t>,</w:t>
+      </w:r>
+      <w:r>
+        <w:t xml:space="preserve"> its predecessors</w:t>
+      </w:r>
+      <w:r>
+        <w:t xml:space="preserve"> </w:t>
+      </w:r>
+      <w:r>
+        <w:t>[2</w:t>
+      </w:r>
+      <w:r>
+        <w:t>5</w:t>
+      </w:r>
+      <w:r>
+        <w:t>]</w:t>
+      </w:r>
+      <w:r>
+        <w:t>. Unlike it</w:t>
+      </w:r>
+      <w:r>
+        <w:t>s predecessor</w:t>
+      </w:r>
+      <w:r>
+        <w:t>s</w:t>
+      </w:r>
+      <w:r>
+        <w:t>,</w:t>
+      </w:r>
+      <w:r>
+        <w:t xml:space="preserve"> </w:t>
+      </w:r>
+      <w:r>
+        <w:t>it uses</w:t>
+      </w:r>
+      <w:r>
+        <w:t xml:space="preserve"> two novel techniques: a disentanglement attention mechanism and an enhanced mask decoder</w:t>
+      </w:r>
+      <w:r>
+        <w:t xml:space="preserve"> [25]</w:t>
+      </w:r>
+      <w:r>
+        <w:t xml:space="preserve">. </w:t>
+      </w:r>
+      <w:r>
+        <w:t>BERT</w:t>
+      </w:r>
+      <w:r>
+        <w:t xml:space="preserve"> and </w:t>
+      </w:r>
+      <w:proofErr w:type="spellStart"/>
+      <w:r>
+        <w:t>RoBERTa</w:t>
+      </w:r>
+      <w:proofErr w:type="spellEnd"/>
+      <w:r>
+        <w:t xml:space="preserve"> </w:t>
+      </w:r>
+      <w:r>
+        <w:t xml:space="preserve"> </w:t>
+      </w:r>
+      <w:r>
+        <w:t>represented each word in the input layer by a single vector</w:t>
+      </w:r>
+      <w:r>
+        <w:t xml:space="preserve"> which is the sum of its word (content) embedding and position embedding, each word in</w:t>
+      </w:r>
+      <w:r>
+        <w:t xml:space="preserve"> </w:t>
+      </w:r>
+      <w:proofErr w:type="spellStart"/>
+      <w:r>
+        <w:t>DeBERTa</w:t>
+      </w:r>
+      <w:proofErr w:type="spellEnd"/>
+      <w:r>
+        <w:t xml:space="preserve">, however, </w:t>
+      </w:r>
+      <w:r>
+        <w:t xml:space="preserve"> represent</w:t>
+      </w:r>
+      <w:r>
+        <w:t>s a word with</w:t>
+      </w:r>
+      <w:r>
+        <w:t xml:space="preserve"> two vectors that encode its content and position, respectively, and the</w:t>
+      </w:r>
+      <w:r>
+        <w:t xml:space="preserve"> </w:t>
+      </w:r>
+      <w:r>
+        <w:t>attention weights among words are computed using disentangled matrices based on their contents</w:t>
+      </w:r>
+      <w:r>
+        <w:t xml:space="preserve"> </w:t>
+      </w:r>
+      <w:r>
+        <w:t>and relative positions</w:t>
+      </w:r>
+      <w:r>
+        <w:t xml:space="preserve"> [25]</w:t>
+      </w:r>
+      <w:r>
+        <w:t xml:space="preserve">. This is motivated by the observation </w:t>
       </w:r>
       <w:r>
         <w:lastRenderedPageBreak/>
-        <w:t xml:space="preserve">need for large datasets. Additionally, </w:t>
-      </w:r>
-      <w:r>
-        <w:t>issues presented are data</w:t>
-      </w:r>
-      <w:r>
-        <w:t xml:space="preserve"> quality, biases in training data, generalization, and overfitting </w:t>
-      </w:r>
-      <w:r>
-        <w:t xml:space="preserve">which </w:t>
-      </w:r>
-      <w:r>
-        <w:t>still pos</w:t>
-      </w:r>
-      <w:r>
-        <w:t>e</w:t>
-      </w:r>
-      <w:r>
-        <w:t xml:space="preserve"> significant obstacles that need to be addressed. [21] </w:t>
-      </w:r>
-      <w:r>
-        <w:t>gives a specific example revealing</w:t>
-      </w:r>
-      <w:r>
-        <w:t xml:space="preserve"> a significant divergence in scoring accuracy when </w:t>
+        <w:t>that the attention weight of a</w:t>
+      </w:r>
+      <w:r>
+        <w:t xml:space="preserve"> </w:t>
+      </w:r>
+      <w:r>
+        <w:t>word pair depends on not only their contents but their relative positions</w:t>
+      </w:r>
+      <w:r>
+        <w:t xml:space="preserve"> [25]</w:t>
+      </w:r>
+      <w:r>
+        <w:t>.</w:t>
+      </w:r>
+      <w:r>
+        <w:t xml:space="preserve"> </w:t>
+      </w:r>
+    </w:p>
+    <w:p>
+      <w:pPr>
+        <w:spacing w:line="360" w:lineRule="auto"/>
+      </w:pPr>
+      <w:r>
+        <w:t>[2</w:t>
+      </w:r>
+      <w:r>
+        <w:t>5</w:t>
+      </w:r>
+      <w:r>
+        <w:t xml:space="preserve">] </w:t>
+      </w:r>
+      <w:proofErr w:type="spellStart"/>
+      <w:r>
+        <w:t>DeBERTa</w:t>
+      </w:r>
+      <w:proofErr w:type="spellEnd"/>
+      <w:r>
+        <w:t>,</w:t>
+      </w:r>
+      <w:r>
+        <w:t xml:space="preserve"> </w:t>
+      </w:r>
+      <w:r>
+        <w:t xml:space="preserve">after training on 78GB of data, outperformed </w:t>
+      </w:r>
+      <w:proofErr w:type="spellStart"/>
+      <w:r>
+        <w:t>RoBERTa</w:t>
+      </w:r>
+      <w:proofErr w:type="spellEnd"/>
+      <w:r>
+        <w:t>,</w:t>
+      </w:r>
+      <w:r>
+        <w:t xml:space="preserve"> which </w:t>
+      </w:r>
+      <w:r>
+        <w:t xml:space="preserve">was </w:t>
+      </w:r>
+      <w:r>
+        <w:t>trained on 160GB</w:t>
+      </w:r>
+      <w:r>
+        <w:t xml:space="preserve"> of data</w:t>
+      </w:r>
+      <w:r>
+        <w:t>.</w:t>
+      </w:r>
+      <w:r>
+        <w:t xml:space="preserve"> </w:t>
+      </w:r>
+      <w:proofErr w:type="spellStart"/>
+      <w:r>
+        <w:t>DeBERTa</w:t>
+      </w:r>
+      <w:proofErr w:type="spellEnd"/>
+      <w:r>
+        <w:t xml:space="preserve"> also</w:t>
+      </w:r>
+      <w:r>
+        <w:t xml:space="preserve"> surpassed human scoring on the </w:t>
+      </w:r>
+      <w:proofErr w:type="spellStart"/>
+      <w:r>
+        <w:t>S</w:t>
+      </w:r>
+      <w:r>
+        <w:t>uper</w:t>
+      </w:r>
+      <w:r>
+        <w:t>GLUE</w:t>
+      </w:r>
+      <w:proofErr w:type="spellEnd"/>
+      <w:r>
+        <w:t xml:space="preserve"> benchmarks for the first time since 202</w:t>
+      </w:r>
+      <w:r>
+        <w:t>1</w:t>
+      </w:r>
+      <w:r>
+        <w:t xml:space="preserve"> [2</w:t>
+      </w:r>
+      <w:r>
+        <w:t>5</w:t>
+      </w:r>
+      <w:r>
+        <w:t>]</w:t>
+      </w:r>
+      <w:r>
+        <w:t>. This benchmark includes a wide range of task</w:t>
+      </w:r>
+      <w:r>
+        <w:t>s</w:t>
+      </w:r>
+      <w:r>
+        <w:t xml:space="preserve"> such as question answering, natural language inference</w:t>
+      </w:r>
+      <w:r>
+        <w:t>,</w:t>
+      </w:r>
+      <w:r>
+        <w:t xml:space="preserve"> and word sense disambiguation</w:t>
+      </w:r>
+      <w:r>
+        <w:t xml:space="preserve"> [2</w:t>
+      </w:r>
+      <w:r>
+        <w:t>5</w:t>
+      </w:r>
+      <w:r>
+        <w:t>]</w:t>
+      </w:r>
+      <w:r>
+        <w:t xml:space="preserve">. </w:t>
+      </w:r>
+    </w:p>
+    <w:p>
+      <w:pPr>
+        <w:spacing w:line="360" w:lineRule="auto"/>
+      </w:pPr>
+      <w:proofErr w:type="spellStart"/>
+      <w:r>
+        <w:t>DeBERTa</w:t>
+      </w:r>
+      <w:proofErr w:type="spellEnd"/>
+      <w:r>
+        <w:t xml:space="preserve"> </w:t>
+      </w:r>
+      <w:r>
+        <w:t>has been</w:t>
+      </w:r>
+      <w:r>
+        <w:t xml:space="preserve"> selected </w:t>
+      </w:r>
+      <w:r>
+        <w:t>to form the</w:t>
+      </w:r>
+      <w:r>
+        <w:t xml:space="preserve"> core component </w:t>
+      </w:r>
+      <w:r>
+        <w:t>in the essay processing pipeline</w:t>
+      </w:r>
+      <w:r>
+        <w:t xml:space="preserve"> for </w:t>
+      </w:r>
+      <w:proofErr w:type="spellStart"/>
+      <w:r>
+        <w:t>BrainPower</w:t>
+      </w:r>
+      <w:proofErr w:type="spellEnd"/>
+      <w:r>
+        <w:t xml:space="preserve">, </w:t>
+      </w:r>
+      <w:r>
+        <w:t xml:space="preserve">serving </w:t>
+      </w:r>
+      <w:r>
+        <w:t>as</w:t>
+      </w:r>
+      <w:r>
+        <w:t xml:space="preserve"> the final step before the end user receives a breakdown of how the traits are scored</w:t>
+      </w:r>
+      <w:r>
+        <w:t xml:space="preserve">. </w:t>
+      </w:r>
+      <w:r>
+        <w:t xml:space="preserve"> This </w:t>
+      </w:r>
+      <w:r>
+        <w:t>decision</w:t>
+      </w:r>
+      <w:r>
+        <w:t xml:space="preserve"> </w:t>
+      </w:r>
+      <w:r>
+        <w:t xml:space="preserve">is based on empirical research that shows </w:t>
+      </w:r>
+      <w:r>
+        <w:t xml:space="preserve">it outperforms other </w:t>
+      </w:r>
+      <w:r>
+        <w:t>state-of-the-art models, even</w:t>
+      </w:r>
+      <w:r>
+        <w:t xml:space="preserve"> when data is scarce </w:t>
+      </w:r>
+      <w:r>
+        <w:t>and</w:t>
+      </w:r>
+      <w:r>
+        <w:t xml:space="preserve"> it</w:t>
+      </w:r>
+      <w:r>
+        <w:t xml:space="preserve"> has </w:t>
+      </w:r>
+      <w:r>
+        <w:t xml:space="preserve">also </w:t>
+      </w:r>
+      <w:r>
+        <w:t>surpassed human scorers on established benchmarks</w:t>
+      </w:r>
+      <w:r>
+        <w:t>, making it</w:t>
+      </w:r>
+      <w:r>
+        <w:t xml:space="preserve"> more </w:t>
+      </w:r>
+      <w:r>
+        <w:t>suitable for</w:t>
+      </w:r>
+      <w:r>
+        <w:t xml:space="preserve"> </w:t>
       </w:r>
       <w:r>
         <w:t xml:space="preserve">the </w:t>
       </w:r>
       <w:r>
-        <w:t>GPT model was applied to open-ended, domain</w:t>
+        <w:t>AES</w:t>
+      </w:r>
+      <w:r>
+        <w:t xml:space="preserve"> task</w:t>
+      </w:r>
+      <w:r>
+        <w:t xml:space="preserve">.  </w:t>
+      </w:r>
+      <w:proofErr w:type="spellStart"/>
+      <w:r>
+        <w:t>DeBERTa</w:t>
+      </w:r>
+      <w:proofErr w:type="spellEnd"/>
+      <w:r>
+        <w:t xml:space="preserve"> is also freely available from the Hugging</w:t>
+      </w:r>
+      <w:r>
+        <w:t xml:space="preserve"> F</w:t>
+      </w:r>
+      <w:r>
+        <w:t xml:space="preserve">ace </w:t>
+      </w:r>
+      <w:r>
+        <w:t>platform</w:t>
+      </w:r>
+      <w:r>
+        <w:t xml:space="preserve"> and offered under the MIT licence, facilitating freedom of modification and reproducibility.</w:t>
+      </w:r>
+    </w:p>
+    <w:p>
+      <w:pPr>
+        <w:spacing w:line="360" w:lineRule="auto"/>
+        <w:rPr>
+          <w:b/>
+          <w:bCs/>
+        </w:rPr>
+      </w:pPr>
+      <w:r>
+        <w:rPr>
+          <w:b/>
+          <w:bCs/>
+        </w:rPr>
+        <w:t>Limitations of OCR</w:t>
+      </w:r>
+    </w:p>
+    <w:p>
+      <w:pPr>
+        <w:spacing w:line="360" w:lineRule="auto"/>
+      </w:pPr>
+      <w:r>
+        <w:t xml:space="preserve">The </w:t>
+      </w:r>
+      <w:r>
+        <w:t>accuracy</w:t>
+      </w:r>
+      <w:r>
+        <w:t xml:space="preserve"> of OCR models </w:t>
+      </w:r>
+      <w:r>
+        <w:t xml:space="preserve">in recognizing text from images depends on the </w:t>
+      </w:r>
+      <w:r>
+        <w:t xml:space="preserve">quality of </w:t>
+      </w:r>
+      <w:r>
+        <w:t>its input image</w:t>
+      </w:r>
+      <w:r>
+        <w:t xml:space="preserve">. </w:t>
+      </w:r>
+      <w:r>
+        <w:t>High quality images have clear, uncluttered text</w:t>
+      </w:r>
+      <w:r>
+        <w:t xml:space="preserve">, </w:t>
+      </w:r>
+      <w:r>
+        <w:t xml:space="preserve">no </w:t>
+      </w:r>
+      <w:r>
+        <w:t xml:space="preserve">background noise </w:t>
+      </w:r>
+      <w:r>
+        <w:t>(</w:t>
+      </w:r>
+      <w:r>
+        <w:t>such as smudges</w:t>
+      </w:r>
+      <w:r>
+        <w:t>) and are captured in well-lit environments</w:t>
+      </w:r>
+      <w:r>
+        <w:t>. Most classroom environments</w:t>
+      </w:r>
+      <w:r>
+        <w:t xml:space="preserve">, however, </w:t>
+      </w:r>
+      <w:r>
+        <w:t xml:space="preserve">do not provide </w:t>
+      </w:r>
+      <w:r>
+        <w:t xml:space="preserve">all </w:t>
+      </w:r>
+      <w:r>
+        <w:t>these conditions.</w:t>
+      </w:r>
+      <w:r>
+        <w:t xml:space="preserve"> </w:t>
+      </w:r>
+      <w:r>
+        <w:t xml:space="preserve"> Furthermore,</w:t>
+      </w:r>
+      <w:r>
+        <w:t xml:space="preserve"> </w:t>
+      </w:r>
+      <w:r>
+        <w:t xml:space="preserve">quality of images </w:t>
+      </w:r>
+      <w:r>
+        <w:t>is determined by the</w:t>
+      </w:r>
+      <w:r>
+        <w:t xml:space="preserve"> </w:t>
+      </w:r>
+      <w:r>
+        <w:t>photographer’s ability to hold the camera steady and</w:t>
+      </w:r>
+      <w:r>
+        <w:t xml:space="preserve"> the quality of </w:t>
+      </w:r>
+      <w:r>
+        <w:t xml:space="preserve">the </w:t>
+      </w:r>
+      <w:r>
+        <w:t xml:space="preserve">camera </w:t>
+      </w:r>
+      <w:r>
+        <w:t>used to capture the image</w:t>
+      </w:r>
+      <w:r>
+        <w:t xml:space="preserve">. </w:t>
+      </w:r>
+      <w:r>
+        <w:t xml:space="preserve">Consequently, selection of an appropriate model </w:t>
+      </w:r>
+      <w:r>
+        <w:t xml:space="preserve">is </w:t>
+      </w:r>
+      <w:r>
+        <w:t>critical</w:t>
+      </w:r>
+      <w:r>
+        <w:t xml:space="preserve"> to</w:t>
+      </w:r>
+      <w:r>
+        <w:t xml:space="preserve"> </w:t>
+      </w:r>
+      <w:r>
+        <w:t xml:space="preserve">preventing </w:t>
+      </w:r>
+      <w:r>
+        <w:t xml:space="preserve">errors </w:t>
+      </w:r>
+      <w:proofErr w:type="gramStart"/>
+      <w:r>
+        <w:t xml:space="preserve">from </w:t>
+      </w:r>
+      <w:r>
+        <w:t xml:space="preserve"> </w:t>
+      </w:r>
+      <w:r>
+        <w:t>propagate</w:t>
+      </w:r>
+      <w:proofErr w:type="gramEnd"/>
+      <w:r>
+        <w:t xml:space="preserve"> through the pipeline</w:t>
+      </w:r>
+      <w:r>
+        <w:t xml:space="preserve"> as errors</w:t>
+      </w:r>
+      <w:r>
+        <w:t xml:space="preserve"> fed into the core (</w:t>
+      </w:r>
+      <w:proofErr w:type="spellStart"/>
+      <w:r>
+        <w:t>DeBERTa</w:t>
+      </w:r>
+      <w:proofErr w:type="spellEnd"/>
+      <w:r>
+        <w:t xml:space="preserve">) will </w:t>
+      </w:r>
+      <w:r>
+        <w:t>degrade</w:t>
+      </w:r>
+      <w:r>
+        <w:t xml:space="preserve"> its scoring accuracy. </w:t>
+      </w:r>
+      <w:r>
+        <w:t xml:space="preserve"> </w:t>
+      </w:r>
+    </w:p>
+    <w:p>
+      <w:pPr>
+        <w:spacing w:line="360" w:lineRule="auto"/>
+      </w:pPr>
+      <w:r>
+        <w:t xml:space="preserve">According to </w:t>
+      </w:r>
+      <w:r>
+        <w:t>[26]</w:t>
+      </w:r>
+      <w:r>
+        <w:t>,</w:t>
+      </w:r>
+      <w:r>
+        <w:t xml:space="preserve"> </w:t>
+      </w:r>
+      <w:r>
+        <w:t xml:space="preserve">Tr-OCR </w:t>
+      </w:r>
+      <w:r>
+        <w:t>maintains impressive performance even on documents that are deformed, multilingual, or degraded</w:t>
+      </w:r>
+      <w:r>
+        <w:t xml:space="preserve">. </w:t>
+      </w:r>
+      <w:r>
+        <w:t xml:space="preserve">However, </w:t>
+      </w:r>
+      <w:r>
+        <w:t>Tr-OCR’s performance</w:t>
+      </w:r>
+      <w:r>
+        <w:t xml:space="preserve"> without</w:t>
+      </w:r>
+      <w:r>
+        <w:t xml:space="preserve"> fine-tuning for line</w:t>
       </w:r>
       <w:r>
         <w:t>-</w:t>
       </w:r>
       <w:r>
-        <w:t xml:space="preserve">specific questions. The model struggled to provide equitable partial credit, a pedagogical necessity that often requires subtle contextual understanding and inference of student intent – qualities that go beyond simple semantic matching. </w:t>
-      </w:r>
-      <w:r>
-        <w:t xml:space="preserve">This again shows how the model’s performance is a direct reflection on the quality, diversity and quantity of training data. </w:t>
-      </w:r>
-      <w:r>
-        <w:t xml:space="preserve">[21] </w:t>
-      </w:r>
-      <w:r>
-        <w:t>cited</w:t>
-      </w:r>
-      <w:r>
-        <w:t xml:space="preserve"> three studies </w:t>
-      </w:r>
-      <w:r>
-        <w:t>that showed</w:t>
-      </w:r>
-      <w:r>
-        <w:t xml:space="preserve"> the limitations of ChatGPT as an AES tool. The results indicate</w:t>
-      </w:r>
-      <w:r>
-        <w:t>d</w:t>
-      </w:r>
-      <w:r>
-        <w:t xml:space="preserve"> that ChatGPT often scores lower </w:t>
-      </w:r>
-      <w:r>
-        <w:t xml:space="preserve">than human scorers </w:t>
-      </w:r>
-      <w:r>
-        <w:t xml:space="preserve">and its evaluation is inconsistent due to variations in its scoring mechanism, training data, model updates and ingrained randomness. Additionally, the consistency of ChatGPT’s scores over multiple evaluations was low, indicating variability and raising concerns about its reliability. </w:t>
-      </w:r>
-    </w:p>
-    <w:p>
-      <w:pPr>
-        <w:spacing w:line="360" w:lineRule="auto"/>
-      </w:pPr>
-      <w:r>
-        <w:t xml:space="preserve">Therefore, to </w:t>
-      </w:r>
-      <w:r>
-        <w:t>provide</w:t>
-      </w:r>
-      <w:r>
-        <w:t xml:space="preserve"> a more granular </w:t>
-      </w:r>
-      <w:r>
-        <w:t xml:space="preserve">essay </w:t>
-      </w:r>
-      <w:r>
-        <w:t xml:space="preserve">evaluation and overcome the limitations of </w:t>
-      </w:r>
-      <w:r>
-        <w:t>data availability</w:t>
-      </w:r>
-      <w:r>
-        <w:t>, this research will implement a transformer model in the essay processing pipeline as the final step before the end user receives a breakdown of how the traits are scored</w:t>
-      </w:r>
-      <w:r>
-        <w:t xml:space="preserve">. </w:t>
+        <w:t>level detection</w:t>
       </w:r>
       <w:r>
         <w:t xml:space="preserve"> </w:t>
       </w:r>
-      <w:proofErr w:type="spellStart"/>
-      <w:r>
-        <w:t>DeBERTa</w:t>
-      </w:r>
-      <w:proofErr w:type="spellEnd"/>
-      <w:r>
-        <w:t xml:space="preserve"> (Decoding enhanced BERT with disentanglement attention) </w:t>
-      </w:r>
-      <w:r>
-        <w:t>is an improvement of</w:t>
-      </w:r>
-      <w:r>
-        <w:t xml:space="preserve"> previous state-of-the-art pre-trained </w:t>
-      </w:r>
-      <w:r>
-        <w:t xml:space="preserve">transformer </w:t>
-      </w:r>
-      <w:r>
-        <w:t xml:space="preserve">models </w:t>
-      </w:r>
-      <w:r>
-        <w:t>such as</w:t>
+      <w:r>
+        <w:t>is not opti</w:t>
+      </w:r>
+      <w:r>
+        <w:t>mal</w:t>
+      </w:r>
+      <w:r>
+        <w:t xml:space="preserve">.  [26] </w:t>
+      </w:r>
+      <w:r>
+        <w:t xml:space="preserve">states </w:t>
+      </w:r>
+      <w:r>
+        <w:t xml:space="preserve">that </w:t>
+      </w:r>
+      <w:r>
+        <w:t>the quality of the input segments has a significant impact on how well it performs. The outcome is frequently degraded when entire pages or unstructured text sections are fed into the algorithm</w:t>
+      </w:r>
+      <w:r>
+        <w:t xml:space="preserve"> [26]</w:t>
+      </w:r>
+      <w:r>
+        <w:t>.</w:t>
       </w:r>
       <w:r>
         <w:t xml:space="preserve"> </w:t>
       </w:r>
-      <w:proofErr w:type="spellStart"/>
-      <w:r>
-        <w:t>RoBERTa</w:t>
-      </w:r>
-      <w:proofErr w:type="spellEnd"/>
+      <w:r>
+        <w:t>Tr</w:t>
+      </w:r>
+      <w:r>
+        <w:t>-</w:t>
+      </w:r>
+      <w:r>
+        <w:t xml:space="preserve">OCR has been used by </w:t>
+      </w:r>
+      <w:r>
+        <w:t>several</w:t>
+      </w:r>
       <w:r>
         <w:t xml:space="preserve"> </w:t>
       </w:r>
       <w:r>
-        <w:t>[24]</w:t>
-      </w:r>
-      <w:r>
-        <w:t>. Unlike it</w:t>
-      </w:r>
-      <w:r>
-        <w:t>s predecessor</w:t>
+        <w:t xml:space="preserve">researchers on government, administrative, and </w:t>
+      </w:r>
+      <w:r>
+        <w:lastRenderedPageBreak/>
+        <w:t>historical</w:t>
+      </w:r>
+      <w:r>
+        <w:t xml:space="preserve"> </w:t>
+      </w:r>
+      <w:r>
+        <w:t>archival datasets, and they have found that it significantly</w:t>
+      </w:r>
+      <w:r>
+        <w:t xml:space="preserve"> </w:t>
+      </w:r>
+      <w:r>
+        <w:t>increases recognition accuracy, especially when the model is</w:t>
+      </w:r>
+      <w:r>
+        <w:t xml:space="preserve"> </w:t>
+      </w:r>
+      <w:r>
+        <w:t>trained at line level</w:t>
+      </w:r>
+      <w:r>
+        <w:t xml:space="preserve"> [26].</w:t>
+      </w:r>
+      <w:r>
+        <w:t xml:space="preserve"> </w:t>
+      </w:r>
+    </w:p>
+    <w:p>
+      <w:pPr>
+        <w:spacing w:line="360" w:lineRule="auto"/>
+      </w:pPr>
+      <w:r>
+        <w:t>According to [26]</w:t>
       </w:r>
       <w:r>
         <w:t>,</w:t>
       </w:r>
       <w:r>
+        <w:t xml:space="preserve"> since Tr-OCR is designed for single-line text detection </w:t>
+      </w:r>
+      <w:r>
+        <w:t>i</w:t>
+      </w:r>
+      <w:r>
+        <w:t>t failed to extract text from full-page or paragraph</w:t>
+      </w:r>
+      <w:r>
+        <w:t>-</w:t>
+      </w:r>
+      <w:r>
+        <w:t>level images. Accuracy in extracting text from single line inputs remained around 50-60%</w:t>
+      </w:r>
+      <w:r>
+        <w:t xml:space="preserve"> [26]</w:t>
+      </w:r>
+      <w:r>
+        <w:t>. L</w:t>
+      </w:r>
+      <w:r>
+        <w:t>ine detection and</w:t>
+      </w:r>
+      <w:r>
         <w:t xml:space="preserve"> </w:t>
       </w:r>
       <w:r>
-        <w:t>BERT</w:t>
-      </w:r>
-      <w:r>
-        <w:t>, it uses</w:t>
-      </w:r>
-      <w:r>
-        <w:t xml:space="preserve"> two novel techniques: a disentanglement attention mechanism and an enhanced mask decoder. </w:t>
-      </w:r>
-      <w:r>
-        <w:t>DeBERTa</w:t>
+        <w:t>segmentation have thus become crucial preprocessing stages</w:t>
+      </w:r>
+      <w:r>
+        <w:t xml:space="preserve"> [26]</w:t>
+      </w:r>
+      <w:r>
+        <w:t>.</w:t>
+      </w:r>
+      <w:r>
+        <w:t xml:space="preserve"> </w:t>
+      </w:r>
+      <w:r>
+        <w:t>[26] used D</w:t>
+      </w:r>
+      <w:r>
+        <w:t>etectron</w:t>
+      </w:r>
+      <w:r>
+        <w:t xml:space="preserve">2 a line identification model and </w:t>
+      </w:r>
+      <w:proofErr w:type="spellStart"/>
+      <w:r>
+        <w:t>SymSpell</w:t>
+      </w:r>
+      <w:proofErr w:type="spellEnd"/>
+      <w:r>
+        <w:t xml:space="preserve"> to capture every line for post-OCR adjustments</w:t>
       </w:r>
       <w:r>
         <w:t>,</w:t>
       </w:r>
       <w:r>
+        <w:t xml:space="preserve"> respectively. The results showed </w:t>
+      </w:r>
+      <w:r>
+        <w:t>that the</w:t>
+      </w:r>
+      <w:r>
+        <w:t xml:space="preserve"> word and character error rates were greatly </w:t>
+      </w:r>
+      <w:r>
+        <w:t>reduced</w:t>
+      </w:r>
+      <w:r>
+        <w:t xml:space="preserve"> after the model was fine-tuned [26].  </w:t>
+      </w:r>
+    </w:p>
+    <w:p>
+      <w:pPr>
+        <w:spacing w:line="360" w:lineRule="auto"/>
+      </w:pPr>
+      <w:r>
+        <w:t xml:space="preserve">It is </w:t>
+      </w:r>
+      <w:r>
+        <w:t>for these reasons,</w:t>
+      </w:r>
+      <w:r>
+        <w:t xml:space="preserve"> along with the findings of [13]</w:t>
+      </w:r>
+      <w:r>
         <w:t xml:space="preserve"> </w:t>
       </w:r>
       <w:r>
-        <w:t xml:space="preserve">after training on 78GB of data, outperformed </w:t>
-      </w:r>
-      <w:proofErr w:type="spellStart"/>
-      <w:r>
-        <w:t>RoBERTa</w:t>
-      </w:r>
-      <w:proofErr w:type="spellEnd"/>
+        <w:t>discussed previously</w:t>
+      </w:r>
+      <w:r>
+        <w:t xml:space="preserve">, that Tr-OCR has been selected as the OCR input component </w:t>
+      </w:r>
+      <w:r>
+        <w:t xml:space="preserve">for </w:t>
+      </w:r>
+      <w:proofErr w:type="spellStart"/>
+      <w:r>
+        <w:t>BrainPower</w:t>
+      </w:r>
+      <w:proofErr w:type="spellEnd"/>
+      <w:r>
+        <w:t>.</w:t>
+      </w:r>
+      <w:r>
+        <w:t xml:space="preserve"> </w:t>
+      </w:r>
+      <w:r>
+        <w:t>However</w:t>
+      </w:r>
       <w:r>
         <w:t>,</w:t>
       </w:r>
       <w:r>
-        <w:t xml:space="preserve"> which trained on 160GB</w:t>
-      </w:r>
-      <w:r>
-        <w:t xml:space="preserve"> of data</w:t>
-      </w:r>
-      <w:r>
-        <w:t>.</w:t>
-      </w:r>
-    </w:p>
-    <w:p>
-      <w:r>
-        <w:t>Unlike BERT where each word in the input layer is represented using</w:t>
+        <w:t xml:space="preserve"> only</w:t>
       </w:r>
       <w:r>
         <w:t xml:space="preserve"> </w:t>
       </w:r>
       <w:r>
-        <w:t>a vector which is the sum of its word (content) embedding and position embedding, each word in</w:t>
-      </w:r>
-      <w:r>
-        <w:t xml:space="preserve"> </w:t>
-      </w:r>
-      <w:proofErr w:type="spellStart"/>
-      <w:r>
-        <w:t>DeBERTa</w:t>
-      </w:r>
-      <w:proofErr w:type="spellEnd"/>
-      <w:r>
-        <w:t xml:space="preserve"> is represented using two vectors that encode its content and position, respectively, and the</w:t>
-      </w:r>
-      <w:r>
-        <w:t xml:space="preserve"> </w:t>
-      </w:r>
-      <w:r>
-        <w:t>attention weights among words are computed using disentangled matrices based on their contents</w:t>
-      </w:r>
-      <w:r>
-        <w:t xml:space="preserve"> </w:t>
-      </w:r>
-      <w:r>
-        <w:t>and relative positions, respectively. This is motivated by the observation that the attention weight of a</w:t>
-      </w:r>
-      <w:r>
-        <w:t xml:space="preserve"> </w:t>
-      </w:r>
-      <w:r>
-        <w:t>word pair depends on not only their contents but their relative positions.</w:t>
-      </w:r>
-      <w:r>
-        <w:t xml:space="preserve"> </w:t>
-      </w:r>
-      <w:r>
-        <w:rPr>
+        <w:t xml:space="preserve">the pretrained model will be incorporated </w:t>
+      </w:r>
+      <w:r>
+        <w:t>as</w:t>
+      </w:r>
+      <w:r>
+        <w:t xml:space="preserve"> fine-tuning the model is beyond the </w:t>
+      </w:r>
+      <w:r>
+        <w:t>scope of</w:t>
+      </w:r>
+      <w:r>
+        <w:t xml:space="preserve"> this research</w:t>
+      </w:r>
+      <w:r>
+        <w:t>. This presents a limitation of the system inherent in Tr-</w:t>
+      </w:r>
+      <w:r>
+        <w:t>OCR; however,</w:t>
+      </w:r>
+      <w:r>
+        <w:t xml:space="preserve"> implementing line-level segmentation is not a trivial task hence it will be undertaken in a future iteration of the system.  </w:t>
+      </w:r>
+      <w:r>
+        <w:t xml:space="preserve">Page-level segmentation, which is provided in the pre-trained model, is sufficient for the scope of this research. </w:t>
+      </w:r>
+    </w:p>
+    <w:p>
+      <w:pPr>
+        <w:spacing w:line="360" w:lineRule="auto"/>
+      </w:pPr>
+      <w:r>
+        <w:t>Limitations of ASR (STT)</w:t>
+      </w:r>
+    </w:p>
+    <w:p>
+      <w:pPr>
+        <w:spacing w:line="360" w:lineRule="auto"/>
+      </w:pPr>
+      <w:r>
+        <w:t>[19] While the model achieves competitive performance, it still exhibits word error rates that may not meet the expectations for all applications, particularly in noisy environments with low-quality audio</w:t>
+      </w:r>
+    </w:p>
+    <w:p>
+      <w:pPr>
+        <w:spacing w:line="360" w:lineRule="auto"/>
+      </w:pPr>
+    </w:p>
+    <w:p>
+      <w:pPr>
+        <w:spacing w:line="360" w:lineRule="auto"/>
+      </w:pPr>
+      <w:r>
+        <w:t>Limitations of Multimodal Integrated Systems</w:t>
+      </w:r>
+    </w:p>
+    <w:p>
+      <w:pPr>
+        <w:spacing w:line="360" w:lineRule="auto"/>
+      </w:pPr>
+    </w:p>
+    <w:p>
+      <w:pPr>
+        <w:rPr>
+          <w:b/>
+          <w:bCs/>
           <w:highlight w:val="yellow"/>
         </w:rPr>
-        <w:t xml:space="preserve">Explain why Roberta is superior explain its </w:t>
-      </w:r>
-      <w:proofErr w:type="gramStart"/>
-      <w:r>
-        <w:rPr>
+      </w:pPr>
+      <w:r>
+        <w:rPr>
+          <w:b/>
+          <w:bCs/>
           <w:highlight w:val="yellow"/>
         </w:rPr>
-        <w:t>two  techniques</w:t>
-      </w:r>
-      <w:proofErr w:type="gramEnd"/>
-      <w:r>
-        <w:rPr>
+        <w:t>One More Section I Think You Should Add</w:t>
+      </w:r>
+    </w:p>
+    <w:p>
+      <w:pPr>
+        <w:rPr>
+          <w:b/>
+          <w:bCs/>
           <w:highlight w:val="yellow"/>
         </w:rPr>
-        <w:t>.</w:t>
-      </w:r>
-      <w:r>
-        <w:t xml:space="preserve"> </w:t>
-      </w:r>
-      <w:r>
-        <w:br w:type="page"/>
-      </w:r>
-    </w:p>
-    <w:p>
-      <w:pPr>
-        <w:spacing w:line="360" w:lineRule="auto"/>
-      </w:pPr>
-      <w:r>
+      </w:pPr>
+      <w:r>
+        <w:rPr>
+          <w:b/>
+          <w:bCs/>
+          <w:highlight w:val="yellow"/>
+        </w:rPr>
+        <w:t>Limitations of Multimodal Integrated Systems</w:t>
+      </w:r>
+    </w:p>
+    <w:p>
+      <w:pPr>
+        <w:rPr>
+          <w:highlight w:val="yellow"/>
+        </w:rPr>
+      </w:pPr>
+      <w:r>
+        <w:rPr>
+          <w:highlight w:val="yellow"/>
+        </w:rPr>
+        <w:t>This section would naturally precede your mitigation plan.</w:t>
+      </w:r>
+    </w:p>
+    <w:p>
+      <w:pPr>
+        <w:rPr>
+          <w:highlight w:val="yellow"/>
+        </w:rPr>
+      </w:pPr>
+      <w:r>
+        <w:rPr>
+          <w:highlight w:val="yellow"/>
+        </w:rPr>
+        <w:t>You could discuss:</w:t>
+      </w:r>
+    </w:p>
+    <w:p>
+      <w:pPr>
+        <w:rPr>
+          <w:b/>
+          <w:bCs/>
+          <w:highlight w:val="yellow"/>
+        </w:rPr>
+      </w:pPr>
+      <w:r>
+        <w:rPr>
+          <w:b/>
+          <w:bCs/>
+          <w:highlight w:val="yellow"/>
+        </w:rPr>
+        <w:t>Error Propagation</w:t>
+      </w:r>
+    </w:p>
+    <w:p>
+      <w:pPr>
+        <w:rPr>
+          <w:highlight w:val="yellow"/>
+        </w:rPr>
+      </w:pPr>
+      <w:r>
+        <w:rPr>
+          <w:highlight w:val="yellow"/>
+        </w:rPr>
         <w:lastRenderedPageBreak/>
-        <w:t xml:space="preserve"> </w:t>
-      </w:r>
-      <w:proofErr w:type="spellStart"/>
-      <w:r>
-        <w:t>DeBERTa</w:t>
-      </w:r>
-      <w:proofErr w:type="spellEnd"/>
-      <w:r>
-        <w:t xml:space="preserve"> also</w:t>
-      </w:r>
-      <w:r>
-        <w:t xml:space="preserve"> surpassed human scoring on the </w:t>
-      </w:r>
-      <w:proofErr w:type="spellStart"/>
-      <w:r>
-        <w:t>S</w:t>
-      </w:r>
-      <w:r>
-        <w:t>uper</w:t>
-      </w:r>
-      <w:r>
-        <w:t>GLUE</w:t>
-      </w:r>
-      <w:proofErr w:type="spellEnd"/>
-      <w:r>
-        <w:t xml:space="preserve"> benchmarks for the first time since 202</w:t>
-      </w:r>
-      <w:r>
-        <w:t>1</w:t>
-      </w:r>
-      <w:r>
-        <w:t xml:space="preserve"> [24]</w:t>
-      </w:r>
-      <w:r>
-        <w:t>. This benchmark includes a wide range of task</w:t>
-      </w:r>
-      <w:r>
-        <w:t>s</w:t>
-      </w:r>
-      <w:r>
-        <w:t xml:space="preserve"> such as question answering, natural language inference</w:t>
-      </w:r>
-      <w:r>
-        <w:t>,</w:t>
-      </w:r>
-      <w:r>
-        <w:t xml:space="preserve"> and word sense disambiguation</w:t>
-      </w:r>
-      <w:r>
-        <w:t xml:space="preserve"> [24]</w:t>
-      </w:r>
-      <w:r>
-        <w:t xml:space="preserve">. </w:t>
-      </w:r>
-      <w:proofErr w:type="spellStart"/>
-      <w:r>
-        <w:t>DeBERTa</w:t>
-      </w:r>
-      <w:proofErr w:type="spellEnd"/>
-      <w:r>
-        <w:t xml:space="preserve"> is also freely available from the </w:t>
-      </w:r>
-      <w:proofErr w:type="spellStart"/>
-      <w:r>
-        <w:t>huggingface</w:t>
-      </w:r>
-      <w:proofErr w:type="spellEnd"/>
-      <w:r>
-        <w:t xml:space="preserve"> website and offered under the MIT licence</w:t>
-      </w:r>
-      <w:r>
-        <w:t>,</w:t>
-      </w:r>
-      <w:r>
-        <w:t xml:space="preserve"> facilitating freedom of modification and reproducibility.</w:t>
-      </w:r>
-      <w:r>
-        <w:t xml:space="preserve"> </w:t>
-      </w:r>
-      <w:proofErr w:type="spellStart"/>
-      <w:r>
-        <w:t>DeBERTa</w:t>
-      </w:r>
-      <w:proofErr w:type="spellEnd"/>
-      <w:r>
-        <w:t xml:space="preserve"> was selected </w:t>
-      </w:r>
-      <w:r>
-        <w:t>to form the</w:t>
-      </w:r>
-      <w:r>
-        <w:t xml:space="preserve"> core component for th</w:t>
-      </w:r>
-      <w:r>
-        <w:t>is</w:t>
-      </w:r>
-      <w:r>
-        <w:t xml:space="preserve"> AES system over more popular </w:t>
-      </w:r>
-      <w:r>
-        <w:t xml:space="preserve">candidate </w:t>
-      </w:r>
-      <w:r>
-        <w:t xml:space="preserve">models like BERT, </w:t>
-      </w:r>
-      <w:proofErr w:type="spellStart"/>
-      <w:r>
-        <w:t>RoBERTa</w:t>
-      </w:r>
-      <w:proofErr w:type="spellEnd"/>
-      <w:r>
-        <w:t xml:space="preserve"> and GPT 4</w:t>
-      </w:r>
-      <w:r>
-        <w:t>. This is because, i</w:t>
-      </w:r>
-      <w:r>
-        <w:t>ts</w:t>
-      </w:r>
-      <w:r>
-        <w:t xml:space="preserve"> performance is not as strongly coupled with the size of the training data as </w:t>
-      </w:r>
-      <w:r>
-        <w:t>these other models</w:t>
-      </w:r>
-      <w:r>
-        <w:t xml:space="preserve"> and has even surpassed human scorers on established benchmarks</w:t>
-      </w:r>
-      <w:r>
-        <w:t>, making it</w:t>
-      </w:r>
-      <w:r>
-        <w:t xml:space="preserve"> more suitable for </w:t>
-      </w:r>
-      <w:r>
-        <w:t xml:space="preserve">the </w:t>
-      </w:r>
-      <w:r>
-        <w:t>AES</w:t>
-      </w:r>
-      <w:r>
-        <w:t xml:space="preserve"> task</w:t>
-      </w:r>
-      <w:r>
-        <w:t xml:space="preserve">, to </w:t>
-      </w:r>
-      <w:r>
-        <w:t xml:space="preserve">compensate for </w:t>
-      </w:r>
-      <w:r>
-        <w:t>data</w:t>
-      </w:r>
-      <w:r>
-        <w:t>set</w:t>
-      </w:r>
-      <w:r>
-        <w:t xml:space="preserve"> limit</w:t>
-      </w:r>
-      <w:r>
-        <w:t>ation</w:t>
-      </w:r>
-      <w:r>
-        <w:t xml:space="preserve"> </w:t>
-      </w:r>
-      <w:r>
-        <w:t>discussed earlier</w:t>
-      </w:r>
-      <w:r>
-        <w:t xml:space="preserve">.  </w:t>
-      </w:r>
-    </w:p>
-    <w:p>
-      <w:pPr>
-        <w:spacing w:line="360" w:lineRule="auto"/>
-      </w:pPr>
-    </w:p>
-    <w:p>
-      <w:pPr>
-        <w:spacing w:line="360" w:lineRule="auto"/>
-      </w:pPr>
-      <w:r>
-        <w:t>Limitations of OCR</w:t>
-      </w:r>
-    </w:p>
-    <w:p>
-      <w:pPr>
-        <w:spacing w:line="360" w:lineRule="auto"/>
-      </w:pPr>
-    </w:p>
-    <w:p>
-      <w:pPr>
-        <w:spacing w:line="360" w:lineRule="auto"/>
-      </w:pPr>
-    </w:p>
-    <w:p>
-      <w:pPr>
-        <w:spacing w:line="360" w:lineRule="auto"/>
-      </w:pPr>
-      <w:r>
-        <w:t>Limitations of ASR (STT)</w:t>
-      </w:r>
-    </w:p>
-    <w:p>
-      <w:pPr>
-        <w:spacing w:line="360" w:lineRule="auto"/>
-      </w:pPr>
-    </w:p>
-    <w:p>
-      <w:pPr>
-        <w:pStyle w:val="ListParagraph"/>
-        <w:spacing w:line="360" w:lineRule="auto"/>
-      </w:pPr>
+        <w:t>Mistakes in OCR and ASR are inherited by the AES model.</w:t>
+      </w:r>
     </w:p>
     <w:p>
       <w:pPr>
@@ -3317,37 +3984,37 @@
           <w:bCs/>
           <w:highlight w:val="yellow"/>
         </w:rPr>
-        <w:t>One More Section I Think You Should Add</w:t>
-      </w:r>
-    </w:p>
-    <w:p>
-      <w:pPr>
-        <w:rPr>
-          <w:b/>
-          <w:bCs/>
+        <w:t>Increased System Complexity</w:t>
+      </w:r>
+    </w:p>
+    <w:p>
+      <w:pPr>
+        <w:rPr>
           <w:highlight w:val="yellow"/>
         </w:rPr>
       </w:pPr>
       <w:r>
         <w:rPr>
-          <w:b/>
-          <w:bCs/>
           <w:highlight w:val="yellow"/>
         </w:rPr>
-        <w:t>Limitations of Multimodal Integrated Systems</w:t>
-      </w:r>
-    </w:p>
-    <w:p>
-      <w:pPr>
-        <w:rPr>
+        <w:t>Integrating multiple models increases implementation complexity and maintenance requirements.</w:t>
+      </w:r>
+    </w:p>
+    <w:p>
+      <w:pPr>
+        <w:rPr>
+          <w:b/>
+          <w:bCs/>
           <w:highlight w:val="yellow"/>
         </w:rPr>
       </w:pPr>
       <w:r>
         <w:rPr>
+          <w:b/>
+          <w:bCs/>
           <w:highlight w:val="yellow"/>
         </w:rPr>
-        <w:t>This section would naturally precede your mitigation plan.</w:t>
+        <w:t>Computational Overhead</w:t>
       </w:r>
     </w:p>
     <w:p>
@@ -3360,97 +4027,6 @@
         <w:rPr>
           <w:highlight w:val="yellow"/>
         </w:rPr>
-        <w:t>You could discuss:</w:t>
-      </w:r>
-    </w:p>
-    <w:p>
-      <w:pPr>
-        <w:rPr>
-          <w:b/>
-          <w:bCs/>
-          <w:highlight w:val="yellow"/>
-        </w:rPr>
-      </w:pPr>
-      <w:r>
-        <w:rPr>
-          <w:b/>
-          <w:bCs/>
-          <w:highlight w:val="yellow"/>
-        </w:rPr>
-        <w:t>Error Propagation</w:t>
-      </w:r>
-    </w:p>
-    <w:p>
-      <w:pPr>
-        <w:rPr>
-          <w:highlight w:val="yellow"/>
-        </w:rPr>
-      </w:pPr>
-      <w:r>
-        <w:rPr>
-          <w:highlight w:val="yellow"/>
-        </w:rPr>
-        <w:t>Mistakes in OCR and ASR are inherited by the AES model.</w:t>
-      </w:r>
-    </w:p>
-    <w:p>
-      <w:pPr>
-        <w:rPr>
-          <w:b/>
-          <w:bCs/>
-          <w:highlight w:val="yellow"/>
-        </w:rPr>
-      </w:pPr>
-      <w:r>
-        <w:rPr>
-          <w:b/>
-          <w:bCs/>
-          <w:highlight w:val="yellow"/>
-        </w:rPr>
-        <w:t>Increased System Complexity</w:t>
-      </w:r>
-    </w:p>
-    <w:p>
-      <w:pPr>
-        <w:rPr>
-          <w:highlight w:val="yellow"/>
-        </w:rPr>
-      </w:pPr>
-      <w:r>
-        <w:rPr>
-          <w:highlight w:val="yellow"/>
-        </w:rPr>
-        <w:t>Integrating multiple models increases implementation complexity and maintenance requirements.</w:t>
-      </w:r>
-    </w:p>
-    <w:p>
-      <w:pPr>
-        <w:rPr>
-          <w:b/>
-          <w:bCs/>
-          <w:highlight w:val="yellow"/>
-        </w:rPr>
-      </w:pPr>
-      <w:r>
-        <w:rPr>
-          <w:b/>
-          <w:bCs/>
-          <w:highlight w:val="yellow"/>
-        </w:rPr>
-        <w:t>Computational Overhead</w:t>
-      </w:r>
-    </w:p>
-    <w:p>
-      <w:pPr>
-        <w:rPr>
-          <w:highlight w:val="yellow"/>
-        </w:rPr>
-      </w:pPr>
-      <w:r>
-        <w:rPr>
-          <w:highlight w:val="yellow"/>
-        </w:rPr>
-        <w:lastRenderedPageBreak/>
         <w:t>Running three models (</w:t>
       </w:r>
       <w:proofErr w:type="spellStart"/>
@@ -5544,6 +6120,124 @@
       <w:proofErr w:type="spellEnd"/>
       <w:r>
         <w:t>: 10.1145/3696230.3696256.</w:t>
+      </w:r>
+    </w:p>
+    <w:p>
+      <w:r>
+        <w:rPr>
+          <w:b/>
+          <w:bCs/>
+        </w:rPr>
+        <w:t>[</w:t>
+      </w:r>
+      <w:r>
+        <w:rPr>
+          <w:b/>
+          <w:bCs/>
+        </w:rPr>
+        <w:t>24</w:t>
+      </w:r>
+      <w:r>
+        <w:rPr>
+          <w:b/>
+          <w:bCs/>
+        </w:rPr>
+        <w:t>]</w:t>
+      </w:r>
+      <w:r>
+        <w:t xml:space="preserve"> Y. Wang, W. Qu, and X. Ye, “Selecting Between BERT and GPT for Text Classification in Political Science Research,” </w:t>
+      </w:r>
+      <w:proofErr w:type="spellStart"/>
+      <w:r>
+        <w:t>arXiv</w:t>
+      </w:r>
+      <w:proofErr w:type="spellEnd"/>
+      <w:r>
+        <w:t xml:space="preserve"> preprint arXiv:2411.05050, Nov. 2024. </w:t>
+      </w:r>
+      <w:proofErr w:type="spellStart"/>
+      <w:r>
+        <w:t>doi</w:t>
+      </w:r>
+      <w:proofErr w:type="spellEnd"/>
+      <w:r>
+        <w:t>: 10.48550/arXiv.2411.05050.</w:t>
+      </w:r>
+    </w:p>
+    <w:p>
+      <w:r>
+        <w:rPr>
+          <w:b/>
+          <w:bCs/>
+        </w:rPr>
+        <w:t>[</w:t>
+      </w:r>
+      <w:r>
+        <w:rPr>
+          <w:b/>
+          <w:bCs/>
+        </w:rPr>
+        <w:t>25</w:t>
+      </w:r>
+      <w:r>
+        <w:rPr>
+          <w:b/>
+          <w:bCs/>
+        </w:rPr>
+        <w:t>]</w:t>
+      </w:r>
+      <w:r>
+        <w:t xml:space="preserve"> P. He, X. Liu, J. Gao, and W. Chen, “</w:t>
+      </w:r>
+      <w:proofErr w:type="spellStart"/>
+      <w:r>
+        <w:t>DeBERTa</w:t>
+      </w:r>
+      <w:proofErr w:type="spellEnd"/>
+      <w:r>
+        <w:t>: Decoding-Enhanced BERT with Disentangled Attention,” in Proc. International Conference on Learning Representations (ICLR), 2021.</w:t>
+      </w:r>
+    </w:p>
+    <w:p>
+      <w:r>
+        <w:rPr>
+          <w:b/>
+          <w:bCs/>
+        </w:rPr>
+        <w:t>[</w:t>
+      </w:r>
+      <w:r>
+        <w:rPr>
+          <w:b/>
+          <w:bCs/>
+        </w:rPr>
+        <w:t>26</w:t>
+      </w:r>
+      <w:r>
+        <w:rPr>
+          <w:b/>
+          <w:bCs/>
+        </w:rPr>
+        <w:t>]</w:t>
+      </w:r>
+      <w:r>
+        <w:t xml:space="preserve"> A. K. Meghana, H. Gupta, and P. Dubey, “Enhanced Text Extraction from Low-Quality Legacy Documents Using </w:t>
+      </w:r>
+      <w:proofErr w:type="spellStart"/>
+      <w:r>
+        <w:t>TrOCR</w:t>
+      </w:r>
+      <w:proofErr w:type="spellEnd"/>
+      <w:r>
+        <w:t xml:space="preserve"> Assisted by Line Detection,” in Proc. 8th World Engineering Conference on Contemporary Technologies (WECON), 2025, </w:t>
+      </w:r>
+      <w:proofErr w:type="spellStart"/>
+      <w:r>
+        <w:t>doi</w:t>
+      </w:r>
+      <w:proofErr w:type="spellEnd"/>
+      <w:r>
+        <w:t>: 10.1109/WECON68556.2025.11414621.</w:t>
       </w:r>
     </w:p>
     <w:sectPr>

</xml_diff>

<commit_message>
Completed lit review, updated evaluation, design, feature prototype sections
</commit_message>
<xml_diff>
--- a/preliminary report/Final Project - Preliminary Report.docx
+++ b/preliminary report/Final Project - Preliminary Report.docx
@@ -2651,13 +2651,7 @@
         <w:t xml:space="preserve">ing </w:t>
       </w:r>
       <w:r>
-        <w:t>the ASAP and its</w:t>
-      </w:r>
-      <w:r>
-        <w:t xml:space="preserve"> extended version, ASAP++, </w:t>
-      </w:r>
-      <w:r>
-        <w:t xml:space="preserve">as both </w:t>
+        <w:t xml:space="preserve">the ASAP and its extended version, ASAP++, as both </w:t>
       </w:r>
       <w:r>
         <w:t>containing few</w:t>
@@ -2669,19 +2663,7 @@
         <w:t>+ adds</w:t>
       </w:r>
       <w:r>
-        <w:t xml:space="preserve"> trait-level </w:t>
-      </w:r>
-      <w:r>
-        <w:t>annotations but</w:t>
-      </w:r>
-      <w:r>
-        <w:t xml:space="preserve"> merges key content traits into a single</w:t>
-      </w:r>
-      <w:r>
-        <w:t xml:space="preserve"> </w:t>
-      </w:r>
-      <w:r>
-        <w:t>“CONTENT”</w:t>
+        <w:t xml:space="preserve"> trait-level annotations but merges key content traits into a single “CONTENT”</w:t>
       </w:r>
       <w:r>
         <w:t xml:space="preserve"> label, </w:t>
@@ -2693,25 +2675,13 @@
         <w:t xml:space="preserve"> granularity and interpretability</w:t>
       </w:r>
       <w:r>
-        <w:t xml:space="preserve">. </w:t>
-      </w:r>
-      <w:r>
-        <w:t>The TOEFL11 dataset</w:t>
+        <w:t>. The TOEFL11 dataset</w:t>
       </w:r>
       <w:r>
         <w:t>, similarly, uses</w:t>
       </w:r>
       <w:r>
-        <w:t xml:space="preserve"> only coarse-grained</w:t>
-      </w:r>
-      <w:r>
-        <w:t xml:space="preserve"> </w:t>
-      </w:r>
-      <w:r>
-        <w:t>proficiency labels (low / medium / high)</w:t>
-      </w:r>
-      <w:r>
-        <w:t xml:space="preserve">. </w:t>
+        <w:t xml:space="preserve"> only coarse-grained proficiency labels (low / medium / high). </w:t>
       </w:r>
       <w:r>
         <w:t xml:space="preserve">Thus, models trained on the TOEFL11 dataset will inherently produce results that are difficult to interpret due to the granularity of the training data. </w:t>
@@ -2877,43 +2847,25 @@
         <w:t>gives a specific example revealing</w:t>
       </w:r>
       <w:r>
-        <w:t xml:space="preserve"> a significant divergence in scoring accuracy when </w:t>
-      </w:r>
-      <w:r>
-        <w:t xml:space="preserve">the </w:t>
-      </w:r>
-      <w:r>
-        <w:t>GPT model was applied to open-ended, domain</w:t>
+        <w:t xml:space="preserve"> a significant divergence in scoring accuracy when the GPT model was applied to open-ended, domain</w:t>
       </w:r>
       <w:r>
         <w:t>-</w:t>
       </w:r>
       <w:r>
-        <w:t xml:space="preserve">specific questions. The model struggled to provide equitable partial credit, a pedagogical necessity that often requires subtle contextual understanding and inference of student intent – qualities that go beyond simple semantic matching. </w:t>
-      </w:r>
-      <w:r>
-        <w:t>This again shows how the model’s performance is a direct reflection on the quality, diversity</w:t>
+        <w:t>specific questions. The model struggled to provide equitable partial credit, a pedagogical necessity that often requires subtle contextual understanding and inference of student intent – qualities that go beyond simple semantic matching. This again shows how the model’s performance is a direct reflection on the quality, diversity</w:t>
       </w:r>
       <w:r>
         <w:t>,</w:t>
       </w:r>
       <w:r>
-        <w:t xml:space="preserve"> and quantity of training data. </w:t>
-      </w:r>
-      <w:r>
-        <w:t xml:space="preserve">[21] </w:t>
+        <w:t xml:space="preserve"> and quantity of training data. [21] </w:t>
       </w:r>
       <w:r>
         <w:t>cited</w:t>
       </w:r>
       <w:r>
-        <w:t xml:space="preserve"> three studies </w:t>
-      </w:r>
-      <w:r>
-        <w:t>that showed</w:t>
-      </w:r>
-      <w:r>
-        <w:t xml:space="preserve"> the limitations of ChatGPT as an AES tool. The results indicate</w:t>
+        <w:t xml:space="preserve"> three studies that showed the limitations of ChatGPT as an AES tool. The results indicate</w:t>
       </w:r>
       <w:r>
         <w:t>d</w:t>
@@ -3303,10 +3255,7 @@
         <w:t xml:space="preserve">serving </w:t>
       </w:r>
       <w:r>
-        <w:t>as</w:t>
-      </w:r>
-      <w:r>
-        <w:t xml:space="preserve"> the final step before the end user receives a breakdown of how the traits are scored</w:t>
+        <w:t>as the final step before the end user receives a breakdown of how the traits are scored</w:t>
       </w:r>
       <w:r>
         <w:t xml:space="preserve">. </w:t>
@@ -3369,7 +3318,7 @@
         <w:t xml:space="preserve"> task</w:t>
       </w:r>
       <w:r>
-        <w:t xml:space="preserve">.  </w:t>
+        <w:t xml:space="preserve">. </w:t>
       </w:r>
       <w:proofErr w:type="spellStart"/>
       <w:r>
@@ -3526,594 +3475,533 @@
       <w:r>
         <w:t xml:space="preserve">errors </w:t>
       </w:r>
-      <w:proofErr w:type="gramStart"/>
-      <w:r>
-        <w:t xml:space="preserve">from </w:t>
+      <w:r>
+        <w:t>from propagate</w:t>
+      </w:r>
+      <w:r>
+        <w:t xml:space="preserve"> through the pipeline</w:t>
+      </w:r>
+      <w:r>
+        <w:t xml:space="preserve"> as errors</w:t>
+      </w:r>
+      <w:r>
+        <w:t xml:space="preserve"> fed into the core (</w:t>
+      </w:r>
+      <w:proofErr w:type="spellStart"/>
+      <w:r>
+        <w:t>DeBERTa</w:t>
+      </w:r>
+      <w:proofErr w:type="spellEnd"/>
+      <w:r>
+        <w:t xml:space="preserve">) will </w:t>
+      </w:r>
+      <w:r>
+        <w:t>degrade</w:t>
+      </w:r>
+      <w:r>
+        <w:t xml:space="preserve"> its scoring accuracy. </w:t>
       </w:r>
       <w:r>
         <w:t xml:space="preserve"> </w:t>
       </w:r>
-      <w:r>
-        <w:t>propagate</w:t>
-      </w:r>
-      <w:proofErr w:type="gramEnd"/>
-      <w:r>
-        <w:t xml:space="preserve"> through the pipeline</w:t>
-      </w:r>
-      <w:r>
-        <w:t xml:space="preserve"> as errors</w:t>
-      </w:r>
-      <w:r>
-        <w:t xml:space="preserve"> fed into the core (</w:t>
+    </w:p>
+    <w:p>
+      <w:pPr>
+        <w:spacing w:line="360" w:lineRule="auto"/>
+      </w:pPr>
+      <w:r>
+        <w:t xml:space="preserve">According to </w:t>
+      </w:r>
+      <w:r>
+        <w:t>[26]</w:t>
+      </w:r>
+      <w:r>
+        <w:t>,</w:t>
+      </w:r>
+      <w:r>
+        <w:t xml:space="preserve"> </w:t>
+      </w:r>
+      <w:r>
+        <w:t xml:space="preserve">Tr-OCR </w:t>
+      </w:r>
+      <w:r>
+        <w:t xml:space="preserve">maintains impressive performance even on documents that are deformed, multilingual, or degraded. </w:t>
+      </w:r>
+      <w:r>
+        <w:t xml:space="preserve">However, </w:t>
+      </w:r>
+      <w:r>
+        <w:t>its</w:t>
+      </w:r>
+      <w:r>
+        <w:t xml:space="preserve"> performance</w:t>
+      </w:r>
+      <w:r>
+        <w:t xml:space="preserve"> without</w:t>
+      </w:r>
+      <w:r>
+        <w:t xml:space="preserve"> fine-tuning for line</w:t>
+      </w:r>
+      <w:r>
+        <w:t>-</w:t>
+      </w:r>
+      <w:r>
+        <w:t>level detection</w:t>
+      </w:r>
+      <w:r>
+        <w:t xml:space="preserve"> </w:t>
+      </w:r>
+      <w:r>
+        <w:t>is not opti</w:t>
+      </w:r>
+      <w:r>
+        <w:t>mal</w:t>
+      </w:r>
+      <w:r>
+        <w:t xml:space="preserve">.  </w:t>
+      </w:r>
+      <w:r>
+        <w:t xml:space="preserve">Since it is designed for single-line text detection it failed to extract text from full-page or paragraph-level images achieving accuracy of around 50-60% in extracting text from single line inputs </w:t>
+      </w:r>
+      <w:r>
+        <w:t>[26]</w:t>
+      </w:r>
+      <w:r>
+        <w:t xml:space="preserve">. </w:t>
+      </w:r>
+    </w:p>
+    <w:p>
+      <w:pPr>
+        <w:spacing w:line="360" w:lineRule="auto"/>
+      </w:pPr>
+      <w:r>
+        <w:lastRenderedPageBreak/>
+        <w:t>According to [26</w:t>
+      </w:r>
+      <w:r>
+        <w:t xml:space="preserve">], when Tr-OCR is used </w:t>
+      </w:r>
+      <w:r>
+        <w:t>with Detectron</w:t>
+      </w:r>
+      <w:r>
+        <w:t xml:space="preserve">2 a line identification model and </w:t>
       </w:r>
       <w:proofErr w:type="spellStart"/>
       <w:r>
-        <w:t>DeBERTa</w:t>
+        <w:t>SymSpell</w:t>
       </w:r>
       <w:proofErr w:type="spellEnd"/>
       <w:r>
-        <w:t xml:space="preserve">) will </w:t>
-      </w:r>
-      <w:r>
-        <w:t>degrade</w:t>
-      </w:r>
-      <w:r>
-        <w:t xml:space="preserve"> its scoring accuracy. </w:t>
+        <w:t xml:space="preserve"> to capture every line for post-OCR adjustments</w:t>
+      </w:r>
+      <w:r>
+        <w:t>,</w:t>
       </w:r>
       <w:r>
         <w:t xml:space="preserve"> </w:t>
       </w:r>
-    </w:p>
-    <w:p>
-      <w:pPr>
-        <w:spacing w:line="360" w:lineRule="auto"/>
-      </w:pPr>
-      <w:r>
-        <w:t xml:space="preserve">According to </w:t>
-      </w:r>
-      <w:r>
-        <w:t>[26]</w:t>
+      <w:r>
+        <w:t>the</w:t>
+      </w:r>
+      <w:r>
+        <w:t xml:space="preserve"> word and character error rates were greatly </w:t>
+      </w:r>
+      <w:r>
+        <w:t>reduced</w:t>
+      </w:r>
+      <w:r>
+        <w:t>.</w:t>
+      </w:r>
+    </w:p>
+    <w:p>
+      <w:pPr>
+        <w:spacing w:line="360" w:lineRule="auto"/>
+      </w:pPr>
+      <w:r>
+        <w:t xml:space="preserve">It is for these reasons, along with the findings of [13] </w:t>
+      </w:r>
+      <w:r>
+        <w:t>discussed previously</w:t>
+      </w:r>
+      <w:r>
+        <w:t xml:space="preserve">, that Tr-OCR has been selected as the OCR input component </w:t>
+      </w:r>
+      <w:r>
+        <w:t xml:space="preserve">for </w:t>
+      </w:r>
+      <w:proofErr w:type="spellStart"/>
+      <w:r>
+        <w:t>BrainPower</w:t>
+      </w:r>
+      <w:proofErr w:type="spellEnd"/>
+      <w:r>
+        <w:t>.</w:t>
+      </w:r>
+      <w:r>
+        <w:t xml:space="preserve"> </w:t>
+      </w:r>
+      <w:r>
+        <w:t>However</w:t>
       </w:r>
       <w:r>
         <w:t>,</w:t>
       </w:r>
       <w:r>
+        <w:t xml:space="preserve"> only</w:t>
+      </w:r>
+      <w:r>
         <w:t xml:space="preserve"> </w:t>
       </w:r>
       <w:r>
-        <w:t xml:space="preserve">Tr-OCR </w:t>
-      </w:r>
-      <w:r>
-        <w:t>maintains impressive performance even on documents that are deformed, multilingual, or degraded</w:t>
+        <w:t xml:space="preserve">the pretrained model will be incorporated </w:t>
+      </w:r>
+      <w:r>
+        <w:t>as</w:t>
+      </w:r>
+      <w:r>
+        <w:t xml:space="preserve"> fine-tuning the model is beyond the </w:t>
+      </w:r>
+      <w:r>
+        <w:t>scope of</w:t>
+      </w:r>
+      <w:r>
+        <w:t xml:space="preserve"> this research</w:t>
       </w:r>
       <w:r>
         <w:t xml:space="preserve">. </w:t>
       </w:r>
-      <w:r>
-        <w:t xml:space="preserve">However, </w:t>
-      </w:r>
-      <w:r>
-        <w:t>Tr-OCR’s performance</w:t>
-      </w:r>
-      <w:r>
-        <w:t xml:space="preserve"> without</w:t>
-      </w:r>
-      <w:r>
-        <w:t xml:space="preserve"> fine-tuning for line</w:t>
-      </w:r>
-      <w:r>
-        <w:t>-</w:t>
-      </w:r>
-      <w:r>
-        <w:t>level detection</w:t>
-      </w:r>
-      <w:r>
-        <w:t xml:space="preserve"> </w:t>
-      </w:r>
-      <w:r>
-        <w:t>is not opti</w:t>
-      </w:r>
-      <w:r>
-        <w:t>mal</w:t>
-      </w:r>
-      <w:r>
-        <w:t xml:space="preserve">.  [26] </w:t>
-      </w:r>
-      <w:r>
-        <w:t xml:space="preserve">states </w:t>
-      </w:r>
-      <w:r>
-        <w:t xml:space="preserve">that </w:t>
-      </w:r>
-      <w:r>
-        <w:t>the quality of the input segments has a significant impact on how well it performs. The outcome is frequently degraded when entire pages or unstructured text sections are fed into the algorithm</w:t>
-      </w:r>
-      <w:r>
-        <w:t xml:space="preserve"> [26]</w:t>
-      </w:r>
-      <w:r>
-        <w:t>.</w:t>
-      </w:r>
-      <w:r>
-        <w:t xml:space="preserve"> </w:t>
-      </w:r>
-      <w:r>
-        <w:t>Tr</w:t>
-      </w:r>
-      <w:r>
-        <w:t>-</w:t>
-      </w:r>
-      <w:r>
-        <w:t xml:space="preserve">OCR has been used by </w:t>
-      </w:r>
-      <w:r>
-        <w:t>several</w:t>
-      </w:r>
-      <w:r>
-        <w:t xml:space="preserve"> </w:t>
-      </w:r>
-      <w:r>
-        <w:t xml:space="preserve">researchers on government, administrative, and </w:t>
-      </w:r>
-      <w:r>
-        <w:lastRenderedPageBreak/>
-        <w:t>historical</w:t>
-      </w:r>
-      <w:r>
-        <w:t xml:space="preserve"> </w:t>
-      </w:r>
-      <w:r>
-        <w:t>archival datasets, and they have found that it significantly</w:t>
-      </w:r>
-      <w:r>
-        <w:t xml:space="preserve"> </w:t>
-      </w:r>
-      <w:r>
-        <w:t>increases recognition accuracy, especially when the model is</w:t>
-      </w:r>
-      <w:r>
-        <w:t xml:space="preserve"> </w:t>
-      </w:r>
-      <w:r>
-        <w:t>trained at line level</w:t>
-      </w:r>
-      <w:r>
-        <w:t xml:space="preserve"> [26].</w:t>
-      </w:r>
-      <w:r>
-        <w:t xml:space="preserve"> </w:t>
-      </w:r>
-    </w:p>
-    <w:p>
-      <w:pPr>
-        <w:spacing w:line="360" w:lineRule="auto"/>
-      </w:pPr>
-      <w:r>
-        <w:t>According to [26]</w:t>
-      </w:r>
-      <w:r>
-        <w:t>,</w:t>
-      </w:r>
-      <w:r>
-        <w:t xml:space="preserve"> since Tr-OCR is designed for single-line text detection </w:t>
-      </w:r>
-      <w:r>
-        <w:t>i</w:t>
-      </w:r>
-      <w:r>
-        <w:t>t failed to extract text from full-page or paragraph</w:t>
-      </w:r>
-      <w:r>
-        <w:t>-</w:t>
-      </w:r>
-      <w:r>
-        <w:t>level images. Accuracy in extracting text from single line inputs remained around 50-60%</w:t>
-      </w:r>
-      <w:r>
-        <w:t xml:space="preserve"> [26]</w:t>
-      </w:r>
-      <w:r>
-        <w:t>. L</w:t>
-      </w:r>
-      <w:r>
-        <w:t>ine detection and</w:t>
-      </w:r>
-      <w:r>
-        <w:t xml:space="preserve"> </w:t>
-      </w:r>
-      <w:r>
-        <w:t>segmentation have thus become crucial preprocessing stages</w:t>
-      </w:r>
-      <w:r>
-        <w:t xml:space="preserve"> [26]</w:t>
-      </w:r>
-      <w:r>
-        <w:t>.</w:t>
-      </w:r>
-      <w:r>
-        <w:t xml:space="preserve"> </w:t>
-      </w:r>
-      <w:r>
-        <w:t>[26] used D</w:t>
-      </w:r>
-      <w:r>
-        <w:t>etectron</w:t>
-      </w:r>
-      <w:r>
-        <w:t xml:space="preserve">2 a line identification model and </w:t>
-      </w:r>
-      <w:proofErr w:type="spellStart"/>
-      <w:r>
-        <w:t>SymSpell</w:t>
-      </w:r>
-      <w:proofErr w:type="spellEnd"/>
-      <w:r>
-        <w:t xml:space="preserve"> to capture every line for post-OCR adjustments</w:t>
-      </w:r>
-      <w:r>
-        <w:t>,</w:t>
-      </w:r>
-      <w:r>
-        <w:t xml:space="preserve"> respectively. The results showed </w:t>
-      </w:r>
-      <w:r>
-        <w:t>that the</w:t>
-      </w:r>
-      <w:r>
-        <w:t xml:space="preserve"> word and character error rates were greatly </w:t>
-      </w:r>
-      <w:r>
-        <w:t>reduced</w:t>
-      </w:r>
-      <w:r>
-        <w:t xml:space="preserve"> after the model was fine-tuned [26].  </w:t>
-      </w:r>
-    </w:p>
-    <w:p>
-      <w:pPr>
-        <w:spacing w:line="360" w:lineRule="auto"/>
-      </w:pPr>
-      <w:r>
-        <w:t xml:space="preserve">It is </w:t>
-      </w:r>
-      <w:r>
-        <w:t>for these reasons,</w:t>
-      </w:r>
-      <w:r>
-        <w:t xml:space="preserve"> along with the findings of [13]</w:t>
-      </w:r>
-      <w:r>
-        <w:t xml:space="preserve"> </w:t>
-      </w:r>
-      <w:r>
-        <w:t>discussed previously</w:t>
-      </w:r>
-      <w:r>
-        <w:t xml:space="preserve">, that Tr-OCR has been selected as the OCR input component </w:t>
-      </w:r>
-      <w:r>
-        <w:t xml:space="preserve">for </w:t>
-      </w:r>
-      <w:proofErr w:type="spellStart"/>
-      <w:r>
-        <w:t>BrainPower</w:t>
-      </w:r>
-      <w:proofErr w:type="spellEnd"/>
-      <w:r>
-        <w:t>.</w:t>
-      </w:r>
-      <w:r>
-        <w:t xml:space="preserve"> </w:t>
-      </w:r>
-      <w:r>
-        <w:t>However</w:t>
-      </w:r>
-      <w:r>
-        <w:t>,</w:t>
-      </w:r>
-      <w:r>
-        <w:t xml:space="preserve"> only</w:t>
-      </w:r>
-      <w:r>
-        <w:t xml:space="preserve"> </w:t>
-      </w:r>
-      <w:r>
-        <w:t xml:space="preserve">the pretrained model will be incorporated </w:t>
-      </w:r>
-      <w:r>
-        <w:t>as</w:t>
-      </w:r>
-      <w:r>
-        <w:t xml:space="preserve"> fine-tuning the model is beyond the </w:t>
-      </w:r>
-      <w:r>
-        <w:t>scope of</w:t>
-      </w:r>
-      <w:r>
-        <w:t xml:space="preserve"> this research</w:t>
-      </w:r>
-      <w:r>
-        <w:t>. This presents a limitation of the system inherent in Tr-</w:t>
-      </w:r>
-      <w:r>
-        <w:t>OCR; however,</w:t>
-      </w:r>
-      <w:r>
-        <w:t xml:space="preserve"> implementing line-level segmentation is not a trivial task hence it will be undertaken in a future iteration of the system.  </w:t>
-      </w:r>
-      <w:r>
-        <w:t xml:space="preserve">Page-level segmentation, which is provided in the pre-trained model, is sufficient for the scope of this research. </w:t>
-      </w:r>
-    </w:p>
-    <w:p>
-      <w:pPr>
-        <w:spacing w:line="360" w:lineRule="auto"/>
-      </w:pPr>
-      <w:r>
-        <w:t>Limitations of ASR (STT)</w:t>
-      </w:r>
-    </w:p>
-    <w:p>
-      <w:pPr>
-        <w:spacing w:line="360" w:lineRule="auto"/>
-      </w:pPr>
-      <w:r>
-        <w:t>[19] While the model achieves competitive performance, it still exhibits word error rates that may not meet the expectations for all applications, particularly in noisy environments with low-quality audio</w:t>
-      </w:r>
-    </w:p>
-    <w:p>
-      <w:pPr>
-        <w:spacing w:line="360" w:lineRule="auto"/>
-      </w:pPr>
-    </w:p>
-    <w:p>
-      <w:pPr>
-        <w:spacing w:line="360" w:lineRule="auto"/>
-      </w:pPr>
-      <w:r>
-        <w:t>Limitations of Multimodal Integrated Systems</w:t>
-      </w:r>
-    </w:p>
-    <w:p>
-      <w:pPr>
-        <w:spacing w:line="360" w:lineRule="auto"/>
-      </w:pPr>
-    </w:p>
-    <w:p>
-      <w:pPr>
+    </w:p>
+    <w:p>
+      <w:pPr>
+        <w:spacing w:line="360" w:lineRule="auto"/>
         <w:rPr>
           <w:b/>
           <w:bCs/>
-          <w:highlight w:val="yellow"/>
         </w:rPr>
       </w:pPr>
       <w:r>
         <w:rPr>
           <w:b/>
           <w:bCs/>
-          <w:highlight w:val="yellow"/>
-        </w:rPr>
-        <w:t>One More Section I Think You Should Add</w:t>
-      </w:r>
-    </w:p>
-    <w:p>
-      <w:pPr>
+        </w:rPr>
+        <w:t>Limitations of ASR (STT)</w:t>
+      </w:r>
+    </w:p>
+    <w:p>
+      <w:pPr>
+        <w:spacing w:line="360" w:lineRule="auto"/>
+      </w:pPr>
+      <w:r>
+        <w:t>[2</w:t>
+      </w:r>
+      <w:r>
+        <w:t>7</w:t>
+      </w:r>
+      <w:r>
+        <w:t xml:space="preserve">] </w:t>
+      </w:r>
+      <w:r>
+        <w:t xml:space="preserve">noise interference, echoes, accents, dialect variation and overlapping speech have a degrading effect on the performance of </w:t>
+      </w:r>
+      <w:r>
+        <w:t>speech-to-text (STT) and text-to-speech (TTS)</w:t>
+      </w:r>
+      <w:r>
+        <w:t xml:space="preserve"> </w:t>
+      </w:r>
+      <w:r>
+        <w:t>systems, resulting</w:t>
+      </w:r>
+      <w:r>
+        <w:t xml:space="preserve"> in </w:t>
+      </w:r>
+      <w:r>
+        <w:t>transcription errors</w:t>
+      </w:r>
+      <w:r>
+        <w:t xml:space="preserve">. </w:t>
+      </w:r>
+      <w:r>
+        <w:t>As with</w:t>
+      </w:r>
+      <w:r>
+        <w:t xml:space="preserve"> OCR systems, </w:t>
+      </w:r>
+      <w:r>
+        <w:t xml:space="preserve">ASR systems are vulnerable to </w:t>
+      </w:r>
+      <w:r>
+        <w:t xml:space="preserve">environmental conditions </w:t>
+      </w:r>
+      <w:r>
+        <w:t>as these determine the quality of the input</w:t>
+      </w:r>
+      <w:r>
+        <w:t>,</w:t>
+      </w:r>
+      <w:r>
+        <w:t xml:space="preserve"> which invariably determines the quality of the output</w:t>
+      </w:r>
+      <w:r>
+        <w:t>.</w:t>
+      </w:r>
+      <w:r>
+        <w:t xml:space="preserve"> According to </w:t>
+      </w:r>
+      <w:r>
+        <w:t>[2</w:t>
+      </w:r>
+      <w:r>
+        <w:t>7</w:t>
+      </w:r>
+      <w:r>
+        <w:t>]</w:t>
+      </w:r>
+      <w:r>
+        <w:t>,</w:t>
+      </w:r>
+      <w:r>
+        <w:t xml:space="preserve"> model and dataset scarcity are the reasons why the issues mentioned earlier still pose a challenge to </w:t>
+      </w:r>
+      <w:r>
+        <w:t xml:space="preserve">modern </w:t>
+      </w:r>
+      <w:r>
+        <w:t xml:space="preserve">ASR systems. This issue of dataset scarcity seems to be a common thread among modern AI models, </w:t>
+      </w:r>
+      <w:r>
+        <w:t xml:space="preserve">since they rely heavily on data for training and testing, </w:t>
+      </w:r>
+      <w:r>
+        <w:t xml:space="preserve">underscoring </w:t>
+      </w:r>
+      <w:r>
+        <w:t>the need</w:t>
+      </w:r>
+      <w:r>
+        <w:t xml:space="preserve"> for </w:t>
+      </w:r>
+      <w:r>
+        <w:t>greater</w:t>
+      </w:r>
+      <w:r>
+        <w:t xml:space="preserve"> diversity and availability.  </w:t>
+      </w:r>
+      <w:r>
+        <w:t xml:space="preserve">These limitations are taken into consideration </w:t>
+      </w:r>
+      <w:r>
+        <w:t>however</w:t>
+      </w:r>
+      <w:r>
+        <w:t xml:space="preserve">, and </w:t>
+      </w:r>
+      <w:r>
+        <w:t>W</w:t>
+      </w:r>
+      <w:r>
+        <w:t>h</w:t>
+      </w:r>
+      <w:r>
+        <w:t>i</w:t>
+      </w:r>
+      <w:r>
+        <w:t>sp</w:t>
+      </w:r>
+      <w:r>
+        <w:t xml:space="preserve">er will serve as the ASR/STT component of </w:t>
+      </w:r>
+      <w:proofErr w:type="spellStart"/>
+      <w:r>
+        <w:t>BrainPower</w:t>
+      </w:r>
+      <w:proofErr w:type="spellEnd"/>
+      <w:r>
+        <w:t xml:space="preserve"> due to its accessibility and state-of-the-art performance. T</w:t>
+      </w:r>
+      <w:r>
+        <w:t xml:space="preserve">he results from both component and integration testing will indicate if </w:t>
+      </w:r>
+      <w:r>
+        <w:t xml:space="preserve">the model needs to be fine-tuned or replaced. </w:t>
+      </w:r>
+      <w:r>
+        <w:t xml:space="preserve"> </w:t>
+      </w:r>
+    </w:p>
+    <w:p>
+      <w:pPr>
+        <w:spacing w:line="360" w:lineRule="auto"/>
         <w:rPr>
           <w:b/>
           <w:bCs/>
-          <w:highlight w:val="yellow"/>
         </w:rPr>
       </w:pPr>
       <w:r>
         <w:rPr>
           <w:b/>
           <w:bCs/>
-          <w:highlight w:val="yellow"/>
         </w:rPr>
         <w:t>Limitations of Multimodal Integrated Systems</w:t>
       </w:r>
     </w:p>
     <w:p>
       <w:pPr>
-        <w:rPr>
-          <w:highlight w:val="yellow"/>
-        </w:rPr>
-      </w:pPr>
-      <w:r>
-        <w:rPr>
-          <w:highlight w:val="yellow"/>
-        </w:rPr>
-        <w:t>This section would naturally precede your mitigation plan.</w:t>
-      </w:r>
-    </w:p>
-    <w:p>
-      <w:pPr>
-        <w:rPr>
-          <w:highlight w:val="yellow"/>
-        </w:rPr>
-      </w:pPr>
-      <w:r>
-        <w:rPr>
-          <w:highlight w:val="yellow"/>
-        </w:rPr>
-        <w:t>You could discuss:</w:t>
-      </w:r>
-    </w:p>
-    <w:p>
-      <w:pPr>
-        <w:rPr>
-          <w:b/>
-          <w:bCs/>
-          <w:highlight w:val="yellow"/>
-        </w:rPr>
-      </w:pPr>
-      <w:r>
-        <w:rPr>
-          <w:b/>
-          <w:bCs/>
-          <w:highlight w:val="yellow"/>
-        </w:rPr>
-        <w:t>Error Propagation</w:t>
-      </w:r>
-    </w:p>
-    <w:p>
-      <w:pPr>
-        <w:rPr>
-          <w:highlight w:val="yellow"/>
-        </w:rPr>
-      </w:pPr>
-      <w:r>
-        <w:rPr>
-          <w:highlight w:val="yellow"/>
-        </w:rPr>
+        <w:spacing w:line="360" w:lineRule="auto"/>
+      </w:pPr>
+      <w:r>
+        <w:t>Multimodal integrated systems inherently suffer the same issues as their constituent components</w:t>
+      </w:r>
+      <w:r>
+        <w:t xml:space="preserve"> – OCR, ASR</w:t>
+      </w:r>
+      <w:r>
+        <w:t>,</w:t>
+      </w:r>
+      <w:r>
+        <w:t xml:space="preserve"> and Transformer models</w:t>
+      </w:r>
+      <w:r>
+        <w:t xml:space="preserve">. Additionally, </w:t>
+      </w:r>
+      <w:r>
+        <w:t>they face issues such as:</w:t>
+      </w:r>
+    </w:p>
+    <w:p>
+      <w:pPr>
+        <w:pStyle w:val="ListParagraph"/>
+        <w:numPr>
+          <w:ilvl w:val="0"/>
+          <w:numId w:val="6"/>
+        </w:numPr>
+        <w:spacing w:line="360" w:lineRule="auto"/>
+      </w:pPr>
+      <w:r>
+        <w:t>Computational complexity</w:t>
+      </w:r>
+      <w:r>
+        <w:t>:</w:t>
+      </w:r>
+      <w:r>
+        <w:t xml:space="preserve"> orchestrating three pretrained models requires a lot of processing power and storage space</w:t>
+      </w:r>
+      <w:r>
+        <w:t>.</w:t>
+      </w:r>
+    </w:p>
+    <w:p>
+      <w:pPr>
+        <w:pStyle w:val="ListParagraph"/>
+        <w:numPr>
+          <w:ilvl w:val="0"/>
+          <w:numId w:val="6"/>
+        </w:numPr>
+        <w:spacing w:line="360" w:lineRule="auto"/>
+      </w:pPr>
+      <w:r>
+        <w:t>Error propagation</w:t>
+      </w:r>
+      <w:r>
+        <w:t>:</w:t>
+      </w:r>
+      <w:r>
+        <w:t xml:space="preserve"> </w:t>
+      </w:r>
+      <w:r>
+        <w:t xml:space="preserve">It is likely that mistakes from either the audio transcription done by the ASR or from recognition and digitization by the OCR will flow as input </w:t>
+      </w:r>
+      <w:r>
         <w:lastRenderedPageBreak/>
-        <w:t>Mistakes in OCR and ASR are inherited by the AES model.</w:t>
-      </w:r>
-    </w:p>
-    <w:p>
-      <w:pPr>
-        <w:rPr>
-          <w:b/>
-          <w:bCs/>
-          <w:highlight w:val="yellow"/>
-        </w:rPr>
-      </w:pPr>
-      <w:r>
-        <w:rPr>
-          <w:b/>
-          <w:bCs/>
-          <w:highlight w:val="yellow"/>
-        </w:rPr>
-        <w:t>Increased System Complexity</w:t>
-      </w:r>
-    </w:p>
-    <w:p>
-      <w:pPr>
-        <w:rPr>
-          <w:highlight w:val="yellow"/>
-        </w:rPr>
-      </w:pPr>
-      <w:r>
-        <w:rPr>
-          <w:highlight w:val="yellow"/>
-        </w:rPr>
-        <w:t>Integrating multiple models increases implementation complexity and maintenance requirements.</w:t>
-      </w:r>
-    </w:p>
-    <w:p>
-      <w:pPr>
-        <w:rPr>
-          <w:b/>
-          <w:bCs/>
-          <w:highlight w:val="yellow"/>
-        </w:rPr>
-      </w:pPr>
-      <w:r>
-        <w:rPr>
-          <w:b/>
-          <w:bCs/>
-          <w:highlight w:val="yellow"/>
-        </w:rPr>
-        <w:t>Computational Overhead</w:t>
-      </w:r>
-    </w:p>
-    <w:p>
-      <w:pPr>
-        <w:rPr>
-          <w:highlight w:val="yellow"/>
-        </w:rPr>
-      </w:pPr>
-      <w:r>
-        <w:rPr>
-          <w:highlight w:val="yellow"/>
-        </w:rPr>
-        <w:t>Running three models (</w:t>
+        <w:t xml:space="preserve">to the AES system core. </w:t>
+      </w:r>
+      <w:r>
+        <w:t>If errors in the input data</w:t>
+      </w:r>
+      <w:r>
+        <w:t xml:space="preserve"> </w:t>
+      </w:r>
+      <w:r>
+        <w:t xml:space="preserve">are not detected and handled correctly, they will propagate and reduce the core component’s accuracy and </w:t>
+      </w:r>
+      <w:r>
+        <w:t>reliability, resulting</w:t>
+      </w:r>
+      <w:r>
+        <w:t xml:space="preserve"> in inaccurate essay scores</w:t>
+      </w:r>
+      <w:r>
+        <w:t xml:space="preserve">. </w:t>
+      </w:r>
+    </w:p>
+    <w:p>
+      <w:pPr>
+        <w:pStyle w:val="ListParagraph"/>
+        <w:numPr>
+          <w:ilvl w:val="0"/>
+          <w:numId w:val="6"/>
+        </w:numPr>
+        <w:spacing w:line="360" w:lineRule="auto"/>
+      </w:pPr>
+      <w:r>
+        <w:t>Modality imbalance</w:t>
+      </w:r>
+      <w:r>
+        <w:t xml:space="preserve">: </w:t>
+      </w:r>
+      <w:r>
+        <w:t xml:space="preserve"> Typed essays may score higher than handwritten or audio-transcribed essays due to noise introduced by OCR or the accent or dialect of the speaker</w:t>
+      </w:r>
+      <w:r>
+        <w:t xml:space="preserve"> for example. </w:t>
+      </w:r>
+    </w:p>
+    <w:p>
+      <w:pPr>
+        <w:pStyle w:val="ListParagraph"/>
+        <w:numPr>
+          <w:ilvl w:val="0"/>
+          <w:numId w:val="6"/>
+        </w:numPr>
+        <w:spacing w:line="360" w:lineRule="auto"/>
+      </w:pPr>
+      <w:r>
+        <w:t xml:space="preserve">Data Bias:  The pre-trained models are inherently biased towards the data they were trained on </w:t>
+      </w:r>
+    </w:p>
+    <w:p>
+      <w:pPr>
+        <w:spacing w:line="360" w:lineRule="auto"/>
+      </w:pPr>
+      <w:r>
+        <w:t>It is</w:t>
+      </w:r>
+      <w:r>
+        <w:t xml:space="preserve"> therefore</w:t>
+      </w:r>
+      <w:r>
+        <w:t xml:space="preserve"> incumbent on the designer to mitigate error propagation by </w:t>
+      </w:r>
+      <w:r>
+        <w:t xml:space="preserve">detecting </w:t>
+      </w:r>
+      <w:r>
+        <w:t xml:space="preserve">errors </w:t>
+      </w:r>
+      <w:r>
+        <w:t xml:space="preserve">in the output from the ASR and OCR </w:t>
+      </w:r>
+      <w:r>
+        <w:t xml:space="preserve">using metrics such as </w:t>
       </w:r>
       <w:proofErr w:type="spellStart"/>
       <w:r>
-        <w:rPr>
-          <w:highlight w:val="yellow"/>
-        </w:rPr>
-        <w:t>TrOCR</w:t>
+        <w:t>as</w:t>
       </w:r>
       <w:proofErr w:type="spellEnd"/>
       <w:r>
-        <w:rPr>
-          <w:highlight w:val="yellow"/>
-        </w:rPr>
-        <w:t xml:space="preserve">, Whisper, and </w:t>
-      </w:r>
-      <w:proofErr w:type="spellStart"/>
-      <w:r>
-        <w:rPr>
-          <w:highlight w:val="yellow"/>
-        </w:rPr>
-        <w:t>DeBERTa</w:t>
-      </w:r>
-      <w:proofErr w:type="spellEnd"/>
-      <w:r>
-        <w:rPr>
-          <w:highlight w:val="yellow"/>
-        </w:rPr>
-        <w:t>) requires more memory and processing time than single-model systems.</w:t>
-      </w:r>
-    </w:p>
-    <w:p>
-      <w:pPr>
-        <w:rPr>
-          <w:b/>
-          <w:bCs/>
-          <w:highlight w:val="yellow"/>
-        </w:rPr>
-      </w:pPr>
-      <w:r>
-        <w:rPr>
-          <w:b/>
-          <w:bCs/>
-          <w:highlight w:val="yellow"/>
-        </w:rPr>
-        <w:t>Dependence on Pretrained Models</w:t>
-      </w:r>
-    </w:p>
-    <w:p>
-      <w:pPr>
-        <w:rPr>
-          <w:highlight w:val="yellow"/>
-        </w:rPr>
-      </w:pPr>
-      <w:r>
-        <w:rPr>
-          <w:highlight w:val="yellow"/>
-        </w:rPr>
-        <w:t>The system's performance depends heavily on the capabilities and biases of externally developed models.</w:t>
-      </w:r>
-    </w:p>
-    <w:p>
-      <w:pPr>
-        <w:rPr>
-          <w:b/>
-          <w:bCs/>
-          <w:highlight w:val="yellow"/>
-        </w:rPr>
-      </w:pPr>
-      <w:r>
-        <w:rPr>
-          <w:b/>
-          <w:bCs/>
-          <w:highlight w:val="yellow"/>
-        </w:rPr>
-        <w:t>Modality Imbalance</w:t>
-      </w:r>
-    </w:p>
-    <w:p>
-      <w:r>
-        <w:rPr>
-          <w:highlight w:val="yellow"/>
-        </w:rPr>
-        <w:t>Different input modalities may not contribute equally. Typed essays may produce better scores than handwritten or spoken essays because OCR and ASR introduce additional noise</w:t>
-      </w:r>
-      <w:r>
-        <w:t>.</w:t>
+        <w:t xml:space="preserve"> WER and CER and managing them at the component level, alerting human scorers when review is necessary.</w:t>
       </w:r>
     </w:p>
     <w:p>
@@ -4136,234 +4024,73 @@
       <w:bookmarkStart w:id="5" w:name="_Toc233058947"/>
       <w:r>
         <w:lastRenderedPageBreak/>
-        <w:t>Evaluation plan</w:t>
+        <w:t xml:space="preserve">Evaluation </w:t>
+      </w:r>
+      <w:r>
+        <w:t>P</w:t>
+      </w:r>
+      <w:r>
+        <w:t>lan</w:t>
       </w:r>
       <w:bookmarkEnd w:id="5"/>
     </w:p>
     <w:p/>
     <w:p>
-      <w:r>
-        <w:t xml:space="preserve">To evaluate the performance of the system </w:t>
-      </w:r>
-      <w:r>
-        <w:t>the following approach will be used:</w:t>
-      </w:r>
-    </w:p>
-    <w:p>
-      <w:r>
+      <w:pPr>
+        <w:pStyle w:val="Heading3"/>
+      </w:pPr>
+      <w:bookmarkStart w:id="6" w:name="_Toc233058948"/>
+      <w:r>
+        <w:t>Evaluation Metrics</w:t>
+      </w:r>
+      <w:bookmarkEnd w:id="6"/>
+    </w:p>
+    <w:p>
+      <w:pPr>
+        <w:spacing w:line="360" w:lineRule="auto"/>
         <w:rPr>
           <w:b/>
           <w:bCs/>
         </w:rPr>
-        <w:t>OCR</w:t>
-      </w:r>
-      <w:r>
-        <w:t xml:space="preserve"> – the output from the OCR component will be text. The WER and CER will be used to evaluate the performance of this component</w:t>
-      </w:r>
-    </w:p>
-    <w:p>
-      <w:r>
+      </w:pPr>
+    </w:p>
+    <w:p>
+      <w:pPr>
+        <w:spacing w:line="360" w:lineRule="auto"/>
         <w:rPr>
           <w:b/>
           <w:bCs/>
         </w:rPr>
-        <w:t>ASR</w:t>
-      </w:r>
-      <w:r>
-        <w:t>- the WER and CER and latency will be used to evaluate this component</w:t>
-      </w:r>
-    </w:p>
-    <w:p>
+      </w:pPr>
       <w:r>
         <w:rPr>
           <w:b/>
           <w:bCs/>
         </w:rPr>
-        <w:t>AES</w:t>
-      </w:r>
-      <w:r>
-        <w:t xml:space="preserve"> – the QWK will be used to describe proximity of the system’s scores to that of human scorers. </w:t>
-      </w:r>
-    </w:p>
-    <w:p>
-      <w:pPr>
-        <w:spacing w:line="360" w:lineRule="auto"/>
-      </w:pPr>
-      <w:r>
+        <w:t>Accuracy and Precision</w:t>
+      </w:r>
+    </w:p>
+    <w:p>
+      <w:pPr>
+        <w:spacing w:line="360" w:lineRule="auto"/>
+      </w:pPr>
+      <w:r>
+        <w:t xml:space="preserve">Accuracy rate is a measure of the number of correct classifications over the entire test set, indicating the strength of the classifier [14]. [15] Precision is the fraction of correctly predicted, positive results out of the sum of all positive predictions (true positives + false positives). This number is useful in situations where the false-positives outnumber the false-negatives. A high-precision value suggests that the model makes accurate positive predictions. Recall on the other hand [16] indicates how well the classifier labels as positive, cases that are positive, showing the ability to correctly identify cases that are positive. This measure is also described as sensitivity.[15] the F1-Score is a measure of the test’s accuracy and is calculated from the precision and recall of the test. </w:t>
+      </w:r>
+    </w:p>
+    <w:p>
+      <w:pPr>
+        <w:spacing w:line="360" w:lineRule="auto"/>
         <w:rPr>
           <w:b/>
           <w:bCs/>
         </w:rPr>
-        <w:t>Datasets –</w:t>
-      </w:r>
-      <w:r>
-        <w:t xml:space="preserve"> ASAP, IELTS (pic one)</w:t>
-      </w:r>
-    </w:p>
-    <w:p>
-      <w:pPr>
-        <w:spacing w:line="360" w:lineRule="auto"/>
-      </w:pPr>
-      <w:r>
-        <w:t>Testing Plan – have at least 10 people each write  5 of the essays in the dataset, each belonging to a different prompt, have them then read and record their voice then have the system process the essays (mics will be of disparate quality replicating real-world quality and potential shoddy equipment, also recording is not studio quality so background will be present, classrooms are not necessarily 100% quiet, have them take pics with their phones (the lighting will not be consistent so the test will replicate real-world conditions)</w:t>
-      </w:r>
-    </w:p>
-    <w:p>
-      <w:pPr>
-        <w:spacing w:line="360" w:lineRule="auto"/>
-      </w:pPr>
-      <w:r>
-        <w:t>Compare:</w:t>
-      </w:r>
-    </w:p>
-    <w:p>
-      <w:pPr>
-        <w:pStyle w:val="ListParagraph"/>
-        <w:numPr>
-          <w:ilvl w:val="0"/>
-          <w:numId w:val="4"/>
-        </w:numPr>
-        <w:spacing w:line="360" w:lineRule="auto"/>
-      </w:pPr>
-      <w:r>
-        <w:t>Essay score from dataset after essay</w:t>
-      </w:r>
-      <w:r>
-        <w:t xml:space="preserve">s </w:t>
-      </w:r>
-      <w:r>
-        <w:t xml:space="preserve">fed directly to </w:t>
-      </w:r>
-      <w:proofErr w:type="spellStart"/>
-      <w:r>
-        <w:t>aes</w:t>
-      </w:r>
-      <w:proofErr w:type="spellEnd"/>
-      <w:r>
-        <w:t xml:space="preserve"> with </w:t>
-      </w:r>
-    </w:p>
-    <w:p>
-      <w:pPr>
-        <w:pStyle w:val="ListParagraph"/>
-        <w:numPr>
-          <w:ilvl w:val="0"/>
-          <w:numId w:val="4"/>
-        </w:numPr>
-        <w:spacing w:line="360" w:lineRule="auto"/>
-      </w:pPr>
-      <w:r>
-        <w:t>Transcribed essay</w:t>
-      </w:r>
-      <w:r>
-        <w:t>s</w:t>
-      </w:r>
-      <w:r>
-        <w:t xml:space="preserve"> fed from </w:t>
-      </w:r>
-      <w:proofErr w:type="spellStart"/>
-      <w:r>
-        <w:t>asr</w:t>
-      </w:r>
-      <w:proofErr w:type="spellEnd"/>
-    </w:p>
-    <w:p>
-      <w:pPr>
-        <w:pStyle w:val="ListParagraph"/>
-        <w:numPr>
-          <w:ilvl w:val="0"/>
-          <w:numId w:val="4"/>
-        </w:numPr>
-        <w:spacing w:line="360" w:lineRule="auto"/>
-      </w:pPr>
-      <w:r>
-        <w:t>Scanned and digitized handwritten essay</w:t>
-      </w:r>
-      <w:r>
-        <w:t>s</w:t>
-      </w:r>
-      <w:r>
-        <w:t xml:space="preserve"> from </w:t>
-      </w:r>
-      <w:proofErr w:type="spellStart"/>
-      <w:r>
-        <w:t>ocr</w:t>
-      </w:r>
-      <w:proofErr w:type="spellEnd"/>
-    </w:p>
-    <w:p>
-      <w:pPr>
-        <w:rPr>
-          <w:rFonts w:eastAsiaTheme="majorEastAsia" w:cstheme="majorBidi"/>
-          <w:color w:val="0F4761" w:themeColor="accent1" w:themeShade="BF"/>
-          <w:sz w:val="28"/>
-          <w:szCs w:val="28"/>
-        </w:rPr>
-      </w:pPr>
-      <w:r>
-        <w:br w:type="page"/>
-      </w:r>
-    </w:p>
-    <w:p>
-      <w:pPr>
-        <w:pStyle w:val="Heading3"/>
-      </w:pPr>
-      <w:bookmarkStart w:id="6" w:name="_Toc233058948"/>
-      <w:r>
-        <w:lastRenderedPageBreak/>
-        <w:t xml:space="preserve">Evaluation </w:t>
-      </w:r>
-      <w:r>
-        <w:t>Metrics</w:t>
-      </w:r>
-      <w:bookmarkEnd w:id="6"/>
-    </w:p>
-    <w:p>
-      <w:pPr>
-        <w:spacing w:line="360" w:lineRule="auto"/>
+      </w:pPr>
+      <w:r>
         <w:rPr>
           <w:b/>
           <w:bCs/>
         </w:rPr>
-      </w:pPr>
-    </w:p>
-    <w:p>
-      <w:pPr>
-        <w:spacing w:line="360" w:lineRule="auto"/>
-        <w:rPr>
-          <w:b/>
-          <w:bCs/>
-        </w:rPr>
-      </w:pPr>
-      <w:r>
-        <w:rPr>
-          <w:b/>
-          <w:bCs/>
-        </w:rPr>
-        <w:t>Accuracy and Precision</w:t>
-      </w:r>
-    </w:p>
-    <w:p>
-      <w:pPr>
-        <w:spacing w:line="360" w:lineRule="auto"/>
-      </w:pPr>
-      <w:r>
-        <w:t xml:space="preserve">Accuracy rate is a measure of the number of correct classifications over the entire test set, indicating the strength of the classifier [14]. [15] Precision is the fraction of correctly predicted, positive results out of the sum of all positive predictions (true positives + false positives). This number is useful in situations where the false-positives outnumber the false-negatives. A high-precision value suggests that the model makes accurate positive predictions. Recall on the other hand [16] indicates how well the classifier labels as positive, cases that are positive, showing the ability to correctly identify cases that are positive. This measure is also described as sensitivity.[15] the F1-Score is a measure of the test’s accuracy and is calculated from the precision and recall of the test. </w:t>
-      </w:r>
-    </w:p>
-    <w:p>
-      <w:pPr>
-        <w:spacing w:line="360" w:lineRule="auto"/>
-        <w:rPr>
-          <w:b/>
-          <w:bCs/>
-        </w:rPr>
-      </w:pPr>
-      <w:r>
-        <w:rPr>
-          <w:b/>
-          <w:bCs/>
-        </w:rPr>
         <w:t>Word Error Rate (WER)</w:t>
       </w:r>
     </w:p>
@@ -4372,10 +4099,7 @@
         <w:spacing w:line="360" w:lineRule="auto"/>
       </w:pPr>
       <w:r>
-        <w:t xml:space="preserve">[17] </w:t>
-      </w:r>
-      <w:r>
-        <w:t xml:space="preserve">The WER metric is used to measure the percentage of words that are incorrectly recognized or translated by the OCR Engine compared to a reference (ground truth) text. </w:t>
+        <w:t xml:space="preserve">[17] The WER metric is used to measure the percentage of words that are incorrectly recognized or translated by the OCR Engine compared to a reference (ground truth) text. </w:t>
       </w:r>
     </w:p>
     <w:p>
@@ -4533,6 +4257,7 @@
         <w:spacing w:line="360" w:lineRule="auto"/>
       </w:pPr>
       <w:r>
+        <w:lastRenderedPageBreak/>
         <w:t xml:space="preserve">[18] this metric counts any deletions, insertions or substitutions at the character level, enabling evaluation based on character-wise accuracy. CER works well in spotting symbol, typographical and abbreviation mistakes. </w:t>
       </w:r>
     </w:p>
@@ -4541,14 +4266,7 @@
         <w:spacing w:line="360" w:lineRule="auto"/>
       </w:pPr>
       <w:r>
-        <w:lastRenderedPageBreak/>
-        <w:t>[</w:t>
-      </w:r>
-      <w:r>
-        <w:t>17] The</w:t>
-      </w:r>
-      <w:r>
-        <w:t xml:space="preserve"> formula is as follows: </w:t>
+        <w:t xml:space="preserve">[17] The formula is as follows: </w:t>
       </w:r>
     </w:p>
     <w:p>
@@ -4669,130 +4387,357 @@
     </w:p>
     <w:p>
       <w:pPr>
-        <w:spacing w:line="360" w:lineRule="auto"/>
-      </w:pPr>
-      <w:r>
-        <w:t>What metrics do speech-to-text models use?</w:t>
-      </w:r>
-    </w:p>
-    <w:p>
-      <w:pPr>
-        <w:spacing w:line="360" w:lineRule="auto"/>
-      </w:pPr>
-      <w:r>
-        <w:t>What are the limitations of speech-to-text models?</w:t>
-      </w:r>
-    </w:p>
-    <w:p>
-      <w:pPr>
-        <w:spacing w:line="360" w:lineRule="auto"/>
-      </w:pPr>
-      <w:r>
-        <w:t>Why that speech-to-text-model? Get literature comparing model performance</w:t>
-      </w:r>
-    </w:p>
-    <w:p>
-      <w:pPr>
-        <w:spacing w:line="360" w:lineRule="auto"/>
-      </w:pPr>
-      <w:r>
-        <w:t>OpenAI whisper (</w:t>
-      </w:r>
-      <w:r>
-        <w:t>academic</w:t>
-      </w:r>
-      <w:r>
-        <w:t xml:space="preserve"> gold standard), NVIDIA Canary-</w:t>
-      </w:r>
-      <w:proofErr w:type="gramStart"/>
-      <w:r>
-        <w:t>Queen(</w:t>
-      </w:r>
-      <w:proofErr w:type="gramEnd"/>
-      <w:r>
-        <w:t>best for raw English accuracy), Distil-Whisper – (Best for low-Resource hardware)</w:t>
-      </w:r>
-    </w:p>
-    <w:p>
-      <w:pPr>
-        <w:spacing w:line="360" w:lineRule="auto"/>
-      </w:pPr>
-    </w:p>
-    <w:p>
-      <w:pPr>
-        <w:spacing w:line="360" w:lineRule="auto"/>
+        <w:pStyle w:val="Heading3"/>
+      </w:pPr>
+      <w:r>
+        <w:t>Plan</w:t>
+      </w:r>
+    </w:p>
+    <w:p>
+      <w:r>
+        <w:t xml:space="preserve">To evaluate the performance of the system </w:t>
+      </w:r>
+      <w:r>
+        <w:t>the following approach will be used:</w:t>
+      </w:r>
+    </w:p>
+    <w:p>
+      <w:r>
         <w:rPr>
           <w:b/>
           <w:bCs/>
         </w:rPr>
-      </w:pPr>
+        <w:t xml:space="preserve">Data input to </w:t>
+      </w:r>
       <w:r>
         <w:rPr>
           <w:b/>
           <w:bCs/>
         </w:rPr>
-        <w:t>Mitigation Plan</w:t>
-      </w:r>
-    </w:p>
-    <w:p>
-      <w:pPr>
-        <w:spacing w:line="360" w:lineRule="auto"/>
-      </w:pPr>
-      <w:r>
-        <w:t xml:space="preserve">One of the major caveats that this integrated system poses is error propagation through the pipeline. Since the AES does not originate the </w:t>
-      </w:r>
-      <w:r>
-        <w:t xml:space="preserve">text that </w:t>
-      </w:r>
-      <w:r>
-        <w:t>it is fed, it is likely that mistakes from either the audio transcription done by the ASR or from recognition and digitization by the OCR, will flow as input to the AES</w:t>
-      </w:r>
-      <w:r>
-        <w:t xml:space="preserve"> system core</w:t>
-      </w:r>
-      <w:r>
-        <w:t>. Thus erroneous, spurious results are inevitable in the output, essay score, from the integrated system</w:t>
-      </w:r>
-      <w:r>
-        <w:t>, reducing its accuracy and reliability</w:t>
-      </w:r>
-      <w:r>
-        <w:t>. It is incumbent on the designer to mitigate error</w:t>
+        <w:t>OCR</w:t>
+      </w:r>
+      <w:r>
+        <w:t xml:space="preserve"> – </w:t>
+      </w:r>
+      <w:r>
+        <w:t xml:space="preserve">WER and CER metrics will be calculated and used to determine whether the output should be sent to the </w:t>
+      </w:r>
+      <w:r>
+        <w:t>core for further processing or a flag raised for human scorer intervention</w:t>
+      </w:r>
+    </w:p>
+    <w:p>
+      <w:r>
+        <w:rPr>
+          <w:b/>
+          <w:bCs/>
+        </w:rPr>
+        <w:t xml:space="preserve">Data input to </w:t>
+      </w:r>
+      <w:r>
+        <w:rPr>
+          <w:b/>
+          <w:bCs/>
+        </w:rPr>
+        <w:t>ASR</w:t>
+      </w:r>
+      <w:r>
+        <w:t xml:space="preserve">- </w:t>
+      </w:r>
+      <w:r>
+        <w:t>WER and CER metrics will be calculated and used to determine whether the output should be sent to the core for further processing or a flag raised for human scorer intervention</w:t>
+      </w:r>
+    </w:p>
+    <w:p>
+      <w:r>
+        <w:rPr>
+          <w:b/>
+          <w:bCs/>
+        </w:rPr>
+        <w:t xml:space="preserve">Data input to </w:t>
+      </w:r>
+      <w:r>
+        <w:rPr>
+          <w:b/>
+          <w:bCs/>
+        </w:rPr>
+        <w:t>AES</w:t>
+      </w:r>
+      <w:r>
+        <w:t xml:space="preserve"> – </w:t>
+      </w:r>
+      <w:r>
+        <w:t>will output trait scores along with a</w:t>
+      </w:r>
+      <w:r>
+        <w:t xml:space="preserve"> QWK </w:t>
+      </w:r>
+      <w:r>
+        <w:t xml:space="preserve">which </w:t>
+      </w:r>
+      <w:r>
+        <w:t>will be used to describe proximity of the system’s scores to that of human scorers</w:t>
+      </w:r>
+      <w:r>
+        <w:t xml:space="preserve"> along </w:t>
+      </w:r>
+    </w:p>
+    <w:p>
+      <w:pPr>
+        <w:spacing w:line="360" w:lineRule="auto"/>
+      </w:pPr>
+      <w:r>
+        <w:rPr>
+          <w:b/>
+          <w:bCs/>
+        </w:rPr>
+        <w:t>Datasets –</w:t>
+      </w:r>
+      <w:r>
+        <w:t xml:space="preserve">this research will use the ASAP dataset for training and testing </w:t>
+      </w:r>
+      <w:proofErr w:type="spellStart"/>
+      <w:r>
+        <w:t>BrainPower</w:t>
+      </w:r>
+      <w:proofErr w:type="spellEnd"/>
+    </w:p>
+    <w:p>
+      <w:pPr>
+        <w:spacing w:line="360" w:lineRule="auto"/>
+      </w:pPr>
+      <w:r>
+        <w:rPr>
+          <w:b/>
+          <w:bCs/>
+        </w:rPr>
+        <w:t>Testing Plan</w:t>
+      </w:r>
+    </w:p>
+    <w:p>
+      <w:pPr>
+        <w:pStyle w:val="ListParagraph"/>
+        <w:numPr>
+          <w:ilvl w:val="0"/>
+          <w:numId w:val="7"/>
+        </w:numPr>
+        <w:spacing w:line="360" w:lineRule="auto"/>
+      </w:pPr>
+      <w:r>
+        <w:t>A sample of 10 individuals will each write five (5) essays selected from the dataset. E</w:t>
+      </w:r>
+      <w:r>
+        <w:t xml:space="preserve">ach </w:t>
+      </w:r>
+      <w:r>
+        <w:t>essay relates to a different prompt. These will then be scanned with and OCR scanner and be captured by camera and then submitted to the system via the OCR component.</w:t>
+      </w:r>
+    </w:p>
+    <w:p>
+      <w:pPr>
+        <w:pStyle w:val="ListParagraph"/>
+        <w:numPr>
+          <w:ilvl w:val="1"/>
+          <w:numId w:val="7"/>
+        </w:numPr>
+        <w:spacing w:line="360" w:lineRule="auto"/>
+      </w:pPr>
+      <w:r>
+        <w:t>Test tweaks:</w:t>
+      </w:r>
+    </w:p>
+    <w:p>
+      <w:pPr>
+        <w:pStyle w:val="ListParagraph"/>
+        <w:numPr>
+          <w:ilvl w:val="2"/>
+          <w:numId w:val="7"/>
+        </w:numPr>
+        <w:spacing w:line="360" w:lineRule="auto"/>
+      </w:pPr>
+      <w:r>
+        <w:t>Taking photos under different light conditions</w:t>
+      </w:r>
+    </w:p>
+    <w:p>
+      <w:pPr>
+        <w:pStyle w:val="ListParagraph"/>
+        <w:numPr>
+          <w:ilvl w:val="2"/>
+          <w:numId w:val="7"/>
+        </w:numPr>
+        <w:spacing w:line="360" w:lineRule="auto"/>
+      </w:pPr>
+      <w:r>
+        <w:t>Crumpling scripts and the scanning/photographing</w:t>
+      </w:r>
+    </w:p>
+    <w:p>
+      <w:pPr>
+        <w:pStyle w:val="ListParagraph"/>
+        <w:numPr>
+          <w:ilvl w:val="2"/>
+          <w:numId w:val="7"/>
+        </w:numPr>
+        <w:spacing w:line="360" w:lineRule="auto"/>
+      </w:pPr>
+      <w:r>
+        <w:t>Smudging scripts and scribbling in the margin</w:t>
+      </w:r>
+    </w:p>
+    <w:p>
+      <w:pPr>
+        <w:pStyle w:val="ListParagraph"/>
+        <w:numPr>
+          <w:ilvl w:val="0"/>
+          <w:numId w:val="7"/>
+        </w:numPr>
+        <w:spacing w:line="360" w:lineRule="auto"/>
+      </w:pPr>
+      <w:r>
+        <w:t>Each member of the sample will</w:t>
+      </w:r>
+      <w:r>
+        <w:t xml:space="preserve"> read </w:t>
+      </w:r>
+      <w:r>
+        <w:t xml:space="preserve">each of the five essays they wrote </w:t>
+      </w:r>
+      <w:r>
+        <w:t xml:space="preserve">and record their voice then </w:t>
+      </w:r>
+      <w:r>
+        <w:t>input the audio via the ASR component of the system</w:t>
+      </w:r>
+      <w:r>
+        <w:t xml:space="preserve"> </w:t>
+      </w:r>
+    </w:p>
+    <w:p>
+      <w:pPr>
+        <w:pStyle w:val="ListParagraph"/>
+        <w:numPr>
+          <w:ilvl w:val="1"/>
+          <w:numId w:val="7"/>
+        </w:numPr>
+        <w:spacing w:line="360" w:lineRule="auto"/>
+      </w:pPr>
+      <w:r>
+        <w:lastRenderedPageBreak/>
+        <w:t>Test tweaks:</w:t>
+      </w:r>
+    </w:p>
+    <w:p>
+      <w:pPr>
+        <w:pStyle w:val="ListParagraph"/>
+        <w:numPr>
+          <w:ilvl w:val="2"/>
+          <w:numId w:val="7"/>
+        </w:numPr>
+        <w:spacing w:line="360" w:lineRule="auto"/>
+      </w:pPr>
+      <w:r>
+        <w:t xml:space="preserve">Various background noises will be used </w:t>
+      </w:r>
+      <w:r>
+        <w:t>to</w:t>
+      </w:r>
+      <w:r>
+        <w:t xml:space="preserve"> obscure the input signal replication real-world classroom conditions</w:t>
+      </w:r>
+    </w:p>
+    <w:p>
+      <w:pPr>
+        <w:spacing w:line="360" w:lineRule="auto"/>
+      </w:pPr>
+      <w:r>
+        <w:t>Compare:</w:t>
+      </w:r>
+    </w:p>
+    <w:p>
+      <w:pPr>
+        <w:pStyle w:val="ListParagraph"/>
+        <w:numPr>
+          <w:ilvl w:val="0"/>
+          <w:numId w:val="4"/>
+        </w:numPr>
+        <w:spacing w:line="360" w:lineRule="auto"/>
+      </w:pPr>
+      <w:r>
+        <w:t>Essay score from dataset after essay</w:t>
+      </w:r>
+      <w:r>
+        <w:t xml:space="preserve">s </w:t>
+      </w:r>
+      <w:r>
+        <w:t xml:space="preserve">fed directly to </w:t>
+      </w:r>
+      <w:proofErr w:type="spellStart"/>
+      <w:r>
+        <w:t>aes</w:t>
+      </w:r>
+      <w:proofErr w:type="spellEnd"/>
+      <w:r>
+        <w:t xml:space="preserve"> with </w:t>
+      </w:r>
+    </w:p>
+    <w:p>
+      <w:pPr>
+        <w:pStyle w:val="ListParagraph"/>
+        <w:numPr>
+          <w:ilvl w:val="0"/>
+          <w:numId w:val="4"/>
+        </w:numPr>
+        <w:spacing w:line="360" w:lineRule="auto"/>
+      </w:pPr>
+      <w:r>
+        <w:t>Transcribed essay</w:t>
       </w:r>
       <w:r>
         <w:t>s</w:t>
       </w:r>
       <w:r>
-        <w:t xml:space="preserve"> propagation by reducing</w:t>
-      </w:r>
-      <w:r>
-        <w:t xml:space="preserve"> them</w:t>
-      </w:r>
-      <w:r>
-        <w:t xml:space="preserve"> at the component level. </w:t>
-      </w:r>
-      <w:r>
-        <w:t xml:space="preserve">Errors are inevitable since no system functions perfectly; therefore, the system must have contingency built </w:t>
-      </w:r>
-      <w:r>
-        <w:t>in,</w:t>
-      </w:r>
-      <w:r>
-        <w:t xml:space="preserve"> so the core is notified and factors this information in is evaluation.</w:t>
-      </w:r>
-    </w:p>
-    <w:p>
-      <w:pPr>
-        <w:spacing w:line="360" w:lineRule="auto"/>
-      </w:pPr>
-    </w:p>
-    <w:p>
-      <w:pPr>
-        <w:spacing w:line="360" w:lineRule="auto"/>
-      </w:pPr>
-      <w:r>
-        <w:t>How to mitigate against OCR and STT input errors to AES</w:t>
-      </w:r>
+        <w:t xml:space="preserve"> fed from </w:t>
+      </w:r>
+      <w:proofErr w:type="spellStart"/>
+      <w:r>
+        <w:t>asr</w:t>
+      </w:r>
+      <w:proofErr w:type="spellEnd"/>
+    </w:p>
+    <w:p>
+      <w:pPr>
+        <w:pStyle w:val="ListParagraph"/>
+        <w:numPr>
+          <w:ilvl w:val="0"/>
+          <w:numId w:val="4"/>
+        </w:numPr>
+        <w:spacing w:line="360" w:lineRule="auto"/>
+      </w:pPr>
+      <w:r>
+        <w:t>Scanned and digitized handwritten essay</w:t>
+      </w:r>
+      <w:r>
+        <w:t>s</w:t>
+      </w:r>
+      <w:r>
+        <w:t xml:space="preserve"> from </w:t>
+      </w:r>
+      <w:proofErr w:type="spellStart"/>
+      <w:r>
+        <w:t>ocr</w:t>
+      </w:r>
+      <w:proofErr w:type="spellEnd"/>
+    </w:p>
+    <w:p>
+      <w:pPr>
+        <w:rPr>
+          <w:rFonts w:eastAsiaTheme="majorEastAsia" w:cstheme="majorBidi"/>
+          <w:color w:val="0F4761" w:themeColor="accent1" w:themeShade="BF"/>
+          <w:sz w:val="28"/>
+          <w:szCs w:val="28"/>
+        </w:rPr>
+      </w:pPr>
       <w:r>
         <w:br w:type="page"/>
       </w:r>
@@ -4876,38 +4821,69 @@
         <w:t>:</w:t>
       </w:r>
     </w:p>
+    <w:p>
+      <w:r>
+        <w:t>(</w:t>
+      </w:r>
+      <w:proofErr w:type="spellStart"/>
+      <w:r>
+        <w:t>ocr</w:t>
+      </w:r>
+      <w:proofErr w:type="spellEnd"/>
+      <w:r>
+        <w:t xml:space="preserve"> -&gt; </w:t>
+      </w:r>
+      <w:proofErr w:type="spellStart"/>
+      <w:r>
+        <w:t>aes</w:t>
+      </w:r>
+      <w:proofErr w:type="spellEnd"/>
+      <w:r>
+        <w:t xml:space="preserve"> &lt;- </w:t>
+      </w:r>
+      <w:proofErr w:type="spellStart"/>
+      <w:r>
+        <w:t>asr</w:t>
+      </w:r>
+      <w:proofErr w:type="spellEnd"/>
+      <w:r>
+        <w:t>)</w:t>
+      </w:r>
+    </w:p>
     <w:p/>
     <w:p>
       <w:pPr>
+        <w:rPr>
+          <w:b/>
+          <w:bCs/>
+        </w:rPr>
+      </w:pPr>
+      <w:r>
+        <w:rPr>
+          <w:b/>
+          <w:bCs/>
+        </w:rPr>
+        <w:t xml:space="preserve">Models </w:t>
+      </w:r>
+    </w:p>
+    <w:p>
+      <w:pPr>
+        <w:spacing w:line="360" w:lineRule="auto"/>
+      </w:pPr>
+      <w:r>
+        <w:t>deberta-v3-base</w:t>
+      </w:r>
+    </w:p>
+    <w:p>
+      <w:pPr>
         <w:spacing w:line="360" w:lineRule="auto"/>
       </w:pPr>
       <w:proofErr w:type="spellStart"/>
       <w:r>
-        <w:t>microsoft</w:t>
+        <w:t>trocr</w:t>
       </w:r>
       <w:proofErr w:type="spellEnd"/>
       <w:r>
-        <w:t>/deberta-v3-base</w:t>
-      </w:r>
-    </w:p>
-    <w:p>
-      <w:pPr>
-        <w:spacing w:line="360" w:lineRule="auto"/>
-      </w:pPr>
-      <w:proofErr w:type="spellStart"/>
-      <w:r>
-        <w:t>microsoft</w:t>
-      </w:r>
-      <w:proofErr w:type="spellEnd"/>
-      <w:r>
-        <w:t>/</w:t>
-      </w:r>
-      <w:proofErr w:type="spellStart"/>
-      <w:r>
-        <w:t>trocr</w:t>
-      </w:r>
-      <w:proofErr w:type="spellEnd"/>
-      <w:r>
         <w:t>-base-handwritten</w:t>
       </w:r>
     </w:p>
@@ -4915,13 +4891,8 @@
       <w:pPr>
         <w:spacing w:line="360" w:lineRule="auto"/>
       </w:pPr>
-      <w:proofErr w:type="spellStart"/>
-      <w:r>
-        <w:t>openai</w:t>
-      </w:r>
-      <w:proofErr w:type="spellEnd"/>
-      <w:r>
-        <w:t>/whisper-</w:t>
+      <w:r>
+        <w:t>whisper-</w:t>
       </w:r>
       <w:proofErr w:type="spellStart"/>
       <w:proofErr w:type="gramStart"/>
@@ -4973,31 +4944,7 @@
         <w:spacing w:line="360" w:lineRule="auto"/>
       </w:pPr>
       <w:r>
-        <w:t>(draw diagram) (</w:t>
-      </w:r>
-      <w:proofErr w:type="spellStart"/>
-      <w:r>
-        <w:t>ocr</w:t>
-      </w:r>
-      <w:proofErr w:type="spellEnd"/>
-      <w:r>
-        <w:t xml:space="preserve"> -&gt; </w:t>
-      </w:r>
-      <w:proofErr w:type="spellStart"/>
-      <w:r>
-        <w:t>aes</w:t>
-      </w:r>
-      <w:proofErr w:type="spellEnd"/>
-      <w:r>
-        <w:t xml:space="preserve"> &lt;- </w:t>
-      </w:r>
-      <w:proofErr w:type="spellStart"/>
-      <w:r>
-        <w:t>asr</w:t>
-      </w:r>
-      <w:proofErr w:type="spellEnd"/>
-      <w:r>
-        <w:t>) -&gt; interpretable essay score</w:t>
+        <w:t>(draw diagram) -&gt; interpretable essay score</w:t>
       </w:r>
     </w:p>
     <w:p>
@@ -5049,6 +4996,7 @@
         <w:spacing w:line="360" w:lineRule="auto"/>
       </w:pPr>
       <w:r>
+        <w:lastRenderedPageBreak/>
         <w:t>Where will the components be hosted:</w:t>
       </w:r>
     </w:p>
@@ -5083,7 +5031,6 @@
         <w:spacing w:line="360" w:lineRule="auto"/>
       </w:pPr>
       <w:r>
-        <w:lastRenderedPageBreak/>
         <w:t xml:space="preserve">Back end – </w:t>
       </w:r>
       <w:proofErr w:type="spellStart"/>
@@ -5185,18 +5132,33 @@
     </w:p>
     <w:p>
       <w:r>
-        <w:t xml:space="preserve">Demonstrate how the AES scores essays from ASAP dataset submitted in digital format and </w:t>
-      </w:r>
-      <w:proofErr w:type="spellStart"/>
-      <w:r>
-        <w:t>calu</w:t>
-      </w:r>
-      <w:r>
-        <w:t>late</w:t>
-      </w:r>
-      <w:proofErr w:type="spellEnd"/>
-      <w:r>
-        <w:t xml:space="preserve"> QWK score and give brief analysis of results, use holistic score for now, and handcrafted features later</w:t>
+        <w:t xml:space="preserve">The feature that will be demonstrated in this section is the OCR component of the AES pipeline. The following essays will be taken from the ASAP dataset (specify prompts). </w:t>
+      </w:r>
+      <w:r>
+        <w:t xml:space="preserve">The </w:t>
+      </w:r>
+      <w:r>
+        <w:t>essays will</w:t>
+      </w:r>
+      <w:r>
+        <w:t xml:space="preserve"> be printed with a laser printer, scanned and submitted. </w:t>
+      </w:r>
+      <w:r>
+        <w:t>They</w:t>
+      </w:r>
+      <w:r>
+        <w:t xml:space="preserve"> will also be photographed under low and good light conditions and submitted for processing. </w:t>
+      </w:r>
+      <w:proofErr w:type="gramStart"/>
+      <w:r>
+        <w:t>Finally</w:t>
+      </w:r>
+      <w:proofErr w:type="gramEnd"/>
+      <w:r>
+        <w:t xml:space="preserve"> they will be handwritten, then scanned and sent in for processing by the OCR. All outputs will be compared to the ground truth to determine accuracy and precision </w:t>
+      </w:r>
+      <w:r>
+        <w:t xml:space="preserve">using the WER and CER metrics. </w:t>
       </w:r>
     </w:p>
     <w:p/>
@@ -6128,32 +6090,66 @@
           <w:b/>
           <w:bCs/>
         </w:rPr>
-        <w:t>[</w:t>
-      </w:r>
+        <w:t>[24]</w:t>
+      </w:r>
+      <w:r>
+        <w:t xml:space="preserve"> Y. Wang, W. Qu, and X. Ye, “Selecting Between BERT and GPT for Text Classification in Political Science Research,” </w:t>
+      </w:r>
+      <w:proofErr w:type="spellStart"/>
+      <w:r>
+        <w:t>arXiv</w:t>
+      </w:r>
+      <w:proofErr w:type="spellEnd"/>
+      <w:r>
+        <w:t xml:space="preserve"> preprint arXiv:2411.05050, Nov. 2024. </w:t>
+      </w:r>
+      <w:proofErr w:type="spellStart"/>
+      <w:r>
+        <w:t>doi</w:t>
+      </w:r>
+      <w:proofErr w:type="spellEnd"/>
+      <w:r>
+        <w:t>: 10.48550/arXiv.2411.05050.</w:t>
+      </w:r>
+    </w:p>
+    <w:p>
       <w:r>
         <w:rPr>
           <w:b/>
           <w:bCs/>
         </w:rPr>
-        <w:t>24</w:t>
-      </w:r>
+        <w:t>[25]</w:t>
+      </w:r>
+      <w:r>
+        <w:t xml:space="preserve"> P. He, X. Liu, J. Gao, and W. Chen, “</w:t>
+      </w:r>
+      <w:proofErr w:type="spellStart"/>
+      <w:r>
+        <w:t>DeBERTa</w:t>
+      </w:r>
+      <w:proofErr w:type="spellEnd"/>
+      <w:r>
+        <w:t>: Decoding-Enhanced BERT with Disentangled Attention,” in Proc. International Conference on Learning Representations (ICLR), 2021.</w:t>
+      </w:r>
+    </w:p>
+    <w:p>
       <w:r>
         <w:rPr>
           <w:b/>
           <w:bCs/>
         </w:rPr>
-        <w:t>]</w:t>
-      </w:r>
-      <w:r>
-        <w:t xml:space="preserve"> Y. Wang, W. Qu, and X. Ye, “Selecting Between BERT and GPT for Text Classification in Political Science Research,” </w:t>
+        <w:t>[26]</w:t>
+      </w:r>
+      <w:r>
+        <w:t xml:space="preserve"> A. K. Meghana, H. Gupta, and P. Dubey, “Enhanced Text Extraction from Low-Quality Legacy Documents Using </w:t>
       </w:r>
       <w:proofErr w:type="spellStart"/>
       <w:r>
-        <w:t>arXiv</w:t>
+        <w:t>TrOCR</w:t>
       </w:r>
       <w:proofErr w:type="spellEnd"/>
       <w:r>
-        <w:t xml:space="preserve"> preprint arXiv:2411.05050, Nov. 2024. </w:t>
+        <w:t xml:space="preserve"> Assisted by Line Detection,” in Proc. 8th World Engineering Conference on Contemporary Technologies (WECON), 2025, </w:t>
       </w:r>
       <w:proofErr w:type="spellStart"/>
       <w:r>
@@ -6161,7 +6157,7 @@
       </w:r>
       <w:proofErr w:type="spellEnd"/>
       <w:r>
-        <w:t>: 10.48550/arXiv.2411.05050.</w:t>
+        <w:t>: 10.1109/WECON68556.2025.11414621.</w:t>
       </w:r>
     </w:p>
     <w:p>
@@ -6170,74 +6166,28 @@
           <w:b/>
           <w:bCs/>
         </w:rPr>
-        <w:t>[</w:t>
-      </w:r>
-      <w:r>
-        <w:rPr>
-          <w:b/>
-          <w:bCs/>
-        </w:rPr>
-        <w:t>25</w:t>
-      </w:r>
-      <w:r>
-        <w:rPr>
-          <w:b/>
-          <w:bCs/>
-        </w:rPr>
-        <w:t>]</w:t>
-      </w:r>
-      <w:r>
-        <w:t xml:space="preserve"> P. He, X. Liu, J. Gao, and W. Chen, “</w:t>
+        <w:t>[27]</w:t>
+      </w:r>
+      <w:r>
+        <w:t xml:space="preserve"> D. K. A, A. V. S, R. Aravindan, and A. Balamurali, "Sound Sight-A TTS and STT Integrated Model using OCR and ASR," in </w:t>
+      </w:r>
+      <w:r>
+        <w:rPr>
+          <w:i/>
+          <w:iCs/>
+        </w:rPr>
+        <w:t>2024 International Conference on Innovative Computing, Intelligent Communication and Smart Electrical Systems (ICSES)</w:t>
+      </w:r>
+      <w:r>
+        <w:t xml:space="preserve">, Chennai, India, Dec. 2024, pp. 1–5. </w:t>
       </w:r>
       <w:proofErr w:type="spellStart"/>
       <w:r>
-        <w:t>DeBERTa</w:t>
+        <w:t>doi</w:t>
       </w:r>
       <w:proofErr w:type="spellEnd"/>
       <w:r>
-        <w:t>: Decoding-Enhanced BERT with Disentangled Attention,” in Proc. International Conference on Learning Representations (ICLR), 2021.</w:t>
-      </w:r>
-    </w:p>
-    <w:p>
-      <w:r>
-        <w:rPr>
-          <w:b/>
-          <w:bCs/>
-        </w:rPr>
-        <w:t>[</w:t>
-      </w:r>
-      <w:r>
-        <w:rPr>
-          <w:b/>
-          <w:bCs/>
-        </w:rPr>
-        <w:t>26</w:t>
-      </w:r>
-      <w:r>
-        <w:rPr>
-          <w:b/>
-          <w:bCs/>
-        </w:rPr>
-        <w:t>]</w:t>
-      </w:r>
-      <w:r>
-        <w:t xml:space="preserve"> A. K. Meghana, H. Gupta, and P. Dubey, “Enhanced Text Extraction from Low-Quality Legacy Documents Using </w:t>
-      </w:r>
-      <w:proofErr w:type="spellStart"/>
-      <w:r>
-        <w:t>TrOCR</w:t>
-      </w:r>
-      <w:proofErr w:type="spellEnd"/>
-      <w:r>
-        <w:t xml:space="preserve"> Assisted by Line Detection,” in Proc. 8th World Engineering Conference on Contemporary Technologies (WECON), 2025, </w:t>
-      </w:r>
-      <w:proofErr w:type="spellStart"/>
-      <w:r>
-        <w:t>doi</w:t>
-      </w:r>
-      <w:proofErr w:type="spellEnd"/>
-      <w:r>
-        <w:t>: 10.1109/WECON68556.2025.11414621.</w:t>
+        <w:t>: 10.1109/ICSES63760.2024.10910492</w:t>
       </w:r>
     </w:p>
     <w:sectPr>
@@ -6571,9 +6521,122 @@
     </w:lvl>
   </w:abstractNum>
   <w:abstractNum w:abstractNumId="2" w15:restartNumberingAfterBreak="0">
-    <w:nsid w:val="65582D2B"/>
+    <w:nsid w:val="24285BB1"/>
     <w:multiLevelType w:val="hybridMultilevel"/>
-    <w:tmpl w:val="0F02FED8"/>
+    <w:tmpl w:val="9DBCD248"/>
+    <w:lvl w:ilvl="0" w:tplc="08090001">
+      <w:start w:val="1"/>
+      <w:numFmt w:val="bullet"/>
+      <w:lvlText w:val=""/>
+      <w:lvlJc w:val="left"/>
+      <w:pPr>
+        <w:ind w:left="720" w:hanging="360"/>
+      </w:pPr>
+      <w:rPr>
+        <w:rFonts w:ascii="Symbol" w:hAnsi="Symbol" w:hint="default"/>
+      </w:rPr>
+    </w:lvl>
+    <w:lvl w:ilvl="1" w:tplc="08090003" w:tentative="1">
+      <w:start w:val="1"/>
+      <w:numFmt w:val="bullet"/>
+      <w:lvlText w:val="o"/>
+      <w:lvlJc w:val="left"/>
+      <w:pPr>
+        <w:ind w:left="1440" w:hanging="360"/>
+      </w:pPr>
+      <w:rPr>
+        <w:rFonts w:ascii="Courier New" w:hAnsi="Courier New" w:cs="Courier New" w:hint="default"/>
+      </w:rPr>
+    </w:lvl>
+    <w:lvl w:ilvl="2" w:tplc="08090005" w:tentative="1">
+      <w:start w:val="1"/>
+      <w:numFmt w:val="bullet"/>
+      <w:lvlText w:val=""/>
+      <w:lvlJc w:val="left"/>
+      <w:pPr>
+        <w:ind w:left="2160" w:hanging="360"/>
+      </w:pPr>
+      <w:rPr>
+        <w:rFonts w:ascii="Wingdings" w:hAnsi="Wingdings" w:hint="default"/>
+      </w:rPr>
+    </w:lvl>
+    <w:lvl w:ilvl="3" w:tplc="08090001" w:tentative="1">
+      <w:start w:val="1"/>
+      <w:numFmt w:val="bullet"/>
+      <w:lvlText w:val=""/>
+      <w:lvlJc w:val="left"/>
+      <w:pPr>
+        <w:ind w:left="2880" w:hanging="360"/>
+      </w:pPr>
+      <w:rPr>
+        <w:rFonts w:ascii="Symbol" w:hAnsi="Symbol" w:hint="default"/>
+      </w:rPr>
+    </w:lvl>
+    <w:lvl w:ilvl="4" w:tplc="08090003" w:tentative="1">
+      <w:start w:val="1"/>
+      <w:numFmt w:val="bullet"/>
+      <w:lvlText w:val="o"/>
+      <w:lvlJc w:val="left"/>
+      <w:pPr>
+        <w:ind w:left="3600" w:hanging="360"/>
+      </w:pPr>
+      <w:rPr>
+        <w:rFonts w:ascii="Courier New" w:hAnsi="Courier New" w:cs="Courier New" w:hint="default"/>
+      </w:rPr>
+    </w:lvl>
+    <w:lvl w:ilvl="5" w:tplc="08090005" w:tentative="1">
+      <w:start w:val="1"/>
+      <w:numFmt w:val="bullet"/>
+      <w:lvlText w:val=""/>
+      <w:lvlJc w:val="left"/>
+      <w:pPr>
+        <w:ind w:left="4320" w:hanging="360"/>
+      </w:pPr>
+      <w:rPr>
+        <w:rFonts w:ascii="Wingdings" w:hAnsi="Wingdings" w:hint="default"/>
+      </w:rPr>
+    </w:lvl>
+    <w:lvl w:ilvl="6" w:tplc="08090001" w:tentative="1">
+      <w:start w:val="1"/>
+      <w:numFmt w:val="bullet"/>
+      <w:lvlText w:val=""/>
+      <w:lvlJc w:val="left"/>
+      <w:pPr>
+        <w:ind w:left="5040" w:hanging="360"/>
+      </w:pPr>
+      <w:rPr>
+        <w:rFonts w:ascii="Symbol" w:hAnsi="Symbol" w:hint="default"/>
+      </w:rPr>
+    </w:lvl>
+    <w:lvl w:ilvl="7" w:tplc="08090003" w:tentative="1">
+      <w:start w:val="1"/>
+      <w:numFmt w:val="bullet"/>
+      <w:lvlText w:val="o"/>
+      <w:lvlJc w:val="left"/>
+      <w:pPr>
+        <w:ind w:left="5760" w:hanging="360"/>
+      </w:pPr>
+      <w:rPr>
+        <w:rFonts w:ascii="Courier New" w:hAnsi="Courier New" w:cs="Courier New" w:hint="default"/>
+      </w:rPr>
+    </w:lvl>
+    <w:lvl w:ilvl="8" w:tplc="08090005" w:tentative="1">
+      <w:start w:val="1"/>
+      <w:numFmt w:val="bullet"/>
+      <w:lvlText w:val=""/>
+      <w:lvlJc w:val="left"/>
+      <w:pPr>
+        <w:ind w:left="6480" w:hanging="360"/>
+      </w:pPr>
+      <w:rPr>
+        <w:rFonts w:ascii="Wingdings" w:hAnsi="Wingdings" w:hint="default"/>
+      </w:rPr>
+    </w:lvl>
+  </w:abstractNum>
+  <w:abstractNum w:abstractNumId="3" w15:restartNumberingAfterBreak="0">
+    <w:nsid w:val="55CC3B7C"/>
+    <w:multiLevelType w:val="hybridMultilevel"/>
+    <w:tmpl w:val="86B2F148"/>
     <w:lvl w:ilvl="0" w:tplc="08090001">
       <w:start w:val="1"/>
       <w:numFmt w:val="bullet"/>
@@ -6598,7 +6661,7 @@
         <w:rFonts w:ascii="Courier New" w:hAnsi="Courier New" w:cs="Courier New" w:hint="default"/>
       </w:rPr>
     </w:lvl>
-    <w:lvl w:ilvl="2" w:tplc="08090005" w:tentative="1">
+    <w:lvl w:ilvl="2" w:tplc="08090005">
       <w:start w:val="1"/>
       <w:numFmt w:val="bullet"/>
       <w:lvlText w:val=""/>
@@ -6683,7 +6746,120 @@
       </w:rPr>
     </w:lvl>
   </w:abstractNum>
-  <w:abstractNum w:abstractNumId="3" w15:restartNumberingAfterBreak="0">
+  <w:abstractNum w:abstractNumId="4" w15:restartNumberingAfterBreak="0">
+    <w:nsid w:val="65582D2B"/>
+    <w:multiLevelType w:val="hybridMultilevel"/>
+    <w:tmpl w:val="0F02FED8"/>
+    <w:lvl w:ilvl="0" w:tplc="08090001">
+      <w:start w:val="1"/>
+      <w:numFmt w:val="bullet"/>
+      <w:lvlText w:val=""/>
+      <w:lvlJc w:val="left"/>
+      <w:pPr>
+        <w:ind w:left="720" w:hanging="360"/>
+      </w:pPr>
+      <w:rPr>
+        <w:rFonts w:ascii="Symbol" w:hAnsi="Symbol" w:hint="default"/>
+      </w:rPr>
+    </w:lvl>
+    <w:lvl w:ilvl="1" w:tplc="08090003">
+      <w:start w:val="1"/>
+      <w:numFmt w:val="bullet"/>
+      <w:lvlText w:val="o"/>
+      <w:lvlJc w:val="left"/>
+      <w:pPr>
+        <w:ind w:left="1440" w:hanging="360"/>
+      </w:pPr>
+      <w:rPr>
+        <w:rFonts w:ascii="Courier New" w:hAnsi="Courier New" w:cs="Courier New" w:hint="default"/>
+      </w:rPr>
+    </w:lvl>
+    <w:lvl w:ilvl="2" w:tplc="08090005" w:tentative="1">
+      <w:start w:val="1"/>
+      <w:numFmt w:val="bullet"/>
+      <w:lvlText w:val=""/>
+      <w:lvlJc w:val="left"/>
+      <w:pPr>
+        <w:ind w:left="2160" w:hanging="360"/>
+      </w:pPr>
+      <w:rPr>
+        <w:rFonts w:ascii="Wingdings" w:hAnsi="Wingdings" w:hint="default"/>
+      </w:rPr>
+    </w:lvl>
+    <w:lvl w:ilvl="3" w:tplc="08090001" w:tentative="1">
+      <w:start w:val="1"/>
+      <w:numFmt w:val="bullet"/>
+      <w:lvlText w:val=""/>
+      <w:lvlJc w:val="left"/>
+      <w:pPr>
+        <w:ind w:left="2880" w:hanging="360"/>
+      </w:pPr>
+      <w:rPr>
+        <w:rFonts w:ascii="Symbol" w:hAnsi="Symbol" w:hint="default"/>
+      </w:rPr>
+    </w:lvl>
+    <w:lvl w:ilvl="4" w:tplc="08090003" w:tentative="1">
+      <w:start w:val="1"/>
+      <w:numFmt w:val="bullet"/>
+      <w:lvlText w:val="o"/>
+      <w:lvlJc w:val="left"/>
+      <w:pPr>
+        <w:ind w:left="3600" w:hanging="360"/>
+      </w:pPr>
+      <w:rPr>
+        <w:rFonts w:ascii="Courier New" w:hAnsi="Courier New" w:cs="Courier New" w:hint="default"/>
+      </w:rPr>
+    </w:lvl>
+    <w:lvl w:ilvl="5" w:tplc="08090005" w:tentative="1">
+      <w:start w:val="1"/>
+      <w:numFmt w:val="bullet"/>
+      <w:lvlText w:val=""/>
+      <w:lvlJc w:val="left"/>
+      <w:pPr>
+        <w:ind w:left="4320" w:hanging="360"/>
+      </w:pPr>
+      <w:rPr>
+        <w:rFonts w:ascii="Wingdings" w:hAnsi="Wingdings" w:hint="default"/>
+      </w:rPr>
+    </w:lvl>
+    <w:lvl w:ilvl="6" w:tplc="08090001" w:tentative="1">
+      <w:start w:val="1"/>
+      <w:numFmt w:val="bullet"/>
+      <w:lvlText w:val=""/>
+      <w:lvlJc w:val="left"/>
+      <w:pPr>
+        <w:ind w:left="5040" w:hanging="360"/>
+      </w:pPr>
+      <w:rPr>
+        <w:rFonts w:ascii="Symbol" w:hAnsi="Symbol" w:hint="default"/>
+      </w:rPr>
+    </w:lvl>
+    <w:lvl w:ilvl="7" w:tplc="08090003" w:tentative="1">
+      <w:start w:val="1"/>
+      <w:numFmt w:val="bullet"/>
+      <w:lvlText w:val="o"/>
+      <w:lvlJc w:val="left"/>
+      <w:pPr>
+        <w:ind w:left="5760" w:hanging="360"/>
+      </w:pPr>
+      <w:rPr>
+        <w:rFonts w:ascii="Courier New" w:hAnsi="Courier New" w:cs="Courier New" w:hint="default"/>
+      </w:rPr>
+    </w:lvl>
+    <w:lvl w:ilvl="8" w:tplc="08090005" w:tentative="1">
+      <w:start w:val="1"/>
+      <w:numFmt w:val="bullet"/>
+      <w:lvlText w:val=""/>
+      <w:lvlJc w:val="left"/>
+      <w:pPr>
+        <w:ind w:left="6480" w:hanging="360"/>
+      </w:pPr>
+      <w:rPr>
+        <w:rFonts w:ascii="Wingdings" w:hAnsi="Wingdings" w:hint="default"/>
+      </w:rPr>
+    </w:lvl>
+  </w:abstractNum>
+  <w:abstractNum w:abstractNumId="5" w15:restartNumberingAfterBreak="0">
     <w:nsid w:val="65DE470F"/>
     <w:multiLevelType w:val="hybridMultilevel"/>
     <w:tmpl w:val="B78E431A"/>
@@ -6796,7 +6972,7 @@
       </w:rPr>
     </w:lvl>
   </w:abstractNum>
-  <w:abstractNum w:abstractNumId="4" w15:restartNumberingAfterBreak="0">
+  <w:abstractNum w:abstractNumId="6" w15:restartNumberingAfterBreak="0">
     <w:nsid w:val="69C20DB5"/>
     <w:multiLevelType w:val="hybridMultilevel"/>
     <w:tmpl w:val="25DEFF8E"/>
@@ -6913,16 +7089,22 @@
     <w:abstractNumId w:val="1"/>
   </w:num>
   <w:num w:numId="2" w16cid:durableId="1625887844">
-    <w:abstractNumId w:val="4"/>
+    <w:abstractNumId w:val="6"/>
   </w:num>
   <w:num w:numId="3" w16cid:durableId="1615869907">
-    <w:abstractNumId w:val="3"/>
+    <w:abstractNumId w:val="5"/>
   </w:num>
   <w:num w:numId="4" w16cid:durableId="1774739438">
     <w:abstractNumId w:val="0"/>
   </w:num>
   <w:num w:numId="5" w16cid:durableId="290677251">
+    <w:abstractNumId w:val="4"/>
+  </w:num>
+  <w:num w:numId="6" w16cid:durableId="1314800344">
     <w:abstractNumId w:val="2"/>
+  </w:num>
+  <w:num w:numId="7" w16cid:durableId="1529755803">
+    <w:abstractNumId w:val="3"/>
   </w:num>
 </w:numbering>
 </file>

</xml_diff>